<commit_message>
Remove creator demo mock stats and update footer LP links
</commit_message>
<xml_diff>
--- a/主題小売り業界向けの売上高改善の向けサイネージ広告共同運用の提案.docx
+++ b/主題小売り業界向けの売上高改善の向けサイネージ広告共同運用の提案.docx
@@ -611,17 +611,15 @@
           <w:color w:val="EE0000"/>
           <w:u w:val="single"/>
         </w:rPr>
-        <w:t>会社のためではなく、所属する</w:t>
-      </w:r>
-      <w:r>
-        <w:rPr>
-          <w:rFonts w:hint="eastAsia"/>
-          <w:b/>
-          <w:bCs/>
+        <w:t>自社の成長より</w:t>
+      </w:r>
+      <w:r>
+        <w:rPr>
+          <w:rFonts w:hint="eastAsia"/>
           <w:color w:val="EE0000"/>
           <w:u w:val="single"/>
         </w:rPr>
-        <w:t>部</w:t>
+        <w:t>、所属する</w:t>
       </w:r>
       <w:r>
         <w:rPr>
@@ -631,7 +629,7 @@
           <w:color w:val="EE0000"/>
           <w:u w:val="single"/>
         </w:rPr>
-        <w:t>署</w:t>
+        <w:t>部</w:t>
       </w:r>
       <w:r>
         <w:rPr>
@@ -641,7 +639,37 @@
           <w:color w:val="EE0000"/>
           <w:u w:val="single"/>
         </w:rPr>
-        <w:t>にメリット</w:t>
+        <w:t>署</w:t>
+      </w:r>
+      <w:r>
+        <w:rPr>
+          <w:rFonts w:hint="eastAsia"/>
+          <w:b/>
+          <w:bCs/>
+          <w:color w:val="EE0000"/>
+          <w:u w:val="single"/>
+        </w:rPr>
+        <w:t>に</w:t>
+      </w:r>
+      <w:r>
+        <w:rPr>
+          <w:rFonts w:hint="eastAsia"/>
+          <w:b/>
+          <w:bCs/>
+          <w:color w:val="EE0000"/>
+          <w:u w:val="single"/>
+        </w:rPr>
+        <w:t>売上</w:t>
+      </w:r>
+      <w:r>
+        <w:rPr>
+          <w:rFonts w:hint="eastAsia"/>
+          <w:b/>
+          <w:bCs/>
+          <w:color w:val="EE0000"/>
+          <w:u w:val="single"/>
+        </w:rPr>
+        <w:t>メリット</w:t>
       </w:r>
       <w:r>
         <w:rPr>
@@ -1607,7 +1635,27 @@
                 <w:sz w:val="24"/>
                 <w:szCs w:val="24"/>
               </w:rPr>
-              <w:t>番組型（レシピ・健康情報＋広告）</w:t>
+              <w:t>番組型（レシピ</w:t>
+            </w:r>
+            <w:r>
+              <w:rPr>
+                <w:rFonts w:eastAsia="游明朝" w:hint="eastAsia"/>
+                <w:b/>
+                <w:bCs/>
+                <w:sz w:val="24"/>
+                <w:szCs w:val="24"/>
+              </w:rPr>
+              <w:t>動画</w:t>
+            </w:r>
+            <w:r>
+              <w:rPr>
+                <w:rFonts w:eastAsia="游明朝"/>
+                <w:b/>
+                <w:bCs/>
+                <w:sz w:val="24"/>
+                <w:szCs w:val="24"/>
+              </w:rPr>
+              <w:t>・健康情報＋広告）</w:t>
             </w:r>
           </w:p>
         </w:tc>
@@ -2416,7 +2464,23 @@
           <w:b/>
           <w:bCs/>
         </w:rPr>
-        <w:t>店舗の初期コストを「実質0円」にして導入ハードルを極限まで下げます。</w:t>
+        <w:t>店舗の初期コストを</w:t>
+      </w:r>
+      <w:r>
+        <w:rPr>
+          <w:rFonts w:eastAsia="游明朝" w:hint="eastAsia"/>
+          <w:b/>
+          <w:bCs/>
+        </w:rPr>
+        <w:t>5台は無料で</w:t>
+      </w:r>
+      <w:r>
+        <w:rPr>
+          <w:rFonts w:eastAsia="游明朝"/>
+          <w:b/>
+          <w:bCs/>
+        </w:rPr>
+        <w:t>「実質0円」にして導入ハードルを極限まで下げます。</w:t>
       </w:r>
     </w:p>
     <w:p>
@@ -3652,19 +3716,19 @@
         <w:rPr>
           <w:rFonts w:eastAsia="游明朝" w:hint="eastAsia"/>
         </w:rPr>
-        <w:t>30000</w:t>
+        <w:t>30</w:t>
       </w:r>
       <w:r>
         <w:rPr>
           <w:rFonts w:eastAsia="游明朝" w:hint="eastAsia"/>
         </w:rPr>
-        <w:t>万</w:t>
+        <w:t>.</w:t>
       </w:r>
       <w:r>
         <w:rPr>
           <w:rFonts w:eastAsia="游明朝" w:hint="eastAsia"/>
         </w:rPr>
-        <w:t>パネル</w:t>
+        <w:t>000パネル</w:t>
       </w:r>
       <w:r>
         <w:rPr>
@@ -4579,7 +4643,7 @@
           <w:noProof/>
         </w:rPr>
         <w:drawing>
-          <wp:inline distT="0" distB="0" distL="0" distR="0" wp14:anchorId="3CE421A6" wp14:editId="4CF908AB">
+          <wp:inline distT="0" distB="0" distL="0" distR="0" wp14:anchorId="3CE421A6" wp14:editId="0508D75E">
             <wp:extent cx="1074164" cy="1059011"/>
             <wp:effectExtent l="0" t="0" r="0" b="8255"/>
             <wp:docPr id="681950858" name="図 1"/>
@@ -4717,30 +4781,1717 @@
         <w:spacing w:line="240" w:lineRule="atLeast"/>
         <w:rPr>
           <w:rFonts w:eastAsia="游明朝"/>
-        </w:rPr>
-      </w:pPr>
-      <w:r>
+          <w:b/>
+          <w:bCs/>
+        </w:rPr>
+      </w:pPr>
+      <w:r>
+        <w:rPr>
+          <w:rFonts w:eastAsia="游明朝"/>
+          <w:b/>
+          <w:bCs/>
+        </w:rPr>
+        <w:t>1. 鮮魚売り場の対面ガラス面</w:t>
+      </w:r>
+    </w:p>
+    <w:p>
+      <w:pPr>
+        <w:adjustRightInd w:val="0"/>
+        <w:snapToGrid w:val="0"/>
+        <w:spacing w:line="240" w:lineRule="atLeast"/>
+        <w:rPr>
+          <w:rFonts w:eastAsia="游明朝"/>
+        </w:rPr>
+      </w:pPr>
+      <w:r>
+        <w:rPr>
+          <w:rFonts w:eastAsia="游明朝"/>
+        </w:rPr>
+        <w:t>対面販売のケースは、お客様の視線が「商品」と「店員」の両方に向く場所です。</w:t>
+      </w:r>
+    </w:p>
+    <w:p>
+      <w:pPr>
+        <w:numPr>
+          <w:ilvl w:val="0"/>
+          <w:numId w:val="24"/>
+        </w:numPr>
+        <w:adjustRightInd w:val="0"/>
+        <w:snapToGrid w:val="0"/>
+        <w:spacing w:line="240" w:lineRule="atLeast"/>
+        <w:rPr>
+          <w:rFonts w:eastAsia="游明朝"/>
+        </w:rPr>
+      </w:pPr>
+      <w:r>
+        <w:rPr>
+          <w:rFonts w:eastAsia="游明朝"/>
+          <w:b/>
+          <w:bCs/>
+        </w:rPr>
+        <w:t>一般的なガラス寸法:</w:t>
+      </w:r>
+      <w:r>
+        <w:rPr>
+          <w:rFonts w:eastAsia="游明朝"/>
+        </w:rPr>
+        <w:t xml:space="preserve"> 幅 1200mm / 1500mm / 1800mm × 高さ 600mm〜900mm</w:t>
+      </w:r>
+    </w:p>
+    <w:p>
+      <w:pPr>
+        <w:numPr>
+          <w:ilvl w:val="0"/>
+          <w:numId w:val="24"/>
+        </w:numPr>
+        <w:adjustRightInd w:val="0"/>
+        <w:snapToGrid w:val="0"/>
+        <w:spacing w:line="240" w:lineRule="atLeast"/>
+        <w:rPr>
+          <w:rFonts w:eastAsia="游明朝"/>
+        </w:rPr>
+      </w:pPr>
+      <w:r>
+        <w:rPr>
+          <w:rFonts w:eastAsia="游明朝"/>
+          <w:b/>
+          <w:bCs/>
+        </w:rPr>
+        <w:t>推奨LEDフィルムサイズ:</w:t>
+      </w:r>
+      <w:r>
+        <w:rPr>
+          <w:rFonts w:eastAsia="游明朝"/>
+        </w:rPr>
+        <w:t xml:space="preserve"> </w:t>
+      </w:r>
+      <w:r>
+        <w:rPr>
+          <w:rFonts w:eastAsia="游明朝"/>
+          <w:b/>
+          <w:bCs/>
+        </w:rPr>
+        <w:t>幅 900mm〜1200mm × 高さ 300mm〜450mm</w:t>
+      </w:r>
+    </w:p>
+    <w:p>
+      <w:pPr>
+        <w:numPr>
+          <w:ilvl w:val="1"/>
+          <w:numId w:val="24"/>
+        </w:numPr>
+        <w:adjustRightInd w:val="0"/>
+        <w:snapToGrid w:val="0"/>
+        <w:spacing w:line="240" w:lineRule="atLeast"/>
+        <w:rPr>
+          <w:rFonts w:eastAsia="游明朝"/>
+        </w:rPr>
+      </w:pPr>
+      <w:r>
+        <w:rPr>
+          <w:rFonts w:eastAsia="游明朝"/>
+          <w:b/>
+          <w:bCs/>
+        </w:rPr>
+        <w:t>理由:</w:t>
+      </w:r>
+      <w:r>
+        <w:rPr>
+          <w:rFonts w:eastAsia="游明朝"/>
+        </w:rPr>
+        <w:t xml:space="preserve"> ガラス全面を覆うと、鮮魚の「鮮度」や「さばく様子」が見えにくくなります。上部3分の1、または左右の端に寄せて「産地情報」や「本日のレシピ」を流すのが最も効果的です。</w:t>
+      </w:r>
+    </w:p>
+    <w:p>
+      <w:pPr>
+        <w:adjustRightInd w:val="0"/>
+        <w:snapToGrid w:val="0"/>
+        <w:spacing w:line="240" w:lineRule="atLeast"/>
+        <w:rPr>
+          <w:rFonts w:eastAsia="游明朝"/>
+        </w:rPr>
+      </w:pPr>
+      <w:r>
+        <w:rPr>
+          <w:rFonts w:eastAsia="游明朝"/>
+        </w:rPr>
+        <w:pict w14:anchorId="08913B22">
+          <v:rect id="_x0000_i1043" style="width:0;height:1.5pt" o:hralign="center" o:hrstd="t" o:hr="t" fillcolor="#a0a0a0" stroked="f">
+            <v:textbox inset="5.85pt,.7pt,5.85pt,.7pt"/>
+          </v:rect>
+        </w:pict>
+      </w:r>
+    </w:p>
+    <w:p>
+      <w:pPr>
+        <w:adjustRightInd w:val="0"/>
+        <w:snapToGrid w:val="0"/>
+        <w:spacing w:line="240" w:lineRule="atLeast"/>
+        <w:rPr>
+          <w:rFonts w:eastAsia="游明朝"/>
+          <w:b/>
+          <w:bCs/>
+        </w:rPr>
+      </w:pPr>
+      <w:r>
+        <w:rPr>
+          <w:rFonts w:eastAsia="游明朝"/>
+          <w:b/>
+          <w:bCs/>
+        </w:rPr>
+        <w:t>2. リーチイン冷凍・冷蔵庫のドア（鏡面・ガラス面）</w:t>
+      </w:r>
+    </w:p>
+    <w:p>
+      <w:pPr>
+        <w:adjustRightInd w:val="0"/>
+        <w:snapToGrid w:val="0"/>
+        <w:spacing w:line="240" w:lineRule="atLeast"/>
+        <w:rPr>
+          <w:rFonts w:eastAsia="游明朝"/>
+        </w:rPr>
+      </w:pPr>
+      <w:r>
+        <w:rPr>
+          <w:rFonts w:eastAsia="游明朝"/>
+        </w:rPr>
+        <w:t>飲料や冷凍食品のコーナーにある「扉」への設置です。</w:t>
+      </w:r>
+    </w:p>
+    <w:p>
+      <w:pPr>
+        <w:numPr>
+          <w:ilvl w:val="0"/>
+          <w:numId w:val="25"/>
+        </w:numPr>
+        <w:adjustRightInd w:val="0"/>
+        <w:snapToGrid w:val="0"/>
+        <w:spacing w:line="240" w:lineRule="atLeast"/>
+        <w:rPr>
+          <w:rFonts w:eastAsia="游明朝"/>
+        </w:rPr>
+      </w:pPr>
+      <w:r>
+        <w:rPr>
+          <w:rFonts w:eastAsia="游明朝"/>
+          <w:b/>
+          <w:bCs/>
+        </w:rPr>
+        <w:t>一般的なドア1枚の寸法:</w:t>
+      </w:r>
+      <w:r>
+        <w:rPr>
+          <w:rFonts w:eastAsia="游明朝"/>
+        </w:rPr>
+        <w:t xml:space="preserve"> 幅 600mm × 高さ 1500mm〜1800mm</w:t>
+      </w:r>
+    </w:p>
+    <w:p>
+      <w:pPr>
+        <w:numPr>
+          <w:ilvl w:val="0"/>
+          <w:numId w:val="25"/>
+        </w:numPr>
+        <w:adjustRightInd w:val="0"/>
+        <w:snapToGrid w:val="0"/>
+        <w:spacing w:line="240" w:lineRule="atLeast"/>
+        <w:rPr>
+          <w:rFonts w:eastAsia="游明朝"/>
+        </w:rPr>
+      </w:pPr>
+      <w:r>
+        <w:rPr>
+          <w:rFonts w:eastAsia="游明朝"/>
+          <w:b/>
+          <w:bCs/>
+        </w:rPr>
+        <w:t>推奨LEDフィルムサイズ:</w:t>
+      </w:r>
+      <w:r>
+        <w:rPr>
+          <w:rFonts w:eastAsia="游明朝"/>
+        </w:rPr>
+        <w:t xml:space="preserve"> </w:t>
+      </w:r>
+      <w:r>
+        <w:rPr>
+          <w:rFonts w:eastAsia="游明朝"/>
+          <w:b/>
+          <w:bCs/>
+        </w:rPr>
+        <w:t>幅 500mm × 高さ 1000mm</w:t>
+      </w:r>
+      <w:r>
+        <w:rPr>
+          <w:rFonts w:eastAsia="游明朝"/>
+        </w:rPr>
+        <w:t>（またはドア中央に500mm四方）</w:t>
+      </w:r>
+    </w:p>
+    <w:p>
+      <w:pPr>
+        <w:numPr>
+          <w:ilvl w:val="1"/>
+          <w:numId w:val="25"/>
+        </w:numPr>
+        <w:adjustRightInd w:val="0"/>
+        <w:snapToGrid w:val="0"/>
+        <w:spacing w:line="240" w:lineRule="atLeast"/>
+        <w:rPr>
+          <w:rFonts w:eastAsia="游明朝"/>
+        </w:rPr>
+      </w:pPr>
+      <w:r>
+        <w:rPr>
+          <w:rFonts w:eastAsia="游明朝"/>
+          <w:b/>
+          <w:bCs/>
+        </w:rPr>
+        <w:t>理由:</w:t>
+      </w:r>
+      <w:r>
+        <w:rPr>
+          <w:rFonts w:eastAsia="游明朝"/>
+        </w:rPr>
+        <w:t xml:space="preserve"> 扉のフレーム（枠）があるため、1000mm×500mmの標準ユニットを縦に1枚貼るのが収まりが良いです。ビールコーナーであれば、商品の顔（ラベル）を隠さないよう、目線の高さに透過率の高い広告を配置します。</w:t>
+      </w:r>
+    </w:p>
+    <w:p>
+      <w:pPr>
+        <w:adjustRightInd w:val="0"/>
+        <w:snapToGrid w:val="0"/>
+        <w:spacing w:line="240" w:lineRule="atLeast"/>
+        <w:rPr>
+          <w:rFonts w:eastAsia="游明朝"/>
+        </w:rPr>
+      </w:pPr>
+      <w:r>
+        <w:rPr>
+          <w:rFonts w:eastAsia="游明朝"/>
+        </w:rPr>
+        <w:pict w14:anchorId="46962E8A">
+          <v:rect id="_x0000_i1044" style="width:0;height:1.5pt" o:hralign="center" o:hrstd="t" o:hr="t" fillcolor="#a0a0a0" stroked="f">
+            <v:textbox inset="5.85pt,.7pt,5.85pt,.7pt"/>
+          </v:rect>
+        </w:pict>
+      </w:r>
+    </w:p>
+    <w:p>
+      <w:pPr>
+        <w:adjustRightInd w:val="0"/>
+        <w:snapToGrid w:val="0"/>
+        <w:spacing w:line="240" w:lineRule="atLeast"/>
+        <w:rPr>
+          <w:rFonts w:eastAsia="游明朝"/>
+          <w:b/>
+          <w:bCs/>
+        </w:rPr>
+      </w:pPr>
+      <w:r>
+        <w:rPr>
+          <w:rFonts w:eastAsia="游明朝"/>
+          <w:b/>
+          <w:bCs/>
+        </w:rPr>
+        <w:t>3. エンドコーナー（棚の端）</w:t>
+      </w:r>
+    </w:p>
+    <w:p>
+      <w:pPr>
+        <w:adjustRightInd w:val="0"/>
+        <w:snapToGrid w:val="0"/>
+        <w:spacing w:line="240" w:lineRule="atLeast"/>
+        <w:rPr>
+          <w:rFonts w:eastAsia="游明朝"/>
+        </w:rPr>
+      </w:pPr>
+      <w:r>
+        <w:rPr>
+          <w:rFonts w:eastAsia="游明朝"/>
+        </w:rPr>
+        <w:t>エンドは「ついで買い」を誘発する最大のスポットです。</w:t>
+      </w:r>
+    </w:p>
+    <w:p>
+      <w:pPr>
+        <w:numPr>
+          <w:ilvl w:val="0"/>
+          <w:numId w:val="26"/>
+        </w:numPr>
+        <w:adjustRightInd w:val="0"/>
+        <w:snapToGrid w:val="0"/>
+        <w:spacing w:line="240" w:lineRule="atLeast"/>
+        <w:rPr>
+          <w:rFonts w:eastAsia="游明朝"/>
+        </w:rPr>
+      </w:pPr>
+      <w:r>
+        <w:rPr>
+          <w:rFonts w:eastAsia="游明朝"/>
+          <w:b/>
+          <w:bCs/>
+        </w:rPr>
+        <w:t>一般的なゴンドラ（棚）の幅:</w:t>
+      </w:r>
+      <w:r>
+        <w:rPr>
+          <w:rFonts w:eastAsia="游明朝"/>
+        </w:rPr>
+        <w:t xml:space="preserve"> </w:t>
+      </w:r>
+      <w:r>
+        <w:rPr>
+          <w:rFonts w:eastAsia="游明朝"/>
+          <w:b/>
+          <w:bCs/>
+        </w:rPr>
+        <w:t>900mm</w:t>
+      </w:r>
+      <w:r>
+        <w:rPr>
+          <w:rFonts w:eastAsia="游明朝"/>
+        </w:rPr>
+        <w:t>（日本のスーパーの標準規格）</w:t>
+      </w:r>
+    </w:p>
+    <w:p>
+      <w:pPr>
+        <w:numPr>
+          <w:ilvl w:val="0"/>
+          <w:numId w:val="26"/>
+        </w:numPr>
+        <w:adjustRightInd w:val="0"/>
+        <w:snapToGrid w:val="0"/>
+        <w:spacing w:line="240" w:lineRule="atLeast"/>
+        <w:rPr>
+          <w:rFonts w:eastAsia="游明朝"/>
+        </w:rPr>
+      </w:pPr>
+      <w:r>
+        <w:rPr>
+          <w:rFonts w:eastAsia="游明朝"/>
+          <w:b/>
+          <w:bCs/>
+        </w:rPr>
+        <w:t>推奨LEDフィルムサイズ:</w:t>
+      </w:r>
+    </w:p>
+    <w:p>
+      <w:pPr>
+        <w:numPr>
+          <w:ilvl w:val="1"/>
+          <w:numId w:val="26"/>
+        </w:numPr>
+        <w:adjustRightInd w:val="0"/>
+        <w:snapToGrid w:val="0"/>
+        <w:spacing w:line="240" w:lineRule="atLeast"/>
+        <w:rPr>
+          <w:rFonts w:eastAsia="游明朝"/>
+        </w:rPr>
+      </w:pPr>
+      <w:r>
+        <w:rPr>
+          <w:rFonts w:eastAsia="游明朝"/>
+          <w:b/>
+          <w:bCs/>
+        </w:rPr>
+        <w:t>看板（トップ）として:</w:t>
+      </w:r>
+      <w:r>
+        <w:rPr>
+          <w:rFonts w:eastAsia="游明朝"/>
+        </w:rPr>
+        <w:t xml:space="preserve"> 幅 900mm × 高さ 200mm〜300mm</w:t>
+      </w:r>
+    </w:p>
+    <w:p>
+      <w:pPr>
+        <w:numPr>
+          <w:ilvl w:val="1"/>
+          <w:numId w:val="26"/>
+        </w:numPr>
+        <w:adjustRightInd w:val="0"/>
+        <w:snapToGrid w:val="0"/>
+        <w:spacing w:line="240" w:lineRule="atLeast"/>
+        <w:rPr>
+          <w:rFonts w:eastAsia="游明朝"/>
+        </w:rPr>
+      </w:pPr>
+      <w:r>
+        <w:rPr>
+          <w:rFonts w:eastAsia="游明朝"/>
+          <w:b/>
+          <w:bCs/>
+        </w:rPr>
+        <w:t>サイド（横面）として:</w:t>
+      </w:r>
+      <w:r>
+        <w:rPr>
+          <w:rFonts w:eastAsia="游明朝"/>
+        </w:rPr>
+        <w:t xml:space="preserve"> 幅 300mm〜450mm × 高さ 1200mm</w:t>
+      </w:r>
+    </w:p>
+    <w:p>
+      <w:pPr>
+        <w:numPr>
+          <w:ilvl w:val="1"/>
+          <w:numId w:val="26"/>
+        </w:numPr>
+        <w:adjustRightInd w:val="0"/>
+        <w:snapToGrid w:val="0"/>
+        <w:spacing w:line="240" w:lineRule="atLeast"/>
+        <w:rPr>
+          <w:rFonts w:eastAsia="游明朝"/>
+        </w:rPr>
+      </w:pPr>
+      <w:r>
+        <w:rPr>
+          <w:rFonts w:eastAsia="游明朝"/>
+          <w:b/>
+          <w:bCs/>
+        </w:rPr>
+        <w:t>理由:</w:t>
+      </w:r>
+      <w:r>
+        <w:rPr>
+          <w:rFonts w:eastAsia="游明朝"/>
+        </w:rPr>
+        <w:t xml:space="preserve"> エンド上部の「看板（トップボード）」部分をLEDフィルムに置き換えると、非常に目立ちます。また、棚のサイド面に貼ることで、通路を歩いている客の横目（アイキャッチ）に動画を飛び込ませることができます。</w:t>
+      </w:r>
+    </w:p>
+    <w:p>
+      <w:pPr>
+        <w:adjustRightInd w:val="0"/>
+        <w:snapToGrid w:val="0"/>
+        <w:spacing w:line="240" w:lineRule="atLeast"/>
+        <w:rPr>
+          <w:rFonts w:eastAsia="游明朝"/>
+        </w:rPr>
+      </w:pPr>
+      <w:r>
+        <w:rPr>
+          <w:rFonts w:eastAsia="游明朝"/>
+        </w:rPr>
+        <w:pict w14:anchorId="0A843DE7">
+          <v:rect id="_x0000_i1045" style="width:0;height:1.5pt" o:hralign="center" o:hrstd="t" o:hr="t" fillcolor="#a0a0a0" stroked="f">
+            <v:textbox inset="5.85pt,.7pt,5.85pt,.7pt"/>
+          </v:rect>
+        </w:pict>
+      </w:r>
+    </w:p>
+    <w:p>
+      <w:pPr>
+        <w:adjustRightInd w:val="0"/>
+        <w:snapToGrid w:val="0"/>
+        <w:spacing w:line="240" w:lineRule="atLeast"/>
+        <w:rPr>
+          <w:rFonts w:eastAsia="游明朝"/>
+          <w:b/>
+          <w:bCs/>
+        </w:rPr>
+      </w:pPr>
+      <w:r>
+        <w:rPr>
+          <w:rFonts w:eastAsia="游明朝"/>
+          <w:b/>
+          <w:bCs/>
+        </w:rPr>
+        <w:t>設置場所別・サイズまとめ表</w:t>
+      </w:r>
+    </w:p>
+    <w:tbl>
+      <w:tblPr>
+        <w:tblW w:w="0" w:type="auto"/>
+        <w:tblCellSpacing w:w="15" w:type="dxa"/>
+        <w:tblCellMar>
+          <w:top w:w="15" w:type="dxa"/>
+          <w:left w:w="15" w:type="dxa"/>
+          <w:bottom w:w="15" w:type="dxa"/>
+          <w:right w:w="15" w:type="dxa"/>
+        </w:tblCellMar>
+        <w:tblLook w:val="04A0" w:firstRow="1" w:lastRow="0" w:firstColumn="1" w:lastColumn="0" w:noHBand="0" w:noVBand="1"/>
+      </w:tblPr>
+      <w:tblGrid>
+        <w:gridCol w:w="1722"/>
+        <w:gridCol w:w="2128"/>
+        <w:gridCol w:w="1918"/>
+        <w:gridCol w:w="2720"/>
+      </w:tblGrid>
+      <w:tr>
+        <w:trPr>
+          <w:tblHeader/>
+          <w:tblCellSpacing w:w="15" w:type="dxa"/>
+        </w:trPr>
+        <w:tc>
+          <w:tcPr>
+            <w:tcW w:w="0" w:type="auto"/>
+            <w:tcBorders>
+              <w:top w:val="single" w:sz="6" w:space="0" w:color="auto"/>
+              <w:left w:val="single" w:sz="6" w:space="0" w:color="auto"/>
+              <w:bottom w:val="single" w:sz="6" w:space="0" w:color="auto"/>
+              <w:right w:val="single" w:sz="6" w:space="0" w:color="auto"/>
+            </w:tcBorders>
+            <w:vAlign w:val="center"/>
+            <w:hideMark/>
+          </w:tcPr>
+          <w:p>
+            <w:pPr>
+              <w:adjustRightInd w:val="0"/>
+              <w:snapToGrid w:val="0"/>
+              <w:spacing w:line="240" w:lineRule="atLeast"/>
+              <w:rPr>
+                <w:rFonts w:eastAsia="游明朝"/>
+              </w:rPr>
+            </w:pPr>
+            <w:r>
+              <w:rPr>
+                <w:rFonts w:eastAsia="游明朝"/>
+                <w:b/>
+                <w:bCs/>
+              </w:rPr>
+              <w:t>設置場所</w:t>
+            </w:r>
+          </w:p>
+        </w:tc>
+        <w:tc>
+          <w:tcPr>
+            <w:tcW w:w="0" w:type="auto"/>
+            <w:tcBorders>
+              <w:top w:val="single" w:sz="6" w:space="0" w:color="auto"/>
+              <w:left w:val="single" w:sz="6" w:space="0" w:color="auto"/>
+              <w:bottom w:val="single" w:sz="6" w:space="0" w:color="auto"/>
+              <w:right w:val="single" w:sz="6" w:space="0" w:color="auto"/>
+            </w:tcBorders>
+            <w:vAlign w:val="center"/>
+            <w:hideMark/>
+          </w:tcPr>
+          <w:p>
+            <w:pPr>
+              <w:adjustRightInd w:val="0"/>
+              <w:snapToGrid w:val="0"/>
+              <w:spacing w:line="240" w:lineRule="atLeast"/>
+              <w:rPr>
+                <w:rFonts w:eastAsia="游明朝"/>
+              </w:rPr>
+            </w:pPr>
+            <w:r>
+              <w:rPr>
+                <w:rFonts w:eastAsia="游明朝"/>
+                <w:b/>
+                <w:bCs/>
+              </w:rPr>
+              <w:t>想定される箇所サイズ</w:t>
+            </w:r>
+          </w:p>
+        </w:tc>
+        <w:tc>
+          <w:tcPr>
+            <w:tcW w:w="0" w:type="auto"/>
+            <w:tcBorders>
+              <w:top w:val="single" w:sz="6" w:space="0" w:color="auto"/>
+              <w:left w:val="single" w:sz="6" w:space="0" w:color="auto"/>
+              <w:bottom w:val="single" w:sz="6" w:space="0" w:color="auto"/>
+              <w:right w:val="single" w:sz="6" w:space="0" w:color="auto"/>
+            </w:tcBorders>
+            <w:vAlign w:val="center"/>
+            <w:hideMark/>
+          </w:tcPr>
+          <w:p>
+            <w:pPr>
+              <w:adjustRightInd w:val="0"/>
+              <w:snapToGrid w:val="0"/>
+              <w:spacing w:line="240" w:lineRule="atLeast"/>
+              <w:rPr>
+                <w:rFonts w:eastAsia="游明朝"/>
+              </w:rPr>
+            </w:pPr>
+            <w:r>
+              <w:rPr>
+                <w:rFonts w:eastAsia="游明朝"/>
+                <w:b/>
+                <w:bCs/>
+              </w:rPr>
+              <w:t>推奨フィルムサイズ</w:t>
+            </w:r>
+          </w:p>
+        </w:tc>
+        <w:tc>
+          <w:tcPr>
+            <w:tcW w:w="0" w:type="auto"/>
+            <w:tcBorders>
+              <w:top w:val="single" w:sz="6" w:space="0" w:color="auto"/>
+              <w:left w:val="single" w:sz="6" w:space="0" w:color="auto"/>
+              <w:bottom w:val="single" w:sz="6" w:space="0" w:color="auto"/>
+              <w:right w:val="single" w:sz="6" w:space="0" w:color="auto"/>
+            </w:tcBorders>
+            <w:vAlign w:val="center"/>
+            <w:hideMark/>
+          </w:tcPr>
+          <w:p>
+            <w:pPr>
+              <w:adjustRightInd w:val="0"/>
+              <w:snapToGrid w:val="0"/>
+              <w:spacing w:line="240" w:lineRule="atLeast"/>
+              <w:rPr>
+                <w:rFonts w:eastAsia="游明朝"/>
+              </w:rPr>
+            </w:pPr>
+            <w:r>
+              <w:rPr>
+                <w:rFonts w:eastAsia="游明朝"/>
+                <w:b/>
+                <w:bCs/>
+              </w:rPr>
+              <w:t>狙える効果</w:t>
+            </w:r>
+          </w:p>
+        </w:tc>
+      </w:tr>
+      <w:tr>
+        <w:trPr>
+          <w:tblCellSpacing w:w="15" w:type="dxa"/>
+        </w:trPr>
+        <w:tc>
+          <w:tcPr>
+            <w:tcW w:w="0" w:type="auto"/>
+            <w:tcBorders>
+              <w:top w:val="single" w:sz="6" w:space="0" w:color="auto"/>
+              <w:left w:val="single" w:sz="6" w:space="0" w:color="auto"/>
+              <w:bottom w:val="single" w:sz="6" w:space="0" w:color="auto"/>
+              <w:right w:val="single" w:sz="6" w:space="0" w:color="auto"/>
+            </w:tcBorders>
+            <w:vAlign w:val="center"/>
+            <w:hideMark/>
+          </w:tcPr>
+          <w:p>
+            <w:pPr>
+              <w:adjustRightInd w:val="0"/>
+              <w:snapToGrid w:val="0"/>
+              <w:spacing w:line="240" w:lineRule="atLeast"/>
+              <w:rPr>
+                <w:rFonts w:eastAsia="游明朝"/>
+              </w:rPr>
+            </w:pPr>
+            <w:r>
+              <w:rPr>
+                <w:rFonts w:eastAsia="游明朝"/>
+                <w:b/>
+                <w:bCs/>
+              </w:rPr>
+              <w:t>鮮魚対面ガラス</w:t>
+            </w:r>
+          </w:p>
+        </w:tc>
+        <w:tc>
+          <w:tcPr>
+            <w:tcW w:w="0" w:type="auto"/>
+            <w:tcBorders>
+              <w:top w:val="single" w:sz="6" w:space="0" w:color="auto"/>
+              <w:left w:val="single" w:sz="6" w:space="0" w:color="auto"/>
+              <w:bottom w:val="single" w:sz="6" w:space="0" w:color="auto"/>
+              <w:right w:val="single" w:sz="6" w:space="0" w:color="auto"/>
+            </w:tcBorders>
+            <w:vAlign w:val="center"/>
+            <w:hideMark/>
+          </w:tcPr>
+          <w:p>
+            <w:pPr>
+              <w:adjustRightInd w:val="0"/>
+              <w:snapToGrid w:val="0"/>
+              <w:spacing w:line="240" w:lineRule="atLeast"/>
+              <w:rPr>
+                <w:rFonts w:eastAsia="游明朝"/>
+              </w:rPr>
+            </w:pPr>
+            <w:r>
+              <w:rPr>
+                <w:rFonts w:eastAsia="游明朝"/>
+              </w:rPr>
+              <w:t>1500 × 800mm</w:t>
+            </w:r>
+          </w:p>
+        </w:tc>
+        <w:tc>
+          <w:tcPr>
+            <w:tcW w:w="0" w:type="auto"/>
+            <w:tcBorders>
+              <w:top w:val="single" w:sz="6" w:space="0" w:color="auto"/>
+              <w:left w:val="single" w:sz="6" w:space="0" w:color="auto"/>
+              <w:bottom w:val="single" w:sz="6" w:space="0" w:color="auto"/>
+              <w:right w:val="single" w:sz="6" w:space="0" w:color="auto"/>
+            </w:tcBorders>
+            <w:vAlign w:val="center"/>
+            <w:hideMark/>
+          </w:tcPr>
+          <w:p>
+            <w:pPr>
+              <w:adjustRightInd w:val="0"/>
+              <w:snapToGrid w:val="0"/>
+              <w:spacing w:line="240" w:lineRule="atLeast"/>
+              <w:rPr>
+                <w:rFonts w:eastAsia="游明朝"/>
+              </w:rPr>
+            </w:pPr>
+            <w:r>
+              <w:rPr>
+                <w:rFonts w:eastAsia="游明朝"/>
+                <w:b/>
+                <w:bCs/>
+              </w:rPr>
+              <w:t>1000 × 300mm</w:t>
+            </w:r>
+          </w:p>
+        </w:tc>
+        <w:tc>
+          <w:tcPr>
+            <w:tcW w:w="0" w:type="auto"/>
+            <w:tcBorders>
+              <w:top w:val="single" w:sz="6" w:space="0" w:color="auto"/>
+              <w:left w:val="single" w:sz="6" w:space="0" w:color="auto"/>
+              <w:bottom w:val="single" w:sz="6" w:space="0" w:color="auto"/>
+              <w:right w:val="single" w:sz="6" w:space="0" w:color="auto"/>
+            </w:tcBorders>
+            <w:vAlign w:val="center"/>
+            <w:hideMark/>
+          </w:tcPr>
+          <w:p>
+            <w:pPr>
+              <w:adjustRightInd w:val="0"/>
+              <w:snapToGrid w:val="0"/>
+              <w:spacing w:line="240" w:lineRule="atLeast"/>
+              <w:rPr>
+                <w:rFonts w:eastAsia="游明朝"/>
+              </w:rPr>
+            </w:pPr>
+            <w:r>
+              <w:rPr>
+                <w:rFonts w:eastAsia="游明朝"/>
+              </w:rPr>
+              <w:t>シズル感の演出・調理法提案</w:t>
+            </w:r>
+          </w:p>
+        </w:tc>
+      </w:tr>
+      <w:tr>
+        <w:trPr>
+          <w:tblCellSpacing w:w="15" w:type="dxa"/>
+        </w:trPr>
+        <w:tc>
+          <w:tcPr>
+            <w:tcW w:w="0" w:type="auto"/>
+            <w:tcBorders>
+              <w:top w:val="single" w:sz="6" w:space="0" w:color="auto"/>
+              <w:left w:val="single" w:sz="6" w:space="0" w:color="auto"/>
+              <w:bottom w:val="single" w:sz="6" w:space="0" w:color="auto"/>
+              <w:right w:val="single" w:sz="6" w:space="0" w:color="auto"/>
+            </w:tcBorders>
+            <w:vAlign w:val="center"/>
+            <w:hideMark/>
+          </w:tcPr>
+          <w:p>
+            <w:pPr>
+              <w:adjustRightInd w:val="0"/>
+              <w:snapToGrid w:val="0"/>
+              <w:spacing w:line="240" w:lineRule="atLeast"/>
+              <w:rPr>
+                <w:rFonts w:eastAsia="游明朝"/>
+              </w:rPr>
+            </w:pPr>
+            <w:r>
+              <w:rPr>
+                <w:rFonts w:eastAsia="游明朝"/>
+                <w:b/>
+                <w:bCs/>
+              </w:rPr>
+              <w:t>冷蔵庫ドア</w:t>
+            </w:r>
+          </w:p>
+        </w:tc>
+        <w:tc>
+          <w:tcPr>
+            <w:tcW w:w="0" w:type="auto"/>
+            <w:tcBorders>
+              <w:top w:val="single" w:sz="6" w:space="0" w:color="auto"/>
+              <w:left w:val="single" w:sz="6" w:space="0" w:color="auto"/>
+              <w:bottom w:val="single" w:sz="6" w:space="0" w:color="auto"/>
+              <w:right w:val="single" w:sz="6" w:space="0" w:color="auto"/>
+            </w:tcBorders>
+            <w:vAlign w:val="center"/>
+            <w:hideMark/>
+          </w:tcPr>
+          <w:p>
+            <w:pPr>
+              <w:adjustRightInd w:val="0"/>
+              <w:snapToGrid w:val="0"/>
+              <w:spacing w:line="240" w:lineRule="atLeast"/>
+              <w:rPr>
+                <w:rFonts w:eastAsia="游明朝"/>
+              </w:rPr>
+            </w:pPr>
+            <w:r>
+              <w:rPr>
+                <w:rFonts w:eastAsia="游明朝"/>
+              </w:rPr>
+              <w:t>600 × 1600mm</w:t>
+            </w:r>
+          </w:p>
+        </w:tc>
+        <w:tc>
+          <w:tcPr>
+            <w:tcW w:w="0" w:type="auto"/>
+            <w:tcBorders>
+              <w:top w:val="single" w:sz="6" w:space="0" w:color="auto"/>
+              <w:left w:val="single" w:sz="6" w:space="0" w:color="auto"/>
+              <w:bottom w:val="single" w:sz="6" w:space="0" w:color="auto"/>
+              <w:right w:val="single" w:sz="6" w:space="0" w:color="auto"/>
+            </w:tcBorders>
+            <w:vAlign w:val="center"/>
+            <w:hideMark/>
+          </w:tcPr>
+          <w:p>
+            <w:pPr>
+              <w:adjustRightInd w:val="0"/>
+              <w:snapToGrid w:val="0"/>
+              <w:spacing w:line="240" w:lineRule="atLeast"/>
+              <w:rPr>
+                <w:rFonts w:eastAsia="游明朝"/>
+              </w:rPr>
+            </w:pPr>
+            <w:r>
+              <w:rPr>
+                <w:rFonts w:eastAsia="游明朝"/>
+                <w:b/>
+                <w:bCs/>
+              </w:rPr>
+              <w:t>500 × 1000mm</w:t>
+            </w:r>
+          </w:p>
+        </w:tc>
+        <w:tc>
+          <w:tcPr>
+            <w:tcW w:w="0" w:type="auto"/>
+            <w:tcBorders>
+              <w:top w:val="single" w:sz="6" w:space="0" w:color="auto"/>
+              <w:left w:val="single" w:sz="6" w:space="0" w:color="auto"/>
+              <w:bottom w:val="single" w:sz="6" w:space="0" w:color="auto"/>
+              <w:right w:val="single" w:sz="6" w:space="0" w:color="auto"/>
+            </w:tcBorders>
+            <w:vAlign w:val="center"/>
+            <w:hideMark/>
+          </w:tcPr>
+          <w:p>
+            <w:pPr>
+              <w:adjustRightInd w:val="0"/>
+              <w:snapToGrid w:val="0"/>
+              <w:spacing w:line="240" w:lineRule="atLeast"/>
+              <w:rPr>
+                <w:rFonts w:eastAsia="游明朝"/>
+              </w:rPr>
+            </w:pPr>
+            <w:r>
+              <w:rPr>
+                <w:rFonts w:eastAsia="游明朝"/>
+              </w:rPr>
+              <w:t>銘柄訴求・セット買い促進</w:t>
+            </w:r>
+          </w:p>
+        </w:tc>
+      </w:tr>
+      <w:tr>
+        <w:trPr>
+          <w:tblCellSpacing w:w="15" w:type="dxa"/>
+        </w:trPr>
+        <w:tc>
+          <w:tcPr>
+            <w:tcW w:w="0" w:type="auto"/>
+            <w:tcBorders>
+              <w:top w:val="single" w:sz="6" w:space="0" w:color="auto"/>
+              <w:left w:val="single" w:sz="6" w:space="0" w:color="auto"/>
+              <w:bottom w:val="single" w:sz="6" w:space="0" w:color="auto"/>
+              <w:right w:val="single" w:sz="6" w:space="0" w:color="auto"/>
+            </w:tcBorders>
+            <w:vAlign w:val="center"/>
+            <w:hideMark/>
+          </w:tcPr>
+          <w:p>
+            <w:pPr>
+              <w:adjustRightInd w:val="0"/>
+              <w:snapToGrid w:val="0"/>
+              <w:spacing w:line="240" w:lineRule="atLeast"/>
+              <w:rPr>
+                <w:rFonts w:eastAsia="游明朝"/>
+              </w:rPr>
+            </w:pPr>
+            <w:r>
+              <w:rPr>
+                <w:rFonts w:eastAsia="游明朝"/>
+                <w:b/>
+                <w:bCs/>
+              </w:rPr>
+              <w:t>エンド上部</w:t>
+            </w:r>
+          </w:p>
+        </w:tc>
+        <w:tc>
+          <w:tcPr>
+            <w:tcW w:w="0" w:type="auto"/>
+            <w:tcBorders>
+              <w:top w:val="single" w:sz="6" w:space="0" w:color="auto"/>
+              <w:left w:val="single" w:sz="6" w:space="0" w:color="auto"/>
+              <w:bottom w:val="single" w:sz="6" w:space="0" w:color="auto"/>
+              <w:right w:val="single" w:sz="6" w:space="0" w:color="auto"/>
+            </w:tcBorders>
+            <w:vAlign w:val="center"/>
+            <w:hideMark/>
+          </w:tcPr>
+          <w:p>
+            <w:pPr>
+              <w:adjustRightInd w:val="0"/>
+              <w:snapToGrid w:val="0"/>
+              <w:spacing w:line="240" w:lineRule="atLeast"/>
+              <w:rPr>
+                <w:rFonts w:eastAsia="游明朝"/>
+              </w:rPr>
+            </w:pPr>
+            <w:r>
+              <w:rPr>
+                <w:rFonts w:eastAsia="游明朝"/>
+              </w:rPr>
+              <w:t>900 × 300mm</w:t>
+            </w:r>
+          </w:p>
+        </w:tc>
+        <w:tc>
+          <w:tcPr>
+            <w:tcW w:w="0" w:type="auto"/>
+            <w:tcBorders>
+              <w:top w:val="single" w:sz="6" w:space="0" w:color="auto"/>
+              <w:left w:val="single" w:sz="6" w:space="0" w:color="auto"/>
+              <w:bottom w:val="single" w:sz="6" w:space="0" w:color="auto"/>
+              <w:right w:val="single" w:sz="6" w:space="0" w:color="auto"/>
+            </w:tcBorders>
+            <w:vAlign w:val="center"/>
+            <w:hideMark/>
+          </w:tcPr>
+          <w:p>
+            <w:pPr>
+              <w:adjustRightInd w:val="0"/>
+              <w:snapToGrid w:val="0"/>
+              <w:spacing w:line="240" w:lineRule="atLeast"/>
+              <w:rPr>
+                <w:rFonts w:eastAsia="游明朝"/>
+              </w:rPr>
+            </w:pPr>
+            <w:r>
+              <w:rPr>
+                <w:rFonts w:eastAsia="游明朝"/>
+                <w:b/>
+                <w:bCs/>
+              </w:rPr>
+              <w:t>900 × 200mm</w:t>
+            </w:r>
+          </w:p>
+        </w:tc>
+        <w:tc>
+          <w:tcPr>
+            <w:tcW w:w="0" w:type="auto"/>
+            <w:tcBorders>
+              <w:top w:val="single" w:sz="6" w:space="0" w:color="auto"/>
+              <w:left w:val="single" w:sz="6" w:space="0" w:color="auto"/>
+              <w:bottom w:val="single" w:sz="6" w:space="0" w:color="auto"/>
+              <w:right w:val="single" w:sz="6" w:space="0" w:color="auto"/>
+            </w:tcBorders>
+            <w:vAlign w:val="center"/>
+            <w:hideMark/>
+          </w:tcPr>
+          <w:p>
+            <w:pPr>
+              <w:adjustRightInd w:val="0"/>
+              <w:snapToGrid w:val="0"/>
+              <w:spacing w:line="240" w:lineRule="atLeast"/>
+              <w:rPr>
+                <w:rFonts w:eastAsia="游明朝"/>
+              </w:rPr>
+            </w:pPr>
+            <w:r>
+              <w:rPr>
+                <w:rFonts w:eastAsia="游明朝"/>
+              </w:rPr>
+              <w:t>コーナーの視認性アップ</w:t>
+            </w:r>
+          </w:p>
+        </w:tc>
+      </w:tr>
+      <w:tr>
+        <w:trPr>
+          <w:tblCellSpacing w:w="15" w:type="dxa"/>
+        </w:trPr>
+        <w:tc>
+          <w:tcPr>
+            <w:tcW w:w="0" w:type="auto"/>
+            <w:tcBorders>
+              <w:top w:val="single" w:sz="6" w:space="0" w:color="auto"/>
+              <w:left w:val="single" w:sz="6" w:space="0" w:color="auto"/>
+              <w:bottom w:val="single" w:sz="6" w:space="0" w:color="auto"/>
+              <w:right w:val="single" w:sz="6" w:space="0" w:color="auto"/>
+            </w:tcBorders>
+            <w:vAlign w:val="center"/>
+            <w:hideMark/>
+          </w:tcPr>
+          <w:p>
+            <w:pPr>
+              <w:adjustRightInd w:val="0"/>
+              <w:snapToGrid w:val="0"/>
+              <w:spacing w:line="240" w:lineRule="atLeast"/>
+              <w:rPr>
+                <w:rFonts w:eastAsia="游明朝"/>
+              </w:rPr>
+            </w:pPr>
+            <w:r>
+              <w:rPr>
+                <w:rFonts w:eastAsia="游明朝"/>
+                <w:b/>
+                <w:bCs/>
+              </w:rPr>
+              <w:t>棚割り（定番棚）</w:t>
+            </w:r>
+          </w:p>
+        </w:tc>
+        <w:tc>
+          <w:tcPr>
+            <w:tcW w:w="0" w:type="auto"/>
+            <w:tcBorders>
+              <w:top w:val="single" w:sz="6" w:space="0" w:color="auto"/>
+              <w:left w:val="single" w:sz="6" w:space="0" w:color="auto"/>
+              <w:bottom w:val="single" w:sz="6" w:space="0" w:color="auto"/>
+              <w:right w:val="single" w:sz="6" w:space="0" w:color="auto"/>
+            </w:tcBorders>
+            <w:vAlign w:val="center"/>
+            <w:hideMark/>
+          </w:tcPr>
+          <w:p>
+            <w:pPr>
+              <w:adjustRightInd w:val="0"/>
+              <w:snapToGrid w:val="0"/>
+              <w:spacing w:line="240" w:lineRule="atLeast"/>
+              <w:rPr>
+                <w:rFonts w:eastAsia="游明朝"/>
+              </w:rPr>
+            </w:pPr>
+            <w:r>
+              <w:rPr>
+                <w:rFonts w:eastAsia="游明朝"/>
+              </w:rPr>
+              <w:t>900 × 150mm</w:t>
+            </w:r>
+          </w:p>
+        </w:tc>
+        <w:tc>
+          <w:tcPr>
+            <w:tcW w:w="0" w:type="auto"/>
+            <w:tcBorders>
+              <w:top w:val="single" w:sz="6" w:space="0" w:color="auto"/>
+              <w:left w:val="single" w:sz="6" w:space="0" w:color="auto"/>
+              <w:bottom w:val="single" w:sz="6" w:space="0" w:color="auto"/>
+              <w:right w:val="single" w:sz="6" w:space="0" w:color="auto"/>
+            </w:tcBorders>
+            <w:vAlign w:val="center"/>
+            <w:hideMark/>
+          </w:tcPr>
+          <w:p>
+            <w:pPr>
+              <w:adjustRightInd w:val="0"/>
+              <w:snapToGrid w:val="0"/>
+              <w:spacing w:line="240" w:lineRule="atLeast"/>
+              <w:rPr>
+                <w:rFonts w:eastAsia="游明朝"/>
+              </w:rPr>
+            </w:pPr>
+            <w:r>
+              <w:rPr>
+                <w:rFonts w:eastAsia="游明朝"/>
+                <w:b/>
+                <w:bCs/>
+              </w:rPr>
+              <w:t>900 × 100mm</w:t>
+            </w:r>
+          </w:p>
+        </w:tc>
+        <w:tc>
+          <w:tcPr>
+            <w:tcW w:w="0" w:type="auto"/>
+            <w:tcBorders>
+              <w:top w:val="single" w:sz="6" w:space="0" w:color="auto"/>
+              <w:left w:val="single" w:sz="6" w:space="0" w:color="auto"/>
+              <w:bottom w:val="single" w:sz="6" w:space="0" w:color="auto"/>
+              <w:right w:val="single" w:sz="6" w:space="0" w:color="auto"/>
+            </w:tcBorders>
+            <w:vAlign w:val="center"/>
+            <w:hideMark/>
+          </w:tcPr>
+          <w:p>
+            <w:pPr>
+              <w:adjustRightInd w:val="0"/>
+              <w:snapToGrid w:val="0"/>
+              <w:spacing w:line="240" w:lineRule="atLeast"/>
+              <w:rPr>
+                <w:rFonts w:eastAsia="游明朝"/>
+              </w:rPr>
+            </w:pPr>
+            <w:r>
+              <w:rPr>
+                <w:rFonts w:eastAsia="游明朝"/>
+              </w:rPr>
+              <w:t>電子棚札＋動画広告</w:t>
+            </w:r>
+          </w:p>
+        </w:tc>
+      </w:tr>
+    </w:tbl>
+    <w:p>
+      <w:pPr>
+        <w:adjustRightInd w:val="0"/>
+        <w:snapToGrid w:val="0"/>
+        <w:spacing w:line="240" w:lineRule="atLeast"/>
         <w:rPr>
           <w:rFonts w:eastAsia="游明朝" w:hint="eastAsia"/>
         </w:rPr>
-        <w:t>100cmから300cmなど防水仕様　精細など用途次第で値段は上下する</w:t>
-      </w:r>
-    </w:p>
-    <w:p>
-      <w:pPr>
-        <w:adjustRightInd w:val="0"/>
-        <w:snapToGrid w:val="0"/>
-        <w:spacing w:line="240" w:lineRule="atLeast"/>
-        <w:rPr>
-          <w:rFonts w:eastAsia="游明朝"/>
-        </w:rPr>
-      </w:pPr>
-      <w:r>
-        <w:rPr>
-          <w:rFonts w:eastAsia="游明朝" w:hint="eastAsia"/>
-        </w:rPr>
-        <w:t>サイズは1mで3万円程度が基本</w:t>
-      </w:r>
+      </w:pPr>
+    </w:p>
+    <w:tbl>
+      <w:tblPr>
+        <w:tblW w:w="0" w:type="auto"/>
+        <w:tblCellSpacing w:w="15" w:type="dxa"/>
+        <w:tblCellMar>
+          <w:top w:w="15" w:type="dxa"/>
+          <w:left w:w="15" w:type="dxa"/>
+          <w:bottom w:w="15" w:type="dxa"/>
+          <w:right w:w="15" w:type="dxa"/>
+        </w:tblCellMar>
+        <w:tblLook w:val="04A0" w:firstRow="1" w:lastRow="0" w:firstColumn="1" w:lastColumn="0" w:noHBand="0" w:noVBand="1"/>
+      </w:tblPr>
+      <w:tblGrid>
+        <w:gridCol w:w="1996"/>
+        <w:gridCol w:w="1564"/>
+        <w:gridCol w:w="1561"/>
+        <w:gridCol w:w="2189"/>
+      </w:tblGrid>
+      <w:tr>
+        <w:trPr>
+          <w:tblHeader/>
+          <w:tblCellSpacing w:w="15" w:type="dxa"/>
+        </w:trPr>
+        <w:tc>
+          <w:tcPr>
+            <w:tcW w:w="0" w:type="auto"/>
+            <w:tcBorders>
+              <w:top w:val="single" w:sz="6" w:space="0" w:color="auto"/>
+              <w:left w:val="single" w:sz="6" w:space="0" w:color="auto"/>
+              <w:bottom w:val="single" w:sz="6" w:space="0" w:color="auto"/>
+              <w:right w:val="single" w:sz="6" w:space="0" w:color="auto"/>
+            </w:tcBorders>
+            <w:vAlign w:val="center"/>
+            <w:hideMark/>
+          </w:tcPr>
+          <w:p>
+            <w:pPr>
+              <w:adjustRightInd w:val="0"/>
+              <w:snapToGrid w:val="0"/>
+              <w:spacing w:line="240" w:lineRule="atLeast"/>
+              <w:rPr>
+                <w:rFonts w:eastAsia="游明朝"/>
+              </w:rPr>
+            </w:pPr>
+            <w:r>
+              <w:rPr>
+                <w:rFonts w:eastAsia="游明朝"/>
+                <w:b/>
+                <w:bCs/>
+              </w:rPr>
+              <w:t>設置場所</w:t>
+            </w:r>
+          </w:p>
+        </w:tc>
+        <w:tc>
+          <w:tcPr>
+            <w:tcW w:w="0" w:type="auto"/>
+            <w:tcBorders>
+              <w:top w:val="single" w:sz="6" w:space="0" w:color="auto"/>
+              <w:left w:val="single" w:sz="6" w:space="0" w:color="auto"/>
+              <w:bottom w:val="single" w:sz="6" w:space="0" w:color="auto"/>
+              <w:right w:val="single" w:sz="6" w:space="0" w:color="auto"/>
+            </w:tcBorders>
+            <w:vAlign w:val="center"/>
+            <w:hideMark/>
+          </w:tcPr>
+          <w:p>
+            <w:pPr>
+              <w:adjustRightInd w:val="0"/>
+              <w:snapToGrid w:val="0"/>
+              <w:spacing w:line="240" w:lineRule="atLeast"/>
+              <w:rPr>
+                <w:rFonts w:eastAsia="游明朝"/>
+              </w:rPr>
+            </w:pPr>
+            <w:r>
+              <w:rPr>
+                <w:rFonts w:eastAsia="游明朝"/>
+                <w:b/>
+                <w:bCs/>
+              </w:rPr>
+              <w:t>推奨サイズ</w:t>
+            </w:r>
+          </w:p>
+        </w:tc>
+        <w:tc>
+          <w:tcPr>
+            <w:tcW w:w="0" w:type="auto"/>
+            <w:tcBorders>
+              <w:top w:val="single" w:sz="6" w:space="0" w:color="auto"/>
+              <w:left w:val="single" w:sz="6" w:space="0" w:color="auto"/>
+              <w:bottom w:val="single" w:sz="6" w:space="0" w:color="auto"/>
+              <w:right w:val="single" w:sz="6" w:space="0" w:color="auto"/>
+            </w:tcBorders>
+            <w:vAlign w:val="center"/>
+            <w:hideMark/>
+          </w:tcPr>
+          <w:p>
+            <w:pPr>
+              <w:adjustRightInd w:val="0"/>
+              <w:snapToGrid w:val="0"/>
+              <w:spacing w:line="240" w:lineRule="atLeast"/>
+              <w:rPr>
+                <w:rFonts w:eastAsia="游明朝"/>
+              </w:rPr>
+            </w:pPr>
+            <w:r>
+              <w:rPr>
+                <w:rFonts w:eastAsia="游明朝"/>
+                <w:b/>
+                <w:bCs/>
+              </w:rPr>
+              <w:t>必要なパネル数</w:t>
+            </w:r>
+          </w:p>
+        </w:tc>
+        <w:tc>
+          <w:tcPr>
+            <w:tcW w:w="0" w:type="auto"/>
+            <w:tcBorders>
+              <w:top w:val="single" w:sz="6" w:space="0" w:color="auto"/>
+              <w:left w:val="single" w:sz="6" w:space="0" w:color="auto"/>
+              <w:bottom w:val="single" w:sz="6" w:space="0" w:color="auto"/>
+              <w:right w:val="single" w:sz="6" w:space="0" w:color="auto"/>
+            </w:tcBorders>
+            <w:vAlign w:val="center"/>
+            <w:hideMark/>
+          </w:tcPr>
+          <w:p>
+            <w:pPr>
+              <w:adjustRightInd w:val="0"/>
+              <w:snapToGrid w:val="0"/>
+              <w:spacing w:line="240" w:lineRule="atLeast"/>
+              <w:rPr>
+                <w:rFonts w:eastAsia="游明朝"/>
+              </w:rPr>
+            </w:pPr>
+            <w:r>
+              <w:rPr>
+                <w:rFonts w:eastAsia="游明朝"/>
+                <w:b/>
+                <w:bCs/>
+              </w:rPr>
+              <w:t>合計予算（1箇所）</w:t>
+            </w:r>
+          </w:p>
+        </w:tc>
+      </w:tr>
+      <w:tr>
+        <w:trPr>
+          <w:tblCellSpacing w:w="15" w:type="dxa"/>
+        </w:trPr>
+        <w:tc>
+          <w:tcPr>
+            <w:tcW w:w="0" w:type="auto"/>
+            <w:tcBorders>
+              <w:top w:val="single" w:sz="6" w:space="0" w:color="auto"/>
+              <w:left w:val="single" w:sz="6" w:space="0" w:color="auto"/>
+              <w:bottom w:val="single" w:sz="6" w:space="0" w:color="auto"/>
+              <w:right w:val="single" w:sz="6" w:space="0" w:color="auto"/>
+            </w:tcBorders>
+            <w:vAlign w:val="center"/>
+            <w:hideMark/>
+          </w:tcPr>
+          <w:p>
+            <w:pPr>
+              <w:adjustRightInd w:val="0"/>
+              <w:snapToGrid w:val="0"/>
+              <w:spacing w:line="240" w:lineRule="atLeast"/>
+              <w:rPr>
+                <w:rFonts w:eastAsia="游明朝"/>
+              </w:rPr>
+            </w:pPr>
+            <w:r>
+              <w:rPr>
+                <w:rFonts w:eastAsia="游明朝"/>
+                <w:b/>
+                <w:bCs/>
+              </w:rPr>
+              <w:t>エンド上部</w:t>
+            </w:r>
+          </w:p>
+        </w:tc>
+        <w:tc>
+          <w:tcPr>
+            <w:tcW w:w="0" w:type="auto"/>
+            <w:tcBorders>
+              <w:top w:val="single" w:sz="6" w:space="0" w:color="auto"/>
+              <w:left w:val="single" w:sz="6" w:space="0" w:color="auto"/>
+              <w:bottom w:val="single" w:sz="6" w:space="0" w:color="auto"/>
+              <w:right w:val="single" w:sz="6" w:space="0" w:color="auto"/>
+            </w:tcBorders>
+            <w:vAlign w:val="center"/>
+            <w:hideMark/>
+          </w:tcPr>
+          <w:p>
+            <w:pPr>
+              <w:adjustRightInd w:val="0"/>
+              <w:snapToGrid w:val="0"/>
+              <w:spacing w:line="240" w:lineRule="atLeast"/>
+              <w:rPr>
+                <w:rFonts w:eastAsia="游明朝"/>
+              </w:rPr>
+            </w:pPr>
+            <w:r>
+              <w:rPr>
+                <w:rFonts w:eastAsia="游明朝"/>
+              </w:rPr>
+              <w:t>900 × 240mm</w:t>
+            </w:r>
+          </w:p>
+        </w:tc>
+        <w:tc>
+          <w:tcPr>
+            <w:tcW w:w="0" w:type="auto"/>
+            <w:tcBorders>
+              <w:top w:val="single" w:sz="6" w:space="0" w:color="auto"/>
+              <w:left w:val="single" w:sz="6" w:space="0" w:color="auto"/>
+              <w:bottom w:val="single" w:sz="6" w:space="0" w:color="auto"/>
+              <w:right w:val="single" w:sz="6" w:space="0" w:color="auto"/>
+            </w:tcBorders>
+            <w:vAlign w:val="center"/>
+            <w:hideMark/>
+          </w:tcPr>
+          <w:p>
+            <w:pPr>
+              <w:adjustRightInd w:val="0"/>
+              <w:snapToGrid w:val="0"/>
+              <w:spacing w:line="240" w:lineRule="atLeast"/>
+              <w:rPr>
+                <w:rFonts w:eastAsia="游明朝"/>
+              </w:rPr>
+            </w:pPr>
+            <w:r>
+              <w:rPr>
+                <w:rFonts w:eastAsia="游明朝"/>
+              </w:rPr>
+              <w:t>1枚</w:t>
+            </w:r>
+          </w:p>
+        </w:tc>
+        <w:tc>
+          <w:tcPr>
+            <w:tcW w:w="0" w:type="auto"/>
+            <w:tcBorders>
+              <w:top w:val="single" w:sz="6" w:space="0" w:color="auto"/>
+              <w:left w:val="single" w:sz="6" w:space="0" w:color="auto"/>
+              <w:bottom w:val="single" w:sz="6" w:space="0" w:color="auto"/>
+              <w:right w:val="single" w:sz="6" w:space="0" w:color="auto"/>
+            </w:tcBorders>
+            <w:vAlign w:val="center"/>
+            <w:hideMark/>
+          </w:tcPr>
+          <w:p>
+            <w:pPr>
+              <w:adjustRightInd w:val="0"/>
+              <w:snapToGrid w:val="0"/>
+              <w:spacing w:line="240" w:lineRule="atLeast"/>
+              <w:rPr>
+                <w:rFonts w:eastAsia="游明朝"/>
+              </w:rPr>
+            </w:pPr>
+            <w:r>
+              <w:rPr>
+                <w:rFonts w:eastAsia="游明朝"/>
+                <w:b/>
+                <w:bCs/>
+              </w:rPr>
+              <w:t>約6万円 〜 8万円</w:t>
+            </w:r>
+          </w:p>
+        </w:tc>
+      </w:tr>
+      <w:tr>
+        <w:trPr>
+          <w:tblCellSpacing w:w="15" w:type="dxa"/>
+        </w:trPr>
+        <w:tc>
+          <w:tcPr>
+            <w:tcW w:w="0" w:type="auto"/>
+            <w:tcBorders>
+              <w:top w:val="single" w:sz="6" w:space="0" w:color="auto"/>
+              <w:left w:val="single" w:sz="6" w:space="0" w:color="auto"/>
+              <w:bottom w:val="single" w:sz="6" w:space="0" w:color="auto"/>
+              <w:right w:val="single" w:sz="6" w:space="0" w:color="auto"/>
+            </w:tcBorders>
+            <w:vAlign w:val="center"/>
+            <w:hideMark/>
+          </w:tcPr>
+          <w:p>
+            <w:pPr>
+              <w:adjustRightInd w:val="0"/>
+              <w:snapToGrid w:val="0"/>
+              <w:spacing w:line="240" w:lineRule="atLeast"/>
+              <w:rPr>
+                <w:rFonts w:eastAsia="游明朝"/>
+              </w:rPr>
+            </w:pPr>
+            <w:r>
+              <w:rPr>
+                <w:rFonts w:eastAsia="游明朝"/>
+                <w:b/>
+                <w:bCs/>
+              </w:rPr>
+              <w:t>冷蔵ショーケース扉</w:t>
+            </w:r>
+          </w:p>
+        </w:tc>
+        <w:tc>
+          <w:tcPr>
+            <w:tcW w:w="0" w:type="auto"/>
+            <w:tcBorders>
+              <w:top w:val="single" w:sz="6" w:space="0" w:color="auto"/>
+              <w:left w:val="single" w:sz="6" w:space="0" w:color="auto"/>
+              <w:bottom w:val="single" w:sz="6" w:space="0" w:color="auto"/>
+              <w:right w:val="single" w:sz="6" w:space="0" w:color="auto"/>
+            </w:tcBorders>
+            <w:vAlign w:val="center"/>
+            <w:hideMark/>
+          </w:tcPr>
+          <w:p>
+            <w:pPr>
+              <w:adjustRightInd w:val="0"/>
+              <w:snapToGrid w:val="0"/>
+              <w:spacing w:line="240" w:lineRule="atLeast"/>
+              <w:rPr>
+                <w:rFonts w:eastAsia="游明朝"/>
+              </w:rPr>
+            </w:pPr>
+            <w:r>
+              <w:rPr>
+                <w:rFonts w:eastAsia="游明朝"/>
+              </w:rPr>
+              <w:t>400 × 1000mm</w:t>
+            </w:r>
+          </w:p>
+        </w:tc>
+        <w:tc>
+          <w:tcPr>
+            <w:tcW w:w="0" w:type="auto"/>
+            <w:tcBorders>
+              <w:top w:val="single" w:sz="6" w:space="0" w:color="auto"/>
+              <w:left w:val="single" w:sz="6" w:space="0" w:color="auto"/>
+              <w:bottom w:val="single" w:sz="6" w:space="0" w:color="auto"/>
+              <w:right w:val="single" w:sz="6" w:space="0" w:color="auto"/>
+            </w:tcBorders>
+            <w:vAlign w:val="center"/>
+            <w:hideMark/>
+          </w:tcPr>
+          <w:p>
+            <w:pPr>
+              <w:adjustRightInd w:val="0"/>
+              <w:snapToGrid w:val="0"/>
+              <w:spacing w:line="240" w:lineRule="atLeast"/>
+              <w:rPr>
+                <w:rFonts w:eastAsia="游明朝"/>
+              </w:rPr>
+            </w:pPr>
+            <w:r>
+              <w:rPr>
+                <w:rFonts w:eastAsia="游明朝"/>
+              </w:rPr>
+              <w:t>1枚</w:t>
+            </w:r>
+          </w:p>
+        </w:tc>
+        <w:tc>
+          <w:tcPr>
+            <w:tcW w:w="0" w:type="auto"/>
+            <w:tcBorders>
+              <w:top w:val="single" w:sz="6" w:space="0" w:color="auto"/>
+              <w:left w:val="single" w:sz="6" w:space="0" w:color="auto"/>
+              <w:bottom w:val="single" w:sz="6" w:space="0" w:color="auto"/>
+              <w:right w:val="single" w:sz="6" w:space="0" w:color="auto"/>
+            </w:tcBorders>
+            <w:vAlign w:val="center"/>
+            <w:hideMark/>
+          </w:tcPr>
+          <w:p>
+            <w:pPr>
+              <w:adjustRightInd w:val="0"/>
+              <w:snapToGrid w:val="0"/>
+              <w:spacing w:line="240" w:lineRule="atLeast"/>
+              <w:rPr>
+                <w:rFonts w:eastAsia="游明朝"/>
+              </w:rPr>
+            </w:pPr>
+            <w:r>
+              <w:rPr>
+                <w:rFonts w:eastAsia="游明朝"/>
+                <w:b/>
+                <w:bCs/>
+              </w:rPr>
+              <w:t>約7万円 〜 9万円</w:t>
+            </w:r>
+          </w:p>
+        </w:tc>
+      </w:tr>
+      <w:tr>
+        <w:trPr>
+          <w:tblCellSpacing w:w="15" w:type="dxa"/>
+        </w:trPr>
+        <w:tc>
+          <w:tcPr>
+            <w:tcW w:w="0" w:type="auto"/>
+            <w:tcBorders>
+              <w:top w:val="single" w:sz="6" w:space="0" w:color="auto"/>
+              <w:left w:val="single" w:sz="6" w:space="0" w:color="auto"/>
+              <w:bottom w:val="single" w:sz="6" w:space="0" w:color="auto"/>
+              <w:right w:val="single" w:sz="6" w:space="0" w:color="auto"/>
+            </w:tcBorders>
+            <w:vAlign w:val="center"/>
+            <w:hideMark/>
+          </w:tcPr>
+          <w:p>
+            <w:pPr>
+              <w:adjustRightInd w:val="0"/>
+              <w:snapToGrid w:val="0"/>
+              <w:spacing w:line="240" w:lineRule="atLeast"/>
+              <w:rPr>
+                <w:rFonts w:eastAsia="游明朝"/>
+              </w:rPr>
+            </w:pPr>
+            <w:r>
+              <w:rPr>
+                <w:rFonts w:eastAsia="游明朝"/>
+                <w:b/>
+                <w:bCs/>
+              </w:rPr>
+              <w:t>鮮魚対面ガラス</w:t>
+            </w:r>
+          </w:p>
+        </w:tc>
+        <w:tc>
+          <w:tcPr>
+            <w:tcW w:w="0" w:type="auto"/>
+            <w:tcBorders>
+              <w:top w:val="single" w:sz="6" w:space="0" w:color="auto"/>
+              <w:left w:val="single" w:sz="6" w:space="0" w:color="auto"/>
+              <w:bottom w:val="single" w:sz="6" w:space="0" w:color="auto"/>
+              <w:right w:val="single" w:sz="6" w:space="0" w:color="auto"/>
+            </w:tcBorders>
+            <w:vAlign w:val="center"/>
+            <w:hideMark/>
+          </w:tcPr>
+          <w:p>
+            <w:pPr>
+              <w:adjustRightInd w:val="0"/>
+              <w:snapToGrid w:val="0"/>
+              <w:spacing w:line="240" w:lineRule="atLeast"/>
+              <w:rPr>
+                <w:rFonts w:eastAsia="游明朝"/>
+              </w:rPr>
+            </w:pPr>
+            <w:r>
+              <w:rPr>
+                <w:rFonts w:eastAsia="游明朝"/>
+              </w:rPr>
+              <w:t>2000 × 240mm</w:t>
+            </w:r>
+          </w:p>
+        </w:tc>
+        <w:tc>
+          <w:tcPr>
+            <w:tcW w:w="0" w:type="auto"/>
+            <w:tcBorders>
+              <w:top w:val="single" w:sz="6" w:space="0" w:color="auto"/>
+              <w:left w:val="single" w:sz="6" w:space="0" w:color="auto"/>
+              <w:bottom w:val="single" w:sz="6" w:space="0" w:color="auto"/>
+              <w:right w:val="single" w:sz="6" w:space="0" w:color="auto"/>
+            </w:tcBorders>
+            <w:vAlign w:val="center"/>
+            <w:hideMark/>
+          </w:tcPr>
+          <w:p>
+            <w:pPr>
+              <w:adjustRightInd w:val="0"/>
+              <w:snapToGrid w:val="0"/>
+              <w:spacing w:line="240" w:lineRule="atLeast"/>
+              <w:rPr>
+                <w:rFonts w:eastAsia="游明朝"/>
+              </w:rPr>
+            </w:pPr>
+            <w:r>
+              <w:rPr>
+                <w:rFonts w:eastAsia="游明朝"/>
+              </w:rPr>
+              <w:t>2枚連結</w:t>
+            </w:r>
+          </w:p>
+        </w:tc>
+        <w:tc>
+          <w:tcPr>
+            <w:tcW w:w="0" w:type="auto"/>
+            <w:tcBorders>
+              <w:top w:val="single" w:sz="6" w:space="0" w:color="auto"/>
+              <w:left w:val="single" w:sz="6" w:space="0" w:color="auto"/>
+              <w:bottom w:val="single" w:sz="6" w:space="0" w:color="auto"/>
+              <w:right w:val="single" w:sz="6" w:space="0" w:color="auto"/>
+            </w:tcBorders>
+            <w:vAlign w:val="center"/>
+            <w:hideMark/>
+          </w:tcPr>
+          <w:p>
+            <w:pPr>
+              <w:adjustRightInd w:val="0"/>
+              <w:snapToGrid w:val="0"/>
+              <w:spacing w:line="240" w:lineRule="atLeast"/>
+              <w:rPr>
+                <w:rFonts w:eastAsia="游明朝"/>
+              </w:rPr>
+            </w:pPr>
+            <w:r>
+              <w:rPr>
+                <w:rFonts w:eastAsia="游明朝"/>
+                <w:b/>
+                <w:bCs/>
+              </w:rPr>
+              <w:t>約10万円 〜 13万円</w:t>
+            </w:r>
+          </w:p>
+        </w:tc>
+      </w:tr>
+    </w:tbl>
+    <w:p>
+      <w:pPr>
+        <w:adjustRightInd w:val="0"/>
+        <w:snapToGrid w:val="0"/>
+        <w:spacing w:line="240" w:lineRule="atLeast"/>
+        <w:rPr>
+          <w:rFonts w:eastAsia="游明朝"/>
+        </w:rPr>
+      </w:pPr>
     </w:p>
     <w:p>
       <w:pPr>
@@ -11126,6 +12877,155 @@
     </w:lvl>
   </w:abstractNum>
   <w:abstractNum w:abstractNumId="3" w15:restartNumberingAfterBreak="0">
+    <w:nsid w:val="0A662C0C"/>
+    <w:multiLevelType w:val="multilevel"/>
+    <w:tmpl w:val="E2AA5190"/>
+    <w:lvl w:ilvl="0">
+      <w:start w:val="1"/>
+      <w:numFmt w:val="bullet"/>
+      <w:lvlText w:val=""/>
+      <w:lvlJc w:val="left"/>
+      <w:pPr>
+        <w:tabs>
+          <w:tab w:val="num" w:pos="720"/>
+        </w:tabs>
+        <w:ind w:left="720" w:hanging="360"/>
+      </w:pPr>
+      <w:rPr>
+        <w:rFonts w:ascii="Symbol" w:hAnsi="Symbol" w:hint="default"/>
+        <w:sz w:val="20"/>
+      </w:rPr>
+    </w:lvl>
+    <w:lvl w:ilvl="1">
+      <w:start w:val="1"/>
+      <w:numFmt w:val="bullet"/>
+      <w:lvlText w:val="o"/>
+      <w:lvlJc w:val="left"/>
+      <w:pPr>
+        <w:tabs>
+          <w:tab w:val="num" w:pos="1440"/>
+        </w:tabs>
+        <w:ind w:left="1440" w:hanging="360"/>
+      </w:pPr>
+      <w:rPr>
+        <w:rFonts w:ascii="Courier New" w:hAnsi="Courier New" w:hint="default"/>
+        <w:sz w:val="20"/>
+      </w:rPr>
+    </w:lvl>
+    <w:lvl w:ilvl="2" w:tentative="1">
+      <w:start w:val="1"/>
+      <w:numFmt w:val="bullet"/>
+      <w:lvlText w:val=""/>
+      <w:lvlJc w:val="left"/>
+      <w:pPr>
+        <w:tabs>
+          <w:tab w:val="num" w:pos="2160"/>
+        </w:tabs>
+        <w:ind w:left="2160" w:hanging="360"/>
+      </w:pPr>
+      <w:rPr>
+        <w:rFonts w:ascii="Wingdings" w:hAnsi="Wingdings" w:hint="default"/>
+        <w:sz w:val="20"/>
+      </w:rPr>
+    </w:lvl>
+    <w:lvl w:ilvl="3" w:tentative="1">
+      <w:start w:val="1"/>
+      <w:numFmt w:val="bullet"/>
+      <w:lvlText w:val=""/>
+      <w:lvlJc w:val="left"/>
+      <w:pPr>
+        <w:tabs>
+          <w:tab w:val="num" w:pos="2880"/>
+        </w:tabs>
+        <w:ind w:left="2880" w:hanging="360"/>
+      </w:pPr>
+      <w:rPr>
+        <w:rFonts w:ascii="Wingdings" w:hAnsi="Wingdings" w:hint="default"/>
+        <w:sz w:val="20"/>
+      </w:rPr>
+    </w:lvl>
+    <w:lvl w:ilvl="4" w:tentative="1">
+      <w:start w:val="1"/>
+      <w:numFmt w:val="bullet"/>
+      <w:lvlText w:val=""/>
+      <w:lvlJc w:val="left"/>
+      <w:pPr>
+        <w:tabs>
+          <w:tab w:val="num" w:pos="3600"/>
+        </w:tabs>
+        <w:ind w:left="3600" w:hanging="360"/>
+      </w:pPr>
+      <w:rPr>
+        <w:rFonts w:ascii="Wingdings" w:hAnsi="Wingdings" w:hint="default"/>
+        <w:sz w:val="20"/>
+      </w:rPr>
+    </w:lvl>
+    <w:lvl w:ilvl="5" w:tentative="1">
+      <w:start w:val="1"/>
+      <w:numFmt w:val="bullet"/>
+      <w:lvlText w:val=""/>
+      <w:lvlJc w:val="left"/>
+      <w:pPr>
+        <w:tabs>
+          <w:tab w:val="num" w:pos="4320"/>
+        </w:tabs>
+        <w:ind w:left="4320" w:hanging="360"/>
+      </w:pPr>
+      <w:rPr>
+        <w:rFonts w:ascii="Wingdings" w:hAnsi="Wingdings" w:hint="default"/>
+        <w:sz w:val="20"/>
+      </w:rPr>
+    </w:lvl>
+    <w:lvl w:ilvl="6" w:tentative="1">
+      <w:start w:val="1"/>
+      <w:numFmt w:val="bullet"/>
+      <w:lvlText w:val=""/>
+      <w:lvlJc w:val="left"/>
+      <w:pPr>
+        <w:tabs>
+          <w:tab w:val="num" w:pos="5040"/>
+        </w:tabs>
+        <w:ind w:left="5040" w:hanging="360"/>
+      </w:pPr>
+      <w:rPr>
+        <w:rFonts w:ascii="Wingdings" w:hAnsi="Wingdings" w:hint="default"/>
+        <w:sz w:val="20"/>
+      </w:rPr>
+    </w:lvl>
+    <w:lvl w:ilvl="7" w:tentative="1">
+      <w:start w:val="1"/>
+      <w:numFmt w:val="bullet"/>
+      <w:lvlText w:val=""/>
+      <w:lvlJc w:val="left"/>
+      <w:pPr>
+        <w:tabs>
+          <w:tab w:val="num" w:pos="5760"/>
+        </w:tabs>
+        <w:ind w:left="5760" w:hanging="360"/>
+      </w:pPr>
+      <w:rPr>
+        <w:rFonts w:ascii="Wingdings" w:hAnsi="Wingdings" w:hint="default"/>
+        <w:sz w:val="20"/>
+      </w:rPr>
+    </w:lvl>
+    <w:lvl w:ilvl="8" w:tentative="1">
+      <w:start w:val="1"/>
+      <w:numFmt w:val="bullet"/>
+      <w:lvlText w:val=""/>
+      <w:lvlJc w:val="left"/>
+      <w:pPr>
+        <w:tabs>
+          <w:tab w:val="num" w:pos="6480"/>
+        </w:tabs>
+        <w:ind w:left="6480" w:hanging="360"/>
+      </w:pPr>
+      <w:rPr>
+        <w:rFonts w:ascii="Wingdings" w:hAnsi="Wingdings" w:hint="default"/>
+        <w:sz w:val="20"/>
+      </w:rPr>
+    </w:lvl>
+  </w:abstractNum>
+  <w:abstractNum w:abstractNumId="4" w15:restartNumberingAfterBreak="0">
     <w:nsid w:val="1A207779"/>
     <w:multiLevelType w:val="multilevel"/>
     <w:tmpl w:val="4CA83B1A"/>
@@ -11274,7 +13174,7 @@
       </w:rPr>
     </w:lvl>
   </w:abstractNum>
-  <w:abstractNum w:abstractNumId="4" w15:restartNumberingAfterBreak="0">
+  <w:abstractNum w:abstractNumId="5" w15:restartNumberingAfterBreak="0">
     <w:nsid w:val="1B9728A6"/>
     <w:multiLevelType w:val="multilevel"/>
     <w:tmpl w:val="5FB86944"/>
@@ -11423,7 +13323,7 @@
       </w:rPr>
     </w:lvl>
   </w:abstractNum>
-  <w:abstractNum w:abstractNumId="5" w15:restartNumberingAfterBreak="0">
+  <w:abstractNum w:abstractNumId="6" w15:restartNumberingAfterBreak="0">
     <w:nsid w:val="230A609D"/>
     <w:multiLevelType w:val="multilevel"/>
     <w:tmpl w:val="46546A38"/>
@@ -11572,7 +13472,7 @@
       </w:rPr>
     </w:lvl>
   </w:abstractNum>
-  <w:abstractNum w:abstractNumId="6" w15:restartNumberingAfterBreak="0">
+  <w:abstractNum w:abstractNumId="7" w15:restartNumberingAfterBreak="0">
     <w:nsid w:val="2AE6725B"/>
     <w:multiLevelType w:val="multilevel"/>
     <w:tmpl w:val="D3A884EE"/>
@@ -11721,7 +13621,7 @@
       </w:rPr>
     </w:lvl>
   </w:abstractNum>
-  <w:abstractNum w:abstractNumId="7" w15:restartNumberingAfterBreak="0">
+  <w:abstractNum w:abstractNumId="8" w15:restartNumberingAfterBreak="0">
     <w:nsid w:val="2B4667CF"/>
     <w:multiLevelType w:val="multilevel"/>
     <w:tmpl w:val="8CCC08E8"/>
@@ -11870,7 +13770,7 @@
       </w:rPr>
     </w:lvl>
   </w:abstractNum>
-  <w:abstractNum w:abstractNumId="8" w15:restartNumberingAfterBreak="0">
+  <w:abstractNum w:abstractNumId="9" w15:restartNumberingAfterBreak="0">
     <w:nsid w:val="2D572E71"/>
     <w:multiLevelType w:val="multilevel"/>
     <w:tmpl w:val="E7D45F08"/>
@@ -12019,7 +13919,7 @@
       </w:rPr>
     </w:lvl>
   </w:abstractNum>
-  <w:abstractNum w:abstractNumId="9" w15:restartNumberingAfterBreak="0">
+  <w:abstractNum w:abstractNumId="10" w15:restartNumberingAfterBreak="0">
     <w:nsid w:val="313C0977"/>
     <w:multiLevelType w:val="multilevel"/>
     <w:tmpl w:val="8FCE4CF6"/>
@@ -12168,7 +14068,7 @@
       </w:rPr>
     </w:lvl>
   </w:abstractNum>
-  <w:abstractNum w:abstractNumId="10" w15:restartNumberingAfterBreak="0">
+  <w:abstractNum w:abstractNumId="11" w15:restartNumberingAfterBreak="0">
     <w:nsid w:val="392C7C08"/>
     <w:multiLevelType w:val="multilevel"/>
     <w:tmpl w:val="27EE58E2"/>
@@ -12317,7 +14217,7 @@
       </w:rPr>
     </w:lvl>
   </w:abstractNum>
-  <w:abstractNum w:abstractNumId="11" w15:restartNumberingAfterBreak="0">
+  <w:abstractNum w:abstractNumId="12" w15:restartNumberingAfterBreak="0">
     <w:nsid w:val="3B4337C7"/>
     <w:multiLevelType w:val="multilevel"/>
     <w:tmpl w:val="22CAF9DE"/>
@@ -12466,7 +14366,7 @@
       </w:rPr>
     </w:lvl>
   </w:abstractNum>
-  <w:abstractNum w:abstractNumId="12" w15:restartNumberingAfterBreak="0">
+  <w:abstractNum w:abstractNumId="13" w15:restartNumberingAfterBreak="0">
     <w:nsid w:val="3FD05A62"/>
     <w:multiLevelType w:val="multilevel"/>
     <w:tmpl w:val="538A3D98"/>
@@ -12615,7 +14515,7 @@
       </w:rPr>
     </w:lvl>
   </w:abstractNum>
-  <w:abstractNum w:abstractNumId="13" w15:restartNumberingAfterBreak="0">
+  <w:abstractNum w:abstractNumId="14" w15:restartNumberingAfterBreak="0">
     <w:nsid w:val="3FD16BA2"/>
     <w:multiLevelType w:val="multilevel"/>
     <w:tmpl w:val="C39E3DB8"/>
@@ -12764,7 +14664,7 @@
       </w:rPr>
     </w:lvl>
   </w:abstractNum>
-  <w:abstractNum w:abstractNumId="14" w15:restartNumberingAfterBreak="0">
+  <w:abstractNum w:abstractNumId="15" w15:restartNumberingAfterBreak="0">
     <w:nsid w:val="46DD5887"/>
     <w:multiLevelType w:val="multilevel"/>
     <w:tmpl w:val="E0C0BAB4"/>
@@ -12913,7 +14813,7 @@
       </w:rPr>
     </w:lvl>
   </w:abstractNum>
-  <w:abstractNum w:abstractNumId="15" w15:restartNumberingAfterBreak="0">
+  <w:abstractNum w:abstractNumId="16" w15:restartNumberingAfterBreak="0">
     <w:nsid w:val="4D265DE7"/>
     <w:multiLevelType w:val="multilevel"/>
     <w:tmpl w:val="6FD0F4A2"/>
@@ -13062,7 +14962,7 @@
       </w:rPr>
     </w:lvl>
   </w:abstractNum>
-  <w:abstractNum w:abstractNumId="16" w15:restartNumberingAfterBreak="0">
+  <w:abstractNum w:abstractNumId="17" w15:restartNumberingAfterBreak="0">
     <w:nsid w:val="50FF1E45"/>
     <w:multiLevelType w:val="multilevel"/>
     <w:tmpl w:val="0B16C2E4"/>
@@ -13179,7 +15079,7 @@
       </w:pPr>
     </w:lvl>
   </w:abstractNum>
-  <w:abstractNum w:abstractNumId="17" w15:restartNumberingAfterBreak="0">
+  <w:abstractNum w:abstractNumId="18" w15:restartNumberingAfterBreak="0">
     <w:nsid w:val="5EFD6384"/>
     <w:multiLevelType w:val="multilevel"/>
     <w:tmpl w:val="0882ACA4"/>
@@ -13328,7 +15228,7 @@
       </w:rPr>
     </w:lvl>
   </w:abstractNum>
-  <w:abstractNum w:abstractNumId="18" w15:restartNumberingAfterBreak="0">
+  <w:abstractNum w:abstractNumId="19" w15:restartNumberingAfterBreak="0">
     <w:nsid w:val="68315F8F"/>
     <w:multiLevelType w:val="multilevel"/>
     <w:tmpl w:val="7E6C8214"/>
@@ -13477,7 +15377,7 @@
       </w:rPr>
     </w:lvl>
   </w:abstractNum>
-  <w:abstractNum w:abstractNumId="19" w15:restartNumberingAfterBreak="0">
+  <w:abstractNum w:abstractNumId="20" w15:restartNumberingAfterBreak="0">
     <w:nsid w:val="69163521"/>
     <w:multiLevelType w:val="multilevel"/>
     <w:tmpl w:val="BFA6B64E"/>
@@ -13626,7 +15526,305 @@
       </w:rPr>
     </w:lvl>
   </w:abstractNum>
-  <w:abstractNum w:abstractNumId="20" w15:restartNumberingAfterBreak="0">
+  <w:abstractNum w:abstractNumId="21" w15:restartNumberingAfterBreak="0">
+    <w:nsid w:val="69301126"/>
+    <w:multiLevelType w:val="multilevel"/>
+    <w:tmpl w:val="03FC3B34"/>
+    <w:lvl w:ilvl="0">
+      <w:start w:val="1"/>
+      <w:numFmt w:val="bullet"/>
+      <w:lvlText w:val=""/>
+      <w:lvlJc w:val="left"/>
+      <w:pPr>
+        <w:tabs>
+          <w:tab w:val="num" w:pos="720"/>
+        </w:tabs>
+        <w:ind w:left="720" w:hanging="360"/>
+      </w:pPr>
+      <w:rPr>
+        <w:rFonts w:ascii="Symbol" w:hAnsi="Symbol" w:hint="default"/>
+        <w:sz w:val="20"/>
+      </w:rPr>
+    </w:lvl>
+    <w:lvl w:ilvl="1">
+      <w:start w:val="1"/>
+      <w:numFmt w:val="bullet"/>
+      <w:lvlText w:val="o"/>
+      <w:lvlJc w:val="left"/>
+      <w:pPr>
+        <w:tabs>
+          <w:tab w:val="num" w:pos="1440"/>
+        </w:tabs>
+        <w:ind w:left="1440" w:hanging="360"/>
+      </w:pPr>
+      <w:rPr>
+        <w:rFonts w:ascii="Courier New" w:hAnsi="Courier New" w:hint="default"/>
+        <w:sz w:val="20"/>
+      </w:rPr>
+    </w:lvl>
+    <w:lvl w:ilvl="2" w:tentative="1">
+      <w:start w:val="1"/>
+      <w:numFmt w:val="bullet"/>
+      <w:lvlText w:val=""/>
+      <w:lvlJc w:val="left"/>
+      <w:pPr>
+        <w:tabs>
+          <w:tab w:val="num" w:pos="2160"/>
+        </w:tabs>
+        <w:ind w:left="2160" w:hanging="360"/>
+      </w:pPr>
+      <w:rPr>
+        <w:rFonts w:ascii="Wingdings" w:hAnsi="Wingdings" w:hint="default"/>
+        <w:sz w:val="20"/>
+      </w:rPr>
+    </w:lvl>
+    <w:lvl w:ilvl="3" w:tentative="1">
+      <w:start w:val="1"/>
+      <w:numFmt w:val="bullet"/>
+      <w:lvlText w:val=""/>
+      <w:lvlJc w:val="left"/>
+      <w:pPr>
+        <w:tabs>
+          <w:tab w:val="num" w:pos="2880"/>
+        </w:tabs>
+        <w:ind w:left="2880" w:hanging="360"/>
+      </w:pPr>
+      <w:rPr>
+        <w:rFonts w:ascii="Wingdings" w:hAnsi="Wingdings" w:hint="default"/>
+        <w:sz w:val="20"/>
+      </w:rPr>
+    </w:lvl>
+    <w:lvl w:ilvl="4" w:tentative="1">
+      <w:start w:val="1"/>
+      <w:numFmt w:val="bullet"/>
+      <w:lvlText w:val=""/>
+      <w:lvlJc w:val="left"/>
+      <w:pPr>
+        <w:tabs>
+          <w:tab w:val="num" w:pos="3600"/>
+        </w:tabs>
+        <w:ind w:left="3600" w:hanging="360"/>
+      </w:pPr>
+      <w:rPr>
+        <w:rFonts w:ascii="Wingdings" w:hAnsi="Wingdings" w:hint="default"/>
+        <w:sz w:val="20"/>
+      </w:rPr>
+    </w:lvl>
+    <w:lvl w:ilvl="5" w:tentative="1">
+      <w:start w:val="1"/>
+      <w:numFmt w:val="bullet"/>
+      <w:lvlText w:val=""/>
+      <w:lvlJc w:val="left"/>
+      <w:pPr>
+        <w:tabs>
+          <w:tab w:val="num" w:pos="4320"/>
+        </w:tabs>
+        <w:ind w:left="4320" w:hanging="360"/>
+      </w:pPr>
+      <w:rPr>
+        <w:rFonts w:ascii="Wingdings" w:hAnsi="Wingdings" w:hint="default"/>
+        <w:sz w:val="20"/>
+      </w:rPr>
+    </w:lvl>
+    <w:lvl w:ilvl="6" w:tentative="1">
+      <w:start w:val="1"/>
+      <w:numFmt w:val="bullet"/>
+      <w:lvlText w:val=""/>
+      <w:lvlJc w:val="left"/>
+      <w:pPr>
+        <w:tabs>
+          <w:tab w:val="num" w:pos="5040"/>
+        </w:tabs>
+        <w:ind w:left="5040" w:hanging="360"/>
+      </w:pPr>
+      <w:rPr>
+        <w:rFonts w:ascii="Wingdings" w:hAnsi="Wingdings" w:hint="default"/>
+        <w:sz w:val="20"/>
+      </w:rPr>
+    </w:lvl>
+    <w:lvl w:ilvl="7" w:tentative="1">
+      <w:start w:val="1"/>
+      <w:numFmt w:val="bullet"/>
+      <w:lvlText w:val=""/>
+      <w:lvlJc w:val="left"/>
+      <w:pPr>
+        <w:tabs>
+          <w:tab w:val="num" w:pos="5760"/>
+        </w:tabs>
+        <w:ind w:left="5760" w:hanging="360"/>
+      </w:pPr>
+      <w:rPr>
+        <w:rFonts w:ascii="Wingdings" w:hAnsi="Wingdings" w:hint="default"/>
+        <w:sz w:val="20"/>
+      </w:rPr>
+    </w:lvl>
+    <w:lvl w:ilvl="8" w:tentative="1">
+      <w:start w:val="1"/>
+      <w:numFmt w:val="bullet"/>
+      <w:lvlText w:val=""/>
+      <w:lvlJc w:val="left"/>
+      <w:pPr>
+        <w:tabs>
+          <w:tab w:val="num" w:pos="6480"/>
+        </w:tabs>
+        <w:ind w:left="6480" w:hanging="360"/>
+      </w:pPr>
+      <w:rPr>
+        <w:rFonts w:ascii="Wingdings" w:hAnsi="Wingdings" w:hint="default"/>
+        <w:sz w:val="20"/>
+      </w:rPr>
+    </w:lvl>
+  </w:abstractNum>
+  <w:abstractNum w:abstractNumId="22" w15:restartNumberingAfterBreak="0">
+    <w:nsid w:val="6DAA5B2F"/>
+    <w:multiLevelType w:val="multilevel"/>
+    <w:tmpl w:val="A7308230"/>
+    <w:lvl w:ilvl="0">
+      <w:start w:val="1"/>
+      <w:numFmt w:val="bullet"/>
+      <w:lvlText w:val=""/>
+      <w:lvlJc w:val="left"/>
+      <w:pPr>
+        <w:tabs>
+          <w:tab w:val="num" w:pos="720"/>
+        </w:tabs>
+        <w:ind w:left="720" w:hanging="360"/>
+      </w:pPr>
+      <w:rPr>
+        <w:rFonts w:ascii="Symbol" w:hAnsi="Symbol" w:hint="default"/>
+        <w:sz w:val="20"/>
+      </w:rPr>
+    </w:lvl>
+    <w:lvl w:ilvl="1">
+      <w:start w:val="1"/>
+      <w:numFmt w:val="bullet"/>
+      <w:lvlText w:val="o"/>
+      <w:lvlJc w:val="left"/>
+      <w:pPr>
+        <w:tabs>
+          <w:tab w:val="num" w:pos="1440"/>
+        </w:tabs>
+        <w:ind w:left="1440" w:hanging="360"/>
+      </w:pPr>
+      <w:rPr>
+        <w:rFonts w:ascii="Courier New" w:hAnsi="Courier New" w:hint="default"/>
+        <w:sz w:val="20"/>
+      </w:rPr>
+    </w:lvl>
+    <w:lvl w:ilvl="2" w:tentative="1">
+      <w:start w:val="1"/>
+      <w:numFmt w:val="bullet"/>
+      <w:lvlText w:val=""/>
+      <w:lvlJc w:val="left"/>
+      <w:pPr>
+        <w:tabs>
+          <w:tab w:val="num" w:pos="2160"/>
+        </w:tabs>
+        <w:ind w:left="2160" w:hanging="360"/>
+      </w:pPr>
+      <w:rPr>
+        <w:rFonts w:ascii="Wingdings" w:hAnsi="Wingdings" w:hint="default"/>
+        <w:sz w:val="20"/>
+      </w:rPr>
+    </w:lvl>
+    <w:lvl w:ilvl="3" w:tentative="1">
+      <w:start w:val="1"/>
+      <w:numFmt w:val="bullet"/>
+      <w:lvlText w:val=""/>
+      <w:lvlJc w:val="left"/>
+      <w:pPr>
+        <w:tabs>
+          <w:tab w:val="num" w:pos="2880"/>
+        </w:tabs>
+        <w:ind w:left="2880" w:hanging="360"/>
+      </w:pPr>
+      <w:rPr>
+        <w:rFonts w:ascii="Wingdings" w:hAnsi="Wingdings" w:hint="default"/>
+        <w:sz w:val="20"/>
+      </w:rPr>
+    </w:lvl>
+    <w:lvl w:ilvl="4" w:tentative="1">
+      <w:start w:val="1"/>
+      <w:numFmt w:val="bullet"/>
+      <w:lvlText w:val=""/>
+      <w:lvlJc w:val="left"/>
+      <w:pPr>
+        <w:tabs>
+          <w:tab w:val="num" w:pos="3600"/>
+        </w:tabs>
+        <w:ind w:left="3600" w:hanging="360"/>
+      </w:pPr>
+      <w:rPr>
+        <w:rFonts w:ascii="Wingdings" w:hAnsi="Wingdings" w:hint="default"/>
+        <w:sz w:val="20"/>
+      </w:rPr>
+    </w:lvl>
+    <w:lvl w:ilvl="5" w:tentative="1">
+      <w:start w:val="1"/>
+      <w:numFmt w:val="bullet"/>
+      <w:lvlText w:val=""/>
+      <w:lvlJc w:val="left"/>
+      <w:pPr>
+        <w:tabs>
+          <w:tab w:val="num" w:pos="4320"/>
+        </w:tabs>
+        <w:ind w:left="4320" w:hanging="360"/>
+      </w:pPr>
+      <w:rPr>
+        <w:rFonts w:ascii="Wingdings" w:hAnsi="Wingdings" w:hint="default"/>
+        <w:sz w:val="20"/>
+      </w:rPr>
+    </w:lvl>
+    <w:lvl w:ilvl="6" w:tentative="1">
+      <w:start w:val="1"/>
+      <w:numFmt w:val="bullet"/>
+      <w:lvlText w:val=""/>
+      <w:lvlJc w:val="left"/>
+      <w:pPr>
+        <w:tabs>
+          <w:tab w:val="num" w:pos="5040"/>
+        </w:tabs>
+        <w:ind w:left="5040" w:hanging="360"/>
+      </w:pPr>
+      <w:rPr>
+        <w:rFonts w:ascii="Wingdings" w:hAnsi="Wingdings" w:hint="default"/>
+        <w:sz w:val="20"/>
+      </w:rPr>
+    </w:lvl>
+    <w:lvl w:ilvl="7" w:tentative="1">
+      <w:start w:val="1"/>
+      <w:numFmt w:val="bullet"/>
+      <w:lvlText w:val=""/>
+      <w:lvlJc w:val="left"/>
+      <w:pPr>
+        <w:tabs>
+          <w:tab w:val="num" w:pos="5760"/>
+        </w:tabs>
+        <w:ind w:left="5760" w:hanging="360"/>
+      </w:pPr>
+      <w:rPr>
+        <w:rFonts w:ascii="Wingdings" w:hAnsi="Wingdings" w:hint="default"/>
+        <w:sz w:val="20"/>
+      </w:rPr>
+    </w:lvl>
+    <w:lvl w:ilvl="8" w:tentative="1">
+      <w:start w:val="1"/>
+      <w:numFmt w:val="bullet"/>
+      <w:lvlText w:val=""/>
+      <w:lvlJc w:val="left"/>
+      <w:pPr>
+        <w:tabs>
+          <w:tab w:val="num" w:pos="6480"/>
+        </w:tabs>
+        <w:ind w:left="6480" w:hanging="360"/>
+      </w:pPr>
+      <w:rPr>
+        <w:rFonts w:ascii="Wingdings" w:hAnsi="Wingdings" w:hint="default"/>
+        <w:sz w:val="20"/>
+      </w:rPr>
+    </w:lvl>
+  </w:abstractNum>
+  <w:abstractNum w:abstractNumId="23" w15:restartNumberingAfterBreak="0">
     <w:nsid w:val="777C2B71"/>
     <w:multiLevelType w:val="multilevel"/>
     <w:tmpl w:val="5B9AADF4"/>
@@ -13742,7 +15940,7 @@
       </w:pPr>
     </w:lvl>
   </w:abstractNum>
-  <w:abstractNum w:abstractNumId="21" w15:restartNumberingAfterBreak="0">
+  <w:abstractNum w:abstractNumId="24" w15:restartNumberingAfterBreak="0">
     <w:nsid w:val="7BD43F44"/>
     <w:multiLevelType w:val="multilevel"/>
     <w:tmpl w:val="63DEC1F6"/>
@@ -13888,7 +16086,7 @@
       </w:rPr>
     </w:lvl>
   </w:abstractNum>
-  <w:abstractNum w:abstractNumId="22" w15:restartNumberingAfterBreak="0">
+  <w:abstractNum w:abstractNumId="25" w15:restartNumberingAfterBreak="0">
     <w:nsid w:val="7FE3768F"/>
     <w:multiLevelType w:val="multilevel"/>
     <w:tmpl w:val="5C4ADD8C"/>
@@ -14038,58 +16236,58 @@
     </w:lvl>
   </w:abstractNum>
   <w:num w:numId="1" w16cid:durableId="250549708">
-    <w:abstractNumId w:val="6"/>
+    <w:abstractNumId w:val="7"/>
   </w:num>
   <w:num w:numId="2" w16cid:durableId="1753315047">
-    <w:abstractNumId w:val="20"/>
+    <w:abstractNumId w:val="23"/>
   </w:num>
   <w:num w:numId="3" w16cid:durableId="1325665506">
+    <w:abstractNumId w:val="16"/>
+  </w:num>
+  <w:num w:numId="4" w16cid:durableId="1891721260">
+    <w:abstractNumId w:val="19"/>
+  </w:num>
+  <w:num w:numId="5" w16cid:durableId="51119003">
     <w:abstractNumId w:val="15"/>
   </w:num>
-  <w:num w:numId="4" w16cid:durableId="1891721260">
-    <w:abstractNumId w:val="18"/>
-  </w:num>
-  <w:num w:numId="5" w16cid:durableId="51119003">
-    <w:abstractNumId w:val="14"/>
-  </w:num>
   <w:num w:numId="6" w16cid:durableId="1696341208">
-    <w:abstractNumId w:val="4"/>
+    <w:abstractNumId w:val="5"/>
   </w:num>
   <w:num w:numId="7" w16cid:durableId="273513776">
-    <w:abstractNumId w:val="16"/>
+    <w:abstractNumId w:val="17"/>
   </w:num>
   <w:num w:numId="8" w16cid:durableId="786923351">
-    <w:abstractNumId w:val="11"/>
+    <w:abstractNumId w:val="12"/>
   </w:num>
   <w:num w:numId="9" w16cid:durableId="945383382">
-    <w:abstractNumId w:val="19"/>
+    <w:abstractNumId w:val="20"/>
   </w:num>
   <w:num w:numId="10" w16cid:durableId="1711414526">
     <w:abstractNumId w:val="0"/>
   </w:num>
   <w:num w:numId="11" w16cid:durableId="632950178">
-    <w:abstractNumId w:val="12"/>
+    <w:abstractNumId w:val="13"/>
   </w:num>
   <w:num w:numId="12" w16cid:durableId="283468027">
-    <w:abstractNumId w:val="7"/>
+    <w:abstractNumId w:val="8"/>
   </w:num>
   <w:num w:numId="13" w16cid:durableId="285433885">
-    <w:abstractNumId w:val="13"/>
+    <w:abstractNumId w:val="14"/>
   </w:num>
   <w:num w:numId="14" w16cid:durableId="287779776">
-    <w:abstractNumId w:val="21"/>
+    <w:abstractNumId w:val="24"/>
   </w:num>
   <w:num w:numId="15" w16cid:durableId="681784353">
-    <w:abstractNumId w:val="5"/>
+    <w:abstractNumId w:val="6"/>
   </w:num>
   <w:num w:numId="16" w16cid:durableId="582640350">
-    <w:abstractNumId w:val="8"/>
+    <w:abstractNumId w:val="9"/>
   </w:num>
   <w:num w:numId="17" w16cid:durableId="1819687038">
-    <w:abstractNumId w:val="22"/>
+    <w:abstractNumId w:val="25"/>
   </w:num>
   <w:num w:numId="18" w16cid:durableId="1829443273">
-    <w:abstractNumId w:val="3"/>
+    <w:abstractNumId w:val="4"/>
   </w:num>
   <w:num w:numId="19" w16cid:durableId="367949055">
     <w:abstractNumId w:val="2"/>
@@ -14098,13 +16296,22 @@
     <w:abstractNumId w:val="1"/>
   </w:num>
   <w:num w:numId="21" w16cid:durableId="1188173754">
-    <w:abstractNumId w:val="17"/>
+    <w:abstractNumId w:val="18"/>
   </w:num>
   <w:num w:numId="22" w16cid:durableId="1867979134">
-    <w:abstractNumId w:val="9"/>
+    <w:abstractNumId w:val="10"/>
   </w:num>
   <w:num w:numId="23" w16cid:durableId="966817049">
-    <w:abstractNumId w:val="10"/>
+    <w:abstractNumId w:val="11"/>
+  </w:num>
+  <w:num w:numId="24" w16cid:durableId="1281960635">
+    <w:abstractNumId w:val="21"/>
+  </w:num>
+  <w:num w:numId="25" w16cid:durableId="859202939">
+    <w:abstractNumId w:val="3"/>
+  </w:num>
+  <w:num w:numId="26" w16cid:durableId="1894191845">
+    <w:abstractNumId w:val="22"/>
   </w:num>
 </w:numbering>
 </file>
@@ -14711,7 +16918,6 @@
   <w:style w:type="character" w:default="1" w:styleId="a0">
     <w:name w:val="Default Paragraph Font"/>
     <w:uiPriority w:val="1"/>
-    <w:semiHidden/>
     <w:unhideWhenUsed/>
   </w:style>
   <w:style w:type="table" w:default="1" w:styleId="a1">

</xml_diff>

<commit_message>
Optimize Login UI: Role Tabs, Google Auth, then Email Form
</commit_message>
<xml_diff>
--- a/主題小売り業界向けの売上高改善の向けサイネージ広告共同運用の提案.docx
+++ b/主題小売り業界向けの売上高改善の向けサイネージ広告共同運用の提案.docx
@@ -8810,7 +8810,19 @@
         <w:rPr>
           <w:rFonts w:hint="eastAsia"/>
         </w:rPr>
-        <w:t>無料(AI翻訳・生成AIでマニュアル作成は実費1つ500円)</w:t>
+        <w:t>無料(AI翻訳・生成AIでマニュアル作成は実費</w:t>
+      </w:r>
+      <w:r>
+        <w:rPr>
+          <w:rFonts w:hint="eastAsia"/>
+        </w:rPr>
+        <w:t>費用</w:t>
+      </w:r>
+      <w:r>
+        <w:rPr>
+          <w:rFonts w:hint="eastAsia"/>
+        </w:rPr>
+        <w:t>500円)</w:t>
       </w:r>
     </w:p>
     <w:p>
@@ -10111,6 +10123,47 @@
         <w:snapToGrid w:val="0"/>
         <w:spacing w:line="240" w:lineRule="atLeast"/>
         <w:ind w:left="1440"/>
+        <w:rPr>
+          <w:b/>
+          <w:bCs/>
+        </w:rPr>
+      </w:pPr>
+      <w:r>
+        <w:rPr>
+          <w:rFonts w:hint="eastAsia"/>
+          <w:b/>
+          <w:bCs/>
+        </w:rPr>
+        <w:t>※運営企業が運用を慣れたら、パネルを追加するだけで</w:t>
+      </w:r>
+    </w:p>
+    <w:p>
+      <w:pPr>
+        <w:pStyle w:val="a9"/>
+        <w:adjustRightInd w:val="0"/>
+        <w:snapToGrid w:val="0"/>
+        <w:spacing w:line="240" w:lineRule="atLeast"/>
+        <w:ind w:left="1440"/>
+        <w:rPr>
+          <w:rFonts w:hint="eastAsia"/>
+        </w:rPr>
+      </w:pPr>
+      <w:r>
+        <w:rPr>
+          <w:rFonts w:hint="eastAsia"/>
+          <w:b/>
+          <w:bCs/>
+        </w:rPr>
+        <w:t>収益が増える可能性がある</w:t>
+      </w:r>
+    </w:p>
+    <w:p>
+      <w:pPr>
+        <w:pStyle w:val="a9"/>
+        <w:adjustRightInd w:val="0"/>
+        <w:snapToGrid w:val="0"/>
+        <w:spacing w:line="240" w:lineRule="atLeast"/>
+        <w:ind w:left="1440"/>
       </w:pPr>
       <w:r>
         <w:t>売り場面積が広く1店舗に5台</w:t>
@@ -11150,7 +11203,7 @@
           <w:szCs w:val="21"/>
           <w:u w:val="single"/>
         </w:rPr>
-        <w:t>30000パネルの</w:t>
+        <w:t>30</w:t>
       </w:r>
       <w:r>
         <w:rPr>
@@ -11160,7 +11213,7 @@
           <w:szCs w:val="21"/>
           <w:u w:val="single"/>
         </w:rPr>
-        <w:t>メディア</w:t>
+        <w:t>.</w:t>
       </w:r>
       <w:r>
         <w:rPr>
@@ -11170,7 +11223,7 @@
           <w:szCs w:val="21"/>
           <w:u w:val="single"/>
         </w:rPr>
-        <w:t>で</w:t>
+        <w:t>000パネルの</w:t>
       </w:r>
       <w:r>
         <w:rPr>
@@ -11180,7 +11233,7 @@
           <w:szCs w:val="21"/>
           <w:u w:val="single"/>
         </w:rPr>
-        <w:t>規模</w:t>
+        <w:t>メディア</w:t>
       </w:r>
       <w:r>
         <w:rPr>
@@ -11190,6 +11243,26 @@
           <w:szCs w:val="21"/>
           <w:u w:val="single"/>
         </w:rPr>
+        <w:t>で</w:t>
+      </w:r>
+      <w:r>
+        <w:rPr>
+          <w:rFonts w:hint="eastAsia"/>
+          <w:b/>
+          <w:bCs/>
+          <w:szCs w:val="21"/>
+          <w:u w:val="single"/>
+        </w:rPr>
+        <w:t>規模</w:t>
+      </w:r>
+      <w:r>
+        <w:rPr>
+          <w:rFonts w:hint="eastAsia"/>
+          <w:b/>
+          <w:bCs/>
+          <w:szCs w:val="21"/>
+          <w:u w:val="single"/>
+        </w:rPr>
         <w:t>の最大化</w:t>
       </w:r>
       <w:r>
@@ -11228,503 +11301,33 @@
         <w:adjustRightInd w:val="0"/>
         <w:snapToGrid w:val="0"/>
         <w:spacing w:line="240" w:lineRule="atLeast"/>
-      </w:pPr>
-    </w:p>
-    <w:p>
-      <w:pPr>
-        <w:adjustRightInd w:val="0"/>
-        <w:snapToGrid w:val="0"/>
-        <w:spacing w:line="240" w:lineRule="atLeast"/>
-      </w:pPr>
-    </w:p>
-    <w:p>
-      <w:pPr>
-        <w:adjustRightInd w:val="0"/>
-        <w:snapToGrid w:val="0"/>
-        <w:spacing w:line="240" w:lineRule="atLeast"/>
-        <w:rPr>
-          <w:b/>
-          <w:bCs/>
-          <w:lang w:eastAsia="zh-CN"/>
-        </w:rPr>
-      </w:pPr>
-      <w:r>
-        <w:rPr>
-          <w:b/>
-          <w:bCs/>
-          <w:color w:val="000000" w:themeColor="text1"/>
-          <w:sz w:val="28"/>
-          <w:szCs w:val="28"/>
-          <w:lang w:eastAsia="zh-CN"/>
-        </w:rPr>
-        <w:t>合計概算</w:t>
-      </w:r>
-      <w:r>
-        <w:rPr>
-          <w:b/>
-          <w:bCs/>
-          <w:lang w:eastAsia="zh-CN"/>
-        </w:rPr>
-        <w:t>（初期投資）</w:t>
-      </w:r>
-      <w:r>
-        <w:rPr>
-          <w:rFonts w:hint="eastAsia"/>
-          <w:b/>
-          <w:bCs/>
-          <w:lang w:eastAsia="zh-CN"/>
-        </w:rPr>
-        <w:t>8</w:t>
-      </w:r>
-      <w:r>
-        <w:rPr>
-          <w:rFonts w:hint="eastAsia"/>
-          <w:b/>
-          <w:bCs/>
-          <w:lang w:eastAsia="zh-CN"/>
-        </w:rPr>
-        <w:t>0</w:t>
-      </w:r>
-      <w:r>
-        <w:rPr>
-          <w:b/>
-          <w:bCs/>
-          <w:lang w:eastAsia="zh-CN"/>
-        </w:rPr>
-        <w:t>万円（税抜）</w:t>
-      </w:r>
-    </w:p>
-    <w:p>
-      <w:pPr>
-        <w:adjustRightInd w:val="0"/>
-        <w:snapToGrid w:val="0"/>
-        <w:spacing w:line="240" w:lineRule="atLeast"/>
-      </w:pPr>
-      <w:r>
-        <w:rPr>
-          <w:rFonts w:hint="eastAsia"/>
-        </w:rPr>
-        <w:t>※</w:t>
-      </w:r>
-      <w:r>
-        <w:rPr>
-          <w:b/>
-          <w:bCs/>
-        </w:rPr>
-        <w:t>投資回収の考え方</w:t>
-      </w:r>
-    </w:p>
-    <w:p>
-      <w:pPr>
-        <w:numPr>
-          <w:ilvl w:val="0"/>
-          <w:numId w:val="6"/>
-        </w:numPr>
-        <w:adjustRightInd w:val="0"/>
-        <w:snapToGrid w:val="0"/>
-        <w:spacing w:line="240" w:lineRule="atLeast"/>
-      </w:pPr>
-      <w:r>
-        <w:rPr>
-          <w:b/>
-          <w:bCs/>
-        </w:rPr>
-        <w:t>広告収入:</w:t>
-      </w:r>
-      <w:r>
-        <w:t xml:space="preserve"> 1枠あたり月額数</w:t>
-      </w:r>
-      <w:r>
-        <w:rPr>
-          <w:rFonts w:hint="eastAsia"/>
-        </w:rPr>
-        <w:t>十</w:t>
-      </w:r>
-      <w:r>
-        <w:t>万円の広告料を食品メーカー5社から徴収すれば</w:t>
-      </w:r>
-    </w:p>
-    <w:p>
-      <w:pPr>
-        <w:adjustRightInd w:val="0"/>
-        <w:snapToGrid w:val="0"/>
-        <w:spacing w:line="240" w:lineRule="atLeast"/>
-        <w:ind w:left="720"/>
-      </w:pPr>
-      <w:r>
-        <w:t>月</w:t>
-      </w:r>
-      <w:r>
-        <w:rPr>
-          <w:rFonts w:hint="eastAsia"/>
-        </w:rPr>
-        <w:t>5</w:t>
-      </w:r>
-      <w:r>
-        <w:t>0~</w:t>
-      </w:r>
-      <w:r>
-        <w:rPr>
-          <w:rFonts w:hint="eastAsia"/>
-        </w:rPr>
-        <w:t>10</w:t>
-      </w:r>
-      <w:r>
-        <w:t>0万円の直接収益</w:t>
-      </w:r>
-    </w:p>
-    <w:p>
-      <w:pPr>
-        <w:adjustRightInd w:val="0"/>
-        <w:snapToGrid w:val="0"/>
-        <w:spacing w:line="240" w:lineRule="atLeast"/>
-        <w:ind w:left="720"/>
-        <w:rPr>
-          <w:u w:val="single"/>
-        </w:rPr>
-      </w:pPr>
-      <w:r>
-        <w:rPr>
-          <w:rFonts w:hint="eastAsia"/>
-          <w:u w:val="single"/>
-        </w:rPr>
-        <w:t>必要人員は5人で済むと想定</w:t>
-      </w:r>
-    </w:p>
-    <w:p>
-      <w:pPr>
-        <w:adjustRightInd w:val="0"/>
-        <w:snapToGrid w:val="0"/>
-        <w:spacing w:line="240" w:lineRule="atLeast"/>
-        <w:rPr>
-          <w:b/>
-          <w:bCs/>
-        </w:rPr>
-      </w:pPr>
-      <w:r>
-        <w:rPr>
-          <w:b/>
-          <w:bCs/>
-        </w:rPr>
-        <w:t>実施スケジュール（案）</w:t>
-      </w:r>
-    </w:p>
-    <w:p>
-      <w:pPr>
-        <w:numPr>
-          <w:ilvl w:val="0"/>
-          <w:numId w:val="7"/>
-        </w:numPr>
-        <w:adjustRightInd w:val="0"/>
-        <w:snapToGrid w:val="0"/>
-        <w:spacing w:line="240" w:lineRule="atLeast"/>
-      </w:pPr>
-      <w:r>
-        <w:rPr>
-          <w:b/>
-          <w:bCs/>
-        </w:rPr>
-        <w:t>1ヶ月目：準備期</w:t>
-      </w:r>
-    </w:p>
-    <w:p>
-      <w:pPr>
-        <w:numPr>
-          <w:ilvl w:val="1"/>
-          <w:numId w:val="7"/>
-        </w:numPr>
-        <w:adjustRightInd w:val="0"/>
-        <w:snapToGrid w:val="0"/>
-        <w:spacing w:line="240" w:lineRule="atLeast"/>
-      </w:pPr>
-      <w:r>
-        <w:t>中国製サイネージの選定と輸入</w:t>
-      </w:r>
-    </w:p>
-    <w:p>
-      <w:pPr>
-        <w:numPr>
-          <w:ilvl w:val="0"/>
-          <w:numId w:val="7"/>
-        </w:numPr>
-        <w:adjustRightInd w:val="0"/>
-        <w:snapToGrid w:val="0"/>
-        <w:spacing w:line="240" w:lineRule="atLeast"/>
-      </w:pPr>
-      <w:r>
-        <w:rPr>
-          <w:b/>
-          <w:bCs/>
-        </w:rPr>
-        <w:t>2ヶ月目：構築・テスト期</w:t>
-      </w:r>
-    </w:p>
-    <w:p>
-      <w:pPr>
-        <w:numPr>
-          <w:ilvl w:val="1"/>
-          <w:numId w:val="7"/>
-        </w:numPr>
-        <w:adjustRightInd w:val="0"/>
-        <w:snapToGrid w:val="0"/>
-        <w:spacing w:line="240" w:lineRule="atLeast"/>
-      </w:pPr>
-      <w:r>
-        <w:t>サイネージの設置と</w:t>
-      </w:r>
-      <w:r>
-        <w:rPr>
-          <w:rFonts w:hint="eastAsia"/>
-        </w:rPr>
-        <w:t>広告事業</w:t>
-      </w:r>
-      <w:r>
-        <w:t>の初期学習。</w:t>
-      </w:r>
-    </w:p>
-    <w:p>
-      <w:pPr>
-        <w:numPr>
-          <w:ilvl w:val="0"/>
-          <w:numId w:val="7"/>
-        </w:numPr>
-        <w:adjustRightInd w:val="0"/>
-        <w:snapToGrid w:val="0"/>
-        <w:spacing w:line="240" w:lineRule="atLeast"/>
-      </w:pPr>
-      <w:r>
-        <w:rPr>
-          <w:b/>
-          <w:bCs/>
-        </w:rPr>
-        <w:t>3ヶ月目：実証実験（PoC）開始</w:t>
-      </w:r>
-    </w:p>
-    <w:p>
-      <w:pPr>
-        <w:numPr>
-          <w:ilvl w:val="1"/>
-          <w:numId w:val="7"/>
-        </w:numPr>
-        <w:adjustRightInd w:val="0"/>
-        <w:snapToGrid w:val="0"/>
-        <w:spacing w:line="240" w:lineRule="atLeast"/>
-      </w:pPr>
-      <w:r>
-        <w:t>1店舗限定で販売・配信開始。POSデータとサイネージ視聴データの相関をシグモイド関数モデルで分析</w:t>
-      </w:r>
-    </w:p>
-    <w:p>
-      <w:pPr>
-        <w:numPr>
-          <w:ilvl w:val="1"/>
-          <w:numId w:val="7"/>
-        </w:numPr>
-        <w:adjustRightInd w:val="0"/>
-        <w:snapToGrid w:val="0"/>
-        <w:spacing w:line="240" w:lineRule="atLeast"/>
-      </w:pPr>
-      <w:r>
-        <w:rPr>
-          <w:rFonts w:hint="eastAsia"/>
-        </w:rPr>
-        <w:t>検証実験次第で同じ小売り店(スーパー・ドラッグストア等)に対して</w:t>
-      </w:r>
-    </w:p>
-    <w:p>
-      <w:pPr>
-        <w:adjustRightInd w:val="0"/>
-        <w:snapToGrid w:val="0"/>
-        <w:spacing w:line="240" w:lineRule="atLeast"/>
-        <w:ind w:left="1440"/>
-        <w:rPr>
-          <w:b/>
-          <w:bCs/>
-        </w:rPr>
-      </w:pPr>
-      <w:r>
-        <w:rPr>
-          <w:rFonts w:hint="eastAsia"/>
-          <w:b/>
-          <w:bCs/>
-        </w:rPr>
-        <w:t>小売り</w:t>
-      </w:r>
-      <w:r>
-        <w:rPr>
-          <w:rFonts w:hint="eastAsia"/>
-          <w:b/>
-          <w:bCs/>
-        </w:rPr>
-        <w:t>向け</w:t>
-      </w:r>
-      <w:r>
-        <w:rPr>
-          <w:rFonts w:hint="eastAsia"/>
-          <w:b/>
-          <w:bCs/>
-        </w:rPr>
-        <w:t>の</w:t>
-      </w:r>
-      <w:r>
-        <w:rPr>
-          <w:rFonts w:hint="eastAsia"/>
-          <w:b/>
-          <w:bCs/>
-        </w:rPr>
-        <w:t>広告</w:t>
-      </w:r>
-      <w:r>
-        <w:rPr>
-          <w:rFonts w:hint="eastAsia"/>
-          <w:b/>
-          <w:bCs/>
-        </w:rPr>
-        <w:t>システムとして</w:t>
-      </w:r>
-      <w:r>
-        <w:rPr>
-          <w:rFonts w:hint="eastAsia"/>
-          <w:b/>
-          <w:bCs/>
-          <w:szCs w:val="21"/>
-        </w:rPr>
-        <w:t>広告代理店</w:t>
-      </w:r>
-      <w:r>
-        <w:rPr>
-          <w:rFonts w:hint="eastAsia"/>
-          <w:b/>
-          <w:bCs/>
-        </w:rPr>
-        <w:t>と提携</w:t>
-      </w:r>
-      <w:r>
-        <w:rPr>
-          <w:rFonts w:hint="eastAsia"/>
-          <w:b/>
-          <w:bCs/>
-        </w:rPr>
-        <w:t>をして、小売り向けの広告事業の拡大を図る</w:t>
-      </w:r>
-    </w:p>
-    <w:p>
-      <w:pPr>
-        <w:adjustRightInd w:val="0"/>
-        <w:snapToGrid w:val="0"/>
-        <w:spacing w:line="240" w:lineRule="atLeast"/>
-        <w:ind w:left="1440"/>
-        <w:rPr>
-          <w:b/>
-          <w:bCs/>
-        </w:rPr>
-      </w:pPr>
-    </w:p>
-    <w:p>
-      <w:pPr>
-        <w:adjustRightInd w:val="0"/>
-        <w:snapToGrid w:val="0"/>
-        <w:spacing w:line="240" w:lineRule="atLeast"/>
-        <w:rPr>
-          <w:rFonts w:ascii="游明朝" w:eastAsia="游明朝" w:hAnsi="游明朝" w:cs="Arial"/>
-          <w:bCs/>
-          <w:color w:val="000000" w:themeColor="text1"/>
-          <w:kern w:val="0"/>
-          <w:szCs w:val="21"/>
-          <w14:ligatures w14:val="none"/>
-        </w:rPr>
-      </w:pPr>
-      <w:r>
-        <w:rPr>
-          <w:rFonts w:ascii="游明朝" w:eastAsia="游明朝" w:hAnsi="游明朝" w:cs="Arial"/>
-          <w:bCs/>
-          <w:kern w:val="0"/>
-          <w:szCs w:val="21"/>
-          <w14:ligatures w14:val="none"/>
-        </w:rPr>
-        <w:t>店舗モデル：実証実験（PoC）</w:t>
-      </w:r>
-      <w:r>
-        <w:rPr>
-          <w:rFonts w:ascii="游明朝" w:eastAsia="游明朝" w:hAnsi="游明朝" w:cs="Arial"/>
-          <w:bCs/>
-          <w:color w:val="000000" w:themeColor="text1"/>
-          <w:kern w:val="0"/>
-          <w:szCs w:val="21"/>
-          <w14:ligatures w14:val="none"/>
-        </w:rPr>
-        <w:t>コスト</w:t>
-      </w:r>
-      <w:r>
-        <w:rPr>
-          <w:rFonts w:ascii="游明朝" w:eastAsia="游明朝" w:hAnsi="游明朝" w:cs="Arial" w:hint="eastAsia"/>
-          <w:bCs/>
-          <w:color w:val="000000" w:themeColor="text1"/>
-          <w:kern w:val="0"/>
-          <w:szCs w:val="21"/>
-          <w14:ligatures w14:val="none"/>
-        </w:rPr>
-        <w:t>全体の</w:t>
-      </w:r>
-      <w:r>
-        <w:rPr>
-          <w:rFonts w:ascii="游明朝" w:eastAsia="游明朝" w:hAnsi="游明朝" w:cs="Arial"/>
-          <w:bCs/>
-          <w:color w:val="000000" w:themeColor="text1"/>
-          <w:kern w:val="0"/>
-          <w:szCs w:val="21"/>
-          <w14:ligatures w14:val="none"/>
-        </w:rPr>
-        <w:t>試算表</w:t>
-      </w:r>
-      <w:r>
-        <w:rPr>
-          <w:rFonts w:ascii="游明朝" w:eastAsia="游明朝" w:hAnsi="游明朝" w:cs="Arial" w:hint="eastAsia"/>
-          <w:bCs/>
-          <w:color w:val="000000" w:themeColor="text1"/>
-          <w:kern w:val="0"/>
-          <w:szCs w:val="21"/>
-          <w14:ligatures w14:val="none"/>
-        </w:rPr>
-        <w:t xml:space="preserve">　</w:t>
-      </w:r>
-      <w:r>
-        <w:rPr>
-          <w:rFonts w:ascii="游明朝" w:eastAsia="游明朝" w:hAnsi="游明朝" w:cs="Arial"/>
-          <w:b/>
-          <w:bCs/>
-          <w:color w:val="000000" w:themeColor="text1"/>
-          <w:kern w:val="0"/>
-          <w:szCs w:val="21"/>
-          <w14:ligatures w14:val="none"/>
-        </w:rPr>
-        <w:t>縦 100cm × 横 100cm</w:t>
-      </w:r>
-      <w:r>
-        <w:rPr>
-          <w:rFonts w:ascii="游明朝" w:eastAsia="游明朝" w:hAnsi="游明朝" w:cs="Arial"/>
-          <w:bCs/>
-          <w:color w:val="000000" w:themeColor="text1"/>
-          <w:kern w:val="0"/>
-          <w:szCs w:val="21"/>
-          <w14:ligatures w14:val="none"/>
-        </w:rPr>
-        <w:t xml:space="preserve"> （1m × 1m）</w:t>
+        <w:rPr>
+          <w:b/>
+          <w:bCs/>
+        </w:rPr>
+      </w:pPr>
+      <w:r>
+        <w:rPr>
+          <w:b/>
+          <w:bCs/>
+        </w:rPr>
+        <w:t>1. 300台導入の総コスト試算（概算）</w:t>
+      </w:r>
+    </w:p>
+    <w:p>
+      <w:pPr>
+        <w:adjustRightInd w:val="0"/>
+        <w:snapToGrid w:val="0"/>
+        <w:spacing w:line="240" w:lineRule="atLeast"/>
+      </w:pPr>
+      <w:r>
+        <w:t>300枚規模の発注（MOQ 100枚以上）になると、アリババのサプライヤーとの直接交渉により、単価を25%〜30%程度抑えることが可能です。</w:t>
       </w:r>
     </w:p>
     <w:tbl>
       <w:tblPr>
         <w:tblW w:w="0" w:type="auto"/>
         <w:tblCellSpacing w:w="15" w:type="dxa"/>
-        <w:tblBorders>
-          <w:top w:val="single" w:sz="2" w:space="0" w:color="auto"/>
-          <w:left w:val="single" w:sz="2" w:space="0" w:color="auto"/>
-          <w:bottom w:val="single" w:sz="4" w:space="0" w:color="auto"/>
-          <w:right w:val="single" w:sz="2" w:space="0" w:color="auto"/>
-          <w:insideH w:val="single" w:sz="6" w:space="0" w:color="auto"/>
-          <w:insideV w:val="single" w:sz="6" w:space="0" w:color="auto"/>
-        </w:tblBorders>
-        <w:shd w:val="clear" w:color="auto" w:fill="FFFFFF" w:themeFill="background1"/>
         <w:tblCellMar>
           <w:top w:w="15" w:type="dxa"/>
           <w:left w:w="15" w:type="dxa"/>
@@ -11734,10 +11337,10 @@
         <w:tblLook w:val="04A0" w:firstRow="1" w:lastRow="0" w:firstColumn="1" w:lastColumn="0" w:noHBand="0" w:noVBand="1"/>
       </w:tblPr>
       <w:tblGrid>
-        <w:gridCol w:w="1575"/>
-        <w:gridCol w:w="1581"/>
-        <w:gridCol w:w="1753"/>
-        <w:gridCol w:w="3589"/>
+        <w:gridCol w:w="2207"/>
+        <w:gridCol w:w="2342"/>
+        <w:gridCol w:w="1345"/>
+        <w:gridCol w:w="2594"/>
       </w:tblGrid>
       <w:tr>
         <w:trPr>
@@ -11747,20 +11350,25 @@
         <w:tc>
           <w:tcPr>
             <w:tcW w:w="0" w:type="auto"/>
-            <w:shd w:val="clear" w:color="auto" w:fill="FFFFFF" w:themeFill="background1"/>
+            <w:tcBorders>
+              <w:top w:val="single" w:sz="6" w:space="0" w:color="auto"/>
+              <w:left w:val="single" w:sz="6" w:space="0" w:color="auto"/>
+              <w:bottom w:val="single" w:sz="6" w:space="0" w:color="auto"/>
+              <w:right w:val="single" w:sz="6" w:space="0" w:color="auto"/>
+            </w:tcBorders>
             <w:vAlign w:val="center"/>
             <w:hideMark/>
           </w:tcPr>
           <w:p>
             <w:pPr>
+              <w:adjustRightInd w:val="0"/>
               <w:snapToGrid w:val="0"/>
-              <w:rPr>
-                <w:color w:val="000000" w:themeColor="text1"/>
-              </w:rPr>
+              <w:spacing w:line="240" w:lineRule="atLeast"/>
             </w:pPr>
             <w:r>
               <w:rPr>
-                <w:color w:val="000000" w:themeColor="text1"/>
+                <w:b/>
+                <w:bCs/>
               </w:rPr>
               <w:t>項目</w:t>
             </w:r>
@@ -11769,64 +11377,79 @@
         <w:tc>
           <w:tcPr>
             <w:tcW w:w="0" w:type="auto"/>
-            <w:shd w:val="clear" w:color="auto" w:fill="FFFFFF" w:themeFill="background1"/>
+            <w:tcBorders>
+              <w:top w:val="single" w:sz="6" w:space="0" w:color="auto"/>
+              <w:left w:val="single" w:sz="6" w:space="0" w:color="auto"/>
+              <w:bottom w:val="single" w:sz="6" w:space="0" w:color="auto"/>
+              <w:right w:val="single" w:sz="6" w:space="0" w:color="auto"/>
+            </w:tcBorders>
             <w:vAlign w:val="center"/>
             <w:hideMark/>
           </w:tcPr>
           <w:p>
             <w:pPr>
+              <w:adjustRightInd w:val="0"/>
               <w:snapToGrid w:val="0"/>
-              <w:rPr>
-                <w:color w:val="000000" w:themeColor="text1"/>
-              </w:rPr>
+              <w:spacing w:line="240" w:lineRule="atLeast"/>
             </w:pPr>
             <w:r>
               <w:rPr>
-                <w:color w:val="000000" w:themeColor="text1"/>
+                <w:b/>
+                <w:bCs/>
               </w:rPr>
-              <w:t>単価（1台：約1㎡想定）</w:t>
+              <w:t>300台一括の単価（目安）</w:t>
             </w:r>
           </w:p>
         </w:tc>
         <w:tc>
           <w:tcPr>
             <w:tcW w:w="0" w:type="auto"/>
-            <w:shd w:val="clear" w:color="auto" w:fill="FFFFFF" w:themeFill="background1"/>
+            <w:tcBorders>
+              <w:top w:val="single" w:sz="6" w:space="0" w:color="auto"/>
+              <w:left w:val="single" w:sz="6" w:space="0" w:color="auto"/>
+              <w:bottom w:val="single" w:sz="6" w:space="0" w:color="auto"/>
+              <w:right w:val="single" w:sz="6" w:space="0" w:color="auto"/>
+            </w:tcBorders>
             <w:vAlign w:val="center"/>
             <w:hideMark/>
           </w:tcPr>
           <w:p>
             <w:pPr>
+              <w:adjustRightInd w:val="0"/>
               <w:snapToGrid w:val="0"/>
-              <w:rPr>
-                <w:color w:val="000000" w:themeColor="text1"/>
-              </w:rPr>
+              <w:spacing w:line="240" w:lineRule="atLeast"/>
             </w:pPr>
             <w:r>
               <w:rPr>
-                <w:color w:val="000000" w:themeColor="text1"/>
+                <w:b/>
+                <w:bCs/>
               </w:rPr>
-              <w:t>300台の総計（60社×5台）</w:t>
+              <w:t>合計金額</w:t>
             </w:r>
           </w:p>
         </w:tc>
         <w:tc>
           <w:tcPr>
             <w:tcW w:w="0" w:type="auto"/>
-            <w:shd w:val="clear" w:color="auto" w:fill="FFFFFF" w:themeFill="background1"/>
+            <w:tcBorders>
+              <w:top w:val="single" w:sz="6" w:space="0" w:color="auto"/>
+              <w:left w:val="single" w:sz="6" w:space="0" w:color="auto"/>
+              <w:bottom w:val="single" w:sz="6" w:space="0" w:color="auto"/>
+              <w:right w:val="single" w:sz="6" w:space="0" w:color="auto"/>
+            </w:tcBorders>
             <w:vAlign w:val="center"/>
             <w:hideMark/>
           </w:tcPr>
           <w:p>
             <w:pPr>
+              <w:adjustRightInd w:val="0"/>
               <w:snapToGrid w:val="0"/>
-              <w:rPr>
-                <w:color w:val="000000" w:themeColor="text1"/>
-              </w:rPr>
+              <w:spacing w:line="240" w:lineRule="atLeast"/>
             </w:pPr>
             <w:r>
               <w:rPr>
-                <w:color w:val="000000" w:themeColor="text1"/>
+                <w:b/>
+                <w:bCs/>
               </w:rPr>
               <w:t>備考</w:t>
             </w:r>
@@ -11840,88 +11463,104 @@
         <w:tc>
           <w:tcPr>
             <w:tcW w:w="0" w:type="auto"/>
-            <w:shd w:val="clear" w:color="auto" w:fill="FFFFFF" w:themeFill="background1"/>
+            <w:tcBorders>
+              <w:top w:val="single" w:sz="6" w:space="0" w:color="auto"/>
+              <w:left w:val="single" w:sz="6" w:space="0" w:color="auto"/>
+              <w:bottom w:val="single" w:sz="6" w:space="0" w:color="auto"/>
+              <w:right w:val="single" w:sz="6" w:space="0" w:color="auto"/>
+            </w:tcBorders>
             <w:vAlign w:val="center"/>
             <w:hideMark/>
           </w:tcPr>
           <w:p>
             <w:pPr>
+              <w:adjustRightInd w:val="0"/>
               <w:snapToGrid w:val="0"/>
-              <w:rPr>
-                <w:color w:val="000000" w:themeColor="text1"/>
-              </w:rPr>
+              <w:spacing w:line="240" w:lineRule="atLeast"/>
             </w:pPr>
             <w:r>
               <w:rPr>
-                <w:color w:val="000000" w:themeColor="text1"/>
+                <w:b/>
+                <w:bCs/>
               </w:rPr>
-              <w:t>機材調達費</w:t>
+              <w:t>LEDパネル (P8クラス)</w:t>
             </w:r>
           </w:p>
         </w:tc>
         <w:tc>
           <w:tcPr>
             <w:tcW w:w="0" w:type="auto"/>
-            <w:shd w:val="clear" w:color="auto" w:fill="FFFFFF" w:themeFill="background1"/>
+            <w:tcBorders>
+              <w:top w:val="single" w:sz="6" w:space="0" w:color="auto"/>
+              <w:left w:val="single" w:sz="6" w:space="0" w:color="auto"/>
+              <w:bottom w:val="single" w:sz="6" w:space="0" w:color="auto"/>
+              <w:right w:val="single" w:sz="6" w:space="0" w:color="auto"/>
+            </w:tcBorders>
             <w:vAlign w:val="center"/>
             <w:hideMark/>
           </w:tcPr>
           <w:p>
             <w:pPr>
+              <w:adjustRightInd w:val="0"/>
               <w:snapToGrid w:val="0"/>
-              <w:rPr>
-                <w:color w:val="000000" w:themeColor="text1"/>
-              </w:rPr>
+              <w:spacing w:line="240" w:lineRule="atLeast"/>
             </w:pPr>
             <w:r>
               <w:rPr>
-                <w:color w:val="000000" w:themeColor="text1"/>
+                <w:b/>
+                <w:bCs/>
               </w:rPr>
-              <w:t>12万 〜 20万円</w:t>
+              <w:t>28,000円</w:t>
             </w:r>
           </w:p>
         </w:tc>
         <w:tc>
           <w:tcPr>
             <w:tcW w:w="0" w:type="auto"/>
-            <w:shd w:val="clear" w:color="auto" w:fill="FFFFFF" w:themeFill="background1"/>
+            <w:tcBorders>
+              <w:top w:val="single" w:sz="6" w:space="0" w:color="auto"/>
+              <w:left w:val="single" w:sz="6" w:space="0" w:color="auto"/>
+              <w:bottom w:val="single" w:sz="6" w:space="0" w:color="auto"/>
+              <w:right w:val="single" w:sz="6" w:space="0" w:color="auto"/>
+            </w:tcBorders>
             <w:vAlign w:val="center"/>
             <w:hideMark/>
           </w:tcPr>
           <w:p>
             <w:pPr>
+              <w:adjustRightInd w:val="0"/>
               <w:snapToGrid w:val="0"/>
-              <w:rPr>
-                <w:color w:val="000000" w:themeColor="text1"/>
-              </w:rPr>
+              <w:spacing w:line="240" w:lineRule="atLeast"/>
             </w:pPr>
             <w:r>
               <w:rPr>
-                <w:color w:val="000000" w:themeColor="text1"/>
+                <w:b/>
+                <w:bCs/>
               </w:rPr>
-              <w:t>3,600万 〜 6,000万円</w:t>
+              <w:t>8,400,000円</w:t>
             </w:r>
           </w:p>
         </w:tc>
         <w:tc>
           <w:tcPr>
             <w:tcW w:w="0" w:type="auto"/>
-            <w:shd w:val="clear" w:color="auto" w:fill="FFFFFF" w:themeFill="background1"/>
+            <w:tcBorders>
+              <w:top w:val="single" w:sz="6" w:space="0" w:color="auto"/>
+              <w:left w:val="single" w:sz="6" w:space="0" w:color="auto"/>
+              <w:bottom w:val="single" w:sz="6" w:space="0" w:color="auto"/>
+              <w:right w:val="single" w:sz="6" w:space="0" w:color="auto"/>
+            </w:tcBorders>
             <w:vAlign w:val="center"/>
             <w:hideMark/>
           </w:tcPr>
           <w:p>
             <w:pPr>
+              <w:adjustRightInd w:val="0"/>
               <w:snapToGrid w:val="0"/>
-              <w:rPr>
-                <w:color w:val="000000" w:themeColor="text1"/>
-              </w:rPr>
+              <w:spacing w:line="240" w:lineRule="atLeast"/>
             </w:pPr>
             <w:r>
-              <w:rPr>
-                <w:color w:val="000000" w:themeColor="text1"/>
-              </w:rPr>
-              <w:t>透明LEDフィルム + 制御IC + 送信BOX（コントローラー）</w:t>
+              <w:t>量産価格を適用</w:t>
             </w:r>
           </w:p>
         </w:tc>
@@ -11933,88 +11572,104 @@
         <w:tc>
           <w:tcPr>
             <w:tcW w:w="0" w:type="auto"/>
-            <w:shd w:val="clear" w:color="auto" w:fill="FFFFFF" w:themeFill="background1"/>
+            <w:tcBorders>
+              <w:top w:val="single" w:sz="6" w:space="0" w:color="auto"/>
+              <w:left w:val="single" w:sz="6" w:space="0" w:color="auto"/>
+              <w:bottom w:val="single" w:sz="6" w:space="0" w:color="auto"/>
+              <w:right w:val="single" w:sz="6" w:space="0" w:color="auto"/>
+            </w:tcBorders>
             <w:vAlign w:val="center"/>
             <w:hideMark/>
           </w:tcPr>
           <w:p>
             <w:pPr>
+              <w:adjustRightInd w:val="0"/>
               <w:snapToGrid w:val="0"/>
-              <w:rPr>
-                <w:color w:val="000000" w:themeColor="text1"/>
-              </w:rPr>
+              <w:spacing w:line="240" w:lineRule="atLeast"/>
             </w:pPr>
             <w:r>
               <w:rPr>
-                <w:color w:val="000000" w:themeColor="text1"/>
+                <w:b/>
+                <w:bCs/>
               </w:rPr>
-              <w:t>輸入・国内検品</w:t>
+              <w:t>再生コントローラー</w:t>
             </w:r>
           </w:p>
         </w:tc>
         <w:tc>
           <w:tcPr>
             <w:tcW w:w="0" w:type="auto"/>
-            <w:shd w:val="clear" w:color="auto" w:fill="FFFFFF" w:themeFill="background1"/>
+            <w:tcBorders>
+              <w:top w:val="single" w:sz="6" w:space="0" w:color="auto"/>
+              <w:left w:val="single" w:sz="6" w:space="0" w:color="auto"/>
+              <w:bottom w:val="single" w:sz="6" w:space="0" w:color="auto"/>
+              <w:right w:val="single" w:sz="6" w:space="0" w:color="auto"/>
+            </w:tcBorders>
             <w:vAlign w:val="center"/>
             <w:hideMark/>
           </w:tcPr>
           <w:p>
             <w:pPr>
+              <w:adjustRightInd w:val="0"/>
               <w:snapToGrid w:val="0"/>
-              <w:rPr>
-                <w:color w:val="000000" w:themeColor="text1"/>
-              </w:rPr>
+              <w:spacing w:line="240" w:lineRule="atLeast"/>
             </w:pPr>
             <w:r>
               <w:rPr>
-                <w:color w:val="000000" w:themeColor="text1"/>
+                <w:b/>
+                <w:bCs/>
               </w:rPr>
-              <w:t>約2.5万円</w:t>
+              <w:t>22,000円</w:t>
             </w:r>
           </w:p>
         </w:tc>
         <w:tc>
           <w:tcPr>
             <w:tcW w:w="0" w:type="auto"/>
-            <w:shd w:val="clear" w:color="auto" w:fill="FFFFFF" w:themeFill="background1"/>
+            <w:tcBorders>
+              <w:top w:val="single" w:sz="6" w:space="0" w:color="auto"/>
+              <w:left w:val="single" w:sz="6" w:space="0" w:color="auto"/>
+              <w:bottom w:val="single" w:sz="6" w:space="0" w:color="auto"/>
+              <w:right w:val="single" w:sz="6" w:space="0" w:color="auto"/>
+            </w:tcBorders>
             <w:vAlign w:val="center"/>
             <w:hideMark/>
           </w:tcPr>
           <w:p>
             <w:pPr>
+              <w:adjustRightInd w:val="0"/>
               <w:snapToGrid w:val="0"/>
-              <w:rPr>
-                <w:color w:val="000000" w:themeColor="text1"/>
-              </w:rPr>
+              <w:spacing w:line="240" w:lineRule="atLeast"/>
             </w:pPr>
             <w:r>
               <w:rPr>
-                <w:color w:val="000000" w:themeColor="text1"/>
+                <w:b/>
+                <w:bCs/>
               </w:rPr>
-              <w:t>750万円</w:t>
+              <w:t>6,600,000円</w:t>
             </w:r>
           </w:p>
         </w:tc>
         <w:tc>
           <w:tcPr>
             <w:tcW w:w="0" w:type="auto"/>
-            <w:shd w:val="clear" w:color="auto" w:fill="FFFFFF" w:themeFill="background1"/>
+            <w:tcBorders>
+              <w:top w:val="single" w:sz="6" w:space="0" w:color="auto"/>
+              <w:left w:val="single" w:sz="6" w:space="0" w:color="auto"/>
+              <w:bottom w:val="single" w:sz="6" w:space="0" w:color="auto"/>
+              <w:right w:val="single" w:sz="6" w:space="0" w:color="auto"/>
+            </w:tcBorders>
             <w:vAlign w:val="center"/>
             <w:hideMark/>
           </w:tcPr>
           <w:p>
             <w:pPr>
+              <w:adjustRightInd w:val="0"/>
               <w:snapToGrid w:val="0"/>
-              <w:rPr>
-                <w:color w:val="000000" w:themeColor="text1"/>
-              </w:rPr>
+              <w:spacing w:line="240" w:lineRule="atLeast"/>
             </w:pPr>
             <w:r>
-              <w:rPr>
-                <w:color w:val="000000" w:themeColor="text1"/>
-              </w:rPr>
-              <w:t>関税(無税)・国内消費税(10%)、国際送料、動作確認</w:t>
+              <w:t>共通基板での一括発注</w:t>
             </w:r>
           </w:p>
         </w:tc>
@@ -12026,88 +11681,104 @@
         <w:tc>
           <w:tcPr>
             <w:tcW w:w="0" w:type="auto"/>
-            <w:shd w:val="clear" w:color="auto" w:fill="FFFFFF" w:themeFill="background1"/>
+            <w:tcBorders>
+              <w:top w:val="single" w:sz="6" w:space="0" w:color="auto"/>
+              <w:left w:val="single" w:sz="6" w:space="0" w:color="auto"/>
+              <w:bottom w:val="single" w:sz="6" w:space="0" w:color="auto"/>
+              <w:right w:val="single" w:sz="6" w:space="0" w:color="auto"/>
+            </w:tcBorders>
             <w:vAlign w:val="center"/>
             <w:hideMark/>
           </w:tcPr>
           <w:p>
             <w:pPr>
+              <w:adjustRightInd w:val="0"/>
               <w:snapToGrid w:val="0"/>
-              <w:rPr>
-                <w:color w:val="000000" w:themeColor="text1"/>
-              </w:rPr>
+              <w:spacing w:line="240" w:lineRule="atLeast"/>
             </w:pPr>
             <w:r>
               <w:rPr>
-                <w:color w:val="000000" w:themeColor="text1"/>
+                <w:b/>
+                <w:bCs/>
               </w:rPr>
-              <w:t>設置施工費</w:t>
+              <w:t>電源・専用配線一式</w:t>
             </w:r>
           </w:p>
         </w:tc>
         <w:tc>
           <w:tcPr>
             <w:tcW w:w="0" w:type="auto"/>
-            <w:shd w:val="clear" w:color="auto" w:fill="FFFFFF" w:themeFill="background1"/>
+            <w:tcBorders>
+              <w:top w:val="single" w:sz="6" w:space="0" w:color="auto"/>
+              <w:left w:val="single" w:sz="6" w:space="0" w:color="auto"/>
+              <w:bottom w:val="single" w:sz="6" w:space="0" w:color="auto"/>
+              <w:right w:val="single" w:sz="6" w:space="0" w:color="auto"/>
+            </w:tcBorders>
             <w:vAlign w:val="center"/>
             <w:hideMark/>
           </w:tcPr>
           <w:p>
             <w:pPr>
+              <w:adjustRightInd w:val="0"/>
               <w:snapToGrid w:val="0"/>
-              <w:rPr>
-                <w:color w:val="000000" w:themeColor="text1"/>
-              </w:rPr>
+              <w:spacing w:line="240" w:lineRule="atLeast"/>
             </w:pPr>
             <w:r>
               <w:rPr>
-                <w:color w:val="000000" w:themeColor="text1"/>
+                <w:b/>
+                <w:bCs/>
               </w:rPr>
-              <w:t>約4万円</w:t>
+              <w:t>8,000円</w:t>
             </w:r>
           </w:p>
         </w:tc>
         <w:tc>
           <w:tcPr>
             <w:tcW w:w="0" w:type="auto"/>
-            <w:shd w:val="clear" w:color="auto" w:fill="FFFFFF" w:themeFill="background1"/>
+            <w:tcBorders>
+              <w:top w:val="single" w:sz="6" w:space="0" w:color="auto"/>
+              <w:left w:val="single" w:sz="6" w:space="0" w:color="auto"/>
+              <w:bottom w:val="single" w:sz="6" w:space="0" w:color="auto"/>
+              <w:right w:val="single" w:sz="6" w:space="0" w:color="auto"/>
+            </w:tcBorders>
             <w:vAlign w:val="center"/>
             <w:hideMark/>
           </w:tcPr>
           <w:p>
             <w:pPr>
+              <w:adjustRightInd w:val="0"/>
               <w:snapToGrid w:val="0"/>
-              <w:rPr>
-                <w:color w:val="000000" w:themeColor="text1"/>
-              </w:rPr>
+              <w:spacing w:line="240" w:lineRule="atLeast"/>
             </w:pPr>
             <w:r>
               <w:rPr>
-                <w:color w:val="000000" w:themeColor="text1"/>
+                <w:b/>
+                <w:bCs/>
               </w:rPr>
-              <w:t>1,200万円</w:t>
+              <w:t>2,400,000円</w:t>
             </w:r>
           </w:p>
         </w:tc>
         <w:tc>
           <w:tcPr>
             <w:tcW w:w="0" w:type="auto"/>
-            <w:shd w:val="clear" w:color="auto" w:fill="FFFFFF" w:themeFill="background1"/>
+            <w:tcBorders>
+              <w:top w:val="single" w:sz="6" w:space="0" w:color="auto"/>
+              <w:left w:val="single" w:sz="6" w:space="0" w:color="auto"/>
+              <w:bottom w:val="single" w:sz="6" w:space="0" w:color="auto"/>
+              <w:right w:val="single" w:sz="6" w:space="0" w:color="auto"/>
+            </w:tcBorders>
             <w:vAlign w:val="center"/>
             <w:hideMark/>
           </w:tcPr>
           <w:p>
             <w:pPr>
+              <w:adjustRightInd w:val="0"/>
               <w:snapToGrid w:val="0"/>
-              <w:rPr>
-                <w:color w:val="000000" w:themeColor="text1"/>
-              </w:rPr>
+              <w:spacing w:line="240" w:lineRule="atLeast"/>
             </w:pPr>
             <w:r>
-              <w:rPr>
-                <w:color w:val="000000" w:themeColor="text1"/>
-              </w:rPr>
-              <w:t>ガラス面清掃、フィルム貼付作業、配線隠蔽処理</w:t>
+              <w:t>日本向けPSE対応想定</w:t>
             </w:r>
           </w:p>
         </w:tc>
@@ -12119,95 +11790,100 @@
         <w:tc>
           <w:tcPr>
             <w:tcW w:w="0" w:type="auto"/>
-            <w:shd w:val="clear" w:color="auto" w:fill="FFFFFF" w:themeFill="background1"/>
+            <w:tcBorders>
+              <w:top w:val="single" w:sz="6" w:space="0" w:color="auto"/>
+              <w:left w:val="single" w:sz="6" w:space="0" w:color="auto"/>
+              <w:bottom w:val="single" w:sz="6" w:space="0" w:color="auto"/>
+              <w:right w:val="single" w:sz="6" w:space="0" w:color="auto"/>
+            </w:tcBorders>
             <w:vAlign w:val="center"/>
             <w:hideMark/>
           </w:tcPr>
           <w:p>
             <w:pPr>
+              <w:adjustRightInd w:val="0"/>
               <w:snapToGrid w:val="0"/>
-              <w:rPr>
-                <w:color w:val="000000" w:themeColor="text1"/>
-              </w:rPr>
+              <w:spacing w:line="240" w:lineRule="atLeast"/>
             </w:pPr>
             <w:r>
               <w:rPr>
-                <w:color w:val="000000" w:themeColor="text1"/>
+                <w:b/>
+                <w:bCs/>
               </w:rPr>
-              <w:t>通信機器（無線Wi-Fi）</w:t>
+              <w:t>予備機 (スペア5%)</w:t>
             </w:r>
           </w:p>
         </w:tc>
         <w:tc>
           <w:tcPr>
             <w:tcW w:w="0" w:type="auto"/>
-            <w:shd w:val="clear" w:color="auto" w:fill="FFFFFF" w:themeFill="background1"/>
+            <w:tcBorders>
+              <w:top w:val="single" w:sz="6" w:space="0" w:color="auto"/>
+              <w:left w:val="single" w:sz="6" w:space="0" w:color="auto"/>
+              <w:bottom w:val="single" w:sz="6" w:space="0" w:color="auto"/>
+              <w:right w:val="single" w:sz="6" w:space="0" w:color="auto"/>
+            </w:tcBorders>
             <w:vAlign w:val="center"/>
             <w:hideMark/>
           </w:tcPr>
           <w:p>
             <w:pPr>
+              <w:adjustRightInd w:val="0"/>
               <w:snapToGrid w:val="0"/>
-              <w:rPr>
-                <w:color w:val="000000" w:themeColor="text1"/>
-              </w:rPr>
+              <w:spacing w:line="240" w:lineRule="atLeast"/>
             </w:pPr>
             <w:r>
-              <w:rPr>
-                <w:color w:val="000000" w:themeColor="text1"/>
-              </w:rPr>
-              <w:t>0.5万円</w:t>
+              <w:t>---</w:t>
             </w:r>
           </w:p>
         </w:tc>
         <w:tc>
           <w:tcPr>
             <w:tcW w:w="0" w:type="auto"/>
-            <w:shd w:val="clear" w:color="auto" w:fill="FFFFFF" w:themeFill="background1"/>
+            <w:tcBorders>
+              <w:top w:val="single" w:sz="6" w:space="0" w:color="auto"/>
+              <w:left w:val="single" w:sz="6" w:space="0" w:color="auto"/>
+              <w:bottom w:val="single" w:sz="6" w:space="0" w:color="auto"/>
+              <w:right w:val="single" w:sz="6" w:space="0" w:color="auto"/>
+            </w:tcBorders>
             <w:vAlign w:val="center"/>
             <w:hideMark/>
           </w:tcPr>
           <w:p>
             <w:pPr>
+              <w:adjustRightInd w:val="0"/>
               <w:snapToGrid w:val="0"/>
-              <w:rPr>
-                <w:color w:val="000000" w:themeColor="text1"/>
-              </w:rPr>
+              <w:spacing w:line="240" w:lineRule="atLeast"/>
             </w:pPr>
             <w:r>
               <w:rPr>
-                <w:color w:val="000000" w:themeColor="text1"/>
+                <w:b/>
+                <w:bCs/>
               </w:rPr>
-              <w:t>150万円</w:t>
+              <w:t>870,000円</w:t>
             </w:r>
           </w:p>
         </w:tc>
         <w:tc>
           <w:tcPr>
             <w:tcW w:w="0" w:type="auto"/>
-            <w:shd w:val="clear" w:color="auto" w:fill="FFFFFF" w:themeFill="background1"/>
+            <w:tcBorders>
+              <w:top w:val="single" w:sz="6" w:space="0" w:color="auto"/>
+              <w:left w:val="single" w:sz="6" w:space="0" w:color="auto"/>
+              <w:bottom w:val="single" w:sz="6" w:space="0" w:color="auto"/>
+              <w:right w:val="single" w:sz="6" w:space="0" w:color="auto"/>
+            </w:tcBorders>
             <w:vAlign w:val="center"/>
             <w:hideMark/>
           </w:tcPr>
           <w:p>
             <w:pPr>
+              <w:adjustRightInd w:val="0"/>
               <w:snapToGrid w:val="0"/>
-              <w:rPr>
-                <w:color w:val="000000" w:themeColor="text1"/>
-              </w:rPr>
+              <w:spacing w:line="240" w:lineRule="atLeast"/>
             </w:pPr>
             <w:r>
-              <w:rPr>
-                <w:rFonts w:hint="eastAsia"/>
-                <w:color w:val="000000" w:themeColor="text1"/>
-              </w:rPr>
-              <w:t>専用</w:t>
-            </w:r>
-            <w:r>
-              <w:rPr>
-                <w:color w:val="000000" w:themeColor="text1"/>
-              </w:rPr>
-              <w:t>通信環境構築用（モバイルルーター・SIM初期費用等）</w:t>
+              <w:t>初期不良・破損対応用(15台)</w:t>
             </w:r>
           </w:p>
         </w:tc>
@@ -12219,88 +11895,100 @@
         <w:tc>
           <w:tcPr>
             <w:tcW w:w="0" w:type="auto"/>
-            <w:shd w:val="clear" w:color="auto" w:fill="FFFFFF" w:themeFill="background1"/>
+            <w:tcBorders>
+              <w:top w:val="single" w:sz="6" w:space="0" w:color="auto"/>
+              <w:left w:val="single" w:sz="6" w:space="0" w:color="auto"/>
+              <w:bottom w:val="single" w:sz="6" w:space="0" w:color="auto"/>
+              <w:right w:val="single" w:sz="6" w:space="0" w:color="auto"/>
+            </w:tcBorders>
             <w:vAlign w:val="center"/>
             <w:hideMark/>
           </w:tcPr>
           <w:p>
             <w:pPr>
+              <w:adjustRightInd w:val="0"/>
               <w:snapToGrid w:val="0"/>
-              <w:rPr>
-                <w:color w:val="000000" w:themeColor="text1"/>
-              </w:rPr>
+              <w:spacing w:line="240" w:lineRule="atLeast"/>
             </w:pPr>
             <w:r>
               <w:rPr>
-                <w:color w:val="000000" w:themeColor="text1"/>
+                <w:b/>
+                <w:bCs/>
               </w:rPr>
-              <w:t>予備機（約10%）</w:t>
+              <w:t>国際送料・関税</w:t>
             </w:r>
           </w:p>
         </w:tc>
         <w:tc>
           <w:tcPr>
             <w:tcW w:w="0" w:type="auto"/>
-            <w:shd w:val="clear" w:color="auto" w:fill="FFFFFF" w:themeFill="background1"/>
+            <w:tcBorders>
+              <w:top w:val="single" w:sz="6" w:space="0" w:color="auto"/>
+              <w:left w:val="single" w:sz="6" w:space="0" w:color="auto"/>
+              <w:bottom w:val="single" w:sz="6" w:space="0" w:color="auto"/>
+              <w:right w:val="single" w:sz="6" w:space="0" w:color="auto"/>
+            </w:tcBorders>
             <w:vAlign w:val="center"/>
             <w:hideMark/>
           </w:tcPr>
           <w:p>
             <w:pPr>
+              <w:adjustRightInd w:val="0"/>
               <w:snapToGrid w:val="0"/>
-              <w:rPr>
-                <w:color w:val="000000" w:themeColor="text1"/>
-              </w:rPr>
+              <w:spacing w:line="240" w:lineRule="atLeast"/>
             </w:pPr>
             <w:r>
-              <w:rPr>
-                <w:color w:val="000000" w:themeColor="text1"/>
-              </w:rPr>
-              <w:t>本体価格に準ずる</w:t>
+              <w:t>---</w:t>
             </w:r>
           </w:p>
         </w:tc>
         <w:tc>
           <w:tcPr>
             <w:tcW w:w="0" w:type="auto"/>
-            <w:shd w:val="clear" w:color="auto" w:fill="FFFFFF" w:themeFill="background1"/>
+            <w:tcBorders>
+              <w:top w:val="single" w:sz="6" w:space="0" w:color="auto"/>
+              <w:left w:val="single" w:sz="6" w:space="0" w:color="auto"/>
+              <w:bottom w:val="single" w:sz="6" w:space="0" w:color="auto"/>
+              <w:right w:val="single" w:sz="6" w:space="0" w:color="auto"/>
+            </w:tcBorders>
             <w:vAlign w:val="center"/>
             <w:hideMark/>
           </w:tcPr>
           <w:p>
             <w:pPr>
+              <w:adjustRightInd w:val="0"/>
               <w:snapToGrid w:val="0"/>
-              <w:rPr>
-                <w:color w:val="000000" w:themeColor="text1"/>
-              </w:rPr>
+              <w:spacing w:line="240" w:lineRule="atLeast"/>
             </w:pPr>
             <w:r>
               <w:rPr>
-                <w:color w:val="000000" w:themeColor="text1"/>
+                <w:b/>
+                <w:bCs/>
               </w:rPr>
-              <w:t>360万 〜 600万円</w:t>
+              <w:t>1,500,000円</w:t>
             </w:r>
           </w:p>
         </w:tc>
         <w:tc>
           <w:tcPr>
             <w:tcW w:w="0" w:type="auto"/>
-            <w:shd w:val="clear" w:color="auto" w:fill="FFFFFF" w:themeFill="background1"/>
+            <w:tcBorders>
+              <w:top w:val="single" w:sz="6" w:space="0" w:color="auto"/>
+              <w:left w:val="single" w:sz="6" w:space="0" w:color="auto"/>
+              <w:bottom w:val="single" w:sz="6" w:space="0" w:color="auto"/>
+              <w:right w:val="single" w:sz="6" w:space="0" w:color="auto"/>
+            </w:tcBorders>
             <w:vAlign w:val="center"/>
             <w:hideMark/>
           </w:tcPr>
           <w:p>
             <w:pPr>
+              <w:adjustRightInd w:val="0"/>
               <w:snapToGrid w:val="0"/>
-              <w:rPr>
-                <w:color w:val="000000" w:themeColor="text1"/>
-              </w:rPr>
+              <w:spacing w:line="240" w:lineRule="atLeast"/>
             </w:pPr>
             <w:r>
-              <w:rPr>
-                <w:color w:val="000000" w:themeColor="text1"/>
-              </w:rPr>
-              <w:t>貼付失敗やドット抜け交換用のストック 30台分</w:t>
+              <w:t>コンテナ輸送（船便）を推奨</w:t>
             </w:r>
           </w:p>
         </w:tc>
@@ -12312,93 +12000,611 @@
         <w:tc>
           <w:tcPr>
             <w:tcW w:w="0" w:type="auto"/>
-            <w:shd w:val="clear" w:color="auto" w:fill="FFFFFF" w:themeFill="background1"/>
+            <w:tcBorders>
+              <w:top w:val="single" w:sz="6" w:space="0" w:color="auto"/>
+              <w:left w:val="single" w:sz="6" w:space="0" w:color="auto"/>
+              <w:bottom w:val="single" w:sz="6" w:space="0" w:color="auto"/>
+              <w:right w:val="single" w:sz="6" w:space="0" w:color="auto"/>
+            </w:tcBorders>
             <w:vAlign w:val="center"/>
             <w:hideMark/>
           </w:tcPr>
           <w:p>
             <w:pPr>
+              <w:adjustRightInd w:val="0"/>
               <w:snapToGrid w:val="0"/>
-              <w:rPr>
-                <w:color w:val="000000" w:themeColor="text1"/>
-              </w:rPr>
+              <w:spacing w:line="240" w:lineRule="atLeast"/>
             </w:pPr>
             <w:r>
               <w:rPr>
-                <w:color w:val="000000" w:themeColor="text1"/>
+                <w:b/>
+                <w:bCs/>
               </w:rPr>
-              <w:t>合計（初期投資）</w:t>
+              <w:t>国内配送・倉庫費用</w:t>
             </w:r>
           </w:p>
         </w:tc>
         <w:tc>
           <w:tcPr>
             <w:tcW w:w="0" w:type="auto"/>
-            <w:shd w:val="clear" w:color="auto" w:fill="FFFFFF" w:themeFill="background1"/>
+            <w:tcBorders>
+              <w:top w:val="single" w:sz="6" w:space="0" w:color="auto"/>
+              <w:left w:val="single" w:sz="6" w:space="0" w:color="auto"/>
+              <w:bottom w:val="single" w:sz="6" w:space="0" w:color="auto"/>
+              <w:right w:val="single" w:sz="6" w:space="0" w:color="auto"/>
+            </w:tcBorders>
             <w:vAlign w:val="center"/>
             <w:hideMark/>
           </w:tcPr>
           <w:p>
             <w:pPr>
+              <w:adjustRightInd w:val="0"/>
               <w:snapToGrid w:val="0"/>
-              <w:rPr>
-                <w:color w:val="000000" w:themeColor="text1"/>
-              </w:rPr>
+              <w:spacing w:line="240" w:lineRule="atLeast"/>
             </w:pPr>
             <w:r>
-              <w:rPr>
-                <w:color w:val="000000" w:themeColor="text1"/>
-              </w:rPr>
-              <w:t>19万 〜 27万円</w:t>
+              <w:t>---</w:t>
             </w:r>
           </w:p>
         </w:tc>
         <w:tc>
           <w:tcPr>
             <w:tcW w:w="0" w:type="auto"/>
-            <w:shd w:val="clear" w:color="auto" w:fill="FFFFFF" w:themeFill="background1"/>
+            <w:tcBorders>
+              <w:top w:val="single" w:sz="6" w:space="0" w:color="auto"/>
+              <w:left w:val="single" w:sz="6" w:space="0" w:color="auto"/>
+              <w:bottom w:val="single" w:sz="6" w:space="0" w:color="auto"/>
+              <w:right w:val="single" w:sz="6" w:space="0" w:color="auto"/>
+            </w:tcBorders>
             <w:vAlign w:val="center"/>
             <w:hideMark/>
           </w:tcPr>
           <w:p>
             <w:pPr>
+              <w:adjustRightInd w:val="0"/>
               <w:snapToGrid w:val="0"/>
-              <w:rPr>
-                <w:color w:val="000000" w:themeColor="text1"/>
-              </w:rPr>
+              <w:spacing w:line="240" w:lineRule="atLeast"/>
             </w:pPr>
             <w:r>
               <w:rPr>
-                <w:color w:val="000000" w:themeColor="text1"/>
+                <w:b/>
+                <w:bCs/>
               </w:rPr>
-              <w:t>6,060万 〜 8,700万円</w:t>
+              <w:t>1,000,000円</w:t>
             </w:r>
           </w:p>
         </w:tc>
         <w:tc>
           <w:tcPr>
             <w:tcW w:w="0" w:type="auto"/>
-            <w:shd w:val="clear" w:color="auto" w:fill="FFFFFF" w:themeFill="background1"/>
+            <w:tcBorders>
+              <w:top w:val="single" w:sz="6" w:space="0" w:color="auto"/>
+              <w:left w:val="single" w:sz="6" w:space="0" w:color="auto"/>
+              <w:bottom w:val="single" w:sz="6" w:space="0" w:color="auto"/>
+              <w:right w:val="single" w:sz="6" w:space="0" w:color="auto"/>
+            </w:tcBorders>
             <w:vAlign w:val="center"/>
             <w:hideMark/>
           </w:tcPr>
           <w:p>
             <w:pPr>
+              <w:adjustRightInd w:val="0"/>
               <w:snapToGrid w:val="0"/>
-              <w:rPr>
-                <w:color w:val="000000" w:themeColor="text1"/>
-              </w:rPr>
+              <w:spacing w:line="240" w:lineRule="atLeast"/>
+            </w:pPr>
+            <w:r>
+              <w:t>検品・個別配送費</w:t>
+            </w:r>
+          </w:p>
+        </w:tc>
+      </w:tr>
+      <w:tr>
+        <w:trPr>
+          <w:tblCellSpacing w:w="15" w:type="dxa"/>
+        </w:trPr>
+        <w:tc>
+          <w:tcPr>
+            <w:tcW w:w="0" w:type="auto"/>
+            <w:tcBorders>
+              <w:top w:val="single" w:sz="6" w:space="0" w:color="auto"/>
+              <w:left w:val="single" w:sz="6" w:space="0" w:color="auto"/>
+              <w:bottom w:val="single" w:sz="6" w:space="0" w:color="auto"/>
+              <w:right w:val="single" w:sz="6" w:space="0" w:color="auto"/>
+            </w:tcBorders>
+            <w:vAlign w:val="center"/>
+            <w:hideMark/>
+          </w:tcPr>
+          <w:p>
+            <w:pPr>
+              <w:adjustRightInd w:val="0"/>
+              <w:snapToGrid w:val="0"/>
+              <w:spacing w:line="240" w:lineRule="atLeast"/>
             </w:pPr>
             <w:r>
               <w:rPr>
-                <w:color w:val="000000" w:themeColor="text1"/>
+                <w:b/>
+                <w:bCs/>
               </w:rPr>
-              <w:t>1台あたりの導入パッケージ費用（初期）</w:t>
+              <w:t>合計（機材原価）</w:t>
+            </w:r>
+          </w:p>
+        </w:tc>
+        <w:tc>
+          <w:tcPr>
+            <w:tcW w:w="0" w:type="auto"/>
+            <w:tcBorders>
+              <w:top w:val="single" w:sz="6" w:space="0" w:color="auto"/>
+              <w:left w:val="single" w:sz="6" w:space="0" w:color="auto"/>
+              <w:bottom w:val="single" w:sz="6" w:space="0" w:color="auto"/>
+              <w:right w:val="single" w:sz="6" w:space="0" w:color="auto"/>
+            </w:tcBorders>
+            <w:vAlign w:val="center"/>
+            <w:hideMark/>
+          </w:tcPr>
+          <w:p>
+            <w:pPr>
+              <w:adjustRightInd w:val="0"/>
+              <w:snapToGrid w:val="0"/>
+              <w:spacing w:line="240" w:lineRule="atLeast"/>
+            </w:pPr>
+            <w:r>
+              <w:rPr>
+                <w:b/>
+                <w:bCs/>
+              </w:rPr>
+              <w:t>約6.9万円 / 台</w:t>
+            </w:r>
+          </w:p>
+        </w:tc>
+        <w:tc>
+          <w:tcPr>
+            <w:tcW w:w="0" w:type="auto"/>
+            <w:tcBorders>
+              <w:top w:val="single" w:sz="6" w:space="0" w:color="auto"/>
+              <w:left w:val="single" w:sz="6" w:space="0" w:color="auto"/>
+              <w:bottom w:val="single" w:sz="6" w:space="0" w:color="auto"/>
+              <w:right w:val="single" w:sz="6" w:space="0" w:color="auto"/>
+            </w:tcBorders>
+            <w:vAlign w:val="center"/>
+            <w:hideMark/>
+          </w:tcPr>
+          <w:p>
+            <w:pPr>
+              <w:adjustRightInd w:val="0"/>
+              <w:snapToGrid w:val="0"/>
+              <w:spacing w:line="240" w:lineRule="atLeast"/>
+            </w:pPr>
+            <w:r>
+              <w:rPr>
+                <w:b/>
+                <w:bCs/>
+              </w:rPr>
+              <w:t>20,770,000円</w:t>
+            </w:r>
+          </w:p>
+        </w:tc>
+        <w:tc>
+          <w:tcPr>
+            <w:tcW w:w="0" w:type="auto"/>
+            <w:tcBorders>
+              <w:top w:val="single" w:sz="6" w:space="0" w:color="auto"/>
+              <w:left w:val="single" w:sz="6" w:space="0" w:color="auto"/>
+              <w:bottom w:val="single" w:sz="6" w:space="0" w:color="auto"/>
+              <w:right w:val="single" w:sz="6" w:space="0" w:color="auto"/>
+            </w:tcBorders>
+            <w:vAlign w:val="center"/>
+            <w:hideMark/>
+          </w:tcPr>
+          <w:p>
+            <w:pPr>
+              <w:adjustRightInd w:val="0"/>
+              <w:snapToGrid w:val="0"/>
+              <w:spacing w:line="240" w:lineRule="atLeast"/>
+            </w:pPr>
+            <w:r>
+              <w:t>消費税(10%)別</w:t>
             </w:r>
           </w:p>
         </w:tc>
       </w:tr>
     </w:tbl>
+    <w:p>
+      <w:pPr>
+        <w:adjustRightInd w:val="0"/>
+        <w:snapToGrid w:val="0"/>
+        <w:spacing w:line="240" w:lineRule="atLeast"/>
+      </w:pPr>
+    </w:p>
+    <w:p>
+      <w:pPr>
+        <w:adjustRightInd w:val="0"/>
+        <w:snapToGrid w:val="0"/>
+        <w:spacing w:line="240" w:lineRule="atLeast"/>
+      </w:pPr>
+    </w:p>
+    <w:p>
+      <w:pPr>
+        <w:adjustRightInd w:val="0"/>
+        <w:snapToGrid w:val="0"/>
+        <w:spacing w:line="240" w:lineRule="atLeast"/>
+        <w:rPr>
+          <w:b/>
+          <w:bCs/>
+          <w:lang w:eastAsia="zh-CN"/>
+        </w:rPr>
+      </w:pPr>
+      <w:r>
+        <w:rPr>
+          <w:b/>
+          <w:bCs/>
+          <w:color w:val="000000" w:themeColor="text1"/>
+          <w:sz w:val="28"/>
+          <w:szCs w:val="28"/>
+          <w:lang w:eastAsia="zh-CN"/>
+        </w:rPr>
+        <w:t>合計概算</w:t>
+      </w:r>
+      <w:r>
+        <w:rPr>
+          <w:b/>
+          <w:bCs/>
+          <w:lang w:eastAsia="zh-CN"/>
+        </w:rPr>
+        <w:t>（初期投資）</w:t>
+      </w:r>
+      <w:r>
+        <w:rPr>
+          <w:rFonts w:hint="eastAsia"/>
+          <w:b/>
+          <w:bCs/>
+          <w:lang w:eastAsia="zh-CN"/>
+        </w:rPr>
+        <w:t>8</w:t>
+      </w:r>
+      <w:r>
+        <w:rPr>
+          <w:rFonts w:hint="eastAsia"/>
+          <w:b/>
+          <w:bCs/>
+          <w:lang w:eastAsia="zh-CN"/>
+        </w:rPr>
+        <w:t>0</w:t>
+      </w:r>
+      <w:r>
+        <w:rPr>
+          <w:b/>
+          <w:bCs/>
+          <w:lang w:eastAsia="zh-CN"/>
+        </w:rPr>
+        <w:t>万円（税抜）</w:t>
+      </w:r>
+    </w:p>
+    <w:p>
+      <w:pPr>
+        <w:adjustRightInd w:val="0"/>
+        <w:snapToGrid w:val="0"/>
+        <w:spacing w:line="240" w:lineRule="atLeast"/>
+      </w:pPr>
+      <w:r>
+        <w:rPr>
+          <w:rFonts w:hint="eastAsia"/>
+        </w:rPr>
+        <w:t>※</w:t>
+      </w:r>
+      <w:r>
+        <w:rPr>
+          <w:b/>
+          <w:bCs/>
+        </w:rPr>
+        <w:t>投資回収の考え方</w:t>
+      </w:r>
+    </w:p>
+    <w:p>
+      <w:pPr>
+        <w:numPr>
+          <w:ilvl w:val="0"/>
+          <w:numId w:val="6"/>
+        </w:numPr>
+        <w:adjustRightInd w:val="0"/>
+        <w:snapToGrid w:val="0"/>
+        <w:spacing w:line="240" w:lineRule="atLeast"/>
+      </w:pPr>
+      <w:r>
+        <w:rPr>
+          <w:b/>
+          <w:bCs/>
+        </w:rPr>
+        <w:t>広告収入:</w:t>
+      </w:r>
+      <w:r>
+        <w:t xml:space="preserve"> 1枠あたり月額数</w:t>
+      </w:r>
+      <w:r>
+        <w:rPr>
+          <w:rFonts w:hint="eastAsia"/>
+        </w:rPr>
+        <w:t>十</w:t>
+      </w:r>
+      <w:r>
+        <w:t>万円の広告料を食品メーカー5社から徴収すれば</w:t>
+      </w:r>
+    </w:p>
+    <w:p>
+      <w:pPr>
+        <w:adjustRightInd w:val="0"/>
+        <w:snapToGrid w:val="0"/>
+        <w:spacing w:line="240" w:lineRule="atLeast"/>
+        <w:ind w:left="720"/>
+      </w:pPr>
+      <w:r>
+        <w:t>月</w:t>
+      </w:r>
+      <w:r>
+        <w:rPr>
+          <w:rFonts w:hint="eastAsia"/>
+        </w:rPr>
+        <w:t>5</w:t>
+      </w:r>
+      <w:r>
+        <w:t>0~</w:t>
+      </w:r>
+      <w:r>
+        <w:rPr>
+          <w:rFonts w:hint="eastAsia"/>
+        </w:rPr>
+        <w:t>10</w:t>
+      </w:r>
+      <w:r>
+        <w:t>0万円の直接収益</w:t>
+      </w:r>
+    </w:p>
+    <w:p>
+      <w:pPr>
+        <w:adjustRightInd w:val="0"/>
+        <w:snapToGrid w:val="0"/>
+        <w:spacing w:line="240" w:lineRule="atLeast"/>
+        <w:ind w:left="720"/>
+        <w:rPr>
+          <w:u w:val="single"/>
+        </w:rPr>
+      </w:pPr>
+      <w:r>
+        <w:rPr>
+          <w:rFonts w:hint="eastAsia"/>
+          <w:u w:val="single"/>
+        </w:rPr>
+        <w:t>必要人員は5人で済むと想定</w:t>
+      </w:r>
+    </w:p>
+    <w:p>
+      <w:pPr>
+        <w:adjustRightInd w:val="0"/>
+        <w:snapToGrid w:val="0"/>
+        <w:spacing w:line="240" w:lineRule="atLeast"/>
+        <w:rPr>
+          <w:b/>
+          <w:bCs/>
+        </w:rPr>
+      </w:pPr>
+      <w:r>
+        <w:rPr>
+          <w:b/>
+          <w:bCs/>
+        </w:rPr>
+        <w:t>実施スケジュール（案）</w:t>
+      </w:r>
+    </w:p>
+    <w:p>
+      <w:pPr>
+        <w:numPr>
+          <w:ilvl w:val="0"/>
+          <w:numId w:val="7"/>
+        </w:numPr>
+        <w:adjustRightInd w:val="0"/>
+        <w:snapToGrid w:val="0"/>
+        <w:spacing w:line="240" w:lineRule="atLeast"/>
+      </w:pPr>
+      <w:r>
+        <w:rPr>
+          <w:b/>
+          <w:bCs/>
+        </w:rPr>
+        <w:t>1ヶ月目：準備期</w:t>
+      </w:r>
+    </w:p>
+    <w:p>
+      <w:pPr>
+        <w:numPr>
+          <w:ilvl w:val="1"/>
+          <w:numId w:val="7"/>
+        </w:numPr>
+        <w:adjustRightInd w:val="0"/>
+        <w:snapToGrid w:val="0"/>
+        <w:spacing w:line="240" w:lineRule="atLeast"/>
+      </w:pPr>
+      <w:r>
+        <w:t>中国製サイネージの選定と輸入</w:t>
+      </w:r>
+    </w:p>
+    <w:p>
+      <w:pPr>
+        <w:numPr>
+          <w:ilvl w:val="0"/>
+          <w:numId w:val="7"/>
+        </w:numPr>
+        <w:adjustRightInd w:val="0"/>
+        <w:snapToGrid w:val="0"/>
+        <w:spacing w:line="240" w:lineRule="atLeast"/>
+      </w:pPr>
+      <w:r>
+        <w:rPr>
+          <w:b/>
+          <w:bCs/>
+        </w:rPr>
+        <w:t>2ヶ月目：構築・テスト期</w:t>
+      </w:r>
+    </w:p>
+    <w:p>
+      <w:pPr>
+        <w:numPr>
+          <w:ilvl w:val="1"/>
+          <w:numId w:val="7"/>
+        </w:numPr>
+        <w:adjustRightInd w:val="0"/>
+        <w:snapToGrid w:val="0"/>
+        <w:spacing w:line="240" w:lineRule="atLeast"/>
+      </w:pPr>
+      <w:r>
+        <w:t>サイネージの設置と</w:t>
+      </w:r>
+      <w:r>
+        <w:rPr>
+          <w:rFonts w:hint="eastAsia"/>
+        </w:rPr>
+        <w:t>広告事業</w:t>
+      </w:r>
+      <w:r>
+        <w:t>の初期学習。</w:t>
+      </w:r>
+    </w:p>
+    <w:p>
+      <w:pPr>
+        <w:numPr>
+          <w:ilvl w:val="0"/>
+          <w:numId w:val="7"/>
+        </w:numPr>
+        <w:adjustRightInd w:val="0"/>
+        <w:snapToGrid w:val="0"/>
+        <w:spacing w:line="240" w:lineRule="atLeast"/>
+      </w:pPr>
+      <w:r>
+        <w:rPr>
+          <w:b/>
+          <w:bCs/>
+        </w:rPr>
+        <w:t>3ヶ月目：実証実験（PoC）開始</w:t>
+      </w:r>
+    </w:p>
+    <w:p>
+      <w:pPr>
+        <w:numPr>
+          <w:ilvl w:val="1"/>
+          <w:numId w:val="7"/>
+        </w:numPr>
+        <w:adjustRightInd w:val="0"/>
+        <w:snapToGrid w:val="0"/>
+        <w:spacing w:line="240" w:lineRule="atLeast"/>
+      </w:pPr>
+      <w:r>
+        <w:t>1店舗限定で販売・配信開始。POSデータとサイネージ視聴データの相関をシグモイド関数モデルで分析</w:t>
+      </w:r>
+    </w:p>
+    <w:p>
+      <w:pPr>
+        <w:numPr>
+          <w:ilvl w:val="1"/>
+          <w:numId w:val="7"/>
+        </w:numPr>
+        <w:adjustRightInd w:val="0"/>
+        <w:snapToGrid w:val="0"/>
+        <w:spacing w:line="240" w:lineRule="atLeast"/>
+      </w:pPr>
+      <w:r>
+        <w:rPr>
+          <w:rFonts w:hint="eastAsia"/>
+        </w:rPr>
+        <w:t>検証実験次第で同じ小売り店(スーパー・ドラッグストア等)に対して</w:t>
+      </w:r>
+    </w:p>
+    <w:p>
+      <w:pPr>
+        <w:adjustRightInd w:val="0"/>
+        <w:snapToGrid w:val="0"/>
+        <w:spacing w:line="240" w:lineRule="atLeast"/>
+        <w:ind w:left="1440"/>
+        <w:rPr>
+          <w:b/>
+          <w:bCs/>
+        </w:rPr>
+      </w:pPr>
+      <w:r>
+        <w:rPr>
+          <w:rFonts w:hint="eastAsia"/>
+          <w:b/>
+          <w:bCs/>
+        </w:rPr>
+        <w:t>小売り</w:t>
+      </w:r>
+      <w:r>
+        <w:rPr>
+          <w:rFonts w:hint="eastAsia"/>
+          <w:b/>
+          <w:bCs/>
+        </w:rPr>
+        <w:t>向け</w:t>
+      </w:r>
+      <w:r>
+        <w:rPr>
+          <w:rFonts w:hint="eastAsia"/>
+          <w:b/>
+          <w:bCs/>
+        </w:rPr>
+        <w:t>の</w:t>
+      </w:r>
+      <w:r>
+        <w:rPr>
+          <w:rFonts w:hint="eastAsia"/>
+          <w:b/>
+          <w:bCs/>
+        </w:rPr>
+        <w:t>広告</w:t>
+      </w:r>
+      <w:r>
+        <w:rPr>
+          <w:rFonts w:hint="eastAsia"/>
+          <w:b/>
+          <w:bCs/>
+        </w:rPr>
+        <w:t>システムとして</w:t>
+      </w:r>
+      <w:r>
+        <w:rPr>
+          <w:rFonts w:hint="eastAsia"/>
+          <w:b/>
+          <w:bCs/>
+          <w:szCs w:val="21"/>
+        </w:rPr>
+        <w:t>広告代理店</w:t>
+      </w:r>
+      <w:r>
+        <w:rPr>
+          <w:rFonts w:hint="eastAsia"/>
+          <w:b/>
+          <w:bCs/>
+        </w:rPr>
+        <w:t>と提携</w:t>
+      </w:r>
+      <w:r>
+        <w:rPr>
+          <w:rFonts w:hint="eastAsia"/>
+          <w:b/>
+          <w:bCs/>
+        </w:rPr>
+        <w:t>をして、小売り向けの広告事業の拡大を図る</w:t>
+      </w:r>
+    </w:p>
+    <w:p>
+      <w:pPr>
+        <w:adjustRightInd w:val="0"/>
+        <w:snapToGrid w:val="0"/>
+        <w:spacing w:line="240" w:lineRule="atLeast"/>
+        <w:ind w:left="1440"/>
+        <w:rPr>
+          <w:b/>
+          <w:bCs/>
+        </w:rPr>
+      </w:pPr>
+    </w:p>
     <w:p>
       <w:pPr>
         <w:adjustRightInd w:val="0"/>
@@ -16745,7 +16951,6 @@
     <w:next w:val="a"/>
     <w:link w:val="20"/>
     <w:uiPriority w:val="9"/>
-    <w:semiHidden/>
     <w:unhideWhenUsed/>
     <w:qFormat/>
     <w:rsid w:val="00A2226A"/>
@@ -16959,7 +17164,6 @@
     <w:basedOn w:val="a0"/>
     <w:link w:val="2"/>
     <w:uiPriority w:val="9"/>
-    <w:semiHidden/>
     <w:rsid w:val="00A2226A"/>
     <w:rPr>
       <w:rFonts w:asciiTheme="majorHAnsi" w:eastAsiaTheme="majorEastAsia" w:hAnsiTheme="majorHAnsi" w:cstheme="majorBidi"/>

</xml_diff>

<commit_message>
Update index with Google Auth
</commit_message>
<xml_diff>
--- a/主題小売り業界向けの売上高改善の向けサイネージ広告共同運用の提案.docx
+++ b/主題小売り業界向けの売上高改善の向けサイネージ広告共同運用の提案.docx
@@ -10448,18 +10448,20 @@
         <w:snapToGrid w:val="0"/>
         <w:spacing w:line="240" w:lineRule="atLeast"/>
         <w:ind w:left="1440"/>
-        <w:rPr>
-          <w:b/>
-          <w:bCs/>
-        </w:rPr>
-      </w:pPr>
-      <w:r>
-        <w:rPr>
-          <w:rFonts w:hint="eastAsia"/>
-          <w:b/>
-          <w:bCs/>
-        </w:rPr>
-        <w:t>※運営企業が運用を慣れたら、パネルを追加するだけで</w:t>
+      </w:pPr>
+      <w:r>
+        <w:rPr>
+          <w:rFonts w:hint="eastAsia"/>
+          <w:b/>
+          <w:bCs/>
+        </w:rPr>
+        <w:t>※</w:t>
+      </w:r>
+      <w:r>
+        <w:rPr>
+          <w:rFonts w:hint="eastAsia"/>
+        </w:rPr>
+        <w:t>運営企業が運用を慣れたら、パネルを追加するだけで</w:t>
       </w:r>
     </w:p>
     <w:p>
@@ -10476,8 +10478,6 @@
       <w:r>
         <w:rPr>
           <w:rFonts w:hint="eastAsia"/>
-          <w:b/>
-          <w:bCs/>
         </w:rPr>
         <w:t>収益が増える可能性がある</w:t>
       </w:r>

</xml_diff>

<commit_message>
Remove Google Login from index.html and update LP links
</commit_message>
<xml_diff>
--- a/主題小売り業界向けの売上高改善の向けサイネージ広告共同運用の提案.docx
+++ b/主題小売り業界向けの売上高改善の向けサイネージ広告共同運用の提案.docx
@@ -308,6 +308,63 @@
           <w:szCs w:val="21"/>
         </w:rPr>
       </w:pPr>
+      <w:r>
+        <w:rPr>
+          <w:rFonts w:eastAsia="游明朝"/>
+          <w:b/>
+          <w:bCs/>
+          <w:noProof/>
+          <w:szCs w:val="21"/>
+        </w:rPr>
+        <w:drawing>
+          <wp:inline distT="0" distB="0" distL="0" distR="0" wp14:anchorId="192EAA24" wp14:editId="1AD3D8BD">
+            <wp:extent cx="914400" cy="914400"/>
+            <wp:effectExtent l="0" t="0" r="0" b="0"/>
+            <wp:docPr id="224292407" name="図 1"/>
+            <wp:cNvGraphicFramePr>
+              <a:graphicFrameLocks xmlns:a="http://schemas.openxmlformats.org/drawingml/2006/main" noChangeAspect="1"/>
+            </wp:cNvGraphicFramePr>
+            <a:graphic xmlns:a="http://schemas.openxmlformats.org/drawingml/2006/main">
+              <a:graphicData uri="http://schemas.openxmlformats.org/drawingml/2006/picture">
+                <pic:pic xmlns:pic="http://schemas.openxmlformats.org/drawingml/2006/picture">
+                  <pic:nvPicPr>
+                    <pic:cNvPr id="0" name="Picture 4"/>
+                    <pic:cNvPicPr>
+                      <a:picLocks noChangeAspect="1" noChangeArrowheads="1"/>
+                    </pic:cNvPicPr>
+                  </pic:nvPicPr>
+                  <pic:blipFill>
+                    <a:blip r:embed="rId8">
+                      <a:extLst>
+                        <a:ext uri="{28A0092B-C50C-407E-A947-70E740481C1C}">
+                          <a14:useLocalDpi xmlns:a14="http://schemas.microsoft.com/office/drawing/2010/main" val="0"/>
+                        </a:ext>
+                      </a:extLst>
+                    </a:blip>
+                    <a:srcRect/>
+                    <a:stretch>
+                      <a:fillRect/>
+                    </a:stretch>
+                  </pic:blipFill>
+                  <pic:spPr bwMode="auto">
+                    <a:xfrm>
+                      <a:off x="0" y="0"/>
+                      <a:ext cx="914400" cy="914400"/>
+                    </a:xfrm>
+                    <a:prstGeom prst="rect">
+                      <a:avLst/>
+                    </a:prstGeom>
+                    <a:noFill/>
+                    <a:ln>
+                      <a:noFill/>
+                    </a:ln>
+                  </pic:spPr>
+                </pic:pic>
+              </a:graphicData>
+            </a:graphic>
+          </wp:inline>
+        </w:drawing>
+      </w:r>
     </w:p>
     <w:p>
       <w:pPr>
@@ -414,9 +471,9 @@
           <w:noProof/>
         </w:rPr>
         <w:drawing>
-          <wp:inline distT="0" distB="0" distL="0" distR="0" wp14:anchorId="14E9A32B" wp14:editId="7E684DCC">
-            <wp:extent cx="1729779" cy="1296929"/>
-            <wp:effectExtent l="6985" t="0" r="0" b="0"/>
+          <wp:inline distT="0" distB="0" distL="0" distR="0" wp14:anchorId="14E9A32B" wp14:editId="4C2E8B3F">
+            <wp:extent cx="1036864" cy="777405"/>
+            <wp:effectExtent l="0" t="3810" r="7620" b="7620"/>
             <wp:docPr id="1210125650" name="図 2"/>
             <wp:cNvGraphicFramePr>
               <a:graphicFrameLocks xmlns:a="http://schemas.openxmlformats.org/drawingml/2006/main" noChangeAspect="1"/>
@@ -431,7 +488,7 @@
                     </pic:cNvPicPr>
                   </pic:nvPicPr>
                   <pic:blipFill>
-                    <a:blip r:embed="rId8" cstate="print">
+                    <a:blip r:embed="rId9" cstate="print">
                       <a:extLst>
                         <a:ext uri="{28A0092B-C50C-407E-A947-70E740481C1C}">
                           <a14:useLocalDpi xmlns:a14="http://schemas.microsoft.com/office/drawing/2010/main" val="0"/>
@@ -446,7 +503,7 @@
                   <pic:spPr bwMode="auto">
                     <a:xfrm rot="5400000">
                       <a:off x="0" y="0"/>
-                      <a:ext cx="1746357" cy="1309358"/>
+                      <a:ext cx="1049946" cy="787213"/>
                     </a:xfrm>
                     <a:prstGeom prst="rect">
                       <a:avLst/>
@@ -1006,7 +1063,21 @@
           <w:rFonts w:hint="eastAsia"/>
           <w:szCs w:val="21"/>
         </w:rPr>
-        <w:t>有機・</w:t>
+        <w:t>有機</w:t>
+      </w:r>
+      <w:r>
+        <w:rPr>
+          <w:rFonts w:hint="eastAsia"/>
+          <w:szCs w:val="21"/>
+        </w:rPr>
+        <w:t>(JAS)</w:t>
+      </w:r>
+      <w:r>
+        <w:rPr>
+          <w:rFonts w:hint="eastAsia"/>
+          <w:szCs w:val="21"/>
+        </w:rPr>
+        <w:t>・</w:t>
       </w:r>
       <w:r>
         <w:rPr>
@@ -1899,7 +1970,7 @@
         <w:snapToGrid w:val="0"/>
         <w:spacing w:line="240" w:lineRule="atLeast"/>
         <w:rPr>
-          <w:rFonts w:eastAsia="游明朝" w:hint="eastAsia"/>
+          <w:rFonts w:eastAsia="游明朝"/>
           <w:b/>
           <w:bCs/>
           <w:sz w:val="28"/>
@@ -2279,7 +2350,19 @@
         <w:rPr>
           <w:rFonts w:eastAsia="游明朝"/>
         </w:rPr>
-        <w:t>「面白い動画・役に立つレシピ動画」等（コンテンツ）を流す間に</w:t>
+        <w:t>「面白い動画・役に立つレシピ動画」等（</w:t>
+      </w:r>
+      <w:r>
+        <w:rPr>
+          <w:rFonts w:eastAsia="游明朝" w:hint="eastAsia"/>
+        </w:rPr>
+        <w:t>フック</w:t>
+      </w:r>
+      <w:r>
+        <w:rPr>
+          <w:rFonts w:eastAsia="游明朝"/>
+        </w:rPr>
+        <w:t>コンテンツ）を流す間に</w:t>
       </w:r>
     </w:p>
     <w:p>
@@ -2614,7 +2697,7 @@
         <w:spacing w:line="240" w:lineRule="atLeast"/>
         <w:ind w:left="720"/>
         <w:rPr>
-          <w:rFonts w:eastAsia="游明朝" w:hint="eastAsia"/>
+          <w:rFonts w:eastAsia="游明朝"/>
         </w:rPr>
       </w:pPr>
     </w:p>
@@ -4556,7 +4639,24 @@
         <w:rPr>
           <w:rFonts w:eastAsia="游明朝" w:hint="eastAsia"/>
         </w:rPr>
-        <w:t>は設置スペースを選ばない</w:t>
+        <w:t>は</w:t>
+      </w:r>
+    </w:p>
+    <w:p>
+      <w:pPr>
+        <w:adjustRightInd w:val="0"/>
+        <w:snapToGrid w:val="0"/>
+        <w:spacing w:line="240" w:lineRule="atLeast"/>
+        <w:ind w:left="720"/>
+        <w:rPr>
+          <w:rFonts w:eastAsia="游明朝"/>
+        </w:rPr>
+      </w:pPr>
+      <w:r>
+        <w:rPr>
+          <w:rFonts w:eastAsia="游明朝" w:hint="eastAsia"/>
+        </w:rPr>
+        <w:t>設置スペースを選ばない</w:t>
       </w:r>
     </w:p>
     <w:p>
@@ -4603,7 +4703,7 @@
                     </pic:cNvPicPr>
                   </pic:nvPicPr>
                   <pic:blipFill>
-                    <a:blip r:embed="rId9" cstate="print">
+                    <a:blip r:embed="rId10" cstate="print">
                       <a:extLst>
                         <a:ext uri="{28A0092B-C50C-407E-A947-70E740481C1C}">
                           <a14:useLocalDpi xmlns:a14="http://schemas.microsoft.com/office/drawing/2010/main" val="0"/>
@@ -4640,7 +4740,7 @@
           <w:noProof/>
         </w:rPr>
         <w:drawing>
-          <wp:inline distT="0" distB="0" distL="0" distR="0" wp14:anchorId="3CE421A6" wp14:editId="0508D75E">
+          <wp:inline distT="0" distB="0" distL="0" distR="0" wp14:anchorId="3CE421A6" wp14:editId="11354E5D">
             <wp:extent cx="1074164" cy="1059011"/>
             <wp:effectExtent l="0" t="0" r="0" b="8255"/>
             <wp:docPr id="681950858" name="図 1"/>
@@ -4657,7 +4757,7 @@
                     </pic:cNvPicPr>
                   </pic:nvPicPr>
                   <pic:blipFill>
-                    <a:blip r:embed="rId10" cstate="print">
+                    <a:blip r:embed="rId11" cstate="print">
                       <a:extLst>
                         <a:ext uri="{28A0092B-C50C-407E-A947-70E740481C1C}">
                           <a14:useLocalDpi xmlns:a14="http://schemas.microsoft.com/office/drawing/2010/main" val="0"/>
@@ -4711,7 +4811,7 @@
                     </pic:cNvPicPr>
                   </pic:nvPicPr>
                   <pic:blipFill>
-                    <a:blip r:embed="rId11" cstate="print">
+                    <a:blip r:embed="rId12" cstate="print">
                       <a:extLst>
                         <a:ext uri="{28A0092B-C50C-407E-A947-70E740481C1C}">
                           <a14:useLocalDpi xmlns:a14="http://schemas.microsoft.com/office/drawing/2010/main" val="0"/>
@@ -4896,7 +4996,27 @@
         <w:rPr>
           <w:rFonts w:eastAsia="游明朝"/>
         </w:rPr>
-        <w:t xml:space="preserve"> ガラス全面を覆うと、鮮魚の「鮮度」や「さばく様子」が見えにくくなります。上部3分の1、または左右の端に寄せて「産地情報」や「本日のレシピ」を流すのが最も効果的です。</w:t>
+        <w:t xml:space="preserve"> ガラス全面を覆うと、鮮魚の「鮮度」や「さばく様子」が見えにくくなります。上部3分の1、または左右の端に寄せて「産地情報」や</w:t>
+      </w:r>
+    </w:p>
+    <w:p>
+      <w:pPr>
+        <w:numPr>
+          <w:ilvl w:val="1"/>
+          <w:numId w:val="24"/>
+        </w:numPr>
+        <w:adjustRightInd w:val="0"/>
+        <w:snapToGrid w:val="0"/>
+        <w:spacing w:line="240" w:lineRule="atLeast"/>
+        <w:rPr>
+          <w:rFonts w:eastAsia="游明朝"/>
+        </w:rPr>
+      </w:pPr>
+      <w:r>
+        <w:rPr>
+          <w:rFonts w:eastAsia="游明朝"/>
+        </w:rPr>
+        <w:t>「本日のレシピ」を流すのが最も効果的です。</w:t>
       </w:r>
     </w:p>
     <w:p>
@@ -4913,7 +5033,7 @@
           <w:rFonts w:eastAsia="游明朝"/>
         </w:rPr>
         <w:pict w14:anchorId="08913B22">
-          <v:rect id="_x0000_i1043" style="width:0;height:1.5pt" o:hralign="center" o:hrstd="t" o:hr="t" fillcolor="#a0a0a0" stroked="f">
+          <v:rect id="_x0000_i1025" style="width:0;height:1.5pt" o:hralign="center" o:hrstd="t" o:hr="t" fillcolor="#a0a0a0" stroked="f">
             <v:textbox inset="5.85pt,.7pt,5.85pt,.7pt"/>
           </v:rect>
         </w:pict>
@@ -5050,7 +5170,41 @@
         <w:rPr>
           <w:rFonts w:eastAsia="游明朝"/>
         </w:rPr>
-        <w:t xml:space="preserve"> 扉のフレーム（枠）があるため、1000mm×500mmの標準ユニットを縦に1枚貼るのが収まりが良いです。ビールコーナーであれば、商品の顔（ラベル）を隠さないよう、目線の高さに透過率の高い広告を配置します。</w:t>
+        <w:t xml:space="preserve"> 扉のフレーム（枠）があるため、1000mm×500mmの標準ユニットを縦に1枚貼るのが収まりが良いです。ビールコーナーであれば、</w:t>
+      </w:r>
+    </w:p>
+    <w:p>
+      <w:pPr>
+        <w:adjustRightInd w:val="0"/>
+        <w:snapToGrid w:val="0"/>
+        <w:spacing w:line="240" w:lineRule="atLeast"/>
+        <w:ind w:left="1440"/>
+        <w:rPr>
+          <w:rFonts w:eastAsia="游明朝"/>
+        </w:rPr>
+      </w:pPr>
+      <w:r>
+        <w:rPr>
+          <w:rFonts w:eastAsia="游明朝"/>
+        </w:rPr>
+        <w:t>商品の顔（ラベル）を隠さないよう、目線の高さに透過率の高い広告を</w:t>
+      </w:r>
+    </w:p>
+    <w:p>
+      <w:pPr>
+        <w:adjustRightInd w:val="0"/>
+        <w:snapToGrid w:val="0"/>
+        <w:spacing w:line="240" w:lineRule="atLeast"/>
+        <w:ind w:left="1440"/>
+        <w:rPr>
+          <w:rFonts w:eastAsia="游明朝"/>
+        </w:rPr>
+      </w:pPr>
+      <w:r>
+        <w:rPr>
+          <w:rFonts w:eastAsia="游明朝"/>
+        </w:rPr>
+        <w:t>配置します。</w:t>
       </w:r>
     </w:p>
     <w:p>
@@ -5067,7 +5221,7 @@
           <w:rFonts w:eastAsia="游明朝"/>
         </w:rPr>
         <w:pict w14:anchorId="46962E8A">
-          <v:rect id="_x0000_i1044" style="width:0;height:1.5pt" o:hralign="center" o:hrstd="t" o:hr="t" fillcolor="#a0a0a0" stroked="f">
+          <v:rect id="_x0000_i1026" style="width:0;height:1.5pt" o:hralign="center" o:hrstd="t" o:hr="t" fillcolor="#a0a0a0" stroked="f">
             <v:textbox inset="5.85pt,.7pt,5.85pt,.7pt"/>
           </v:rect>
         </w:pict>
@@ -5271,7 +5425,7 @@
           <w:rFonts w:eastAsia="游明朝"/>
         </w:rPr>
         <w:pict w14:anchorId="0A843DE7">
-          <v:rect id="_x0000_i1045" style="width:0;height:1.5pt" o:hralign="center" o:hrstd="t" o:hr="t" fillcolor="#a0a0a0" stroked="f">
+          <v:rect id="_x0000_i1027" style="width:0;height:1.5pt" o:hralign="center" o:hrstd="t" o:hr="t" fillcolor="#a0a0a0" stroked="f">
             <v:textbox inset="5.85pt,.7pt,5.85pt,.7pt"/>
           </v:rect>
         </w:pict>
@@ -5952,7 +6106,7 @@
         <w:snapToGrid w:val="0"/>
         <w:spacing w:line="240" w:lineRule="atLeast"/>
         <w:rPr>
-          <w:rFonts w:eastAsia="游明朝" w:hint="eastAsia"/>
+          <w:rFonts w:eastAsia="游明朝"/>
         </w:rPr>
       </w:pPr>
     </w:p>
@@ -6656,7 +6810,7 @@
         <w:snapToGrid w:val="0"/>
         <w:spacing w:line="240" w:lineRule="atLeast"/>
         <w:rPr>
-          <w:rFonts w:eastAsia="游明朝" w:hint="eastAsia"/>
+          <w:rFonts w:eastAsia="游明朝"/>
         </w:rPr>
       </w:pPr>
     </w:p>
@@ -6738,7 +6892,7 @@
                     </pic:cNvPicPr>
                   </pic:nvPicPr>
                   <pic:blipFill>
-                    <a:blip r:embed="rId12" cstate="print">
+                    <a:blip r:embed="rId13" cstate="print">
                       <a:extLst>
                         <a:ext uri="{28A0092B-C50C-407E-A947-70E740481C1C}">
                           <a14:useLocalDpi xmlns:a14="http://schemas.microsoft.com/office/drawing/2010/main" val="0"/>
@@ -7155,7 +7309,7 @@
                     </pic:cNvPicPr>
                   </pic:nvPicPr>
                   <pic:blipFill>
-                    <a:blip r:embed="rId13" cstate="print">
+                    <a:blip r:embed="rId14" cstate="print">
                       <a:extLst>
                         <a:ext uri="{28A0092B-C50C-407E-A947-70E740481C1C}">
                           <a14:useLocalDpi xmlns:a14="http://schemas.microsoft.com/office/drawing/2010/main" val="0"/>
@@ -7341,7 +7495,7 @@
                     </pic:cNvPicPr>
                   </pic:nvPicPr>
                   <pic:blipFill>
-                    <a:blip r:embed="rId14" cstate="print">
+                    <a:blip r:embed="rId15" cstate="print">
                       <a:extLst>
                         <a:ext uri="{28A0092B-C50C-407E-A947-70E740481C1C}">
                           <a14:useLocalDpi xmlns:a14="http://schemas.microsoft.com/office/drawing/2010/main" val="0"/>
@@ -7624,7 +7778,7 @@
                     </pic:cNvPicPr>
                   </pic:nvPicPr>
                   <pic:blipFill>
-                    <a:blip r:embed="rId15" cstate="print">
+                    <a:blip r:embed="rId16" cstate="print">
                       <a:extLst>
                         <a:ext uri="{28A0092B-C50C-407E-A947-70E740481C1C}">
                           <a14:useLocalDpi xmlns:a14="http://schemas.microsoft.com/office/drawing/2010/main" val="0"/>
@@ -8735,7 +8889,7 @@
                     </pic:cNvPicPr>
                   </pic:nvPicPr>
                   <pic:blipFill>
-                    <a:blip r:embed="rId16" cstate="print">
+                    <a:blip r:embed="rId17" cstate="print">
                       <a:extLst>
                         <a:ext uri="{28A0092B-C50C-407E-A947-70E740481C1C}">
                           <a14:useLocalDpi xmlns:a14="http://schemas.microsoft.com/office/drawing/2010/main" val="0"/>
@@ -8894,7 +9048,7 @@
                     </pic:cNvPicPr>
                   </pic:nvPicPr>
                   <pic:blipFill>
-                    <a:blip r:embed="rId17" cstate="print">
+                    <a:blip r:embed="rId18" cstate="print">
                       <a:extLst>
                         <a:ext uri="{28A0092B-C50C-407E-A947-70E740481C1C}">
                           <a14:useLocalDpi xmlns:a14="http://schemas.microsoft.com/office/drawing/2010/main" val="0"/>
@@ -9092,9 +9246,6 @@
         <w:adjustRightInd w:val="0"/>
         <w:snapToGrid w:val="0"/>
         <w:spacing w:line="240" w:lineRule="atLeast"/>
-        <w:rPr>
-          <w:rFonts w:hint="eastAsia"/>
-        </w:rPr>
       </w:pPr>
     </w:p>
     <w:p>
@@ -9139,7 +9290,7 @@
                     </pic:cNvPicPr>
                   </pic:nvPicPr>
                   <pic:blipFill>
-                    <a:blip r:embed="rId18" cstate="print">
+                    <a:blip r:embed="rId19" cstate="print">
                       <a:extLst>
                         <a:ext uri="{28A0092B-C50C-407E-A947-70E740481C1C}">
                           <a14:useLocalDpi xmlns:a14="http://schemas.microsoft.com/office/drawing/2010/main" val="0"/>
@@ -9269,7 +9420,7 @@
                     </pic:cNvPicPr>
                   </pic:nvPicPr>
                   <pic:blipFill>
-                    <a:blip r:embed="rId19" cstate="print">
+                    <a:blip r:embed="rId20" cstate="print">
                       <a:extLst>
                         <a:ext uri="{28A0092B-C50C-407E-A947-70E740481C1C}">
                           <a14:useLocalDpi xmlns:a14="http://schemas.microsoft.com/office/drawing/2010/main" val="0"/>
@@ -9611,7 +9762,6 @@
         <w:snapToGrid w:val="0"/>
         <w:spacing w:line="240" w:lineRule="atLeast"/>
         <w:rPr>
-          <w:rFonts w:hint="eastAsia"/>
           <w:b/>
           <w:bCs/>
         </w:rPr>
@@ -9914,9 +10064,6 @@
         <w:adjustRightInd w:val="0"/>
         <w:snapToGrid w:val="0"/>
         <w:spacing w:line="240" w:lineRule="atLeast"/>
-        <w:rPr>
-          <w:rFonts w:hint="eastAsia"/>
-        </w:rPr>
       </w:pPr>
     </w:p>
     <w:p>
@@ -10471,9 +10618,6 @@
         <w:snapToGrid w:val="0"/>
         <w:spacing w:line="240" w:lineRule="atLeast"/>
         <w:ind w:left="1440"/>
-        <w:rPr>
-          <w:rFonts w:hint="eastAsia"/>
-        </w:rPr>
       </w:pPr>
       <w:r>
         <w:rPr>
@@ -10734,9 +10878,6 @@
         <w:snapToGrid w:val="0"/>
         <w:spacing w:line="240" w:lineRule="atLeast"/>
         <w:ind w:left="1440"/>
-        <w:rPr>
-          <w:rFonts w:hint="eastAsia"/>
-        </w:rPr>
       </w:pPr>
       <w:r>
         <w:t>といった大きなクロスセルが発生します。</w:t>
@@ -10764,9 +10905,6 @@
         <w:snapToGrid w:val="0"/>
         <w:spacing w:line="240" w:lineRule="atLeast"/>
         <w:ind w:left="1440"/>
-        <w:rPr>
-          <w:rFonts w:hint="eastAsia"/>
-        </w:rPr>
       </w:pPr>
       <w:r>
         <w:rPr>
@@ -10897,9 +11035,6 @@
         <w:adjustRightInd w:val="0"/>
         <w:snapToGrid w:val="0"/>
         <w:spacing w:line="240" w:lineRule="atLeast"/>
-        <w:rPr>
-          <w:rFonts w:hint="eastAsia"/>
-        </w:rPr>
       </w:pPr>
     </w:p>
     <w:p>
@@ -11412,64 +11547,59 @@
         <w:adjustRightInd w:val="0"/>
         <w:snapToGrid w:val="0"/>
         <w:spacing w:line="240" w:lineRule="atLeast"/>
-        <w:rPr>
-          <w:rFonts w:hint="eastAsia"/>
-        </w:rPr>
-      </w:pPr>
-    </w:p>
-    <w:p>
-      <w:pPr>
-        <w:adjustRightInd w:val="0"/>
-        <w:snapToGrid w:val="0"/>
-        <w:spacing w:line="240" w:lineRule="atLeast"/>
-      </w:pPr>
-    </w:p>
-    <w:p>
-      <w:pPr>
-        <w:adjustRightInd w:val="0"/>
-        <w:snapToGrid w:val="0"/>
-        <w:spacing w:line="240" w:lineRule="atLeast"/>
-      </w:pPr>
-    </w:p>
-    <w:p>
-      <w:pPr>
-        <w:adjustRightInd w:val="0"/>
-        <w:snapToGrid w:val="0"/>
-        <w:spacing w:line="240" w:lineRule="atLeast"/>
-      </w:pPr>
-    </w:p>
-    <w:p>
-      <w:pPr>
-        <w:adjustRightInd w:val="0"/>
-        <w:snapToGrid w:val="0"/>
-        <w:spacing w:line="240" w:lineRule="atLeast"/>
-      </w:pPr>
-    </w:p>
-    <w:p>
-      <w:pPr>
-        <w:adjustRightInd w:val="0"/>
-        <w:snapToGrid w:val="0"/>
-        <w:spacing w:line="240" w:lineRule="atLeast"/>
-      </w:pPr>
-    </w:p>
-    <w:p>
-      <w:pPr>
-        <w:adjustRightInd w:val="0"/>
-        <w:snapToGrid w:val="0"/>
-        <w:spacing w:line="240" w:lineRule="atLeast"/>
-        <w:rPr>
-          <w:rFonts w:hint="eastAsia"/>
-        </w:rPr>
-      </w:pPr>
-    </w:p>
-    <w:p>
-      <w:pPr>
-        <w:adjustRightInd w:val="0"/>
-        <w:snapToGrid w:val="0"/>
-        <w:spacing w:line="240" w:lineRule="atLeast"/>
-        <w:rPr>
-          <w:b/>
-          <w:bCs/>
+      </w:pPr>
+    </w:p>
+    <w:p>
+      <w:pPr>
+        <w:adjustRightInd w:val="0"/>
+        <w:snapToGrid w:val="0"/>
+        <w:spacing w:line="240" w:lineRule="atLeast"/>
+      </w:pPr>
+    </w:p>
+    <w:p>
+      <w:pPr>
+        <w:adjustRightInd w:val="0"/>
+        <w:snapToGrid w:val="0"/>
+        <w:spacing w:line="240" w:lineRule="atLeast"/>
+      </w:pPr>
+    </w:p>
+    <w:p>
+      <w:pPr>
+        <w:adjustRightInd w:val="0"/>
+        <w:snapToGrid w:val="0"/>
+        <w:spacing w:line="240" w:lineRule="atLeast"/>
+      </w:pPr>
+    </w:p>
+    <w:p>
+      <w:pPr>
+        <w:adjustRightInd w:val="0"/>
+        <w:snapToGrid w:val="0"/>
+        <w:spacing w:line="240" w:lineRule="atLeast"/>
+      </w:pPr>
+    </w:p>
+    <w:p>
+      <w:pPr>
+        <w:adjustRightInd w:val="0"/>
+        <w:snapToGrid w:val="0"/>
+        <w:spacing w:line="240" w:lineRule="atLeast"/>
+      </w:pPr>
+    </w:p>
+    <w:p>
+      <w:pPr>
+        <w:adjustRightInd w:val="0"/>
+        <w:snapToGrid w:val="0"/>
+        <w:spacing w:line="240" w:lineRule="atLeast"/>
+      </w:pPr>
+    </w:p>
+    <w:p>
+      <w:pPr>
+        <w:adjustRightInd w:val="0"/>
+        <w:snapToGrid w:val="0"/>
+        <w:spacing w:line="240" w:lineRule="atLeast"/>
+        <w:rPr>
+          <w:b/>
+          <w:bCs/>
+          <w:lang w:eastAsia="zh-CN"/>
         </w:rPr>
       </w:pPr>
       <w:r>
@@ -11541,7 +11671,6 @@
         <w:snapToGrid w:val="0"/>
         <w:spacing w:line="240" w:lineRule="atLeast"/>
         <w:rPr>
-          <w:rFonts w:hint="eastAsia"/>
           <w:b/>
           <w:bCs/>
         </w:rPr>
@@ -12454,7 +12583,6 @@
         <w:snapToGrid w:val="0"/>
         <w:spacing w:line="240" w:lineRule="atLeast"/>
         <w:rPr>
-          <w:rFonts w:hint="eastAsia"/>
           <w:b/>
           <w:bCs/>
         </w:rPr>
@@ -12496,15 +12624,7 @@
           <w:b/>
           <w:bCs/>
         </w:rPr>
-        <w:t>スモールスタート</w:t>
-      </w:r>
-      <w:r>
-        <w:rPr>
-          <w:rFonts w:hint="eastAsia"/>
-          <w:b/>
-          <w:bCs/>
-        </w:rPr>
-        <w:t>80</w:t>
+        <w:t>スモールスタート80</w:t>
       </w:r>
       <w:r>
         <w:rPr>
@@ -12824,29 +12944,6 @@
         </w:rPr>
         <w:t>小売り向けの広告事業の拡大を図る</w:t>
       </w:r>
-    </w:p>
-    <w:p>
-      <w:pPr>
-        <w:adjustRightInd w:val="0"/>
-        <w:snapToGrid w:val="0"/>
-        <w:spacing w:line="240" w:lineRule="atLeast"/>
-        <w:ind w:left="1440"/>
-        <w:rPr>
-          <w:b/>
-          <w:bCs/>
-        </w:rPr>
-      </w:pPr>
-    </w:p>
-    <w:p>
-      <w:pPr>
-        <w:adjustRightInd w:val="0"/>
-        <w:snapToGrid w:val="0"/>
-        <w:spacing w:line="240" w:lineRule="atLeast"/>
-        <w:rPr>
-          <w:b/>
-          <w:bCs/>
-        </w:rPr>
-      </w:pPr>
     </w:p>
     <w:p>
       <w:pPr>
@@ -17355,6 +17452,7 @@
   <w:style w:type="character" w:default="1" w:styleId="a0">
     <w:name w:val="Default Paragraph Font"/>
     <w:uiPriority w:val="1"/>
+    <w:semiHidden/>
     <w:unhideWhenUsed/>
   </w:style>
   <w:style w:type="table" w:default="1" w:styleId="a1">

</xml_diff>

<commit_message>
Enforce max duration on YouTube videos and trigger instant reload
</commit_message>
<xml_diff>
--- a/主題小売り業界向けの売上高改善の向けサイネージ広告共同運用の提案.docx
+++ b/主題小売り業界向けの売上高改善の向けサイネージ広告共同運用の提案.docx
@@ -4856,6 +4856,12 @@
         </w:rPr>
         <w:t>設置スペースを選ばない</w:t>
       </w:r>
+      <w:r>
+        <w:rPr>
+          <w:rFonts w:eastAsia="游明朝" w:hint="eastAsia"/>
+        </w:rPr>
+        <w:t xml:space="preserve">　</w:t>
+      </w:r>
     </w:p>
     <w:p>
       <w:pPr>
@@ -4938,7 +4944,7 @@
           <w:noProof/>
         </w:rPr>
         <w:drawing>
-          <wp:inline distT="0" distB="0" distL="0" distR="0" wp14:anchorId="3CE421A6" wp14:editId="099A5C19">
+          <wp:inline distT="0" distB="0" distL="0" distR="0" wp14:anchorId="3CE421A6" wp14:editId="6D07E9EE">
             <wp:extent cx="1074164" cy="1059011"/>
             <wp:effectExtent l="0" t="0" r="0" b="8255"/>
             <wp:docPr id="681950858" name="図 1"/>
@@ -5439,7 +5445,7 @@
         <w:rPr>
           <w:rFonts w:eastAsia="游明朝"/>
         </w:rPr>
-        <w:t>商品の顔（ラベル）を隠さないよう、目線の高さに透過率の高い広告を</w:t>
+        <w:t>商品の顔（ラベル）を隠さないよう、目線の高さに</w:t>
       </w:r>
     </w:p>
     <w:p>
@@ -5456,7 +5462,7 @@
         <w:rPr>
           <w:rFonts w:eastAsia="游明朝"/>
         </w:rPr>
-        <w:t>配置します。</w:t>
+        <w:t>透過率の高い広告を配置します。</w:t>
       </w:r>
     </w:p>
     <w:p>
@@ -6995,6 +7001,24 @@
           <w:rFonts w:eastAsia="游明朝"/>
         </w:rPr>
       </w:pPr>
+      <w:r>
+        <w:rPr>
+          <w:rFonts w:eastAsia="游明朝" w:hint="eastAsia"/>
+        </w:rPr>
+        <w:t>設置作業で現場の作業はクリックするだけの</w:t>
+      </w:r>
+      <w:r>
+        <w:rPr>
+          <w:rFonts w:eastAsia="游明朝" w:hint="eastAsia"/>
+        </w:rPr>
+        <w:t>3</w:t>
+      </w:r>
+      <w:r>
+        <w:rPr>
+          <w:rFonts w:eastAsia="游明朝" w:hint="eastAsia"/>
+        </w:rPr>
+        <w:t>ステップ</w:t>
+      </w:r>
     </w:p>
     <w:p>
       <w:pPr>

</xml_diff>

<commit_message>
Update removal script to fully revert security features (USB, AutoLogon, User)
</commit_message>
<xml_diff>
--- a/主題小売り業界向けの売上高改善の向けサイネージ広告共同運用の提案.docx
+++ b/主題小売り業界向けの売上高改善の向けサイネージ広告共同運用の提案.docx
@@ -4944,7 +4944,7 @@
           <w:noProof/>
         </w:rPr>
         <w:drawing>
-          <wp:inline distT="0" distB="0" distL="0" distR="0" wp14:anchorId="3CE421A6" wp14:editId="6D07E9EE">
+          <wp:inline distT="0" distB="0" distL="0" distR="0" wp14:anchorId="3CE421A6" wp14:editId="3DDBAF76">
             <wp:extent cx="1074164" cy="1059011"/>
             <wp:effectExtent l="0" t="0" r="0" b="8255"/>
             <wp:docPr id="681950858" name="図 1"/>
@@ -15186,6 +15186,68 @@
     </w:p>
     <w:p>
       <w:pPr>
+        <w:snapToGrid w:val="0"/>
+      </w:pPr>
+      <w:r>
+        <w:rPr>
+          <w:rFonts w:hint="eastAsia"/>
+        </w:rPr>
+        <w:t>ランサムウェア対応済み</w:t>
+      </w:r>
+    </w:p>
+    <w:p>
+      <w:pPr>
+        <w:snapToGrid w:val="0"/>
+      </w:pPr>
+      <w:r>
+        <w:t>1. サーバー環境の「使い捨て」構造（AWS App Runner）</w:t>
+      </w:r>
+    </w:p>
+    <w:p>
+      <w:pPr>
+        <w:snapToGrid w:val="0"/>
+      </w:pPr>
+      <w:r>
+        <w:t>2. メディアファイル等の保護（Amazon S3）</w:t>
+      </w:r>
+    </w:p>
+    <w:p>
+      <w:pPr>
+        <w:snapToGrid w:val="0"/>
+      </w:pPr>
+      <w:r>
+        <w:t>3. データベース化における保護</w:t>
+      </w:r>
+    </w:p>
+    <w:p>
+      <w:pPr>
+        <w:snapToGrid w:val="0"/>
+      </w:pPr>
+      <w:r>
+        <w:t>4. 2段階認証（2FA）</w:t>
+      </w:r>
+    </w:p>
+    <w:p>
+      <w:pPr>
+        <w:snapToGrid w:val="0"/>
+      </w:pPr>
+      <w:r>
+        <w:t>5.店頭サイネージ端末（Windows等）の保護</w:t>
+      </w:r>
+    </w:p>
+    <w:p>
+      <w:pPr>
+        <w:adjustRightInd w:val="0"/>
+        <w:snapToGrid w:val="0"/>
+        <w:spacing w:line="240" w:lineRule="atLeast"/>
+        <w:rPr>
+          <w:rFonts w:hint="eastAsia"/>
+          <w:u w:val="single"/>
+        </w:rPr>
+      </w:pPr>
+    </w:p>
+    <w:p>
+      <w:pPr>
         <w:adjustRightInd w:val="0"/>
         <w:snapToGrid w:val="0"/>
         <w:spacing w:line="240" w:lineRule="atLeast"/>
@@ -15336,35 +15398,15 @@
           <w:b/>
           <w:bCs/>
         </w:rPr>
-        <w:t xml:space="preserve">　　　残り　アンドロイドアプリにする</w:t>
-      </w:r>
-      <w:r>
-        <w:rPr>
-          <w:rFonts w:hint="eastAsia"/>
-          <w:b/>
-          <w:bCs/>
-        </w:rPr>
-        <w:t>(サイネージパネルの</w:t>
-      </w:r>
-    </w:p>
-    <w:p>
-      <w:pPr>
-        <w:adjustRightInd w:val="0"/>
-        <w:snapToGrid w:val="0"/>
-        <w:spacing w:line="240" w:lineRule="atLeast"/>
-        <w:ind w:firstLineChars="600" w:firstLine="1261"/>
-        <w:rPr>
-          <w:b/>
-          <w:bCs/>
-        </w:rPr>
-      </w:pPr>
-      <w:r>
-        <w:rPr>
-          <w:rFonts w:hint="eastAsia"/>
-          <w:b/>
-          <w:bCs/>
-        </w:rPr>
-        <w:t>Googleのカメラ許可の労力の削減)</w:t>
+        <w:t xml:space="preserve">　　　残り　アンドロイドアプリ</w:t>
+      </w:r>
+      <w:r>
+        <w:rPr>
+          <w:rFonts w:hint="eastAsia"/>
+          <w:b/>
+          <w:bCs/>
+        </w:rPr>
+        <w:t>のテスト</w:t>
       </w:r>
     </w:p>
     <w:p>
@@ -15385,6 +15427,11 @@
         </w:rPr>
         <w:t xml:space="preserve">　　　　　　Googleアドセンス・アドマネージャーとの連携</w:t>
       </w:r>
+    </w:p>
+    <w:p>
+      <w:pPr>
+        <w:snapToGrid w:val="0"/>
+      </w:pPr>
     </w:p>
     <w:p>
       <w:pPr>

</xml_diff>

<commit_message>
Add 2FA QR code UI to login portal for admin users
</commit_message>
<xml_diff>
--- a/主題小売り業界向けの売上高改善の向けサイネージ広告共同運用の提案.docx
+++ b/主題小売り業界向けの売上高改善の向けサイネージ広告共同運用の提案.docx
@@ -4944,7 +4944,7 @@
           <w:noProof/>
         </w:rPr>
         <w:drawing>
-          <wp:inline distT="0" distB="0" distL="0" distR="0" wp14:anchorId="3CE421A6" wp14:editId="3DDBAF76">
+          <wp:inline distT="0" distB="0" distL="0" distR="0" wp14:anchorId="3CE421A6" wp14:editId="7C4A31F4">
             <wp:extent cx="1074164" cy="1059011"/>
             <wp:effectExtent l="0" t="0" r="0" b="8255"/>
             <wp:docPr id="681950858" name="図 1"/>
@@ -7763,6 +7763,77 @@
           <w:rFonts w:hint="eastAsia"/>
         </w:rPr>
         <w:t>する想定</w:t>
+      </w:r>
+    </w:p>
+    <w:p>
+      <w:pPr>
+        <w:adjustRightInd w:val="0"/>
+        <w:snapToGrid w:val="0"/>
+        <w:spacing w:line="240" w:lineRule="atLeast"/>
+        <w:ind w:firstLineChars="100" w:firstLine="210"/>
+        <w:rPr>
+          <w:rFonts w:hint="eastAsia"/>
+        </w:rPr>
+      </w:pPr>
+    </w:p>
+    <w:p>
+      <w:pPr>
+        <w:snapToGrid w:val="0"/>
+      </w:pPr>
+      <w:r>
+        <w:rPr>
+          <w:rFonts w:hint="eastAsia"/>
+        </w:rPr>
+        <w:t>ランサムウェア対応済み</w:t>
+      </w:r>
+    </w:p>
+    <w:p>
+      <w:pPr>
+        <w:snapToGrid w:val="0"/>
+      </w:pPr>
+      <w:r>
+        <w:t>1. サーバー環境の「使い捨て」構造（AWS App Runner）</w:t>
+      </w:r>
+    </w:p>
+    <w:p>
+      <w:pPr>
+        <w:snapToGrid w:val="0"/>
+      </w:pPr>
+      <w:r>
+        <w:t>2. メディアファイル等の保護（Amazon S3）</w:t>
+      </w:r>
+    </w:p>
+    <w:p>
+      <w:pPr>
+        <w:snapToGrid w:val="0"/>
+      </w:pPr>
+      <w:r>
+        <w:t>3. データベース化における保護</w:t>
+      </w:r>
+    </w:p>
+    <w:p>
+      <w:pPr>
+        <w:snapToGrid w:val="0"/>
+      </w:pPr>
+      <w:r>
+        <w:t xml:space="preserve">4. </w:t>
+      </w:r>
+      <w:r>
+        <w:rPr>
+          <w:rFonts w:hint="eastAsia"/>
+        </w:rPr>
+        <w:t xml:space="preserve">admin </w:t>
+      </w:r>
+      <w:r>
+        <w:t>2段階認証（2FA）</w:t>
+      </w:r>
+    </w:p>
+    <w:p>
+      <w:pPr>
+        <w:snapToGrid w:val="0"/>
+      </w:pPr>
+      <w:r>
+        <w:t>5.店頭サイネージ端末（Windows等）の保護</w:t>
       </w:r>
     </w:p>
     <w:p>
@@ -15186,62 +15257,10 @@
     </w:p>
     <w:p>
       <w:pPr>
-        <w:snapToGrid w:val="0"/>
-      </w:pPr>
-      <w:r>
-        <w:rPr>
-          <w:rFonts w:hint="eastAsia"/>
-        </w:rPr>
-        <w:t>ランサムウェア対応済み</w:t>
-      </w:r>
-    </w:p>
-    <w:p>
-      <w:pPr>
-        <w:snapToGrid w:val="0"/>
-      </w:pPr>
-      <w:r>
-        <w:t>1. サーバー環境の「使い捨て」構造（AWS App Runner）</w:t>
-      </w:r>
-    </w:p>
-    <w:p>
-      <w:pPr>
-        <w:snapToGrid w:val="0"/>
-      </w:pPr>
-      <w:r>
-        <w:t>2. メディアファイル等の保護（Amazon S3）</w:t>
-      </w:r>
-    </w:p>
-    <w:p>
-      <w:pPr>
-        <w:snapToGrid w:val="0"/>
-      </w:pPr>
-      <w:r>
-        <w:t>3. データベース化における保護</w:t>
-      </w:r>
-    </w:p>
-    <w:p>
-      <w:pPr>
-        <w:snapToGrid w:val="0"/>
-      </w:pPr>
-      <w:r>
-        <w:t>4. 2段階認証（2FA）</w:t>
-      </w:r>
-    </w:p>
-    <w:p>
-      <w:pPr>
-        <w:snapToGrid w:val="0"/>
-      </w:pPr>
-      <w:r>
-        <w:t>5.店頭サイネージ端末（Windows等）の保護</w:t>
-      </w:r>
-    </w:p>
-    <w:p>
-      <w:pPr>
-        <w:adjustRightInd w:val="0"/>
-        <w:snapToGrid w:val="0"/>
-        <w:spacing w:line="240" w:lineRule="atLeast"/>
-        <w:rPr>
-          <w:rFonts w:hint="eastAsia"/>
+        <w:adjustRightInd w:val="0"/>
+        <w:snapToGrid w:val="0"/>
+        <w:spacing w:line="240" w:lineRule="atLeast"/>
+        <w:rPr>
           <w:u w:val="single"/>
         </w:rPr>
       </w:pPr>

</xml_diff>

<commit_message>
Fix Admin Portal: Add logout, skip 2FA for demo, wire signup to 2FA
</commit_message>
<xml_diff>
--- a/主題小売り業界向けの売上高改善の向けサイネージ広告共同運用の提案.docx
+++ b/主題小売り業界向けの売上高改善の向けサイネージ広告共同運用の提案.docx
@@ -15185,6 +15185,25 @@
         <w:spacing w:line="240" w:lineRule="atLeast"/>
         <w:ind w:firstLineChars="100" w:firstLine="210"/>
         <w:rPr>
+          <w:u w:val="single"/>
+        </w:rPr>
+      </w:pPr>
+      <w:r>
+        <w:rPr>
+          <w:rFonts w:hint="eastAsia"/>
+          <w:u w:val="single"/>
+        </w:rPr>
+        <w:t xml:space="preserve">現在の想定のサーバー代は月100円～500円　</w:t>
+      </w:r>
+    </w:p>
+    <w:p>
+      <w:pPr>
+        <w:adjustRightInd w:val="0"/>
+        <w:snapToGrid w:val="0"/>
+        <w:spacing w:line="240" w:lineRule="atLeast"/>
+        <w:ind w:firstLineChars="100" w:firstLine="210"/>
+        <w:rPr>
+          <w:rFonts w:hint="eastAsia"/>
           <w:u w:val="single"/>
         </w:rPr>
       </w:pPr>

</xml_diff>

<commit_message>
Feature: Implement optimistic background AI review in creator portal to reduce wait time
</commit_message>
<xml_diff>
--- a/主題小売り業界向けの売上高改善の向けサイネージ広告共同運用の提案.docx
+++ b/主題小売り業界向けの売上高改善の向けサイネージ広告共同運用の提案.docx
@@ -7849,6 +7849,16 @@
         <w:snapToGrid w:val="0"/>
         <w:spacing w:line="240" w:lineRule="atLeast"/>
         <w:rPr>
+          <w:rFonts w:hint="eastAsia"/>
+        </w:rPr>
+      </w:pPr>
+    </w:p>
+    <w:p>
+      <w:pPr>
+        <w:adjustRightInd w:val="0"/>
+        <w:snapToGrid w:val="0"/>
+        <w:spacing w:line="240" w:lineRule="atLeast"/>
+        <w:rPr>
           <w:b/>
           <w:bCs/>
         </w:rPr>
@@ -8506,6 +8516,23 @@
         </w:rPr>
         <w:t>収益化</w:t>
       </w:r>
+    </w:p>
+    <w:p>
+      <w:pPr>
+        <w:snapToGrid w:val="0"/>
+        <w:rPr>
+          <w:u w:val="single"/>
+        </w:rPr>
+      </w:pPr>
+    </w:p>
+    <w:p>
+      <w:pPr>
+        <w:snapToGrid w:val="0"/>
+        <w:rPr>
+          <w:rFonts w:hint="eastAsia"/>
+          <w:u w:val="single"/>
+        </w:rPr>
+      </w:pPr>
     </w:p>
     <w:p>
       <w:pPr>
@@ -9448,6 +9475,51 @@
         <w:adjustRightInd w:val="0"/>
         <w:snapToGrid w:val="0"/>
         <w:spacing w:line="240" w:lineRule="atLeast"/>
+      </w:pPr>
+    </w:p>
+    <w:p>
+      <w:pPr>
+        <w:adjustRightInd w:val="0"/>
+        <w:snapToGrid w:val="0"/>
+        <w:spacing w:line="240" w:lineRule="atLeast"/>
+      </w:pPr>
+    </w:p>
+    <w:p>
+      <w:pPr>
+        <w:adjustRightInd w:val="0"/>
+        <w:snapToGrid w:val="0"/>
+        <w:spacing w:line="240" w:lineRule="atLeast"/>
+      </w:pPr>
+    </w:p>
+    <w:p>
+      <w:pPr>
+        <w:adjustRightInd w:val="0"/>
+        <w:snapToGrid w:val="0"/>
+        <w:spacing w:line="240" w:lineRule="atLeast"/>
+      </w:pPr>
+    </w:p>
+    <w:p>
+      <w:pPr>
+        <w:adjustRightInd w:val="0"/>
+        <w:snapToGrid w:val="0"/>
+        <w:spacing w:line="240" w:lineRule="atLeast"/>
+      </w:pPr>
+    </w:p>
+    <w:p>
+      <w:pPr>
+        <w:adjustRightInd w:val="0"/>
+        <w:snapToGrid w:val="0"/>
+        <w:spacing w:line="240" w:lineRule="atLeast"/>
+        <w:rPr>
+          <w:rFonts w:hint="eastAsia"/>
+        </w:rPr>
+      </w:pPr>
+    </w:p>
+    <w:p>
+      <w:pPr>
+        <w:adjustRightInd w:val="0"/>
+        <w:snapToGrid w:val="0"/>
+        <w:spacing w:line="240" w:lineRule="atLeast"/>
         <w:rPr>
           <w:b/>
           <w:bCs/>
@@ -9688,27 +9760,9 @@
         <w:adjustRightInd w:val="0"/>
         <w:snapToGrid w:val="0"/>
         <w:spacing w:line="240" w:lineRule="atLeast"/>
-      </w:pPr>
-    </w:p>
-    <w:p>
-      <w:pPr>
-        <w:adjustRightInd w:val="0"/>
-        <w:snapToGrid w:val="0"/>
-        <w:spacing w:line="240" w:lineRule="atLeast"/>
-      </w:pPr>
-    </w:p>
-    <w:p>
-      <w:pPr>
-        <w:adjustRightInd w:val="0"/>
-        <w:snapToGrid w:val="0"/>
-        <w:spacing w:line="240" w:lineRule="atLeast"/>
-      </w:pPr>
-    </w:p>
-    <w:p>
-      <w:pPr>
-        <w:adjustRightInd w:val="0"/>
-        <w:snapToGrid w:val="0"/>
-        <w:spacing w:line="240" w:lineRule="atLeast"/>
+        <w:rPr>
+          <w:rFonts w:hint="eastAsia"/>
+        </w:rPr>
       </w:pPr>
     </w:p>
     <w:p>
@@ -10104,116 +10158,7 @@
         <w:snapToGrid w:val="0"/>
         <w:spacing w:line="240" w:lineRule="atLeast"/>
         <w:rPr>
-          <w:b/>
-          <w:bCs/>
-        </w:rPr>
-      </w:pPr>
-    </w:p>
-    <w:p>
-      <w:pPr>
-        <w:adjustRightInd w:val="0"/>
-        <w:snapToGrid w:val="0"/>
-        <w:spacing w:line="240" w:lineRule="atLeast"/>
-        <w:rPr>
-          <w:b/>
-          <w:bCs/>
-        </w:rPr>
-      </w:pPr>
-    </w:p>
-    <w:p>
-      <w:pPr>
-        <w:adjustRightInd w:val="0"/>
-        <w:snapToGrid w:val="0"/>
-        <w:spacing w:line="240" w:lineRule="atLeast"/>
-        <w:rPr>
-          <w:b/>
-          <w:bCs/>
-        </w:rPr>
-      </w:pPr>
-    </w:p>
-    <w:p>
-      <w:pPr>
-        <w:adjustRightInd w:val="0"/>
-        <w:snapToGrid w:val="0"/>
-        <w:spacing w:line="240" w:lineRule="atLeast"/>
-        <w:rPr>
-          <w:b/>
-          <w:bCs/>
-        </w:rPr>
-      </w:pPr>
-    </w:p>
-    <w:p>
-      <w:pPr>
-        <w:adjustRightInd w:val="0"/>
-        <w:snapToGrid w:val="0"/>
-        <w:spacing w:line="240" w:lineRule="atLeast"/>
-        <w:rPr>
-          <w:b/>
-          <w:bCs/>
-        </w:rPr>
-      </w:pPr>
-    </w:p>
-    <w:p>
-      <w:pPr>
-        <w:adjustRightInd w:val="0"/>
-        <w:snapToGrid w:val="0"/>
-        <w:spacing w:line="240" w:lineRule="atLeast"/>
-        <w:rPr>
-          <w:b/>
-          <w:bCs/>
-        </w:rPr>
-      </w:pPr>
-    </w:p>
-    <w:p>
-      <w:pPr>
-        <w:adjustRightInd w:val="0"/>
-        <w:snapToGrid w:val="0"/>
-        <w:spacing w:line="240" w:lineRule="atLeast"/>
-        <w:rPr>
-          <w:b/>
-          <w:bCs/>
-        </w:rPr>
-      </w:pPr>
-    </w:p>
-    <w:p>
-      <w:pPr>
-        <w:adjustRightInd w:val="0"/>
-        <w:snapToGrid w:val="0"/>
-        <w:spacing w:line="240" w:lineRule="atLeast"/>
-        <w:rPr>
-          <w:b/>
-          <w:bCs/>
-        </w:rPr>
-      </w:pPr>
-    </w:p>
-    <w:p>
-      <w:pPr>
-        <w:adjustRightInd w:val="0"/>
-        <w:snapToGrid w:val="0"/>
-        <w:spacing w:line="240" w:lineRule="atLeast"/>
-        <w:rPr>
-          <w:b/>
-          <w:bCs/>
-        </w:rPr>
-      </w:pPr>
-    </w:p>
-    <w:p>
-      <w:pPr>
-        <w:adjustRightInd w:val="0"/>
-        <w:snapToGrid w:val="0"/>
-        <w:spacing w:line="240" w:lineRule="atLeast"/>
-        <w:rPr>
-          <w:b/>
-          <w:bCs/>
-        </w:rPr>
-      </w:pPr>
-    </w:p>
-    <w:p>
-      <w:pPr>
-        <w:adjustRightInd w:val="0"/>
-        <w:snapToGrid w:val="0"/>
-        <w:spacing w:line="240" w:lineRule="atLeast"/>
-        <w:rPr>
+          <w:rFonts w:hint="eastAsia"/>
           <w:b/>
           <w:bCs/>
         </w:rPr>
@@ -15193,7 +15138,21 @@
           <w:rFonts w:hint="eastAsia"/>
           <w:u w:val="single"/>
         </w:rPr>
-        <w:t xml:space="preserve">現在の想定のサーバー代は月100円～500円　</w:t>
+        <w:t>現在の</w:t>
+      </w:r>
+      <w:r>
+        <w:rPr>
+          <w:rFonts w:hint="eastAsia"/>
+          <w:u w:val="single"/>
+        </w:rPr>
+        <w:t>4月時点の</w:t>
+      </w:r>
+      <w:r>
+        <w:rPr>
+          <w:rFonts w:hint="eastAsia"/>
+          <w:u w:val="single"/>
+        </w:rPr>
+        <w:t xml:space="preserve">サーバー代は月100円～500円　</w:t>
       </w:r>
     </w:p>
     <w:p>
@@ -15381,7 +15340,21 @@
           <w:rFonts w:hint="eastAsia"/>
           <w:u w:val="single"/>
         </w:rPr>
-        <w:t>パネルなど中国語資材担当1名</w:t>
+        <w:t>パネルなど中国語</w:t>
+      </w:r>
+      <w:r>
+        <w:rPr>
+          <w:rFonts w:hint="eastAsia"/>
+          <w:u w:val="single"/>
+        </w:rPr>
+        <w:t>・</w:t>
+      </w:r>
+      <w:r>
+        <w:rPr>
+          <w:rFonts w:hint="eastAsia"/>
+          <w:u w:val="single"/>
+        </w:rPr>
+        <w:t>資材担当1名</w:t>
       </w:r>
     </w:p>
     <w:p>
@@ -15436,15 +15409,15 @@
           <w:b/>
           <w:bCs/>
         </w:rPr>
-        <w:t xml:space="preserve">　　　残り　アンドロイドアプリ</w:t>
-      </w:r>
-      <w:r>
-        <w:rPr>
-          <w:rFonts w:hint="eastAsia"/>
-          <w:b/>
-          <w:bCs/>
-        </w:rPr>
-        <w:t>のテスト</w:t>
+        <w:t xml:space="preserve">　　　残り　</w:t>
+      </w:r>
+      <w:r>
+        <w:rPr>
+          <w:rFonts w:hint="eastAsia"/>
+          <w:b/>
+          <w:bCs/>
+        </w:rPr>
+        <w:t>テスト</w:t>
       </w:r>
     </w:p>
     <w:p>

</xml_diff>

<commit_message>
Implement real S3 upload API for Retailer Portal, update database structure, and dynamically inject retailer specific loop videos into the signage player playlist
</commit_message>
<xml_diff>
--- a/主題小売り業界向けの売上高改善の向けサイネージ広告共同運用の提案.docx
+++ b/主題小売り業界向けの売上高改善の向けサイネージ広告共同運用の提案.docx
@@ -433,7 +433,7 @@
         <w:rPr>
           <w:rFonts w:eastAsia="游明朝" w:hint="eastAsia"/>
         </w:rPr>
-        <w:t>スーパー向けの</w:t>
+        <w:t>スーパー</w:t>
       </w:r>
       <w:r>
         <w:rPr>
@@ -445,12 +445,24 @@
         <w:rPr>
           <w:rFonts w:eastAsia="游明朝" w:hint="eastAsia"/>
         </w:rPr>
-        <w:t>小売りYouTubeシステム</w:t>
+        <w:t>小売り</w:t>
       </w:r>
       <w:r>
         <w:rPr>
           <w:rFonts w:eastAsia="游明朝" w:hint="eastAsia"/>
         </w:rPr>
+        <w:t>向けの</w:t>
+      </w:r>
+      <w:r>
+        <w:rPr>
+          <w:rFonts w:eastAsia="游明朝" w:hint="eastAsia"/>
+        </w:rPr>
+        <w:t>YouTubeシステム</w:t>
+      </w:r>
+      <w:r>
+        <w:rPr>
+          <w:rFonts w:eastAsia="游明朝" w:hint="eastAsia"/>
+        </w:rPr>
         <w:t>(リテアド)</w:t>
       </w:r>
       <w:r>
@@ -485,7 +497,13 @@
         <w:rPr>
           <w:rFonts w:eastAsia="游明朝" w:hint="eastAsia"/>
         </w:rPr>
-        <w:t>スーパーに</w:t>
+        <w:t>小売り</w:t>
+      </w:r>
+      <w:r>
+        <w:rPr>
+          <w:rFonts w:eastAsia="游明朝" w:hint="eastAsia"/>
+        </w:rPr>
+        <w:t>に</w:t>
       </w:r>
       <w:r>
         <w:rPr>
@@ -947,6 +965,81 @@
     <w:p>
       <w:pPr>
         <w:snapToGrid w:val="0"/>
+      </w:pPr>
+    </w:p>
+    <w:p>
+      <w:pPr>
+        <w:snapToGrid w:val="0"/>
+      </w:pPr>
+      <w:r>
+        <w:rPr>
+          <w:rFonts w:hint="eastAsia"/>
+        </w:rPr>
+        <w:t>背景</w:t>
+      </w:r>
+    </w:p>
+    <w:p>
+      <w:pPr>
+        <w:snapToGrid w:val="0"/>
+      </w:pPr>
+      <w:r>
+        <w:rPr>
+          <w:rFonts w:hint="eastAsia"/>
+        </w:rPr>
+        <w:t>小売りは低</w:t>
+      </w:r>
+      <w:r>
+        <w:rPr>
+          <w:rFonts w:hint="eastAsia"/>
+        </w:rPr>
+        <w:t>利益</w:t>
+      </w:r>
+      <w:r>
+        <w:rPr>
+          <w:rFonts w:hint="eastAsia"/>
+        </w:rPr>
+        <w:t>や　人件費の割合が多いが通例ですが</w:t>
+      </w:r>
+    </w:p>
+    <w:p>
+      <w:pPr>
+        <w:snapToGrid w:val="0"/>
+      </w:pPr>
+      <w:r>
+        <w:rPr>
+          <w:rFonts w:hint="eastAsia"/>
+        </w:rPr>
+        <w:t>広告事業で共同運営という新しい</w:t>
+      </w:r>
+      <w:r>
+        <w:rPr>
+          <w:rFonts w:hint="eastAsia"/>
+        </w:rPr>
+        <w:t>ビジネスモデルで</w:t>
+      </w:r>
+    </w:p>
+    <w:p>
+      <w:pPr>
+        <w:snapToGrid w:val="0"/>
+      </w:pPr>
+      <w:r>
+        <w:rPr>
+          <w:rFonts w:hint="eastAsia"/>
+        </w:rPr>
+        <w:t>この小売り業界自体の固定概念を変革したい。</w:t>
+      </w:r>
+    </w:p>
+    <w:p>
+      <w:pPr>
+        <w:snapToGrid w:val="0"/>
+        <w:rPr>
+          <w:rFonts w:hint="eastAsia"/>
+        </w:rPr>
+      </w:pPr>
+    </w:p>
+    <w:p>
+      <w:pPr>
+        <w:snapToGrid w:val="0"/>
         <w:rPr>
           <w:b/>
           <w:bCs/>
@@ -1013,6 +1106,18 @@
       <w:pPr>
         <w:snapToGrid w:val="0"/>
         <w:rPr>
+          <w:b/>
+          <w:bCs/>
+          <w:sz w:val="28"/>
+          <w:szCs w:val="28"/>
+        </w:rPr>
+      </w:pPr>
+    </w:p>
+    <w:p>
+      <w:pPr>
+        <w:snapToGrid w:val="0"/>
+        <w:rPr>
+          <w:rFonts w:hint="eastAsia"/>
           <w:b/>
           <w:bCs/>
           <w:sz w:val="28"/>
@@ -1431,6 +1536,36 @@
         <w:spacing w:line="240" w:lineRule="atLeast"/>
         <w:rPr>
           <w:rFonts w:eastAsia="游明朝"/>
+        </w:rPr>
+      </w:pPr>
+    </w:p>
+    <w:p>
+      <w:pPr>
+        <w:adjustRightInd w:val="0"/>
+        <w:snapToGrid w:val="0"/>
+        <w:spacing w:line="240" w:lineRule="atLeast"/>
+        <w:rPr>
+          <w:rFonts w:eastAsia="游明朝"/>
+        </w:rPr>
+      </w:pPr>
+    </w:p>
+    <w:p>
+      <w:pPr>
+        <w:adjustRightInd w:val="0"/>
+        <w:snapToGrid w:val="0"/>
+        <w:spacing w:line="240" w:lineRule="atLeast"/>
+        <w:rPr>
+          <w:rFonts w:eastAsia="游明朝"/>
+        </w:rPr>
+      </w:pPr>
+    </w:p>
+    <w:p>
+      <w:pPr>
+        <w:adjustRightInd w:val="0"/>
+        <w:snapToGrid w:val="0"/>
+        <w:spacing w:line="240" w:lineRule="atLeast"/>
+        <w:rPr>
+          <w:rFonts w:eastAsia="游明朝" w:hint="eastAsia"/>
         </w:rPr>
       </w:pPr>
     </w:p>
@@ -2566,6 +2701,39 @@
         <w:adjustRightInd w:val="0"/>
         <w:snapToGrid w:val="0"/>
         <w:spacing w:line="240" w:lineRule="atLeast"/>
+        <w:ind w:left="720"/>
+        <w:rPr>
+          <w:rFonts w:eastAsia="游明朝"/>
+        </w:rPr>
+      </w:pPr>
+    </w:p>
+    <w:p>
+      <w:pPr>
+        <w:adjustRightInd w:val="0"/>
+        <w:snapToGrid w:val="0"/>
+        <w:spacing w:line="240" w:lineRule="atLeast"/>
+        <w:ind w:left="720"/>
+        <w:rPr>
+          <w:rFonts w:eastAsia="游明朝"/>
+        </w:rPr>
+      </w:pPr>
+    </w:p>
+    <w:p>
+      <w:pPr>
+        <w:adjustRightInd w:val="0"/>
+        <w:snapToGrid w:val="0"/>
+        <w:spacing w:line="240" w:lineRule="atLeast"/>
+        <w:ind w:left="720"/>
+        <w:rPr>
+          <w:rFonts w:eastAsia="游明朝" w:hint="eastAsia"/>
+        </w:rPr>
+      </w:pPr>
+    </w:p>
+    <w:p>
+      <w:pPr>
+        <w:adjustRightInd w:val="0"/>
+        <w:snapToGrid w:val="0"/>
+        <w:spacing w:line="240" w:lineRule="atLeast"/>
         <w:rPr>
           <w:rFonts w:eastAsia="游明朝"/>
         </w:rPr>
@@ -2816,29 +2984,7 @@
         <w:spacing w:line="240" w:lineRule="atLeast"/>
         <w:ind w:left="720"/>
         <w:rPr>
-          <w:rFonts w:eastAsia="游明朝"/>
-        </w:rPr>
-      </w:pPr>
-    </w:p>
-    <w:p>
-      <w:pPr>
-        <w:adjustRightInd w:val="0"/>
-        <w:snapToGrid w:val="0"/>
-        <w:spacing w:line="240" w:lineRule="atLeast"/>
-        <w:ind w:left="720"/>
-        <w:rPr>
-          <w:rFonts w:eastAsia="游明朝"/>
-        </w:rPr>
-      </w:pPr>
-    </w:p>
-    <w:p>
-      <w:pPr>
-        <w:adjustRightInd w:val="0"/>
-        <w:snapToGrid w:val="0"/>
-        <w:spacing w:line="240" w:lineRule="atLeast"/>
-        <w:ind w:left="720"/>
-        <w:rPr>
-          <w:rFonts w:eastAsia="游明朝"/>
+          <w:rFonts w:eastAsia="游明朝" w:hint="eastAsia"/>
         </w:rPr>
       </w:pPr>
     </w:p>
@@ -3349,23 +3495,7 @@
         <w:snapToGrid w:val="0"/>
         <w:spacing w:line="240" w:lineRule="atLeast"/>
         <w:rPr>
-          <w:rFonts w:eastAsia="游明朝"/>
-        </w:rPr>
-      </w:pPr>
-      <w:r>
-        <w:rPr>
-          <w:rFonts w:eastAsia="游明朝"/>
-        </w:rPr>
-        <w:t>ここが、他の小売サイネージとは決定的に異なる強烈な価値となります。</w:t>
-      </w:r>
-    </w:p>
-    <w:p>
-      <w:pPr>
-        <w:adjustRightInd w:val="0"/>
-        <w:snapToGrid w:val="0"/>
-        <w:spacing w:line="240" w:lineRule="atLeast"/>
-        <w:rPr>
-          <w:rFonts w:eastAsia="游明朝"/>
+          <w:rFonts w:eastAsia="游明朝" w:hint="eastAsia"/>
         </w:rPr>
       </w:pPr>
     </w:p>
@@ -4944,7 +5074,7 @@
           <w:noProof/>
         </w:rPr>
         <w:drawing>
-          <wp:inline distT="0" distB="0" distL="0" distR="0" wp14:anchorId="3CE421A6" wp14:editId="7C4A31F4">
+          <wp:inline distT="0" distB="0" distL="0" distR="0" wp14:anchorId="3CE421A6" wp14:editId="6758A7C4">
             <wp:extent cx="1074164" cy="1059011"/>
             <wp:effectExtent l="0" t="0" r="0" b="8255"/>
             <wp:docPr id="681950858" name="図 1"/>
@@ -7771,9 +7901,6 @@
         <w:snapToGrid w:val="0"/>
         <w:spacing w:line="240" w:lineRule="atLeast"/>
         <w:ind w:firstLineChars="100" w:firstLine="210"/>
-        <w:rPr>
-          <w:rFonts w:hint="eastAsia"/>
-        </w:rPr>
       </w:pPr>
     </w:p>
     <w:p>
@@ -7848,9 +7975,6 @@
         <w:adjustRightInd w:val="0"/>
         <w:snapToGrid w:val="0"/>
         <w:spacing w:line="240" w:lineRule="atLeast"/>
-        <w:rPr>
-          <w:rFonts w:hint="eastAsia"/>
-        </w:rPr>
       </w:pPr>
     </w:p>
     <w:p>
@@ -8529,7 +8653,6 @@
       <w:pPr>
         <w:snapToGrid w:val="0"/>
         <w:rPr>
-          <w:rFonts w:hint="eastAsia"/>
           <w:u w:val="single"/>
         </w:rPr>
       </w:pPr>
@@ -9510,9 +9633,6 @@
         <w:adjustRightInd w:val="0"/>
         <w:snapToGrid w:val="0"/>
         <w:spacing w:line="240" w:lineRule="atLeast"/>
-        <w:rPr>
-          <w:rFonts w:hint="eastAsia"/>
-        </w:rPr>
       </w:pPr>
     </w:p>
     <w:p>
@@ -9760,9 +9880,6 @@
         <w:adjustRightInd w:val="0"/>
         <w:snapToGrid w:val="0"/>
         <w:spacing w:line="240" w:lineRule="atLeast"/>
-        <w:rPr>
-          <w:rFonts w:hint="eastAsia"/>
-        </w:rPr>
       </w:pPr>
     </w:p>
     <w:p>
@@ -10110,59 +10227,196 @@
         <w:snapToGrid w:val="0"/>
         <w:spacing w:line="240" w:lineRule="atLeast"/>
       </w:pPr>
+    </w:p>
+    <w:p>
+      <w:pPr>
+        <w:adjustRightInd w:val="0"/>
+        <w:snapToGrid w:val="0"/>
+        <w:spacing w:line="240" w:lineRule="atLeast"/>
+      </w:pPr>
+    </w:p>
+    <w:p>
+      <w:pPr>
+        <w:adjustRightInd w:val="0"/>
+        <w:snapToGrid w:val="0"/>
+        <w:spacing w:line="240" w:lineRule="atLeast"/>
+      </w:pPr>
+    </w:p>
+    <w:p>
+      <w:pPr>
+        <w:adjustRightInd w:val="0"/>
+        <w:snapToGrid w:val="0"/>
+        <w:spacing w:line="240" w:lineRule="atLeast"/>
+      </w:pPr>
+    </w:p>
+    <w:p>
+      <w:pPr>
+        <w:adjustRightInd w:val="0"/>
+        <w:snapToGrid w:val="0"/>
+        <w:spacing w:line="240" w:lineRule="atLeast"/>
+      </w:pPr>
+    </w:p>
+    <w:p>
+      <w:pPr>
+        <w:adjustRightInd w:val="0"/>
+        <w:snapToGrid w:val="0"/>
+        <w:spacing w:line="240" w:lineRule="atLeast"/>
+        <w:rPr>
+          <w:b/>
+          <w:bCs/>
+        </w:rPr>
+      </w:pPr>
+      <w:r>
+        <w:rPr>
+          <w:rFonts w:hint="eastAsia"/>
+          <w:b/>
+          <w:bCs/>
+        </w:rPr>
+        <w:t>5.</w:t>
+      </w:r>
+      <w:r>
+        <w:rPr>
+          <w:rFonts w:hint="eastAsia"/>
+          <w:b/>
+          <w:bCs/>
+        </w:rPr>
+        <w:t>サイネージパネル</w:t>
+      </w:r>
+    </w:p>
+    <w:p>
+      <w:pPr>
+        <w:adjustRightInd w:val="0"/>
+        <w:snapToGrid w:val="0"/>
+        <w:spacing w:line="240" w:lineRule="atLeast"/>
+      </w:pPr>
+      <w:r>
+        <w:rPr>
+          <w:rFonts w:hint="eastAsia"/>
+          <w:noProof/>
+        </w:rPr>
+        <w:drawing>
+          <wp:inline distT="0" distB="0" distL="0" distR="0" wp14:anchorId="65EB02F1" wp14:editId="507F347C">
+            <wp:extent cx="1203960" cy="1067984"/>
+            <wp:effectExtent l="0" t="0" r="0" b="0"/>
+            <wp:docPr id="1378102655" name="図 1"/>
+            <wp:cNvGraphicFramePr>
+              <a:graphicFrameLocks xmlns:a="http://schemas.openxmlformats.org/drawingml/2006/main" noChangeAspect="1"/>
+            </wp:cNvGraphicFramePr>
+            <a:graphic xmlns:a="http://schemas.openxmlformats.org/drawingml/2006/main">
+              <a:graphicData uri="http://schemas.openxmlformats.org/drawingml/2006/picture">
+                <pic:pic xmlns:pic="http://schemas.openxmlformats.org/drawingml/2006/picture">
+                  <pic:nvPicPr>
+                    <pic:cNvPr id="0" name="Picture 4"/>
+                    <pic:cNvPicPr>
+                      <a:picLocks noChangeAspect="1" noChangeArrowheads="1"/>
+                    </pic:cNvPicPr>
+                  </pic:nvPicPr>
+                  <pic:blipFill>
+                    <a:blip r:embed="rId22" cstate="print">
+                      <a:extLst>
+                        <a:ext uri="{28A0092B-C50C-407E-A947-70E740481C1C}">
+                          <a14:useLocalDpi xmlns:a14="http://schemas.microsoft.com/office/drawing/2010/main" val="0"/>
+                        </a:ext>
+                      </a:extLst>
+                    </a:blip>
+                    <a:srcRect/>
+                    <a:stretch>
+                      <a:fillRect/>
+                    </a:stretch>
+                  </pic:blipFill>
+                  <pic:spPr bwMode="auto">
+                    <a:xfrm>
+                      <a:off x="0" y="0"/>
+                      <a:ext cx="1216003" cy="1078666"/>
+                    </a:xfrm>
+                    <a:prstGeom prst="rect">
+                      <a:avLst/>
+                    </a:prstGeom>
+                    <a:noFill/>
+                    <a:ln>
+                      <a:noFill/>
+                    </a:ln>
+                  </pic:spPr>
+                </pic:pic>
+              </a:graphicData>
+            </a:graphic>
+          </wp:inline>
+        </w:drawing>
+      </w:r>
+    </w:p>
+    <w:p>
+      <w:pPr>
+        <w:adjustRightInd w:val="0"/>
+        <w:snapToGrid w:val="0"/>
+        <w:spacing w:line="240" w:lineRule="atLeast"/>
+      </w:pPr>
+      <w:r>
+        <w:t>エッジ処理</w:t>
+      </w:r>
+      <w:r>
+        <w:rPr>
+          <w:rFonts w:hint="eastAsia"/>
+        </w:rPr>
+        <w:t xml:space="preserve">　</w:t>
+      </w:r>
+    </w:p>
+    <w:p>
+      <w:pPr>
+        <w:adjustRightInd w:val="0"/>
+        <w:snapToGrid w:val="0"/>
+        <w:spacing w:line="240" w:lineRule="atLeast"/>
+      </w:pPr>
+      <w:r>
+        <w:rPr>
+          <w:b/>
+          <w:bCs/>
+        </w:rPr>
+        <w:t>個人を特定できない統計データのみ</w:t>
+      </w:r>
+      <w:r>
+        <w:t>（端末内でのリアルタイム数値データ</w:t>
+      </w:r>
+      <w:r>
+        <w:rPr>
+          <w:rFonts w:hint="eastAsia"/>
+        </w:rPr>
+        <w:t>処理</w:t>
+      </w:r>
+      <w:r>
+        <w:t>）」</w:t>
+      </w:r>
+    </w:p>
+    <w:p>
+      <w:pPr>
+        <w:adjustRightInd w:val="0"/>
+        <w:snapToGrid w:val="0"/>
+        <w:spacing w:line="240" w:lineRule="atLeast"/>
+      </w:pPr>
+    </w:p>
+    <w:p>
+      <w:pPr>
+        <w:adjustRightInd w:val="0"/>
+        <w:snapToGrid w:val="0"/>
+        <w:spacing w:line="240" w:lineRule="atLeast"/>
+      </w:pPr>
       <w:r>
         <w:rPr>
           <w:rFonts w:hint="eastAsia"/>
         </w:rPr>
         <w:t>管理画面</w:t>
       </w:r>
-    </w:p>
-    <w:p>
-      <w:pPr>
-        <w:adjustRightInd w:val="0"/>
-        <w:snapToGrid w:val="0"/>
-        <w:spacing w:line="240" w:lineRule="atLeast"/>
-      </w:pPr>
+      <w:r>
+        <w:rPr>
+          <w:rFonts w:hint="eastAsia"/>
+        </w:rPr>
+        <w:t xml:space="preserve">　</w:t>
+      </w:r>
       <w:r>
         <w:rPr>
           <w:rFonts w:hint="eastAsia"/>
         </w:rPr>
         <w:t>広告主・クリエイター・代理店の入金・支払いの一括自動管理</w:t>
       </w:r>
-    </w:p>
-    <w:p>
-      <w:pPr>
-        <w:adjustRightInd w:val="0"/>
-        <w:snapToGrid w:val="0"/>
-        <w:spacing w:line="240" w:lineRule="atLeast"/>
-        <w:rPr>
-          <w:b/>
-          <w:bCs/>
-        </w:rPr>
-      </w:pPr>
-    </w:p>
-    <w:p>
-      <w:pPr>
-        <w:adjustRightInd w:val="0"/>
-        <w:snapToGrid w:val="0"/>
-        <w:spacing w:line="240" w:lineRule="atLeast"/>
-        <w:rPr>
-          <w:b/>
-          <w:bCs/>
-        </w:rPr>
-      </w:pPr>
-    </w:p>
-    <w:p>
-      <w:pPr>
-        <w:adjustRightInd w:val="0"/>
-        <w:snapToGrid w:val="0"/>
-        <w:spacing w:line="240" w:lineRule="atLeast"/>
-        <w:rPr>
-          <w:rFonts w:hint="eastAsia"/>
-          <w:b/>
-          <w:bCs/>
-        </w:rPr>
-      </w:pPr>
     </w:p>
     <w:p>
       <w:pPr>
@@ -11578,6 +11832,14 @@
     </w:p>
     <w:p>
       <w:pPr>
+        <w:adjustRightInd w:val="0"/>
+        <w:snapToGrid w:val="0"/>
+        <w:spacing w:line="240" w:lineRule="atLeast"/>
+        <w:ind w:left="1440"/>
+      </w:pPr>
+    </w:p>
+    <w:p>
+      <w:pPr>
         <w:numPr>
           <w:ilvl w:val="0"/>
           <w:numId w:val="27"/>
@@ -11796,7 +12058,7 @@
                     </pic:cNvPicPr>
                   </pic:nvPicPr>
                   <pic:blipFill>
-                    <a:blip r:embed="rId22" cstate="print">
+                    <a:blip r:embed="rId23" cstate="print">
                       <a:extLst>
                         <a:ext uri="{28A0092B-C50C-407E-A947-70E740481C1C}">
                           <a14:useLocalDpi xmlns:a14="http://schemas.microsoft.com/office/drawing/2010/main" val="0"/>
@@ -11849,7 +12111,7 @@
                     </pic:cNvPicPr>
                   </pic:nvPicPr>
                   <pic:blipFill>
-                    <a:blip r:embed="rId23" cstate="print">
+                    <a:blip r:embed="rId24" cstate="print">
                       <a:extLst>
                         <a:ext uri="{28A0092B-C50C-407E-A947-70E740481C1C}">
                           <a14:useLocalDpi xmlns:a14="http://schemas.microsoft.com/office/drawing/2010/main" val="0"/>
@@ -11902,7 +12164,7 @@
                     </pic:cNvPicPr>
                   </pic:nvPicPr>
                   <pic:blipFill>
-                    <a:blip r:embed="rId24" cstate="print">
+                    <a:blip r:embed="rId25" cstate="print">
                       <a:extLst>
                         <a:ext uri="{28A0092B-C50C-407E-A947-70E740481C1C}">
                           <a14:useLocalDpi xmlns:a14="http://schemas.microsoft.com/office/drawing/2010/main" val="0"/>
@@ -11955,7 +12217,7 @@
                     </pic:cNvPicPr>
                   </pic:nvPicPr>
                   <pic:blipFill>
-                    <a:blip r:embed="rId25" cstate="print">
+                    <a:blip r:embed="rId26" cstate="print">
                       <a:extLst>
                         <a:ext uri="{28A0092B-C50C-407E-A947-70E740481C1C}">
                           <a14:useLocalDpi xmlns:a14="http://schemas.microsoft.com/office/drawing/2010/main" val="0"/>
@@ -12008,7 +12270,7 @@
                     </pic:cNvPicPr>
                   </pic:nvPicPr>
                   <pic:blipFill>
-                    <a:blip r:embed="rId26" cstate="print">
+                    <a:blip r:embed="rId27" cstate="print">
                       <a:extLst>
                         <a:ext uri="{28A0092B-C50C-407E-A947-70E740481C1C}">
                           <a14:useLocalDpi xmlns:a14="http://schemas.microsoft.com/office/drawing/2010/main" val="0"/>
@@ -12057,7 +12319,19 @@
         <w:rPr>
           <w:rFonts w:hint="eastAsia"/>
         </w:rPr>
-        <w:t>川崎氏武蔵新城店を視察しました</w:t>
+        <w:t>川崎</w:t>
+      </w:r>
+      <w:r>
+        <w:rPr>
+          <w:rFonts w:hint="eastAsia"/>
+        </w:rPr>
+        <w:t>市</w:t>
+      </w:r>
+      <w:r>
+        <w:rPr>
+          <w:rFonts w:hint="eastAsia"/>
+        </w:rPr>
+        <w:t>武蔵新城店を視察しました</w:t>
       </w:r>
     </w:p>
     <w:p>
@@ -12667,69 +12941,6 @@
         </w:rPr>
         <w:t>を目指す</w:t>
       </w:r>
-    </w:p>
-    <w:p>
-      <w:pPr>
-        <w:adjustRightInd w:val="0"/>
-        <w:snapToGrid w:val="0"/>
-        <w:spacing w:line="240" w:lineRule="atLeast"/>
-      </w:pPr>
-    </w:p>
-    <w:p>
-      <w:pPr>
-        <w:adjustRightInd w:val="0"/>
-        <w:snapToGrid w:val="0"/>
-        <w:spacing w:line="240" w:lineRule="atLeast"/>
-      </w:pPr>
-    </w:p>
-    <w:p>
-      <w:pPr>
-        <w:adjustRightInd w:val="0"/>
-        <w:snapToGrid w:val="0"/>
-        <w:spacing w:line="240" w:lineRule="atLeast"/>
-      </w:pPr>
-    </w:p>
-    <w:p>
-      <w:pPr>
-        <w:adjustRightInd w:val="0"/>
-        <w:snapToGrid w:val="0"/>
-        <w:spacing w:line="240" w:lineRule="atLeast"/>
-      </w:pPr>
-    </w:p>
-    <w:p>
-      <w:pPr>
-        <w:adjustRightInd w:val="0"/>
-        <w:snapToGrid w:val="0"/>
-        <w:spacing w:line="240" w:lineRule="atLeast"/>
-      </w:pPr>
-    </w:p>
-    <w:p>
-      <w:pPr>
-        <w:adjustRightInd w:val="0"/>
-        <w:snapToGrid w:val="0"/>
-        <w:spacing w:line="240" w:lineRule="atLeast"/>
-      </w:pPr>
-    </w:p>
-    <w:p>
-      <w:pPr>
-        <w:adjustRightInd w:val="0"/>
-        <w:snapToGrid w:val="0"/>
-        <w:spacing w:line="240" w:lineRule="atLeast"/>
-      </w:pPr>
-    </w:p>
-    <w:p>
-      <w:pPr>
-        <w:adjustRightInd w:val="0"/>
-        <w:snapToGrid w:val="0"/>
-        <w:spacing w:line="240" w:lineRule="atLeast"/>
-      </w:pPr>
-    </w:p>
-    <w:p>
-      <w:pPr>
-        <w:adjustRightInd w:val="0"/>
-        <w:snapToGrid w:val="0"/>
-        <w:spacing w:line="240" w:lineRule="atLeast"/>
-      </w:pPr>
     </w:p>
     <w:p>
       <w:pPr>
@@ -15162,7 +15373,6 @@
         <w:spacing w:line="240" w:lineRule="atLeast"/>
         <w:ind w:firstLineChars="100" w:firstLine="210"/>
         <w:rPr>
-          <w:rFonts w:hint="eastAsia"/>
           <w:u w:val="single"/>
         </w:rPr>
       </w:pPr>
@@ -20255,7 +20465,6 @@
   <w:style w:type="character" w:default="1" w:styleId="a0">
     <w:name w:val="Default Paragraph Font"/>
     <w:uiPriority w:val="1"/>
-    <w:semiHidden/>
     <w:unhideWhenUsed/>
   </w:style>
   <w:style w:type="table" w:default="1" w:styleId="a1">

</xml_diff>

<commit_message>
Fix 404 error by explicitly adding routing for retailer_portal.html to Express server
</commit_message>
<xml_diff>
--- a/主題小売り業界向けの売上高改善の向けサイネージ広告共同運用の提案.docx
+++ b/主題小売り業界向けの売上高改善の向けサイネージ広告共同運用の提案.docx
@@ -998,13 +998,42 @@
         <w:rPr>
           <w:rFonts w:hint="eastAsia"/>
         </w:rPr>
-        <w:t>や　人件費の割合が多いが通例ですが</w:t>
-      </w:r>
-    </w:p>
-    <w:p>
-      <w:pPr>
-        <w:snapToGrid w:val="0"/>
-      </w:pPr>
+        <w:t xml:space="preserve">や　</w:t>
+      </w:r>
+      <w:r>
+        <w:rPr>
+          <w:rFonts w:hint="eastAsia"/>
+        </w:rPr>
+        <w:t>売上高における</w:t>
+      </w:r>
+      <w:r>
+        <w:rPr>
+          <w:rFonts w:hint="eastAsia"/>
+        </w:rPr>
+        <w:t>人件費の割合が多いが通例ですが</w:t>
+      </w:r>
+    </w:p>
+    <w:p>
+      <w:pPr>
+        <w:snapToGrid w:val="0"/>
+      </w:pPr>
+      <w:r>
+        <w:rPr>
+          <w:rFonts w:hint="eastAsia"/>
+        </w:rPr>
+        <w:t>物価高や建築費高騰などは、企業の利益を更に圧迫しています。</w:t>
+      </w:r>
+    </w:p>
+    <w:p>
+      <w:pPr>
+        <w:snapToGrid w:val="0"/>
+      </w:pPr>
+      <w:r>
+        <w:rPr>
+          <w:rFonts w:hint="eastAsia"/>
+        </w:rPr>
+        <w:t>この問題を</w:t>
+      </w:r>
       <w:r>
         <w:rPr>
           <w:rFonts w:hint="eastAsia"/>
@@ -1026,15 +1055,24 @@
         <w:rPr>
           <w:rFonts w:hint="eastAsia"/>
         </w:rPr>
-        <w:t>この小売り業界自体の固定概念を変革したい。</w:t>
-      </w:r>
-    </w:p>
-    <w:p>
-      <w:pPr>
-        <w:snapToGrid w:val="0"/>
-        <w:rPr>
-          <w:rFonts w:hint="eastAsia"/>
-        </w:rPr>
+        <w:t>この小売り業界</w:t>
+      </w:r>
+      <w:r>
+        <w:rPr>
+          <w:rFonts w:hint="eastAsia"/>
+        </w:rPr>
+        <w:t>の問題を解決</w:t>
+      </w:r>
+      <w:r>
+        <w:rPr>
+          <w:rFonts w:hint="eastAsia"/>
+        </w:rPr>
+        <w:t>したい。</w:t>
+      </w:r>
+    </w:p>
+    <w:p>
+      <w:pPr>
+        <w:snapToGrid w:val="0"/>
       </w:pPr>
     </w:p>
     <w:p>
@@ -1117,7 +1155,6 @@
       <w:pPr>
         <w:snapToGrid w:val="0"/>
         <w:rPr>
-          <w:rFonts w:hint="eastAsia"/>
           <w:b/>
           <w:bCs/>
           <w:sz w:val="28"/>
@@ -1565,7 +1602,7 @@
         <w:snapToGrid w:val="0"/>
         <w:spacing w:line="240" w:lineRule="atLeast"/>
         <w:rPr>
-          <w:rFonts w:eastAsia="游明朝" w:hint="eastAsia"/>
+          <w:rFonts w:eastAsia="游明朝"/>
         </w:rPr>
       </w:pPr>
     </w:p>
@@ -2725,7 +2762,7 @@
         <w:spacing w:line="240" w:lineRule="atLeast"/>
         <w:ind w:left="720"/>
         <w:rPr>
-          <w:rFonts w:eastAsia="游明朝" w:hint="eastAsia"/>
+          <w:rFonts w:eastAsia="游明朝"/>
         </w:rPr>
       </w:pPr>
     </w:p>
@@ -2971,20 +3008,8 @@
         <w:adjustRightInd w:val="0"/>
         <w:snapToGrid w:val="0"/>
         <w:spacing w:line="240" w:lineRule="atLeast"/>
-        <w:ind w:left="720"/>
-        <w:rPr>
-          <w:rFonts w:eastAsia="游明朝"/>
-        </w:rPr>
-      </w:pPr>
-    </w:p>
-    <w:p>
-      <w:pPr>
-        <w:adjustRightInd w:val="0"/>
-        <w:snapToGrid w:val="0"/>
-        <w:spacing w:line="240" w:lineRule="atLeast"/>
-        <w:ind w:left="720"/>
-        <w:rPr>
-          <w:rFonts w:eastAsia="游明朝" w:hint="eastAsia"/>
+        <w:rPr>
+          <w:rFonts w:eastAsia="游明朝"/>
         </w:rPr>
       </w:pPr>
     </w:p>
@@ -3488,16 +3513,6 @@
         </w:rPr>
         <w:t>AI搭載のリアル広告プラットフォーム」です。</w:t>
       </w:r>
-    </w:p>
-    <w:p>
-      <w:pPr>
-        <w:adjustRightInd w:val="0"/>
-        <w:snapToGrid w:val="0"/>
-        <w:spacing w:line="240" w:lineRule="atLeast"/>
-        <w:rPr>
-          <w:rFonts w:eastAsia="游明朝" w:hint="eastAsia"/>
-        </w:rPr>
-      </w:pPr>
     </w:p>
     <w:p>
       <w:pPr>
@@ -5074,7 +5089,7 @@
           <w:noProof/>
         </w:rPr>
         <w:drawing>
-          <wp:inline distT="0" distB="0" distL="0" distR="0" wp14:anchorId="3CE421A6" wp14:editId="6758A7C4">
+          <wp:inline distT="0" distB="0" distL="0" distR="0" wp14:anchorId="3CE421A6" wp14:editId="51708676">
             <wp:extent cx="1074164" cy="1059011"/>
             <wp:effectExtent l="0" t="0" r="0" b="8255"/>
             <wp:docPr id="681950858" name="図 1"/>
@@ -7166,116 +7181,8 @@
         <w:snapToGrid w:val="0"/>
         <w:spacing w:line="240" w:lineRule="atLeast"/>
         <w:rPr>
-          <w:rFonts w:eastAsia="游明朝"/>
-        </w:rPr>
-      </w:pPr>
-    </w:p>
-    <w:p>
-      <w:pPr>
-        <w:adjustRightInd w:val="0"/>
-        <w:snapToGrid w:val="0"/>
-        <w:spacing w:line="240" w:lineRule="atLeast"/>
-        <w:rPr>
-          <w:rFonts w:eastAsia="游明朝"/>
-        </w:rPr>
-      </w:pPr>
-    </w:p>
-    <w:p>
-      <w:pPr>
-        <w:adjustRightInd w:val="0"/>
-        <w:snapToGrid w:val="0"/>
-        <w:spacing w:line="240" w:lineRule="atLeast"/>
-        <w:rPr>
-          <w:rFonts w:eastAsia="游明朝"/>
-        </w:rPr>
-      </w:pPr>
-    </w:p>
-    <w:p>
-      <w:pPr>
-        <w:adjustRightInd w:val="0"/>
-        <w:snapToGrid w:val="0"/>
-        <w:spacing w:line="240" w:lineRule="atLeast"/>
-        <w:rPr>
-          <w:rFonts w:eastAsia="游明朝"/>
-        </w:rPr>
-      </w:pPr>
-    </w:p>
-    <w:p>
-      <w:pPr>
-        <w:adjustRightInd w:val="0"/>
-        <w:snapToGrid w:val="0"/>
-        <w:spacing w:line="240" w:lineRule="atLeast"/>
-        <w:rPr>
-          <w:rFonts w:eastAsia="游明朝"/>
-        </w:rPr>
-      </w:pPr>
-    </w:p>
-    <w:p>
-      <w:pPr>
-        <w:adjustRightInd w:val="0"/>
-        <w:snapToGrid w:val="0"/>
-        <w:spacing w:line="240" w:lineRule="atLeast"/>
-        <w:rPr>
-          <w:rFonts w:eastAsia="游明朝"/>
-        </w:rPr>
-      </w:pPr>
-    </w:p>
-    <w:p>
-      <w:pPr>
-        <w:adjustRightInd w:val="0"/>
-        <w:snapToGrid w:val="0"/>
-        <w:spacing w:line="240" w:lineRule="atLeast"/>
-        <w:rPr>
-          <w:rFonts w:eastAsia="游明朝"/>
-        </w:rPr>
-      </w:pPr>
-    </w:p>
-    <w:p>
-      <w:pPr>
-        <w:adjustRightInd w:val="0"/>
-        <w:snapToGrid w:val="0"/>
-        <w:spacing w:line="240" w:lineRule="atLeast"/>
-        <w:rPr>
-          <w:rFonts w:eastAsia="游明朝"/>
-        </w:rPr>
-      </w:pPr>
-    </w:p>
-    <w:p>
-      <w:pPr>
-        <w:adjustRightInd w:val="0"/>
-        <w:snapToGrid w:val="0"/>
-        <w:spacing w:line="240" w:lineRule="atLeast"/>
-        <w:rPr>
-          <w:rFonts w:eastAsia="游明朝"/>
-        </w:rPr>
-      </w:pPr>
-    </w:p>
-    <w:p>
-      <w:pPr>
-        <w:adjustRightInd w:val="0"/>
-        <w:snapToGrid w:val="0"/>
-        <w:spacing w:line="240" w:lineRule="atLeast"/>
-        <w:rPr>
-          <w:rFonts w:eastAsia="游明朝"/>
-        </w:rPr>
-      </w:pPr>
-    </w:p>
-    <w:p>
-      <w:pPr>
-        <w:adjustRightInd w:val="0"/>
-        <w:snapToGrid w:val="0"/>
-        <w:spacing w:line="240" w:lineRule="atLeast"/>
-        <w:rPr>
-          <w:rFonts w:eastAsia="游明朝"/>
-        </w:rPr>
-      </w:pPr>
-    </w:p>
-    <w:p>
-      <w:pPr>
-        <w:adjustRightInd w:val="0"/>
-        <w:snapToGrid w:val="0"/>
-        <w:spacing w:line="240" w:lineRule="atLeast"/>
-        <w:rPr>
+          <w:b/>
+          <w:bCs/>
           <w:sz w:val="28"/>
           <w:szCs w:val="28"/>
         </w:rPr>
@@ -7283,6 +7190,8 @@
       <w:r>
         <w:rPr>
           <w:rFonts w:hint="eastAsia"/>
+          <w:b/>
+          <w:bCs/>
           <w:sz w:val="28"/>
           <w:szCs w:val="28"/>
         </w:rPr>
@@ -7291,6 +7200,8 @@
       <w:r>
         <w:rPr>
           <w:rFonts w:hint="eastAsia"/>
+          <w:b/>
+          <w:bCs/>
           <w:sz w:val="28"/>
           <w:szCs w:val="28"/>
         </w:rPr>
@@ -10295,9 +10206,9 @@
           <w:noProof/>
         </w:rPr>
         <w:drawing>
-          <wp:inline distT="0" distB="0" distL="0" distR="0" wp14:anchorId="65EB02F1" wp14:editId="507F347C">
-            <wp:extent cx="1203960" cy="1067984"/>
-            <wp:effectExtent l="0" t="0" r="0" b="0"/>
+          <wp:inline distT="0" distB="0" distL="0" distR="0" wp14:anchorId="65EB02F1" wp14:editId="508AF467">
+            <wp:extent cx="867609" cy="769620"/>
+            <wp:effectExtent l="0" t="0" r="8890" b="0"/>
             <wp:docPr id="1378102655" name="図 1"/>
             <wp:cNvGraphicFramePr>
               <a:graphicFrameLocks xmlns:a="http://schemas.openxmlformats.org/drawingml/2006/main" noChangeAspect="1"/>
@@ -10327,7 +10238,7 @@
                   <pic:spPr bwMode="auto">
                     <a:xfrm>
                       <a:off x="0" y="0"/>
-                      <a:ext cx="1216003" cy="1078666"/>
+                      <a:ext cx="881922" cy="782317"/>
                     </a:xfrm>
                     <a:prstGeom prst="rect">
                       <a:avLst/>
@@ -10392,6 +10303,54 @@
         <w:snapToGrid w:val="0"/>
         <w:spacing w:line="240" w:lineRule="atLeast"/>
       </w:pPr>
+      <w:r>
+        <w:rPr>
+          <w:rFonts w:hint="eastAsia"/>
+        </w:rPr>
+        <w:t>地域のイベントや店舗イベントなど配信して親近感を醸成</w:t>
+      </w:r>
+    </w:p>
+    <w:p>
+      <w:pPr>
+        <w:adjustRightInd w:val="0"/>
+        <w:snapToGrid w:val="0"/>
+        <w:spacing w:line="240" w:lineRule="atLeast"/>
+        <w:rPr>
+          <w:rFonts w:hint="eastAsia"/>
+        </w:rPr>
+      </w:pPr>
+    </w:p>
+    <w:p>
+      <w:pPr>
+        <w:adjustRightInd w:val="0"/>
+        <w:snapToGrid w:val="0"/>
+        <w:spacing w:line="240" w:lineRule="atLeast"/>
+      </w:pPr>
+      <w:r>
+        <w:rPr>
+          <w:rFonts w:hint="eastAsia"/>
+        </w:rPr>
+        <w:t>法人配信管理画面(大企業の</w:t>
+      </w:r>
+      <w:r>
+        <w:rPr>
+          <w:rFonts w:hint="eastAsia"/>
+        </w:rPr>
+        <w:t>自社広告配信機能</w:t>
+      </w:r>
+      <w:r>
+        <w:rPr>
+          <w:rFonts w:hint="eastAsia"/>
+        </w:rPr>
+        <w:t xml:space="preserve">)　</w:t>
+      </w:r>
+    </w:p>
+    <w:p>
+      <w:pPr>
+        <w:adjustRightInd w:val="0"/>
+        <w:snapToGrid w:val="0"/>
+        <w:spacing w:line="240" w:lineRule="atLeast"/>
+      </w:pPr>
     </w:p>
     <w:p>
       <w:pPr>
@@ -10516,7 +10475,7 @@
         <w:ind w:left="720"/>
       </w:pPr>
       <w:r>
-        <w:t>2022年2月期（18億円赤字）、2023年2月期（15億円赤字）と苦戦していましたが、</w:t>
+        <w:t>2022年2月期（18億円赤字）、2023年2月期（15億円赤字）と苦戦していました</w:t>
       </w:r>
     </w:p>
     <w:p>
@@ -11248,15 +11207,6 @@
     </w:p>
     <w:p>
       <w:pPr>
-        <w:pStyle w:val="a9"/>
-        <w:adjustRightInd w:val="0"/>
-        <w:snapToGrid w:val="0"/>
-        <w:spacing w:line="240" w:lineRule="atLeast"/>
-        <w:ind w:left="1440"/>
-      </w:pPr>
-    </w:p>
-    <w:p>
-      <w:pPr>
         <w:adjustRightInd w:val="0"/>
         <w:snapToGrid w:val="0"/>
         <w:spacing w:line="240" w:lineRule="atLeast"/>
@@ -11829,14 +11779,6 @@
       <w:r>
         <w:t>の設置が一般的です。</w:t>
       </w:r>
-    </w:p>
-    <w:p>
-      <w:pPr>
-        <w:adjustRightInd w:val="0"/>
-        <w:snapToGrid w:val="0"/>
-        <w:spacing w:line="240" w:lineRule="atLeast"/>
-        <w:ind w:left="1440"/>
-      </w:pPr>
     </w:p>
     <w:p>
       <w:pPr>
@@ -20465,6 +20407,7 @@
   <w:style w:type="character" w:default="1" w:styleId="a0">
     <w:name w:val="Default Paragraph Font"/>
     <w:uiPriority w:val="1"/>
+    <w:semiHidden/>
     <w:unhideWhenUsed/>
   </w:style>
   <w:style w:type="table" w:default="1" w:styleId="a1">

</xml_diff>

<commit_message>
Update privacy policy to include required Google AdSense Cookie and Location Data disclosures
</commit_message>
<xml_diff>
--- a/主題小売り業界向けの売上高改善の向けサイネージ広告共同運用の提案.docx
+++ b/主題小売り業界向けの売上高改善の向けサイネージ広告共同運用の提案.docx
@@ -1768,7 +1768,7 @@
                 <w:sz w:val="24"/>
                 <w:szCs w:val="24"/>
               </w:rPr>
-              <w:t>リテアド (Retail-Ad Next)</w:t>
+              <w:t>リテアド (Retail-Ad )</w:t>
             </w:r>
           </w:p>
         </w:tc>
@@ -5089,7 +5089,7 @@
           <w:noProof/>
         </w:rPr>
         <w:drawing>
-          <wp:inline distT="0" distB="0" distL="0" distR="0" wp14:anchorId="3CE421A6" wp14:editId="51708676">
+          <wp:inline distT="0" distB="0" distL="0" distR="0" wp14:anchorId="3CE421A6" wp14:editId="6C95F82F">
             <wp:extent cx="1074164" cy="1059011"/>
             <wp:effectExtent l="0" t="0" r="0" b="8255"/>
             <wp:docPr id="681950858" name="図 1"/>
@@ -7811,74 +7811,9 @@
         <w:adjustRightInd w:val="0"/>
         <w:snapToGrid w:val="0"/>
         <w:spacing w:line="240" w:lineRule="atLeast"/>
-        <w:ind w:firstLineChars="100" w:firstLine="210"/>
-      </w:pPr>
-    </w:p>
-    <w:p>
-      <w:pPr>
-        <w:snapToGrid w:val="0"/>
-      </w:pPr>
-      <w:r>
-        <w:rPr>
-          <w:rFonts w:hint="eastAsia"/>
-        </w:rPr>
-        <w:t>ランサムウェア対応済み</w:t>
-      </w:r>
-    </w:p>
-    <w:p>
-      <w:pPr>
-        <w:snapToGrid w:val="0"/>
-      </w:pPr>
-      <w:r>
-        <w:t>1. サーバー環境の「使い捨て」構造（AWS App Runner）</w:t>
-      </w:r>
-    </w:p>
-    <w:p>
-      <w:pPr>
-        <w:snapToGrid w:val="0"/>
-      </w:pPr>
-      <w:r>
-        <w:t>2. メディアファイル等の保護（Amazon S3）</w:t>
-      </w:r>
-    </w:p>
-    <w:p>
-      <w:pPr>
-        <w:snapToGrid w:val="0"/>
-      </w:pPr>
-      <w:r>
-        <w:t>3. データベース化における保護</w:t>
-      </w:r>
-    </w:p>
-    <w:p>
-      <w:pPr>
-        <w:snapToGrid w:val="0"/>
-      </w:pPr>
-      <w:r>
-        <w:t xml:space="preserve">4. </w:t>
-      </w:r>
-      <w:r>
-        <w:rPr>
-          <w:rFonts w:hint="eastAsia"/>
-        </w:rPr>
-        <w:t xml:space="preserve">admin </w:t>
-      </w:r>
-      <w:r>
-        <w:t>2段階認証（2FA）</w:t>
-      </w:r>
-    </w:p>
-    <w:p>
-      <w:pPr>
-        <w:snapToGrid w:val="0"/>
-      </w:pPr>
-      <w:r>
-        <w:t>5.店頭サイネージ端末（Windows等）の保護</w:t>
-      </w:r>
-    </w:p>
-    <w:p>
-      <w:pPr>
-        <w:adjustRightInd w:val="0"/>
-        <w:snapToGrid w:val="0"/>
-        <w:spacing w:line="240" w:lineRule="atLeast"/>
+        <w:rPr>
+          <w:rFonts w:hint="eastAsia"/>
+        </w:rPr>
       </w:pPr>
     </w:p>
     <w:p>
@@ -9502,41 +9437,9 @@
         <w:adjustRightInd w:val="0"/>
         <w:snapToGrid w:val="0"/>
         <w:spacing w:line="240" w:lineRule="atLeast"/>
-      </w:pPr>
-    </w:p>
-    <w:p>
-      <w:pPr>
-        <w:adjustRightInd w:val="0"/>
-        <w:snapToGrid w:val="0"/>
-        <w:spacing w:line="240" w:lineRule="atLeast"/>
-      </w:pPr>
-    </w:p>
-    <w:p>
-      <w:pPr>
-        <w:adjustRightInd w:val="0"/>
-        <w:snapToGrid w:val="0"/>
-        <w:spacing w:line="240" w:lineRule="atLeast"/>
-      </w:pPr>
-    </w:p>
-    <w:p>
-      <w:pPr>
-        <w:adjustRightInd w:val="0"/>
-        <w:snapToGrid w:val="0"/>
-        <w:spacing w:line="240" w:lineRule="atLeast"/>
-      </w:pPr>
-    </w:p>
-    <w:p>
-      <w:pPr>
-        <w:adjustRightInd w:val="0"/>
-        <w:snapToGrid w:val="0"/>
-        <w:spacing w:line="240" w:lineRule="atLeast"/>
-      </w:pPr>
-    </w:p>
-    <w:p>
-      <w:pPr>
-        <w:adjustRightInd w:val="0"/>
-        <w:snapToGrid w:val="0"/>
-        <w:spacing w:line="240" w:lineRule="atLeast"/>
+        <w:rPr>
+          <w:rFonts w:hint="eastAsia"/>
+        </w:rPr>
       </w:pPr>
     </w:p>
     <w:p>
@@ -10130,41 +10033,9 @@
         <w:adjustRightInd w:val="0"/>
         <w:snapToGrid w:val="0"/>
         <w:spacing w:line="240" w:lineRule="atLeast"/>
-      </w:pPr>
-    </w:p>
-    <w:p>
-      <w:pPr>
-        <w:adjustRightInd w:val="0"/>
-        <w:snapToGrid w:val="0"/>
-        <w:spacing w:line="240" w:lineRule="atLeast"/>
-      </w:pPr>
-    </w:p>
-    <w:p>
-      <w:pPr>
-        <w:adjustRightInd w:val="0"/>
-        <w:snapToGrid w:val="0"/>
-        <w:spacing w:line="240" w:lineRule="atLeast"/>
-      </w:pPr>
-    </w:p>
-    <w:p>
-      <w:pPr>
-        <w:adjustRightInd w:val="0"/>
-        <w:snapToGrid w:val="0"/>
-        <w:spacing w:line="240" w:lineRule="atLeast"/>
-      </w:pPr>
-    </w:p>
-    <w:p>
-      <w:pPr>
-        <w:adjustRightInd w:val="0"/>
-        <w:snapToGrid w:val="0"/>
-        <w:spacing w:line="240" w:lineRule="atLeast"/>
-      </w:pPr>
-    </w:p>
-    <w:p>
-      <w:pPr>
-        <w:adjustRightInd w:val="0"/>
-        <w:snapToGrid w:val="0"/>
-        <w:spacing w:line="240" w:lineRule="atLeast"/>
+        <w:rPr>
+          <w:rFonts w:hint="eastAsia"/>
+        </w:rPr>
       </w:pPr>
     </w:p>
     <w:p>
@@ -10303,29 +10174,19 @@
         <w:snapToGrid w:val="0"/>
         <w:spacing w:line="240" w:lineRule="atLeast"/>
       </w:pPr>
-      <w:r>
-        <w:rPr>
-          <w:rFonts w:hint="eastAsia"/>
-        </w:rPr>
-        <w:t>地域のイベントや店舗イベントなど配信して親近感を醸成</w:t>
-      </w:r>
-    </w:p>
-    <w:p>
-      <w:pPr>
-        <w:adjustRightInd w:val="0"/>
-        <w:snapToGrid w:val="0"/>
-        <w:spacing w:line="240" w:lineRule="atLeast"/>
-        <w:rPr>
-          <w:rFonts w:hint="eastAsia"/>
-        </w:rPr>
-      </w:pPr>
-    </w:p>
-    <w:p>
-      <w:pPr>
-        <w:adjustRightInd w:val="0"/>
-        <w:snapToGrid w:val="0"/>
-        <w:spacing w:line="240" w:lineRule="atLeast"/>
-      </w:pPr>
+    </w:p>
+    <w:p>
+      <w:pPr>
+        <w:adjustRightInd w:val="0"/>
+        <w:snapToGrid w:val="0"/>
+        <w:spacing w:line="240" w:lineRule="atLeast"/>
+      </w:pPr>
+      <w:r>
+        <w:rPr>
+          <w:rFonts w:hint="eastAsia"/>
+        </w:rPr>
+        <w:t>6.</w:t>
+      </w:r>
       <w:r>
         <w:rPr>
           <w:rFonts w:hint="eastAsia"/>
@@ -10351,13 +10212,56 @@
         <w:snapToGrid w:val="0"/>
         <w:spacing w:line="240" w:lineRule="atLeast"/>
       </w:pPr>
-    </w:p>
-    <w:p>
-      <w:pPr>
-        <w:adjustRightInd w:val="0"/>
-        <w:snapToGrid w:val="0"/>
-        <w:spacing w:line="240" w:lineRule="atLeast"/>
-      </w:pPr>
+      <w:r>
+        <w:rPr>
+          <w:rFonts w:hint="eastAsia"/>
+        </w:rPr>
+        <w:t>地域のイベントや店舗イベントなど</w:t>
+      </w:r>
+      <w:r>
+        <w:rPr>
+          <w:rFonts w:hint="eastAsia"/>
+        </w:rPr>
+        <w:t>自社作成動画を</w:t>
+      </w:r>
+      <w:r>
+        <w:rPr>
+          <w:rFonts w:hint="eastAsia"/>
+        </w:rPr>
+        <w:t>配信して</w:t>
+      </w:r>
+      <w:r>
+        <w:rPr>
+          <w:rFonts w:hint="eastAsia"/>
+        </w:rPr>
+        <w:t>顧客に</w:t>
+      </w:r>
+      <w:r>
+        <w:rPr>
+          <w:rFonts w:hint="eastAsia"/>
+        </w:rPr>
+        <w:t>親近感を醸成</w:t>
+      </w:r>
+    </w:p>
+    <w:p>
+      <w:pPr>
+        <w:adjustRightInd w:val="0"/>
+        <w:snapToGrid w:val="0"/>
+        <w:spacing w:line="240" w:lineRule="atLeast"/>
+      </w:pPr>
+    </w:p>
+    <w:p>
+      <w:pPr>
+        <w:adjustRightInd w:val="0"/>
+        <w:snapToGrid w:val="0"/>
+        <w:spacing w:line="240" w:lineRule="atLeast"/>
+      </w:pPr>
+      <w:r>
+        <w:rPr>
+          <w:rFonts w:hint="eastAsia"/>
+        </w:rPr>
+        <w:t>7.</w:t>
+      </w:r>
       <w:r>
         <w:rPr>
           <w:rFonts w:hint="eastAsia"/>
@@ -10383,6 +10287,63 @@
         <w:snapToGrid w:val="0"/>
         <w:spacing w:line="240" w:lineRule="atLeast"/>
         <w:rPr>
+          <w:b/>
+          <w:bCs/>
+        </w:rPr>
+      </w:pPr>
+    </w:p>
+    <w:p>
+      <w:pPr>
+        <w:snapToGrid w:val="0"/>
+      </w:pPr>
+      <w:r>
+        <w:rPr>
+          <w:rFonts w:hint="eastAsia"/>
+        </w:rPr>
+        <w:t>8.</w:t>
+      </w:r>
+      <w:r>
+        <w:rPr>
+          <w:rFonts w:hint="eastAsia"/>
+        </w:rPr>
+        <w:t>ランサムウェア対応済み</w:t>
+      </w:r>
+    </w:p>
+    <w:p>
+      <w:pPr>
+        <w:snapToGrid w:val="0"/>
+      </w:pPr>
+      <w:r>
+        <w:t>1. サーバー環境の「使い捨て」構造</w:t>
+      </w:r>
+      <w:r>
+        <w:rPr>
+          <w:rFonts w:hint="eastAsia"/>
+        </w:rPr>
+        <w:t>など</w:t>
+      </w:r>
+      <w:r>
+        <w:t>（AWS App Runner）</w:t>
+      </w:r>
+    </w:p>
+    <w:p>
+      <w:pPr>
+        <w:adjustRightInd w:val="0"/>
+        <w:snapToGrid w:val="0"/>
+        <w:spacing w:line="240" w:lineRule="atLeast"/>
+        <w:rPr>
+          <w:b/>
+          <w:bCs/>
+        </w:rPr>
+      </w:pPr>
+    </w:p>
+    <w:p>
+      <w:pPr>
+        <w:adjustRightInd w:val="0"/>
+        <w:snapToGrid w:val="0"/>
+        <w:spacing w:line="240" w:lineRule="atLeast"/>
+        <w:rPr>
+          <w:rFonts w:hint="eastAsia"/>
           <w:b/>
           <w:bCs/>
         </w:rPr>
@@ -10720,7 +10681,7 @@
       <w:tblGrid>
         <w:gridCol w:w="1876"/>
         <w:gridCol w:w="2734"/>
-        <w:gridCol w:w="2863"/>
+        <w:gridCol w:w="3158"/>
       </w:tblGrid>
       <w:tr>
         <w:trPr>
@@ -10911,6 +10872,12 @@
               <w:ind w:left="720"/>
             </w:pPr>
             <w:r>
+              <w:rPr>
+                <w:rFonts w:hint="eastAsia"/>
+              </w:rPr>
+              <w:t>目標値</w:t>
+            </w:r>
+            <w:r>
               <w:t>6,000店 (約1/3)</w:t>
             </w:r>
           </w:p>
@@ -11188,6 +11155,14 @@
       </w:pPr>
       <w:r>
         <w:rPr>
+          <w:rFonts w:hint="eastAsia"/>
+          <w:b/>
+          <w:bCs/>
+        </w:rPr>
+        <w:t>目標は</w:t>
+      </w:r>
+      <w:r>
+        <w:rPr>
           <w:b/>
           <w:bCs/>
         </w:rPr>
@@ -11204,6 +11179,28 @@
       <w:r>
         <w:t>。</w:t>
       </w:r>
+    </w:p>
+    <w:p>
+      <w:pPr>
+        <w:adjustRightInd w:val="0"/>
+        <w:snapToGrid w:val="0"/>
+        <w:spacing w:line="240" w:lineRule="atLeast"/>
+        <w:ind w:firstLineChars="200" w:firstLine="420"/>
+        <w:rPr>
+          <w:rFonts w:hint="eastAsia"/>
+        </w:rPr>
+      </w:pPr>
+    </w:p>
+    <w:p>
+      <w:pPr>
+        <w:adjustRightInd w:val="0"/>
+        <w:snapToGrid w:val="0"/>
+        <w:spacing w:line="240" w:lineRule="atLeast"/>
+        <w:ind w:firstLineChars="200" w:firstLine="420"/>
+        <w:rPr>
+          <w:rFonts w:hint="eastAsia"/>
+        </w:rPr>
+      </w:pPr>
     </w:p>
     <w:p>
       <w:pPr>
@@ -12668,7 +12665,19 @@
         <w:rPr>
           <w:rFonts w:eastAsia="游明朝" w:hint="eastAsia"/>
         </w:rPr>
-        <w:t>医師による健康配信など顧客に興味を持ってもらうコンテンツを作成</w:t>
+        <w:t>医師による健康</w:t>
+      </w:r>
+      <w:r>
+        <w:rPr>
+          <w:rFonts w:eastAsia="游明朝" w:hint="eastAsia"/>
+        </w:rPr>
+        <w:t>情報</w:t>
+      </w:r>
+      <w:r>
+        <w:rPr>
+          <w:rFonts w:eastAsia="游明朝" w:hint="eastAsia"/>
+        </w:rPr>
+        <w:t>配信など顧客に興味を持ってもらうコンテンツを作成</w:t>
       </w:r>
     </w:p>
     <w:p>
@@ -12733,23 +12742,6 @@
         <w:rPr>
           <w:rFonts w:eastAsia="游明朝" w:hint="eastAsia"/>
         </w:rPr>
-        <w:t>売上1000億を目指すのなら必要な施策</w:t>
-      </w:r>
-    </w:p>
-    <w:p>
-      <w:pPr>
-        <w:adjustRightInd w:val="0"/>
-        <w:snapToGrid w:val="0"/>
-        <w:spacing w:line="240" w:lineRule="atLeast"/>
-        <w:ind w:left="720"/>
-        <w:rPr>
-          <w:rFonts w:eastAsia="游明朝"/>
-        </w:rPr>
-      </w:pPr>
-      <w:r>
-        <w:rPr>
-          <w:rFonts w:eastAsia="游明朝" w:hint="eastAsia"/>
-        </w:rPr>
         <w:t>(日本の広告市場規模は7兆円規模)</w:t>
       </w:r>
     </w:p>
@@ -12835,7 +12827,7 @@
           <w:szCs w:val="21"/>
           <w:u w:val="single"/>
         </w:rPr>
-        <w:t>000パネルの</w:t>
+        <w:t>000パネル</w:t>
       </w:r>
       <w:r>
         <w:rPr>
@@ -12845,7 +12837,7 @@
           <w:szCs w:val="21"/>
           <w:u w:val="single"/>
         </w:rPr>
-        <w:t>メディア</w:t>
+        <w:t>以上</w:t>
       </w:r>
       <w:r>
         <w:rPr>
@@ -12855,7 +12847,7 @@
           <w:szCs w:val="21"/>
           <w:u w:val="single"/>
         </w:rPr>
-        <w:t>で</w:t>
+        <w:t>の</w:t>
       </w:r>
       <w:r>
         <w:rPr>
@@ -12865,7 +12857,7 @@
           <w:szCs w:val="21"/>
           <w:u w:val="single"/>
         </w:rPr>
-        <w:t>規模</w:t>
+        <w:t>メディア</w:t>
       </w:r>
       <w:r>
         <w:rPr>
@@ -12875,6 +12867,26 @@
           <w:szCs w:val="21"/>
           <w:u w:val="single"/>
         </w:rPr>
+        <w:t>で</w:t>
+      </w:r>
+      <w:r>
+        <w:rPr>
+          <w:rFonts w:hint="eastAsia"/>
+          <w:b/>
+          <w:bCs/>
+          <w:szCs w:val="21"/>
+          <w:u w:val="single"/>
+        </w:rPr>
+        <w:t>規模</w:t>
+      </w:r>
+      <w:r>
+        <w:rPr>
+          <w:rFonts w:hint="eastAsia"/>
+          <w:b/>
+          <w:bCs/>
+          <w:szCs w:val="21"/>
+          <w:u w:val="single"/>
+        </w:rPr>
         <w:t>の最大化</w:t>
       </w:r>
       <w:r>
@@ -12889,6 +12901,82 @@
         <w:adjustRightInd w:val="0"/>
         <w:snapToGrid w:val="0"/>
         <w:spacing w:line="240" w:lineRule="atLeast"/>
+      </w:pPr>
+    </w:p>
+    <w:p>
+      <w:pPr>
+        <w:adjustRightInd w:val="0"/>
+        <w:snapToGrid w:val="0"/>
+        <w:spacing w:line="240" w:lineRule="atLeast"/>
+      </w:pPr>
+    </w:p>
+    <w:p>
+      <w:pPr>
+        <w:adjustRightInd w:val="0"/>
+        <w:snapToGrid w:val="0"/>
+        <w:spacing w:line="240" w:lineRule="atLeast"/>
+      </w:pPr>
+    </w:p>
+    <w:p>
+      <w:pPr>
+        <w:adjustRightInd w:val="0"/>
+        <w:snapToGrid w:val="0"/>
+        <w:spacing w:line="240" w:lineRule="atLeast"/>
+      </w:pPr>
+    </w:p>
+    <w:p>
+      <w:pPr>
+        <w:adjustRightInd w:val="0"/>
+        <w:snapToGrid w:val="0"/>
+        <w:spacing w:line="240" w:lineRule="atLeast"/>
+      </w:pPr>
+    </w:p>
+    <w:p>
+      <w:pPr>
+        <w:adjustRightInd w:val="0"/>
+        <w:snapToGrid w:val="0"/>
+        <w:spacing w:line="240" w:lineRule="atLeast"/>
+      </w:pPr>
+    </w:p>
+    <w:p>
+      <w:pPr>
+        <w:adjustRightInd w:val="0"/>
+        <w:snapToGrid w:val="0"/>
+        <w:spacing w:line="240" w:lineRule="atLeast"/>
+      </w:pPr>
+    </w:p>
+    <w:p>
+      <w:pPr>
+        <w:adjustRightInd w:val="0"/>
+        <w:snapToGrid w:val="0"/>
+        <w:spacing w:line="240" w:lineRule="atLeast"/>
+      </w:pPr>
+    </w:p>
+    <w:p>
+      <w:pPr>
+        <w:adjustRightInd w:val="0"/>
+        <w:snapToGrid w:val="0"/>
+        <w:spacing w:line="240" w:lineRule="atLeast"/>
+      </w:pPr>
+    </w:p>
+    <w:p>
+      <w:pPr>
+        <w:adjustRightInd w:val="0"/>
+        <w:snapToGrid w:val="0"/>
+        <w:spacing w:line="240" w:lineRule="atLeast"/>
+        <w:rPr>
+          <w:rFonts w:hint="eastAsia"/>
+        </w:rPr>
+      </w:pPr>
+    </w:p>
+    <w:p>
+      <w:pPr>
+        <w:adjustRightInd w:val="0"/>
+        <w:snapToGrid w:val="0"/>
+        <w:spacing w:line="240" w:lineRule="atLeast"/>
+        <w:rPr>
+          <w:rFonts w:hint="eastAsia"/>
+        </w:rPr>
       </w:pPr>
     </w:p>
     <w:p>
@@ -12991,6 +13079,22 @@
           <w:bCs/>
         </w:rPr>
         <w:t>300台導入の総コスト試算（概算）</w:t>
+      </w:r>
+      <w:r>
+        <w:rPr>
+          <w:rFonts w:hint="eastAsia"/>
+          <w:b/>
+          <w:bCs/>
+        </w:rPr>
+        <w:t>60社×5パネル</w:t>
+      </w:r>
+      <w:r>
+        <w:rPr>
+          <w:rFonts w:hint="eastAsia"/>
+          <w:b/>
+          <w:bCs/>
+        </w:rPr>
+        <w:t>※呼び水効果</w:t>
       </w:r>
     </w:p>
     <w:tbl>

</xml_diff>

<commit_message>
Fix template literals in generateBatFile in retailer_portal.html
</commit_message>
<xml_diff>
--- a/主題小売り業界向けの売上高改善の向けサイネージ広告共同運用の提案.docx
+++ b/主題小売り業界向けの売上高改善の向けサイネージ広告共同運用の提案.docx
@@ -15647,6 +15647,25 @@
           <w:u w:val="single"/>
         </w:rPr>
         <w:t>経理1名</w:t>
+      </w:r>
+    </w:p>
+    <w:p>
+      <w:pPr>
+        <w:adjustRightInd w:val="0"/>
+        <w:snapToGrid w:val="0"/>
+        <w:spacing w:line="240" w:lineRule="atLeast"/>
+        <w:ind w:left="720"/>
+        <w:rPr>
+          <w:rFonts w:hint="eastAsia"/>
+          <w:u w:val="single"/>
+        </w:rPr>
+      </w:pPr>
+      <w:r>
+        <w:rPr>
+          <w:rFonts w:hint="eastAsia"/>
+          <w:u w:val="single"/>
+        </w:rPr>
+        <w:t>後にクリエイティブ人員を追加</w:t>
       </w:r>
     </w:p>
     <w:p>

</xml_diff>

<commit_message>
feat: Add PDF AI automatic hierarchy generation and category grouping to Manual Help
</commit_message>
<xml_diff>
--- a/主題小売り業界向けの売上高改善の向けサイネージ広告共同運用の提案.docx
+++ b/主題小売り業界向けの売上高改善の向けサイネージ広告共同運用の提案.docx
@@ -5089,7 +5089,7 @@
           <w:noProof/>
         </w:rPr>
         <w:drawing>
-          <wp:inline distT="0" distB="0" distL="0" distR="0" wp14:anchorId="3CE421A6" wp14:editId="6C95F82F">
+          <wp:inline distT="0" distB="0" distL="0" distR="0" wp14:anchorId="3CE421A6" wp14:editId="54452E70">
             <wp:extent cx="1074164" cy="1059011"/>
             <wp:effectExtent l="0" t="0" r="0" b="8255"/>
             <wp:docPr id="681950858" name="図 1"/>
@@ -7811,9 +7811,6 @@
         <w:adjustRightInd w:val="0"/>
         <w:snapToGrid w:val="0"/>
         <w:spacing w:line="240" w:lineRule="atLeast"/>
-        <w:rPr>
-          <w:rFonts w:hint="eastAsia"/>
-        </w:rPr>
       </w:pPr>
     </w:p>
     <w:p>
@@ -9437,9 +9434,6 @@
         <w:adjustRightInd w:val="0"/>
         <w:snapToGrid w:val="0"/>
         <w:spacing w:line="240" w:lineRule="atLeast"/>
-        <w:rPr>
-          <w:rFonts w:hint="eastAsia"/>
-        </w:rPr>
       </w:pPr>
     </w:p>
     <w:p>
@@ -10033,9 +10027,6 @@
         <w:adjustRightInd w:val="0"/>
         <w:snapToGrid w:val="0"/>
         <w:spacing w:line="240" w:lineRule="atLeast"/>
-        <w:rPr>
-          <w:rFonts w:hint="eastAsia"/>
-        </w:rPr>
       </w:pPr>
     </w:p>
     <w:p>
@@ -10216,31 +10207,7 @@
         <w:rPr>
           <w:rFonts w:hint="eastAsia"/>
         </w:rPr>
-        <w:t>地域のイベントや店舗イベントなど</w:t>
-      </w:r>
-      <w:r>
-        <w:rPr>
-          <w:rFonts w:hint="eastAsia"/>
-        </w:rPr>
-        <w:t>自社作成動画を</w:t>
-      </w:r>
-      <w:r>
-        <w:rPr>
-          <w:rFonts w:hint="eastAsia"/>
-        </w:rPr>
-        <w:t>配信して</w:t>
-      </w:r>
-      <w:r>
-        <w:rPr>
-          <w:rFonts w:hint="eastAsia"/>
-        </w:rPr>
-        <w:t>顧客に</w:t>
-      </w:r>
-      <w:r>
-        <w:rPr>
-          <w:rFonts w:hint="eastAsia"/>
-        </w:rPr>
-        <w:t>親近感を醸成</w:t>
+        <w:t>地域のイベントや店舗イベントなど自社作成動画を配信して顧客に親近感を醸成</w:t>
       </w:r>
     </w:p>
     <w:p>
@@ -10300,13 +10267,7 @@
         <w:rPr>
           <w:rFonts w:hint="eastAsia"/>
         </w:rPr>
-        <w:t>8.</w:t>
-      </w:r>
-      <w:r>
-        <w:rPr>
-          <w:rFonts w:hint="eastAsia"/>
-        </w:rPr>
-        <w:t>ランサムウェア対応済み</w:t>
+        <w:t>8.ランサムウェア対応済み</w:t>
       </w:r>
     </w:p>
     <w:p>
@@ -10343,7 +10304,6 @@
         <w:snapToGrid w:val="0"/>
         <w:spacing w:line="240" w:lineRule="atLeast"/>
         <w:rPr>
-          <w:rFonts w:hint="eastAsia"/>
           <w:b/>
           <w:bCs/>
         </w:rPr>
@@ -11186,9 +11146,6 @@
         <w:snapToGrid w:val="0"/>
         <w:spacing w:line="240" w:lineRule="atLeast"/>
         <w:ind w:firstLineChars="200" w:firstLine="420"/>
-        <w:rPr>
-          <w:rFonts w:hint="eastAsia"/>
-        </w:rPr>
       </w:pPr>
     </w:p>
     <w:p>
@@ -11197,9 +11154,6 @@
         <w:snapToGrid w:val="0"/>
         <w:spacing w:line="240" w:lineRule="atLeast"/>
         <w:ind w:firstLineChars="200" w:firstLine="420"/>
-        <w:rPr>
-          <w:rFonts w:hint="eastAsia"/>
-        </w:rPr>
       </w:pPr>
     </w:p>
     <w:p>
@@ -12964,19 +12918,13 @@
         <w:adjustRightInd w:val="0"/>
         <w:snapToGrid w:val="0"/>
         <w:spacing w:line="240" w:lineRule="atLeast"/>
-        <w:rPr>
-          <w:rFonts w:hint="eastAsia"/>
-        </w:rPr>
-      </w:pPr>
-    </w:p>
-    <w:p>
-      <w:pPr>
-        <w:adjustRightInd w:val="0"/>
-        <w:snapToGrid w:val="0"/>
-        <w:spacing w:line="240" w:lineRule="atLeast"/>
-        <w:rPr>
-          <w:rFonts w:hint="eastAsia"/>
-        </w:rPr>
+      </w:pPr>
+    </w:p>
+    <w:p>
+      <w:pPr>
+        <w:adjustRightInd w:val="0"/>
+        <w:snapToGrid w:val="0"/>
+        <w:spacing w:line="240" w:lineRule="atLeast"/>
       </w:pPr>
     </w:p>
     <w:p>
@@ -14433,7 +14381,7 @@
       <w:tblGrid>
         <w:gridCol w:w="2627"/>
         <w:gridCol w:w="1771"/>
-        <w:gridCol w:w="1809"/>
+        <w:gridCol w:w="3992"/>
       </w:tblGrid>
       <w:tr>
         <w:trPr>
@@ -14458,6 +14406,8 @@
               <w:snapToGrid w:val="0"/>
               <w:spacing w:line="240" w:lineRule="atLeast"/>
               <w:rPr>
+                <w:b/>
+                <w:bCs/>
                 <w:u w:val="single"/>
               </w:rPr>
             </w:pPr>
@@ -14489,6 +14439,8 @@
               <w:snapToGrid w:val="0"/>
               <w:spacing w:line="240" w:lineRule="atLeast"/>
               <w:rPr>
+                <w:b/>
+                <w:bCs/>
                 <w:u w:val="single"/>
               </w:rPr>
             </w:pPr>
@@ -14520,6 +14472,8 @@
               <w:snapToGrid w:val="0"/>
               <w:spacing w:line="240" w:lineRule="atLeast"/>
               <w:rPr>
+                <w:b/>
+                <w:bCs/>
                 <w:u w:val="single"/>
               </w:rPr>
             </w:pPr>
@@ -14536,6 +14490,7 @@
       </w:tr>
       <w:tr>
         <w:trPr>
+          <w:tblHeader/>
           <w:tblCellSpacing w:w="15" w:type="dxa"/>
         </w:trPr>
         <w:tc>
@@ -14556,6 +14511,8 @@
               <w:snapToGrid w:val="0"/>
               <w:spacing w:line="240" w:lineRule="atLeast"/>
               <w:rPr>
+                <w:b/>
+                <w:bCs/>
                 <w:u w:val="single"/>
               </w:rPr>
             </w:pPr>
@@ -14587,11 +14544,15 @@
               <w:snapToGrid w:val="0"/>
               <w:spacing w:line="240" w:lineRule="atLeast"/>
               <w:rPr>
+                <w:b/>
+                <w:bCs/>
                 <w:u w:val="single"/>
               </w:rPr>
             </w:pPr>
             <w:r>
               <w:rPr>
+                <w:b/>
+                <w:bCs/>
                 <w:u w:val="single"/>
               </w:rPr>
               <w:t>2,077万円</w:t>
@@ -14616,11 +14577,15 @@
               <w:snapToGrid w:val="0"/>
               <w:spacing w:line="240" w:lineRule="atLeast"/>
               <w:rPr>
+                <w:b/>
+                <w:bCs/>
                 <w:u w:val="single"/>
               </w:rPr>
             </w:pPr>
             <w:r>
               <w:rPr>
+                <w:b/>
+                <w:bCs/>
                 <w:u w:val="single"/>
               </w:rPr>
               <w:t>予備機・送料込</w:t>
@@ -14630,6 +14595,7 @@
       </w:tr>
       <w:tr>
         <w:trPr>
+          <w:tblHeader/>
           <w:tblCellSpacing w:w="15" w:type="dxa"/>
         </w:trPr>
         <w:tc>
@@ -14650,6 +14616,8 @@
               <w:snapToGrid w:val="0"/>
               <w:spacing w:line="240" w:lineRule="atLeast"/>
               <w:rPr>
+                <w:b/>
+                <w:bCs/>
                 <w:u w:val="single"/>
               </w:rPr>
             </w:pPr>
@@ -14681,11 +14649,15 @@
               <w:snapToGrid w:val="0"/>
               <w:spacing w:line="240" w:lineRule="atLeast"/>
               <w:rPr>
+                <w:b/>
+                <w:bCs/>
                 <w:u w:val="single"/>
               </w:rPr>
             </w:pPr>
             <w:r>
               <w:rPr>
+                <w:b/>
+                <w:bCs/>
                 <w:u w:val="single"/>
               </w:rPr>
               <w:t>2,645万円</w:t>
@@ -14710,20 +14682,25 @@
               <w:snapToGrid w:val="0"/>
               <w:spacing w:line="240" w:lineRule="atLeast"/>
               <w:rPr>
+                <w:b/>
+                <w:bCs/>
                 <w:u w:val="single"/>
               </w:rPr>
             </w:pPr>
             <w:r>
               <w:rPr>
+                <w:b/>
+                <w:bCs/>
                 <w:u w:val="single"/>
               </w:rPr>
-              <w:t>法定福利費込</w:t>
+              <w:t>法定福利費込（正社員等の固定費）</w:t>
             </w:r>
           </w:p>
         </w:tc>
       </w:tr>
       <w:tr>
         <w:trPr>
+          <w:tblHeader/>
           <w:tblCellSpacing w:w="15" w:type="dxa"/>
         </w:trPr>
         <w:tc>
@@ -14744,6 +14721,8 @@
               <w:snapToGrid w:val="0"/>
               <w:spacing w:line="240" w:lineRule="atLeast"/>
               <w:rPr>
+                <w:b/>
+                <w:bCs/>
                 <w:u w:val="single"/>
               </w:rPr>
             </w:pPr>
@@ -14775,11 +14754,15 @@
               <w:snapToGrid w:val="0"/>
               <w:spacing w:line="240" w:lineRule="atLeast"/>
               <w:rPr>
+                <w:b/>
+                <w:bCs/>
                 <w:u w:val="single"/>
               </w:rPr>
             </w:pPr>
             <w:r>
               <w:rPr>
+                <w:b/>
+                <w:bCs/>
                 <w:u w:val="single"/>
               </w:rPr>
               <w:t>450万円</w:t>
@@ -14804,11 +14787,15 @@
               <w:snapToGrid w:val="0"/>
               <w:spacing w:line="240" w:lineRule="atLeast"/>
               <w:rPr>
+                <w:b/>
+                <w:bCs/>
                 <w:u w:val="single"/>
               </w:rPr>
             </w:pPr>
             <w:r>
               <w:rPr>
+                <w:b/>
+                <w:bCs/>
                 <w:u w:val="single"/>
               </w:rPr>
               <w:t>1.5万円/台想定</w:t>
@@ -14818,6 +14805,7 @@
       </w:tr>
       <w:tr>
         <w:trPr>
+          <w:tblHeader/>
           <w:tblCellSpacing w:w="15" w:type="dxa"/>
         </w:trPr>
         <w:tc>
@@ -14838,16 +14826,18 @@
               <w:snapToGrid w:val="0"/>
               <w:spacing w:line="240" w:lineRule="atLeast"/>
               <w:rPr>
-                <w:u w:val="single"/>
-              </w:rPr>
-            </w:pPr>
-            <w:r>
-              <w:rPr>
                 <w:b/>
                 <w:bCs/>
                 <w:u w:val="single"/>
               </w:rPr>
-              <w:t>運用インフラ費（1年分）</w:t>
+            </w:pPr>
+            <w:r>
+              <w:rPr>
+                <w:b/>
+                <w:bCs/>
+                <w:u w:val="single"/>
+              </w:rPr>
+              <w:t>業務委託費（1年分）</w:t>
             </w:r>
           </w:p>
         </w:tc>
@@ -14869,14 +14859,18 @@
               <w:snapToGrid w:val="0"/>
               <w:spacing w:line="240" w:lineRule="atLeast"/>
               <w:rPr>
+                <w:b/>
+                <w:bCs/>
                 <w:u w:val="single"/>
               </w:rPr>
             </w:pPr>
             <w:r>
               <w:rPr>
+                <w:b/>
+                <w:bCs/>
                 <w:u w:val="single"/>
               </w:rPr>
-              <w:t>400万円</w:t>
+              <w:t>1,000万円</w:t>
             </w:r>
           </w:p>
         </w:tc>
@@ -14898,20 +14892,25 @@
               <w:snapToGrid w:val="0"/>
               <w:spacing w:line="240" w:lineRule="atLeast"/>
               <w:rPr>
+                <w:b/>
+                <w:bCs/>
                 <w:u w:val="single"/>
               </w:rPr>
             </w:pPr>
             <w:r>
               <w:rPr>
+                <w:b/>
+                <w:bCs/>
                 <w:u w:val="single"/>
               </w:rPr>
-              <w:t>通信・サーバー等</w:t>
+              <w:t>広告営業 動画制作・クリエイティブ委託</w:t>
             </w:r>
           </w:p>
         </w:tc>
       </w:tr>
       <w:tr>
         <w:trPr>
+          <w:tblHeader/>
           <w:tblCellSpacing w:w="15" w:type="dxa"/>
         </w:trPr>
         <w:tc>
@@ -14932,6 +14931,113 @@
               <w:snapToGrid w:val="0"/>
               <w:spacing w:line="240" w:lineRule="atLeast"/>
               <w:rPr>
+                <w:b/>
+                <w:bCs/>
+                <w:u w:val="single"/>
+              </w:rPr>
+            </w:pPr>
+            <w:r>
+              <w:rPr>
+                <w:b/>
+                <w:bCs/>
+                <w:u w:val="single"/>
+              </w:rPr>
+              <w:t>通信インフラ費（1年分）</w:t>
+            </w:r>
+          </w:p>
+        </w:tc>
+        <w:tc>
+          <w:tcPr>
+            <w:tcW w:w="0" w:type="auto"/>
+            <w:tcBorders>
+              <w:top w:val="single" w:sz="6" w:space="0" w:color="auto"/>
+              <w:left w:val="single" w:sz="6" w:space="0" w:color="auto"/>
+              <w:bottom w:val="single" w:sz="6" w:space="0" w:color="auto"/>
+              <w:right w:val="single" w:sz="6" w:space="0" w:color="auto"/>
+            </w:tcBorders>
+            <w:vAlign w:val="center"/>
+            <w:hideMark/>
+          </w:tcPr>
+          <w:p>
+            <w:pPr>
+              <w:adjustRightInd w:val="0"/>
+              <w:snapToGrid w:val="0"/>
+              <w:spacing w:line="240" w:lineRule="atLeast"/>
+              <w:rPr>
+                <w:b/>
+                <w:bCs/>
+                <w:u w:val="single"/>
+              </w:rPr>
+            </w:pPr>
+            <w:r>
+              <w:rPr>
+                <w:b/>
+                <w:bCs/>
+                <w:u w:val="single"/>
+              </w:rPr>
+              <w:t>200万円</w:t>
+            </w:r>
+          </w:p>
+        </w:tc>
+        <w:tc>
+          <w:tcPr>
+            <w:tcW w:w="0" w:type="auto"/>
+            <w:tcBorders>
+              <w:top w:val="single" w:sz="6" w:space="0" w:color="auto"/>
+              <w:left w:val="single" w:sz="6" w:space="0" w:color="auto"/>
+              <w:bottom w:val="single" w:sz="6" w:space="0" w:color="auto"/>
+              <w:right w:val="single" w:sz="6" w:space="0" w:color="auto"/>
+            </w:tcBorders>
+            <w:vAlign w:val="center"/>
+            <w:hideMark/>
+          </w:tcPr>
+          <w:p>
+            <w:pPr>
+              <w:adjustRightInd w:val="0"/>
+              <w:snapToGrid w:val="0"/>
+              <w:spacing w:line="240" w:lineRule="atLeast"/>
+              <w:rPr>
+                <w:b/>
+                <w:bCs/>
+                <w:u w:val="single"/>
+              </w:rPr>
+            </w:pPr>
+            <w:r>
+              <w:rPr>
+                <w:b/>
+                <w:bCs/>
+                <w:u w:val="single"/>
+              </w:rPr>
+              <w:t>従量課金（最大400万の半額計上）</w:t>
+            </w:r>
+          </w:p>
+        </w:tc>
+      </w:tr>
+      <w:tr>
+        <w:trPr>
+          <w:tblHeader/>
+          <w:tblCellSpacing w:w="15" w:type="dxa"/>
+        </w:trPr>
+        <w:tc>
+          <w:tcPr>
+            <w:tcW w:w="0" w:type="auto"/>
+            <w:tcBorders>
+              <w:top w:val="single" w:sz="6" w:space="0" w:color="auto"/>
+              <w:left w:val="single" w:sz="6" w:space="0" w:color="auto"/>
+              <w:bottom w:val="single" w:sz="6" w:space="0" w:color="auto"/>
+              <w:right w:val="single" w:sz="6" w:space="0" w:color="auto"/>
+            </w:tcBorders>
+            <w:vAlign w:val="center"/>
+            <w:hideMark/>
+          </w:tcPr>
+          <w:p>
+            <w:pPr>
+              <w:adjustRightInd w:val="0"/>
+              <w:snapToGrid w:val="0"/>
+              <w:spacing w:line="240" w:lineRule="atLeast"/>
+              <w:rPr>
+                <w:b/>
+                <w:bCs/>
                 <w:u w:val="single"/>
               </w:rPr>
             </w:pPr>
@@ -14963,11 +15069,15 @@
               <w:snapToGrid w:val="0"/>
               <w:spacing w:line="240" w:lineRule="atLeast"/>
               <w:rPr>
+                <w:b/>
+                <w:bCs/>
                 <w:u w:val="single"/>
               </w:rPr>
             </w:pPr>
             <w:r>
               <w:rPr>
+                <w:b/>
+                <w:bCs/>
                 <w:u w:val="single"/>
               </w:rPr>
               <w:t>100万円</w:t>
@@ -14992,11 +15102,15 @@
               <w:snapToGrid w:val="0"/>
               <w:spacing w:line="240" w:lineRule="atLeast"/>
               <w:rPr>
+                <w:b/>
+                <w:bCs/>
                 <w:u w:val="single"/>
               </w:rPr>
             </w:pPr>
             <w:r>
               <w:rPr>
+                <w:b/>
+                <w:bCs/>
                 <w:u w:val="single"/>
               </w:rPr>
               <w:t>PSE対応・予備費</w:t>
@@ -15006,6 +15120,7 @@
       </w:tr>
       <w:tr>
         <w:trPr>
+          <w:tblHeader/>
           <w:tblCellSpacing w:w="15" w:type="dxa"/>
         </w:trPr>
         <w:tc>
@@ -15026,6 +15141,8 @@
               <w:snapToGrid w:val="0"/>
               <w:spacing w:line="240" w:lineRule="atLeast"/>
               <w:rPr>
+                <w:b/>
+                <w:bCs/>
                 <w:u w:val="single"/>
               </w:rPr>
             </w:pPr>
@@ -15057,16 +15174,18 @@
               <w:snapToGrid w:val="0"/>
               <w:spacing w:line="240" w:lineRule="atLeast"/>
               <w:rPr>
-                <w:u w:val="single"/>
-              </w:rPr>
-            </w:pPr>
-            <w:r>
-              <w:rPr>
                 <w:b/>
                 <w:bCs/>
                 <w:u w:val="single"/>
               </w:rPr>
-              <w:t>約5,672万円</w:t>
+            </w:pPr>
+            <w:r>
+              <w:rPr>
+                <w:b/>
+                <w:bCs/>
+                <w:u w:val="single"/>
+              </w:rPr>
+              <w:t>約6,472万円</w:t>
             </w:r>
           </w:p>
         </w:tc>
@@ -15088,11 +15207,15 @@
               <w:snapToGrid w:val="0"/>
               <w:spacing w:line="240" w:lineRule="atLeast"/>
               <w:rPr>
+                <w:b/>
+                <w:bCs/>
                 <w:u w:val="single"/>
               </w:rPr>
             </w:pPr>
             <w:r>
               <w:rPr>
+                <w:b/>
+                <w:bCs/>
                 <w:u w:val="single"/>
               </w:rPr>
               <w:t>---</w:t>
@@ -15313,20 +15436,81 @@
         <w:spacing w:line="240" w:lineRule="atLeast"/>
         <w:rPr>
           <w:u w:val="single"/>
+          <w:lang w:eastAsia="zh-CN"/>
         </w:rPr>
       </w:pPr>
       <w:r>
         <w:rPr>
           <w:rFonts w:hint="eastAsia"/>
           <w:u w:val="single"/>
+          <w:lang w:eastAsia="zh-CN"/>
+        </w:rPr>
+        <w:t>業務委託費　想定内訳</w:t>
+      </w:r>
+      <w:r>
+        <w:rPr>
+          <w:rFonts w:hint="eastAsia"/>
+          <w:u w:val="single"/>
+          <w:lang w:eastAsia="zh-CN"/>
+        </w:rPr>
+        <w:t>(</w:t>
+      </w:r>
+      <w:r>
+        <w:rPr>
+          <w:rFonts w:hint="eastAsia"/>
+          <w:b/>
+          <w:bCs/>
+          <w:u w:val="single"/>
+          <w:lang w:eastAsia="zh-CN"/>
+        </w:rPr>
+        <w:t>1</w:t>
+      </w:r>
+      <w:r>
+        <w:rPr>
+          <w:b/>
+          <w:bCs/>
+          <w:u w:val="single"/>
+          <w:lang w:eastAsia="zh-CN"/>
+        </w:rPr>
+        <w:t>,</w:t>
+      </w:r>
+      <w:r>
+        <w:rPr>
+          <w:rFonts w:hint="eastAsia"/>
+          <w:b/>
+          <w:bCs/>
+          <w:u w:val="single"/>
+        </w:rPr>
+        <w:t>300万円</w:t>
+      </w:r>
+      <w:r>
+        <w:rPr>
+          <w:rFonts w:hint="eastAsia"/>
+          <w:u w:val="single"/>
+          <w:lang w:eastAsia="zh-CN"/>
+        </w:rPr>
+        <w:t>)</w:t>
+      </w:r>
+    </w:p>
+    <w:p>
+      <w:pPr>
+        <w:adjustRightInd w:val="0"/>
+        <w:snapToGrid w:val="0"/>
+        <w:spacing w:line="240" w:lineRule="atLeast"/>
+        <w:rPr>
+          <w:u w:val="single"/>
+        </w:rPr>
+      </w:pPr>
+      <w:r>
+        <w:rPr>
+          <w:rFonts w:hint="eastAsia"/>
+          <w:u w:val="single"/>
         </w:rPr>
         <w:t>※</w:t>
       </w:r>
       <w:r>
         <w:rPr>
           <w:rFonts w:hint="eastAsia"/>
-          <w:b/>
-          <w:bCs/>
           <w:u w:val="single"/>
         </w:rPr>
         <w:t>通信インフラ</w:t>
@@ -15334,8 +15518,6 @@
       <w:r>
         <w:rPr>
           <w:rFonts w:hint="eastAsia"/>
-          <w:b/>
-          <w:bCs/>
           <w:u w:val="single"/>
         </w:rPr>
         <w:t>費</w:t>
@@ -15419,24 +15601,78 @@
         <w:spacing w:line="240" w:lineRule="atLeast"/>
         <w:ind w:firstLineChars="100" w:firstLine="210"/>
         <w:rPr>
+          <w:rFonts w:hint="eastAsia"/>
           <w:u w:val="single"/>
         </w:rPr>
       </w:pPr>
-    </w:p>
-    <w:p>
-      <w:pPr>
-        <w:adjustRightInd w:val="0"/>
-        <w:snapToGrid w:val="0"/>
-        <w:spacing w:line="240" w:lineRule="atLeast"/>
+      <w:r>
         <w:rPr>
           <w:u w:val="single"/>
         </w:rPr>
-      </w:pPr>
-      <w:r>
-        <w:rPr>
-          <w:rFonts w:hint="eastAsia"/>
+        <w:t>広告営業の委託</w:t>
+      </w:r>
+    </w:p>
+    <w:p>
+      <w:pPr>
+        <w:adjustRightInd w:val="0"/>
+        <w:snapToGrid w:val="0"/>
+        <w:spacing w:line="240" w:lineRule="atLeast"/>
+        <w:ind w:firstLineChars="100" w:firstLine="210"/>
+        <w:rPr>
           <w:u w:val="single"/>
         </w:rPr>
+      </w:pPr>
+      <w:r>
+        <w:rPr>
+          <w:u w:val="single"/>
+        </w:rPr>
+        <w:t>動画制作・クリエイティブ委託</w:t>
+      </w:r>
+    </w:p>
+    <w:p>
+      <w:pPr>
+        <w:adjustRightInd w:val="0"/>
+        <w:snapToGrid w:val="0"/>
+        <w:spacing w:line="240" w:lineRule="atLeast"/>
+        <w:ind w:firstLineChars="100" w:firstLine="210"/>
+        <w:rPr>
+          <w:rFonts w:hint="eastAsia"/>
+          <w:u w:val="single"/>
+        </w:rPr>
+      </w:pPr>
+      <w:r>
+        <w:rPr>
+          <w:rFonts w:hint="eastAsia"/>
+          <w:u w:val="single"/>
+        </w:rPr>
+        <w:t>中国渡航費・契約金</w:t>
+      </w:r>
+    </w:p>
+    <w:p>
+      <w:pPr>
+        <w:adjustRightInd w:val="0"/>
+        <w:snapToGrid w:val="0"/>
+        <w:spacing w:line="240" w:lineRule="atLeast"/>
+        <w:ind w:firstLineChars="100" w:firstLine="210"/>
+        <w:rPr>
+          <w:u w:val="single"/>
+        </w:rPr>
+      </w:pPr>
+    </w:p>
+    <w:p>
+      <w:pPr>
+        <w:adjustRightInd w:val="0"/>
+        <w:snapToGrid w:val="0"/>
+        <w:spacing w:line="240" w:lineRule="atLeast"/>
+        <w:rPr>
+          <w:u w:val="single"/>
+        </w:rPr>
+      </w:pPr>
+      <w:r>
+        <w:rPr>
+          <w:rFonts w:hint="eastAsia"/>
+          <w:u w:val="single"/>
+        </w:rPr>
         <w:t>※テナント費はライフ</w:t>
       </w:r>
       <w:r>
@@ -15485,6 +15721,7 @@
         <w:snapToGrid w:val="0"/>
         <w:spacing w:line="240" w:lineRule="atLeast"/>
         <w:rPr>
+          <w:rFonts w:hint="eastAsia"/>
           <w:u w:val="single"/>
         </w:rPr>
       </w:pPr>
@@ -15494,10 +15731,18 @@
         <w:adjustRightInd w:val="0"/>
         <w:snapToGrid w:val="0"/>
         <w:spacing w:line="240" w:lineRule="atLeast"/>
+        <w:ind w:left="720"/>
         <w:rPr>
           <w:u w:val="single"/>
         </w:rPr>
       </w:pPr>
+      <w:r>
+        <w:rPr>
+          <w:rFonts w:hint="eastAsia"/>
+          <w:u w:val="single"/>
+        </w:rPr>
+        <w:t>必要人員詳細</w:t>
+      </w:r>
     </w:p>
     <w:p>
       <w:pPr>
@@ -15514,7 +15759,21 @@
           <w:rFonts w:hint="eastAsia"/>
           <w:u w:val="single"/>
         </w:rPr>
-        <w:t>必要人員詳細</w:t>
+        <w:t>フロント・バック</w:t>
+      </w:r>
+      <w:r>
+        <w:rPr>
+          <w:rFonts w:hint="eastAsia"/>
+          <w:u w:val="single"/>
+        </w:rPr>
+        <w:t>エンド・マーケティング</w:t>
+      </w:r>
+      <w:r>
+        <w:rPr>
+          <w:rFonts w:hint="eastAsia"/>
+          <w:u w:val="single"/>
+        </w:rPr>
+        <w:t xml:space="preserve">は熊澤で担当　</w:t>
       </w:r>
     </w:p>
     <w:p>
@@ -15532,21 +15791,21 @@
           <w:rFonts w:hint="eastAsia"/>
           <w:u w:val="single"/>
         </w:rPr>
-        <w:t>フロント・バック</w:t>
+        <w:t>広告主説明の営業担当</w:t>
       </w:r>
       <w:r>
         <w:rPr>
           <w:rFonts w:hint="eastAsia"/>
           <w:u w:val="single"/>
         </w:rPr>
-        <w:t>エンド・マーケティング</w:t>
+        <w:t>2</w:t>
       </w:r>
       <w:r>
         <w:rPr>
           <w:rFonts w:hint="eastAsia"/>
           <w:u w:val="single"/>
         </w:rPr>
-        <w:t xml:space="preserve">は熊澤で担当　</w:t>
+        <w:t>人※基本は代理店が担当</w:t>
       </w:r>
     </w:p>
     <w:p>
@@ -15564,21 +15823,21 @@
           <w:rFonts w:hint="eastAsia"/>
           <w:u w:val="single"/>
         </w:rPr>
-        <w:t>広告主説明の営業担当</w:t>
+        <w:t>パネルなど中国語</w:t>
       </w:r>
       <w:r>
         <w:rPr>
           <w:rFonts w:hint="eastAsia"/>
           <w:u w:val="single"/>
         </w:rPr>
-        <w:t>2</w:t>
+        <w:t>・</w:t>
       </w:r>
       <w:r>
         <w:rPr>
           <w:rFonts w:hint="eastAsia"/>
           <w:u w:val="single"/>
         </w:rPr>
-        <w:t>人※基本は代理店が担当</w:t>
+        <w:t>資材担当1名</w:t>
       </w:r>
     </w:p>
     <w:p>
@@ -15596,21 +15855,25 @@
           <w:rFonts w:hint="eastAsia"/>
           <w:u w:val="single"/>
         </w:rPr>
-        <w:t>パネルなど中国語</w:t>
-      </w:r>
-      <w:r>
-        <w:rPr>
-          <w:rFonts w:hint="eastAsia"/>
+        <w:t>審査担当バイト1名</w:t>
+      </w:r>
+    </w:p>
+    <w:p>
+      <w:pPr>
+        <w:adjustRightInd w:val="0"/>
+        <w:snapToGrid w:val="0"/>
+        <w:spacing w:line="240" w:lineRule="atLeast"/>
+        <w:ind w:left="720"/>
+        <w:rPr>
           <w:u w:val="single"/>
         </w:rPr>
-        <w:t>・</w:t>
-      </w:r>
+      </w:pPr>
       <w:r>
         <w:rPr>
           <w:rFonts w:hint="eastAsia"/>
           <w:u w:val="single"/>
         </w:rPr>
-        <w:t>資材担当1名</w:t>
+        <w:t>経理1名</w:t>
       </w:r>
     </w:p>
     <w:p>
@@ -15620,43 +15883,6 @@
         <w:spacing w:line="240" w:lineRule="atLeast"/>
         <w:ind w:left="720"/>
         <w:rPr>
-          <w:u w:val="single"/>
-        </w:rPr>
-      </w:pPr>
-      <w:r>
-        <w:rPr>
-          <w:rFonts w:hint="eastAsia"/>
-          <w:u w:val="single"/>
-        </w:rPr>
-        <w:t>審査担当バイト1名</w:t>
-      </w:r>
-    </w:p>
-    <w:p>
-      <w:pPr>
-        <w:adjustRightInd w:val="0"/>
-        <w:snapToGrid w:val="0"/>
-        <w:spacing w:line="240" w:lineRule="atLeast"/>
-        <w:ind w:left="720"/>
-        <w:rPr>
-          <w:u w:val="single"/>
-        </w:rPr>
-      </w:pPr>
-      <w:r>
-        <w:rPr>
-          <w:rFonts w:hint="eastAsia"/>
-          <w:u w:val="single"/>
-        </w:rPr>
-        <w:t>経理1名</w:t>
-      </w:r>
-    </w:p>
-    <w:p>
-      <w:pPr>
-        <w:adjustRightInd w:val="0"/>
-        <w:snapToGrid w:val="0"/>
-        <w:spacing w:line="240" w:lineRule="atLeast"/>
-        <w:ind w:left="720"/>
-        <w:rPr>
-          <w:rFonts w:hint="eastAsia"/>
           <w:u w:val="single"/>
         </w:rPr>
       </w:pPr>
@@ -20530,7 +20756,6 @@
   <w:style w:type="character" w:default="1" w:styleId="a0">
     <w:name w:val="Default Paragraph Font"/>
     <w:uiPriority w:val="1"/>
-    <w:semiHidden/>
     <w:unhideWhenUsed/>
   </w:style>
   <w:style w:type="table" w:default="1" w:styleId="a1">

</xml_diff>

<commit_message>
feat: Add QR code generation to anywhere_retail.html and fix button layout
</commit_message>
<xml_diff>
--- a/主題小売り業界向けの売上高改善の向けサイネージ広告共同運用の提案.docx
+++ b/主題小売り業界向けの売上高改善の向けサイネージ広告共同運用の提案.docx
@@ -3794,6 +3794,303 @@
         <w:adjustRightInd w:val="0"/>
         <w:snapToGrid w:val="0"/>
         <w:spacing w:line="240" w:lineRule="atLeast"/>
+        <w:ind w:left="720"/>
+        <w:rPr>
+          <w:rFonts w:eastAsia="游明朝"/>
+        </w:rPr>
+      </w:pPr>
+    </w:p>
+    <w:p>
+      <w:pPr>
+        <w:adjustRightInd w:val="0"/>
+        <w:snapToGrid w:val="0"/>
+        <w:spacing w:line="240" w:lineRule="atLeast"/>
+        <w:ind w:left="720"/>
+        <w:rPr>
+          <w:rFonts w:eastAsia="游明朝"/>
+        </w:rPr>
+      </w:pPr>
+    </w:p>
+    <w:p>
+      <w:pPr>
+        <w:adjustRightInd w:val="0"/>
+        <w:snapToGrid w:val="0"/>
+        <w:spacing w:line="240" w:lineRule="atLeast"/>
+        <w:ind w:left="720"/>
+        <w:rPr>
+          <w:rFonts w:eastAsia="游明朝"/>
+        </w:rPr>
+      </w:pPr>
+    </w:p>
+    <w:p>
+      <w:pPr>
+        <w:adjustRightInd w:val="0"/>
+        <w:snapToGrid w:val="0"/>
+        <w:spacing w:line="240" w:lineRule="atLeast"/>
+        <w:ind w:left="720"/>
+        <w:rPr>
+          <w:rFonts w:eastAsia="游明朝"/>
+        </w:rPr>
+      </w:pPr>
+    </w:p>
+    <w:p>
+      <w:pPr>
+        <w:adjustRightInd w:val="0"/>
+        <w:snapToGrid w:val="0"/>
+        <w:spacing w:line="240" w:lineRule="atLeast"/>
+        <w:ind w:left="720"/>
+        <w:rPr>
+          <w:rFonts w:eastAsia="游明朝"/>
+        </w:rPr>
+      </w:pPr>
+    </w:p>
+    <w:p>
+      <w:pPr>
+        <w:adjustRightInd w:val="0"/>
+        <w:snapToGrid w:val="0"/>
+        <w:spacing w:line="240" w:lineRule="atLeast"/>
+        <w:ind w:left="720"/>
+        <w:rPr>
+          <w:rFonts w:eastAsia="游明朝"/>
+        </w:rPr>
+      </w:pPr>
+    </w:p>
+    <w:p>
+      <w:pPr>
+        <w:adjustRightInd w:val="0"/>
+        <w:snapToGrid w:val="0"/>
+        <w:spacing w:line="240" w:lineRule="atLeast"/>
+        <w:ind w:left="720"/>
+        <w:rPr>
+          <w:rFonts w:eastAsia="游明朝"/>
+        </w:rPr>
+      </w:pPr>
+    </w:p>
+    <w:p>
+      <w:pPr>
+        <w:adjustRightInd w:val="0"/>
+        <w:snapToGrid w:val="0"/>
+        <w:spacing w:line="240" w:lineRule="atLeast"/>
+        <w:ind w:left="720"/>
+        <w:rPr>
+          <w:rFonts w:eastAsia="游明朝"/>
+        </w:rPr>
+      </w:pPr>
+    </w:p>
+    <w:p>
+      <w:pPr>
+        <w:adjustRightInd w:val="0"/>
+        <w:snapToGrid w:val="0"/>
+        <w:spacing w:line="240" w:lineRule="atLeast"/>
+        <w:ind w:left="720"/>
+        <w:rPr>
+          <w:rFonts w:eastAsia="游明朝"/>
+        </w:rPr>
+      </w:pPr>
+    </w:p>
+    <w:p>
+      <w:pPr>
+        <w:adjustRightInd w:val="0"/>
+        <w:snapToGrid w:val="0"/>
+        <w:spacing w:line="240" w:lineRule="atLeast"/>
+        <w:ind w:left="720"/>
+        <w:rPr>
+          <w:rFonts w:eastAsia="游明朝"/>
+        </w:rPr>
+      </w:pPr>
+    </w:p>
+    <w:p>
+      <w:pPr>
+        <w:adjustRightInd w:val="0"/>
+        <w:snapToGrid w:val="0"/>
+        <w:spacing w:line="240" w:lineRule="atLeast"/>
+        <w:ind w:left="720"/>
+        <w:rPr>
+          <w:rFonts w:eastAsia="游明朝"/>
+        </w:rPr>
+      </w:pPr>
+    </w:p>
+    <w:p>
+      <w:pPr>
+        <w:adjustRightInd w:val="0"/>
+        <w:snapToGrid w:val="0"/>
+        <w:spacing w:line="240" w:lineRule="atLeast"/>
+        <w:ind w:left="720"/>
+        <w:rPr>
+          <w:rFonts w:eastAsia="游明朝"/>
+        </w:rPr>
+      </w:pPr>
+    </w:p>
+    <w:p>
+      <w:pPr>
+        <w:adjustRightInd w:val="0"/>
+        <w:snapToGrid w:val="0"/>
+        <w:spacing w:line="240" w:lineRule="atLeast"/>
+        <w:ind w:left="720"/>
+        <w:rPr>
+          <w:rFonts w:eastAsia="游明朝"/>
+        </w:rPr>
+      </w:pPr>
+    </w:p>
+    <w:p>
+      <w:pPr>
+        <w:adjustRightInd w:val="0"/>
+        <w:snapToGrid w:val="0"/>
+        <w:spacing w:line="240" w:lineRule="atLeast"/>
+        <w:ind w:left="720"/>
+        <w:rPr>
+          <w:rFonts w:eastAsia="游明朝"/>
+        </w:rPr>
+      </w:pPr>
+    </w:p>
+    <w:p>
+      <w:pPr>
+        <w:adjustRightInd w:val="0"/>
+        <w:snapToGrid w:val="0"/>
+        <w:spacing w:line="240" w:lineRule="atLeast"/>
+        <w:ind w:left="720"/>
+        <w:rPr>
+          <w:rFonts w:eastAsia="游明朝"/>
+        </w:rPr>
+      </w:pPr>
+    </w:p>
+    <w:p>
+      <w:pPr>
+        <w:adjustRightInd w:val="0"/>
+        <w:snapToGrid w:val="0"/>
+        <w:spacing w:line="240" w:lineRule="atLeast"/>
+        <w:ind w:left="720"/>
+        <w:rPr>
+          <w:rFonts w:eastAsia="游明朝"/>
+        </w:rPr>
+      </w:pPr>
+    </w:p>
+    <w:p>
+      <w:pPr>
+        <w:adjustRightInd w:val="0"/>
+        <w:snapToGrid w:val="0"/>
+        <w:spacing w:line="240" w:lineRule="atLeast"/>
+        <w:ind w:left="720"/>
+        <w:rPr>
+          <w:rFonts w:eastAsia="游明朝"/>
+        </w:rPr>
+      </w:pPr>
+    </w:p>
+    <w:p>
+      <w:pPr>
+        <w:adjustRightInd w:val="0"/>
+        <w:snapToGrid w:val="0"/>
+        <w:spacing w:line="240" w:lineRule="atLeast"/>
+        <w:ind w:left="720"/>
+        <w:rPr>
+          <w:rFonts w:eastAsia="游明朝"/>
+        </w:rPr>
+      </w:pPr>
+    </w:p>
+    <w:p>
+      <w:pPr>
+        <w:adjustRightInd w:val="0"/>
+        <w:snapToGrid w:val="0"/>
+        <w:spacing w:line="240" w:lineRule="atLeast"/>
+        <w:ind w:left="720"/>
+        <w:rPr>
+          <w:rFonts w:eastAsia="游明朝"/>
+        </w:rPr>
+      </w:pPr>
+    </w:p>
+    <w:p>
+      <w:pPr>
+        <w:adjustRightInd w:val="0"/>
+        <w:snapToGrid w:val="0"/>
+        <w:spacing w:line="240" w:lineRule="atLeast"/>
+        <w:ind w:left="720"/>
+        <w:rPr>
+          <w:rFonts w:eastAsia="游明朝"/>
+        </w:rPr>
+      </w:pPr>
+    </w:p>
+    <w:p>
+      <w:pPr>
+        <w:adjustRightInd w:val="0"/>
+        <w:snapToGrid w:val="0"/>
+        <w:spacing w:line="240" w:lineRule="atLeast"/>
+        <w:ind w:left="720"/>
+        <w:rPr>
+          <w:rFonts w:eastAsia="游明朝"/>
+        </w:rPr>
+      </w:pPr>
+    </w:p>
+    <w:p>
+      <w:pPr>
+        <w:adjustRightInd w:val="0"/>
+        <w:snapToGrid w:val="0"/>
+        <w:spacing w:line="240" w:lineRule="atLeast"/>
+        <w:ind w:left="720"/>
+        <w:rPr>
+          <w:rFonts w:eastAsia="游明朝"/>
+        </w:rPr>
+      </w:pPr>
+    </w:p>
+    <w:p>
+      <w:pPr>
+        <w:adjustRightInd w:val="0"/>
+        <w:snapToGrid w:val="0"/>
+        <w:spacing w:line="240" w:lineRule="atLeast"/>
+        <w:ind w:left="720"/>
+        <w:rPr>
+          <w:rFonts w:eastAsia="游明朝"/>
+        </w:rPr>
+      </w:pPr>
+    </w:p>
+    <w:p>
+      <w:pPr>
+        <w:adjustRightInd w:val="0"/>
+        <w:snapToGrid w:val="0"/>
+        <w:spacing w:line="240" w:lineRule="atLeast"/>
+        <w:ind w:left="720"/>
+        <w:rPr>
+          <w:rFonts w:eastAsia="游明朝"/>
+        </w:rPr>
+      </w:pPr>
+    </w:p>
+    <w:p>
+      <w:pPr>
+        <w:adjustRightInd w:val="0"/>
+        <w:snapToGrid w:val="0"/>
+        <w:spacing w:line="240" w:lineRule="atLeast"/>
+        <w:ind w:left="720"/>
+        <w:rPr>
+          <w:rFonts w:eastAsia="游明朝"/>
+        </w:rPr>
+      </w:pPr>
+    </w:p>
+    <w:p>
+      <w:pPr>
+        <w:adjustRightInd w:val="0"/>
+        <w:snapToGrid w:val="0"/>
+        <w:spacing w:line="240" w:lineRule="atLeast"/>
+        <w:ind w:left="720"/>
+        <w:rPr>
+          <w:rFonts w:eastAsia="游明朝"/>
+        </w:rPr>
+      </w:pPr>
+    </w:p>
+    <w:p>
+      <w:pPr>
+        <w:adjustRightInd w:val="0"/>
+        <w:snapToGrid w:val="0"/>
+        <w:spacing w:line="240" w:lineRule="atLeast"/>
+        <w:ind w:left="720"/>
+        <w:rPr>
+          <w:rFonts w:eastAsia="游明朝" w:hint="eastAsia"/>
+        </w:rPr>
+      </w:pPr>
+    </w:p>
+    <w:p>
+      <w:pPr>
+        <w:adjustRightInd w:val="0"/>
+        <w:snapToGrid w:val="0"/>
+        <w:spacing w:line="240" w:lineRule="atLeast"/>
         <w:rPr>
           <w:rFonts w:eastAsia="游明朝"/>
           <w:b/>
@@ -5089,7 +5386,7 @@
           <w:noProof/>
         </w:rPr>
         <w:drawing>
-          <wp:inline distT="0" distB="0" distL="0" distR="0" wp14:anchorId="3CE421A6" wp14:editId="54452E70">
+          <wp:inline distT="0" distB="0" distL="0" distR="0" wp14:anchorId="3CE421A6" wp14:editId="5314DE91">
             <wp:extent cx="1074164" cy="1059011"/>
             <wp:effectExtent l="0" t="0" r="0" b="8255"/>
             <wp:docPr id="681950858" name="図 1"/>
@@ -7181,6 +7478,116 @@
         <w:snapToGrid w:val="0"/>
         <w:spacing w:line="240" w:lineRule="atLeast"/>
         <w:rPr>
+          <w:rFonts w:eastAsia="游明朝"/>
+        </w:rPr>
+      </w:pPr>
+    </w:p>
+    <w:p>
+      <w:pPr>
+        <w:adjustRightInd w:val="0"/>
+        <w:snapToGrid w:val="0"/>
+        <w:spacing w:line="240" w:lineRule="atLeast"/>
+        <w:rPr>
+          <w:rFonts w:eastAsia="游明朝"/>
+        </w:rPr>
+      </w:pPr>
+    </w:p>
+    <w:p>
+      <w:pPr>
+        <w:adjustRightInd w:val="0"/>
+        <w:snapToGrid w:val="0"/>
+        <w:spacing w:line="240" w:lineRule="atLeast"/>
+        <w:rPr>
+          <w:rFonts w:eastAsia="游明朝"/>
+        </w:rPr>
+      </w:pPr>
+    </w:p>
+    <w:p>
+      <w:pPr>
+        <w:adjustRightInd w:val="0"/>
+        <w:snapToGrid w:val="0"/>
+        <w:spacing w:line="240" w:lineRule="atLeast"/>
+        <w:rPr>
+          <w:rFonts w:eastAsia="游明朝"/>
+        </w:rPr>
+      </w:pPr>
+    </w:p>
+    <w:p>
+      <w:pPr>
+        <w:adjustRightInd w:val="0"/>
+        <w:snapToGrid w:val="0"/>
+        <w:spacing w:line="240" w:lineRule="atLeast"/>
+        <w:rPr>
+          <w:rFonts w:eastAsia="游明朝"/>
+        </w:rPr>
+      </w:pPr>
+    </w:p>
+    <w:p>
+      <w:pPr>
+        <w:adjustRightInd w:val="0"/>
+        <w:snapToGrid w:val="0"/>
+        <w:spacing w:line="240" w:lineRule="atLeast"/>
+        <w:rPr>
+          <w:rFonts w:eastAsia="游明朝"/>
+        </w:rPr>
+      </w:pPr>
+    </w:p>
+    <w:p>
+      <w:pPr>
+        <w:adjustRightInd w:val="0"/>
+        <w:snapToGrid w:val="0"/>
+        <w:spacing w:line="240" w:lineRule="atLeast"/>
+        <w:rPr>
+          <w:rFonts w:eastAsia="游明朝"/>
+        </w:rPr>
+      </w:pPr>
+    </w:p>
+    <w:p>
+      <w:pPr>
+        <w:adjustRightInd w:val="0"/>
+        <w:snapToGrid w:val="0"/>
+        <w:spacing w:line="240" w:lineRule="atLeast"/>
+        <w:rPr>
+          <w:rFonts w:eastAsia="游明朝"/>
+        </w:rPr>
+      </w:pPr>
+    </w:p>
+    <w:p>
+      <w:pPr>
+        <w:adjustRightInd w:val="0"/>
+        <w:snapToGrid w:val="0"/>
+        <w:spacing w:line="240" w:lineRule="atLeast"/>
+        <w:rPr>
+          <w:rFonts w:eastAsia="游明朝"/>
+        </w:rPr>
+      </w:pPr>
+    </w:p>
+    <w:p>
+      <w:pPr>
+        <w:adjustRightInd w:val="0"/>
+        <w:snapToGrid w:val="0"/>
+        <w:spacing w:line="240" w:lineRule="atLeast"/>
+        <w:rPr>
+          <w:rFonts w:eastAsia="游明朝"/>
+        </w:rPr>
+      </w:pPr>
+    </w:p>
+    <w:p>
+      <w:pPr>
+        <w:adjustRightInd w:val="0"/>
+        <w:snapToGrid w:val="0"/>
+        <w:spacing w:line="240" w:lineRule="atLeast"/>
+        <w:rPr>
+          <w:rFonts w:eastAsia="游明朝" w:hint="eastAsia"/>
+        </w:rPr>
+      </w:pPr>
+    </w:p>
+    <w:p>
+      <w:pPr>
+        <w:adjustRightInd w:val="0"/>
+        <w:snapToGrid w:val="0"/>
+        <w:spacing w:line="240" w:lineRule="atLeast"/>
+        <w:rPr>
           <w:b/>
           <w:bCs/>
           <w:sz w:val="28"/>
@@ -7598,6 +8005,9 @@
         <w:adjustRightInd w:val="0"/>
         <w:snapToGrid w:val="0"/>
         <w:spacing w:line="240" w:lineRule="atLeast"/>
+        <w:rPr>
+          <w:rFonts w:hint="eastAsia"/>
+        </w:rPr>
       </w:pPr>
     </w:p>
     <w:p>
@@ -7825,6 +8235,65 @@
         <w:adjustRightInd w:val="0"/>
         <w:snapToGrid w:val="0"/>
         <w:spacing w:line="240" w:lineRule="atLeast"/>
+      </w:pPr>
+    </w:p>
+    <w:p>
+      <w:pPr>
+        <w:adjustRightInd w:val="0"/>
+        <w:snapToGrid w:val="0"/>
+        <w:spacing w:line="240" w:lineRule="atLeast"/>
+      </w:pPr>
+    </w:p>
+    <w:p>
+      <w:pPr>
+        <w:adjustRightInd w:val="0"/>
+        <w:snapToGrid w:val="0"/>
+        <w:spacing w:line="240" w:lineRule="atLeast"/>
+      </w:pPr>
+    </w:p>
+    <w:p>
+      <w:pPr>
+        <w:adjustRightInd w:val="0"/>
+        <w:snapToGrid w:val="0"/>
+        <w:spacing w:line="240" w:lineRule="atLeast"/>
+      </w:pPr>
+    </w:p>
+    <w:p>
+      <w:pPr>
+        <w:adjustRightInd w:val="0"/>
+        <w:snapToGrid w:val="0"/>
+        <w:spacing w:line="240" w:lineRule="atLeast"/>
+      </w:pPr>
+    </w:p>
+    <w:p>
+      <w:pPr>
+        <w:adjustRightInd w:val="0"/>
+        <w:snapToGrid w:val="0"/>
+        <w:spacing w:line="240" w:lineRule="atLeast"/>
+      </w:pPr>
+    </w:p>
+    <w:p>
+      <w:pPr>
+        <w:adjustRightInd w:val="0"/>
+        <w:snapToGrid w:val="0"/>
+        <w:spacing w:line="240" w:lineRule="atLeast"/>
+      </w:pPr>
+    </w:p>
+    <w:p>
+      <w:pPr>
+        <w:adjustRightInd w:val="0"/>
+        <w:snapToGrid w:val="0"/>
+        <w:spacing w:line="240" w:lineRule="atLeast"/>
+        <w:rPr>
+          <w:rFonts w:hint="eastAsia"/>
+        </w:rPr>
+      </w:pPr>
+    </w:p>
+    <w:p>
+      <w:pPr>
+        <w:adjustRightInd w:val="0"/>
+        <w:snapToGrid w:val="0"/>
+        <w:spacing w:line="240" w:lineRule="atLeast"/>
         <w:rPr>
           <w:b/>
           <w:bCs/>
@@ -8149,10 +8618,10 @@
           <w:noProof/>
         </w:rPr>
         <w:drawing>
-          <wp:inline distT="0" distB="0" distL="0" distR="0" wp14:anchorId="76872587" wp14:editId="13BAD719">
-            <wp:extent cx="662940" cy="985597"/>
-            <wp:effectExtent l="0" t="0" r="3810" b="5080"/>
-            <wp:docPr id="76437822" name="図 1"/>
+          <wp:inline distT="0" distB="0" distL="0" distR="0" wp14:anchorId="0A2A751B" wp14:editId="027EBC92">
+            <wp:extent cx="491490" cy="1017920"/>
+            <wp:effectExtent l="0" t="0" r="3810" b="0"/>
+            <wp:docPr id="1900950343" name="図 1"/>
             <wp:cNvGraphicFramePr>
               <a:graphicFrameLocks xmlns:a="http://schemas.openxmlformats.org/drawingml/2006/main" noChangeAspect="1"/>
             </wp:cNvGraphicFramePr>
@@ -8160,7 +8629,7 @@
               <a:graphicData uri="http://schemas.openxmlformats.org/drawingml/2006/picture">
                 <pic:pic xmlns:pic="http://schemas.openxmlformats.org/drawingml/2006/picture">
                   <pic:nvPicPr>
-                    <pic:cNvPr id="0" name="Picture 1"/>
+                    <pic:cNvPr id="0" name="Picture 4"/>
                     <pic:cNvPicPr>
                       <a:picLocks noChangeAspect="1" noChangeArrowheads="1"/>
                     </pic:cNvPicPr>
@@ -8181,7 +8650,7 @@
                   <pic:spPr bwMode="auto">
                     <a:xfrm>
                       <a:off x="0" y="0"/>
-                      <a:ext cx="668356" cy="993649"/>
+                      <a:ext cx="500361" cy="1036293"/>
                     </a:xfrm>
                     <a:prstGeom prst="rect">
                       <a:avLst/>
@@ -8203,6 +8672,10 @@
         <w:adjustRightInd w:val="0"/>
         <w:snapToGrid w:val="0"/>
         <w:spacing w:line="240" w:lineRule="atLeast"/>
+        <w:ind w:firstLineChars="100" w:firstLine="210"/>
+        <w:rPr>
+          <w:rFonts w:hint="eastAsia"/>
+        </w:rPr>
       </w:pPr>
       <w:r>
         <w:rPr>
@@ -8210,6 +8683,12 @@
         </w:rPr>
         <w:t>・どこでもレジサービスを初期費用なしで提供</w:t>
       </w:r>
+      <w:r>
+        <w:rPr>
+          <w:rFonts w:hint="eastAsia"/>
+        </w:rPr>
+        <w:t>(スクエア決済)　を完備</w:t>
+      </w:r>
     </w:p>
     <w:p>
       <w:pPr>
@@ -8235,7 +8714,19 @@
         <w:rPr>
           <w:rFonts w:hint="eastAsia"/>
         </w:rPr>
-        <w:t xml:space="preserve">　レジスペースの確保が難しい小規模スーパーやセルフレジの導入コストが</w:t>
+        <w:t xml:space="preserve">　</w:t>
+      </w:r>
+      <w:r>
+        <w:rPr>
+          <w:rFonts w:hint="eastAsia"/>
+        </w:rPr>
+        <w:t>1.</w:t>
+      </w:r>
+      <w:r>
+        <w:rPr>
+          <w:rFonts w:hint="eastAsia"/>
+        </w:rPr>
+        <w:t>レジスペースの確保が難しい小規模スーパーやセルフレジの導入コストが</w:t>
       </w:r>
     </w:p>
     <w:p>
@@ -8254,135 +8745,249 @@
     </w:p>
     <w:p>
       <w:pPr>
-        <w:adjustRightInd w:val="0"/>
-        <w:snapToGrid w:val="0"/>
-        <w:spacing w:line="240" w:lineRule="atLeast"/>
+        <w:snapToGrid w:val="0"/>
         <w:ind w:firstLineChars="100" w:firstLine="210"/>
-      </w:pPr>
-      <w:r>
-        <w:rPr>
-          <w:rFonts w:hint="eastAsia"/>
-        </w:rPr>
-        <w:t>年末の混雑の解消でPOSデータと連携して駐車場前でも</w:t>
-      </w:r>
-    </w:p>
-    <w:p>
-      <w:pPr>
-        <w:adjustRightInd w:val="0"/>
-        <w:snapToGrid w:val="0"/>
-        <w:spacing w:line="240" w:lineRule="atLeast"/>
+        <w:rPr>
+          <w:b/>
+          <w:bCs/>
+        </w:rPr>
+      </w:pPr>
+      <w:r>
+        <w:rPr>
+          <w:rFonts w:hint="eastAsia"/>
+        </w:rPr>
+        <w:t>2.限定・</w:t>
+      </w:r>
+      <w:r>
+        <w:rPr>
+          <w:rFonts w:hint="eastAsia"/>
+        </w:rPr>
+        <w:t>上位顧客から提供を開始し</w:t>
+      </w:r>
+    </w:p>
+    <w:p>
+      <w:pPr>
+        <w:snapToGrid w:val="0"/>
+      </w:pPr>
+      <w:r>
+        <w:rPr>
+          <w:rFonts w:hint="eastAsia"/>
+          <w:b/>
+          <w:bCs/>
+        </w:rPr>
+        <w:t xml:space="preserve">　</w:t>
+      </w:r>
+      <w:r>
+        <w:rPr>
+          <w:rFonts w:hint="eastAsia"/>
+        </w:rPr>
+        <w:t>1.</w:t>
+      </w:r>
+      <w:r>
+        <w:t>「</w:t>
+      </w:r>
+      <w:r>
+        <w:rPr>
+          <w:rFonts w:hint="eastAsia"/>
+        </w:rPr>
+        <w:t>店舗・小売り業者の</w:t>
+      </w:r>
+      <w:r>
+        <w:t>顧客用スマホレジQR発行」</w:t>
+      </w:r>
+      <w:r>
+        <w:rPr>
+          <w:rFonts w:hint="eastAsia"/>
+        </w:rPr>
+        <w:t>機能</w:t>
+      </w:r>
+    </w:p>
+    <w:p>
+      <w:pPr>
+        <w:snapToGrid w:val="0"/>
         <w:ind w:firstLineChars="100" w:firstLine="210"/>
-      </w:pPr>
-      <w:r>
-        <w:rPr>
-          <w:rFonts w:hint="eastAsia"/>
-        </w:rPr>
-        <w:t>バーコードを読み込み機能と決済機能(</w:t>
-      </w:r>
-      <w:r>
-        <w:rPr>
-          <w:rFonts w:hint="eastAsia"/>
-        </w:rPr>
-        <w:t>スクエア決済</w:t>
-      </w:r>
-      <w:r>
-        <w:rPr>
-          <w:rFonts w:hint="eastAsia"/>
-        </w:rPr>
-        <w:t>)　を完備</w:t>
-      </w:r>
-    </w:p>
-    <w:p>
-      <w:pPr>
-        <w:adjustRightInd w:val="0"/>
-        <w:snapToGrid w:val="0"/>
-        <w:spacing w:line="240" w:lineRule="atLeast"/>
+        <w:rPr>
+          <w:rFonts w:hint="eastAsia"/>
+        </w:rPr>
+      </w:pPr>
+      <w:r>
+        <w:rPr>
+          <w:rFonts w:hint="eastAsia"/>
+        </w:rPr>
+        <w:t>2.</w:t>
+      </w:r>
+      <w:r>
+        <w:t>自動パラメータ生成機能 </w:t>
+      </w:r>
+      <w:r>
+        <w:rPr>
+          <w:rFonts w:hint="eastAsia"/>
+        </w:rPr>
+        <w:t>account作成</w:t>
+      </w:r>
+      <w:r>
+        <w:t>し</w:t>
+      </w:r>
+      <w:r>
+        <w:rPr>
+          <w:rFonts w:hint="eastAsia"/>
+        </w:rPr>
+        <w:t>た</w:t>
+      </w:r>
+    </w:p>
+    <w:p>
+      <w:pPr>
+        <w:snapToGrid w:val="0"/>
+        <w:ind w:firstLineChars="200" w:firstLine="420"/>
+        <w:rPr>
+          <w:rFonts w:hint="eastAsia"/>
+        </w:rPr>
+      </w:pPr>
+      <w:r>
+        <w:t>お店の</w:t>
+      </w:r>
+      <w:r>
+        <w:rPr>
+          <w:rFonts w:hint="eastAsia"/>
+        </w:rPr>
+        <w:t>情報と決済をlink</w:t>
+      </w:r>
+    </w:p>
+    <w:p>
+      <w:pPr>
+        <w:snapToGrid w:val="0"/>
         <w:ind w:firstLineChars="100" w:firstLine="210"/>
-      </w:pPr>
-    </w:p>
-    <w:p>
-      <w:pPr>
-        <w:snapToGrid w:val="0"/>
-        <w:rPr>
-          <w:b/>
-          <w:bCs/>
-        </w:rPr>
-      </w:pPr>
-      <w:r>
-        <w:rPr>
-          <w:rFonts w:hint="eastAsia"/>
-        </w:rPr>
-        <w:t>※</w:t>
-      </w:r>
-      <w:r>
-        <w:rPr>
-          <w:rFonts w:hint="eastAsia"/>
-        </w:rPr>
-        <w:t>上位顧客から提供を開始してデータや利用状況を見て順次提供</w:t>
-      </w:r>
-      <w:r>
-        <w:rPr>
-          <w:rFonts w:hint="eastAsia"/>
-        </w:rPr>
-        <w:t>拡大</w:t>
-      </w:r>
-    </w:p>
-    <w:p>
-      <w:pPr>
-        <w:snapToGrid w:val="0"/>
-        <w:rPr>
-          <w:b/>
-          <w:bCs/>
-        </w:rPr>
-      </w:pPr>
-      <w:r>
-        <w:rPr>
-          <w:rFonts w:hint="eastAsia"/>
-          <w:b/>
-          <w:bCs/>
-        </w:rPr>
-        <w:t>特殊印刷(カード)の印刷会社の社長の知り合いがいるので</w:t>
-      </w:r>
-    </w:p>
-    <w:p>
-      <w:pPr>
-        <w:snapToGrid w:val="0"/>
-        <w:rPr>
-          <w:b/>
-          <w:bCs/>
-        </w:rPr>
-      </w:pPr>
-      <w:r>
-        <w:rPr>
-          <w:rFonts w:hint="eastAsia"/>
-          <w:b/>
-          <w:bCs/>
-        </w:rPr>
-        <w:t>特別なレターで上位顧客に便りを送れば</w:t>
-      </w:r>
-      <w:r>
-        <w:rPr>
-          <w:rFonts w:hint="eastAsia"/>
-          <w:b/>
-          <w:bCs/>
-        </w:rPr>
-        <w:t>、データも取れて</w:t>
-      </w:r>
-      <w:r>
-        <w:rPr>
-          <w:rFonts w:hint="eastAsia"/>
-          <w:b/>
-          <w:bCs/>
-        </w:rPr>
-        <w:t>喜んで頂けると考えます。</w:t>
-      </w:r>
-    </w:p>
-    <w:p>
-      <w:pPr>
-        <w:snapToGrid w:val="0"/>
-        <w:rPr>
-          <w:b/>
-          <w:bCs/>
+        <w:rPr>
+          <w:rFonts w:hint="eastAsia"/>
+        </w:rPr>
+      </w:pPr>
+      <w:r>
+        <w:rPr>
+          <w:rFonts w:hint="eastAsia"/>
+        </w:rPr>
+        <w:t>3.</w:t>
+      </w:r>
+      <w:r>
+        <w:rPr>
+          <w:rFonts w:hint="eastAsia"/>
+        </w:rPr>
+        <w:t>顧客に提供する</w:t>
+      </w:r>
+      <w:r>
+        <w:t>QRコード画像 ＆ URLコピー機能 </w:t>
+      </w:r>
+    </w:p>
+    <w:p>
+      <w:pPr>
+        <w:snapToGrid w:val="0"/>
+        <w:ind w:firstLineChars="100" w:firstLine="210"/>
+      </w:pPr>
+      <w:r>
+        <w:t>【運用メリット】</w:t>
+      </w:r>
+    </w:p>
+    <w:p>
+      <w:pPr>
+        <w:snapToGrid w:val="0"/>
+        <w:ind w:firstLineChars="200" w:firstLine="420"/>
+      </w:pPr>
+      <w:r>
+        <w:rPr>
+          <w:rFonts w:hint="eastAsia"/>
+          <w:b/>
+          <w:bCs/>
+        </w:rPr>
+        <w:t>レター・</w:t>
+      </w:r>
+      <w:r>
+        <w:rPr>
+          <w:b/>
+          <w:bCs/>
+        </w:rPr>
+        <w:t>LINE等での遠隔配信が可能に:</w:t>
+      </w:r>
+      <w:r>
+        <w:t> </w:t>
+      </w:r>
+      <w:r>
+        <w:t xml:space="preserve"> </w:t>
+      </w:r>
+    </w:p>
+    <w:p>
+      <w:pPr>
+        <w:snapToGrid w:val="0"/>
+        <w:ind w:firstLineChars="200" w:firstLine="420"/>
+      </w:pPr>
+      <w:r>
+        <w:t>コピーしたURLをお店の公式LINEやメルマガで</w:t>
+      </w:r>
+    </w:p>
+    <w:p>
+      <w:pPr>
+        <w:snapToGrid w:val="0"/>
+        <w:ind w:firstLineChars="200" w:firstLine="420"/>
+      </w:pPr>
+      <w:r>
+        <w:t>上位顧客（VIP）に一斉送信することができます。</w:t>
+      </w:r>
+    </w:p>
+    <w:p>
+      <w:pPr>
+        <w:snapToGrid w:val="0"/>
+        <w:ind w:firstLineChars="200" w:firstLine="420"/>
+      </w:pPr>
+      <w:r>
+        <w:rPr>
+          <w:b/>
+          <w:bCs/>
+        </w:rPr>
+        <w:t>店側の完全コントロール:</w:t>
+      </w:r>
+      <w:r>
+        <w:t> </w:t>
+      </w:r>
+    </w:p>
+    <w:p>
+      <w:pPr>
+        <w:snapToGrid w:val="0"/>
+        <w:ind w:firstLineChars="200" w:firstLine="420"/>
+      </w:pPr>
+      <w:r>
+        <w:t>お客様がそのURLを開いて買い物をすれば</w:t>
+      </w:r>
+    </w:p>
+    <w:p>
+      <w:pPr>
+        <w:snapToGrid w:val="0"/>
+        <w:ind w:firstLineChars="200" w:firstLine="420"/>
+      </w:pPr>
+      <w:r>
+        <w:t>システム側には「パラメータに入っているA社の売上」として</w:t>
+      </w:r>
+    </w:p>
+    <w:p>
+      <w:pPr>
+        <w:snapToGrid w:val="0"/>
+        <w:ind w:firstLineChars="200" w:firstLine="420"/>
+      </w:pPr>
+      <w:r>
+        <w:t>自動で確実に記録されるため、お店側が配信先を</w:t>
+      </w:r>
+    </w:p>
+    <w:p>
+      <w:pPr>
+        <w:snapToGrid w:val="0"/>
+        <w:ind w:firstLineChars="200" w:firstLine="420"/>
+      </w:pPr>
+      <w:r>
+        <w:t>完全にコントロールしながら運用できます。</w:t>
+      </w:r>
+    </w:p>
+    <w:p>
+      <w:pPr>
+        <w:snapToGrid w:val="0"/>
+        <w:rPr>
+          <w:rFonts w:hint="eastAsia"/>
         </w:rPr>
       </w:pPr>
     </w:p>
@@ -8459,28 +9064,35 @@
           <w:rFonts w:hint="eastAsia"/>
           <w:u w:val="single"/>
         </w:rPr>
-        <w:t>このデメリットをセルフレジの廃止や　そのスペースを広告スペース</w:t>
-      </w:r>
-      <w:r>
-        <w:rPr>
-          <w:rFonts w:hint="eastAsia"/>
+        <w:t xml:space="preserve">このデメリットをセルフレジの廃止や　</w:t>
+      </w:r>
+    </w:p>
+    <w:p>
+      <w:pPr>
+        <w:snapToGrid w:val="0"/>
+        <w:rPr>
           <w:u w:val="single"/>
         </w:rPr>
+      </w:pPr>
+      <w:r>
+        <w:rPr>
+          <w:rFonts w:hint="eastAsia"/>
+          <w:u w:val="single"/>
+        </w:rPr>
+        <w:t>そのスペースを広告スペース</w:t>
+      </w:r>
+      <w:r>
+        <w:rPr>
+          <w:rFonts w:hint="eastAsia"/>
+          <w:u w:val="single"/>
+        </w:rPr>
         <w:t>を</w:t>
       </w:r>
-    </w:p>
-    <w:p>
-      <w:pPr>
-        <w:snapToGrid w:val="0"/>
-        <w:rPr>
+      <w:r>
+        <w:rPr>
+          <w:rFonts w:hint="eastAsia"/>
           <w:u w:val="single"/>
         </w:rPr>
-      </w:pPr>
-      <w:r>
-        <w:rPr>
-          <w:rFonts w:hint="eastAsia"/>
-          <w:u w:val="single"/>
-        </w:rPr>
         <w:t>収益化</w:t>
       </w:r>
     </w:p>
@@ -8488,14 +9100,7 @@
       <w:pPr>
         <w:snapToGrid w:val="0"/>
         <w:rPr>
-          <w:u w:val="single"/>
-        </w:rPr>
-      </w:pPr>
-    </w:p>
-    <w:p>
-      <w:pPr>
-        <w:snapToGrid w:val="0"/>
-        <w:rPr>
+          <w:rFonts w:hint="eastAsia"/>
           <w:u w:val="single"/>
         </w:rPr>
       </w:pPr>
@@ -9413,34 +10018,17 @@
         <w:rPr>
           <w:rFonts w:hint="eastAsia"/>
         </w:rPr>
-        <w:t>時間調整などするだけで、シフトガンチャートなど一目で人員配置や</w:t>
-      </w:r>
-    </w:p>
-    <w:p>
-      <w:pPr>
-        <w:adjustRightInd w:val="0"/>
-        <w:snapToGrid w:val="0"/>
-        <w:spacing w:line="240" w:lineRule="atLeast"/>
-      </w:pPr>
-      <w:r>
-        <w:rPr>
-          <w:rFonts w:hint="eastAsia"/>
-        </w:rPr>
-        <w:t>時間帯を理解・調整をできます</w:t>
-      </w:r>
-    </w:p>
-    <w:p>
-      <w:pPr>
-        <w:adjustRightInd w:val="0"/>
-        <w:snapToGrid w:val="0"/>
-        <w:spacing w:line="240" w:lineRule="atLeast"/>
-      </w:pPr>
-    </w:p>
-    <w:p>
-      <w:pPr>
-        <w:adjustRightInd w:val="0"/>
-        <w:snapToGrid w:val="0"/>
-        <w:spacing w:line="240" w:lineRule="atLeast"/>
+        <w:t>シフトガンチャートなど一目で人員配置や時間帯を理解・調整をできます</w:t>
+      </w:r>
+    </w:p>
+    <w:p>
+      <w:pPr>
+        <w:adjustRightInd w:val="0"/>
+        <w:snapToGrid w:val="0"/>
+        <w:spacing w:line="240" w:lineRule="atLeast"/>
+        <w:rPr>
+          <w:rFonts w:hint="eastAsia"/>
+        </w:rPr>
       </w:pPr>
     </w:p>
     <w:p>
@@ -10034,6 +10622,37 @@
         <w:adjustRightInd w:val="0"/>
         <w:snapToGrid w:val="0"/>
         <w:spacing w:line="240" w:lineRule="atLeast"/>
+      </w:pPr>
+    </w:p>
+    <w:p>
+      <w:pPr>
+        <w:adjustRightInd w:val="0"/>
+        <w:snapToGrid w:val="0"/>
+        <w:spacing w:line="240" w:lineRule="atLeast"/>
+      </w:pPr>
+    </w:p>
+    <w:p>
+      <w:pPr>
+        <w:adjustRightInd w:val="0"/>
+        <w:snapToGrid w:val="0"/>
+        <w:spacing w:line="240" w:lineRule="atLeast"/>
+      </w:pPr>
+    </w:p>
+    <w:p>
+      <w:pPr>
+        <w:adjustRightInd w:val="0"/>
+        <w:snapToGrid w:val="0"/>
+        <w:spacing w:line="240" w:lineRule="atLeast"/>
+        <w:rPr>
+          <w:rFonts w:hint="eastAsia"/>
+        </w:rPr>
+      </w:pPr>
+    </w:p>
+    <w:p>
+      <w:pPr>
+        <w:adjustRightInd w:val="0"/>
+        <w:snapToGrid w:val="0"/>
+        <w:spacing w:line="240" w:lineRule="atLeast"/>
         <w:rPr>
           <w:b/>
           <w:bCs/>
@@ -10304,6 +10923,238 @@
         <w:snapToGrid w:val="0"/>
         <w:spacing w:line="240" w:lineRule="atLeast"/>
         <w:rPr>
+          <w:b/>
+          <w:bCs/>
+        </w:rPr>
+      </w:pPr>
+    </w:p>
+    <w:p>
+      <w:pPr>
+        <w:adjustRightInd w:val="0"/>
+        <w:snapToGrid w:val="0"/>
+        <w:spacing w:line="240" w:lineRule="atLeast"/>
+        <w:rPr>
+          <w:b/>
+          <w:bCs/>
+        </w:rPr>
+      </w:pPr>
+    </w:p>
+    <w:p>
+      <w:pPr>
+        <w:adjustRightInd w:val="0"/>
+        <w:snapToGrid w:val="0"/>
+        <w:spacing w:line="240" w:lineRule="atLeast"/>
+        <w:rPr>
+          <w:b/>
+          <w:bCs/>
+        </w:rPr>
+      </w:pPr>
+    </w:p>
+    <w:p>
+      <w:pPr>
+        <w:adjustRightInd w:val="0"/>
+        <w:snapToGrid w:val="0"/>
+        <w:spacing w:line="240" w:lineRule="atLeast"/>
+        <w:rPr>
+          <w:b/>
+          <w:bCs/>
+        </w:rPr>
+      </w:pPr>
+    </w:p>
+    <w:p>
+      <w:pPr>
+        <w:adjustRightInd w:val="0"/>
+        <w:snapToGrid w:val="0"/>
+        <w:spacing w:line="240" w:lineRule="atLeast"/>
+        <w:rPr>
+          <w:b/>
+          <w:bCs/>
+        </w:rPr>
+      </w:pPr>
+    </w:p>
+    <w:p>
+      <w:pPr>
+        <w:adjustRightInd w:val="0"/>
+        <w:snapToGrid w:val="0"/>
+        <w:spacing w:line="240" w:lineRule="atLeast"/>
+        <w:rPr>
+          <w:b/>
+          <w:bCs/>
+        </w:rPr>
+      </w:pPr>
+    </w:p>
+    <w:p>
+      <w:pPr>
+        <w:adjustRightInd w:val="0"/>
+        <w:snapToGrid w:val="0"/>
+        <w:spacing w:line="240" w:lineRule="atLeast"/>
+        <w:rPr>
+          <w:b/>
+          <w:bCs/>
+        </w:rPr>
+      </w:pPr>
+    </w:p>
+    <w:p>
+      <w:pPr>
+        <w:adjustRightInd w:val="0"/>
+        <w:snapToGrid w:val="0"/>
+        <w:spacing w:line="240" w:lineRule="atLeast"/>
+        <w:rPr>
+          <w:b/>
+          <w:bCs/>
+        </w:rPr>
+      </w:pPr>
+    </w:p>
+    <w:p>
+      <w:pPr>
+        <w:adjustRightInd w:val="0"/>
+        <w:snapToGrid w:val="0"/>
+        <w:spacing w:line="240" w:lineRule="atLeast"/>
+        <w:rPr>
+          <w:b/>
+          <w:bCs/>
+        </w:rPr>
+      </w:pPr>
+    </w:p>
+    <w:p>
+      <w:pPr>
+        <w:adjustRightInd w:val="0"/>
+        <w:snapToGrid w:val="0"/>
+        <w:spacing w:line="240" w:lineRule="atLeast"/>
+        <w:rPr>
+          <w:b/>
+          <w:bCs/>
+        </w:rPr>
+      </w:pPr>
+    </w:p>
+    <w:p>
+      <w:pPr>
+        <w:adjustRightInd w:val="0"/>
+        <w:snapToGrid w:val="0"/>
+        <w:spacing w:line="240" w:lineRule="atLeast"/>
+        <w:rPr>
+          <w:b/>
+          <w:bCs/>
+        </w:rPr>
+      </w:pPr>
+    </w:p>
+    <w:p>
+      <w:pPr>
+        <w:adjustRightInd w:val="0"/>
+        <w:snapToGrid w:val="0"/>
+        <w:spacing w:line="240" w:lineRule="atLeast"/>
+        <w:rPr>
+          <w:b/>
+          <w:bCs/>
+        </w:rPr>
+      </w:pPr>
+    </w:p>
+    <w:p>
+      <w:pPr>
+        <w:adjustRightInd w:val="0"/>
+        <w:snapToGrid w:val="0"/>
+        <w:spacing w:line="240" w:lineRule="atLeast"/>
+        <w:rPr>
+          <w:b/>
+          <w:bCs/>
+        </w:rPr>
+      </w:pPr>
+    </w:p>
+    <w:p>
+      <w:pPr>
+        <w:adjustRightInd w:val="0"/>
+        <w:snapToGrid w:val="0"/>
+        <w:spacing w:line="240" w:lineRule="atLeast"/>
+        <w:rPr>
+          <w:b/>
+          <w:bCs/>
+        </w:rPr>
+      </w:pPr>
+    </w:p>
+    <w:p>
+      <w:pPr>
+        <w:adjustRightInd w:val="0"/>
+        <w:snapToGrid w:val="0"/>
+        <w:spacing w:line="240" w:lineRule="atLeast"/>
+        <w:rPr>
+          <w:b/>
+          <w:bCs/>
+        </w:rPr>
+      </w:pPr>
+    </w:p>
+    <w:p>
+      <w:pPr>
+        <w:adjustRightInd w:val="0"/>
+        <w:snapToGrid w:val="0"/>
+        <w:spacing w:line="240" w:lineRule="atLeast"/>
+        <w:rPr>
+          <w:b/>
+          <w:bCs/>
+        </w:rPr>
+      </w:pPr>
+    </w:p>
+    <w:p>
+      <w:pPr>
+        <w:adjustRightInd w:val="0"/>
+        <w:snapToGrid w:val="0"/>
+        <w:spacing w:line="240" w:lineRule="atLeast"/>
+        <w:rPr>
+          <w:b/>
+          <w:bCs/>
+        </w:rPr>
+      </w:pPr>
+    </w:p>
+    <w:p>
+      <w:pPr>
+        <w:adjustRightInd w:val="0"/>
+        <w:snapToGrid w:val="0"/>
+        <w:spacing w:line="240" w:lineRule="atLeast"/>
+        <w:rPr>
+          <w:b/>
+          <w:bCs/>
+        </w:rPr>
+      </w:pPr>
+    </w:p>
+    <w:p>
+      <w:pPr>
+        <w:adjustRightInd w:val="0"/>
+        <w:snapToGrid w:val="0"/>
+        <w:spacing w:line="240" w:lineRule="atLeast"/>
+        <w:rPr>
+          <w:b/>
+          <w:bCs/>
+        </w:rPr>
+      </w:pPr>
+    </w:p>
+    <w:p>
+      <w:pPr>
+        <w:adjustRightInd w:val="0"/>
+        <w:snapToGrid w:val="0"/>
+        <w:spacing w:line="240" w:lineRule="atLeast"/>
+        <w:rPr>
+          <w:b/>
+          <w:bCs/>
+        </w:rPr>
+      </w:pPr>
+    </w:p>
+    <w:p>
+      <w:pPr>
+        <w:adjustRightInd w:val="0"/>
+        <w:snapToGrid w:val="0"/>
+        <w:spacing w:line="240" w:lineRule="atLeast"/>
+        <w:rPr>
+          <w:b/>
+          <w:bCs/>
+        </w:rPr>
+      </w:pPr>
+    </w:p>
+    <w:p>
+      <w:pPr>
+        <w:adjustRightInd w:val="0"/>
+        <w:snapToGrid w:val="0"/>
+        <w:spacing w:line="240" w:lineRule="atLeast"/>
+        <w:rPr>
+          <w:rFonts w:hint="eastAsia"/>
           <w:b/>
           <w:bCs/>
         </w:rPr>
@@ -11014,6 +11865,14 @@
               </w:rPr>
               <w:t>30,000</w:t>
             </w:r>
+            <w:r>
+              <w:rPr>
+                <w:rFonts w:hint="eastAsia"/>
+                <w:b/>
+                <w:bCs/>
+              </w:rPr>
+              <w:t>(目標値)</w:t>
+            </w:r>
           </w:p>
         </w:tc>
       </w:tr>
@@ -11126,7 +11985,22 @@
           <w:b/>
           <w:bCs/>
         </w:rPr>
-        <w:t>（3万パネル）の日本最大級のメディ</w:t>
+        <w:t>（3万パネル）の日本最大級</w:t>
+      </w:r>
+      <w:r>
+        <w:rPr>
+          <w:rFonts w:hint="eastAsia"/>
+          <w:b/>
+          <w:bCs/>
+        </w:rPr>
+        <w:t>以上</w:t>
+      </w:r>
+      <w:r>
+        <w:rPr>
+          <w:b/>
+          <w:bCs/>
+        </w:rPr>
+        <w:t>のメディ</w:t>
       </w:r>
       <w:r>
         <w:rPr>
@@ -15480,6 +16354,7 @@
           <w:b/>
           <w:bCs/>
           <w:u w:val="single"/>
+          <w:lang w:eastAsia="zh-CN"/>
         </w:rPr>
         <w:t>300万円</w:t>
       </w:r>
@@ -15601,7 +16476,6 @@
         <w:spacing w:line="240" w:lineRule="atLeast"/>
         <w:ind w:firstLineChars="100" w:firstLine="210"/>
         <w:rPr>
-          <w:rFonts w:hint="eastAsia"/>
           <w:u w:val="single"/>
         </w:rPr>
       </w:pPr>
@@ -15636,7 +16510,6 @@
         <w:spacing w:line="240" w:lineRule="atLeast"/>
         <w:ind w:firstLineChars="100" w:firstLine="210"/>
         <w:rPr>
-          <w:rFonts w:hint="eastAsia"/>
           <w:u w:val="single"/>
         </w:rPr>
       </w:pPr>
@@ -15721,7 +16594,6 @@
         <w:snapToGrid w:val="0"/>
         <w:spacing w:line="240" w:lineRule="atLeast"/>
         <w:rPr>
-          <w:rFonts w:hint="eastAsia"/>
           <w:u w:val="single"/>
         </w:rPr>
       </w:pPr>
@@ -18647,6 +19519,155 @@
     </w:lvl>
   </w:abstractNum>
   <w:abstractNum w:abstractNumId="18" w15:restartNumberingAfterBreak="0">
+    <w:nsid w:val="4F2F0BC6"/>
+    <w:multiLevelType w:val="multilevel"/>
+    <w:tmpl w:val="99EEEBF4"/>
+    <w:lvl w:ilvl="0">
+      <w:start w:val="1"/>
+      <w:numFmt w:val="bullet"/>
+      <w:lvlText w:val=""/>
+      <w:lvlJc w:val="left"/>
+      <w:pPr>
+        <w:tabs>
+          <w:tab w:val="num" w:pos="720"/>
+        </w:tabs>
+        <w:ind w:left="720" w:hanging="360"/>
+      </w:pPr>
+      <w:rPr>
+        <w:rFonts w:ascii="Symbol" w:hAnsi="Symbol" w:hint="default"/>
+        <w:sz w:val="20"/>
+      </w:rPr>
+    </w:lvl>
+    <w:lvl w:ilvl="1" w:tentative="1">
+      <w:start w:val="1"/>
+      <w:numFmt w:val="bullet"/>
+      <w:lvlText w:val=""/>
+      <w:lvlJc w:val="left"/>
+      <w:pPr>
+        <w:tabs>
+          <w:tab w:val="num" w:pos="1440"/>
+        </w:tabs>
+        <w:ind w:left="1440" w:hanging="360"/>
+      </w:pPr>
+      <w:rPr>
+        <w:rFonts w:ascii="Symbol" w:hAnsi="Symbol" w:hint="default"/>
+        <w:sz w:val="20"/>
+      </w:rPr>
+    </w:lvl>
+    <w:lvl w:ilvl="2" w:tentative="1">
+      <w:start w:val="1"/>
+      <w:numFmt w:val="bullet"/>
+      <w:lvlText w:val=""/>
+      <w:lvlJc w:val="left"/>
+      <w:pPr>
+        <w:tabs>
+          <w:tab w:val="num" w:pos="2160"/>
+        </w:tabs>
+        <w:ind w:left="2160" w:hanging="360"/>
+      </w:pPr>
+      <w:rPr>
+        <w:rFonts w:ascii="Symbol" w:hAnsi="Symbol" w:hint="default"/>
+        <w:sz w:val="20"/>
+      </w:rPr>
+    </w:lvl>
+    <w:lvl w:ilvl="3" w:tentative="1">
+      <w:start w:val="1"/>
+      <w:numFmt w:val="bullet"/>
+      <w:lvlText w:val=""/>
+      <w:lvlJc w:val="left"/>
+      <w:pPr>
+        <w:tabs>
+          <w:tab w:val="num" w:pos="2880"/>
+        </w:tabs>
+        <w:ind w:left="2880" w:hanging="360"/>
+      </w:pPr>
+      <w:rPr>
+        <w:rFonts w:ascii="Symbol" w:hAnsi="Symbol" w:hint="default"/>
+        <w:sz w:val="20"/>
+      </w:rPr>
+    </w:lvl>
+    <w:lvl w:ilvl="4" w:tentative="1">
+      <w:start w:val="1"/>
+      <w:numFmt w:val="bullet"/>
+      <w:lvlText w:val=""/>
+      <w:lvlJc w:val="left"/>
+      <w:pPr>
+        <w:tabs>
+          <w:tab w:val="num" w:pos="3600"/>
+        </w:tabs>
+        <w:ind w:left="3600" w:hanging="360"/>
+      </w:pPr>
+      <w:rPr>
+        <w:rFonts w:ascii="Symbol" w:hAnsi="Symbol" w:hint="default"/>
+        <w:sz w:val="20"/>
+      </w:rPr>
+    </w:lvl>
+    <w:lvl w:ilvl="5" w:tentative="1">
+      <w:start w:val="1"/>
+      <w:numFmt w:val="bullet"/>
+      <w:lvlText w:val=""/>
+      <w:lvlJc w:val="left"/>
+      <w:pPr>
+        <w:tabs>
+          <w:tab w:val="num" w:pos="4320"/>
+        </w:tabs>
+        <w:ind w:left="4320" w:hanging="360"/>
+      </w:pPr>
+      <w:rPr>
+        <w:rFonts w:ascii="Symbol" w:hAnsi="Symbol" w:hint="default"/>
+        <w:sz w:val="20"/>
+      </w:rPr>
+    </w:lvl>
+    <w:lvl w:ilvl="6" w:tentative="1">
+      <w:start w:val="1"/>
+      <w:numFmt w:val="bullet"/>
+      <w:lvlText w:val=""/>
+      <w:lvlJc w:val="left"/>
+      <w:pPr>
+        <w:tabs>
+          <w:tab w:val="num" w:pos="5040"/>
+        </w:tabs>
+        <w:ind w:left="5040" w:hanging="360"/>
+      </w:pPr>
+      <w:rPr>
+        <w:rFonts w:ascii="Symbol" w:hAnsi="Symbol" w:hint="default"/>
+        <w:sz w:val="20"/>
+      </w:rPr>
+    </w:lvl>
+    <w:lvl w:ilvl="7" w:tentative="1">
+      <w:start w:val="1"/>
+      <w:numFmt w:val="bullet"/>
+      <w:lvlText w:val=""/>
+      <w:lvlJc w:val="left"/>
+      <w:pPr>
+        <w:tabs>
+          <w:tab w:val="num" w:pos="5760"/>
+        </w:tabs>
+        <w:ind w:left="5760" w:hanging="360"/>
+      </w:pPr>
+      <w:rPr>
+        <w:rFonts w:ascii="Symbol" w:hAnsi="Symbol" w:hint="default"/>
+        <w:sz w:val="20"/>
+      </w:rPr>
+    </w:lvl>
+    <w:lvl w:ilvl="8" w:tentative="1">
+      <w:start w:val="1"/>
+      <w:numFmt w:val="bullet"/>
+      <w:lvlText w:val=""/>
+      <w:lvlJc w:val="left"/>
+      <w:pPr>
+        <w:tabs>
+          <w:tab w:val="num" w:pos="6480"/>
+        </w:tabs>
+        <w:ind w:left="6480" w:hanging="360"/>
+      </w:pPr>
+      <w:rPr>
+        <w:rFonts w:ascii="Symbol" w:hAnsi="Symbol" w:hint="default"/>
+        <w:sz w:val="20"/>
+      </w:rPr>
+    </w:lvl>
+  </w:abstractNum>
+  <w:abstractNum w:abstractNumId="19" w15:restartNumberingAfterBreak="0">
     <w:nsid w:val="50FF1E45"/>
     <w:multiLevelType w:val="multilevel"/>
     <w:tmpl w:val="0B16C2E4"/>
@@ -18763,7 +19784,7 @@
       </w:pPr>
     </w:lvl>
   </w:abstractNum>
-  <w:abstractNum w:abstractNumId="19" w15:restartNumberingAfterBreak="0">
+  <w:abstractNum w:abstractNumId="20" w15:restartNumberingAfterBreak="0">
     <w:nsid w:val="5EFD6384"/>
     <w:multiLevelType w:val="multilevel"/>
     <w:tmpl w:val="0882ACA4"/>
@@ -18912,7 +19933,7 @@
       </w:rPr>
     </w:lvl>
   </w:abstractNum>
-  <w:abstractNum w:abstractNumId="20" w15:restartNumberingAfterBreak="0">
+  <w:abstractNum w:abstractNumId="21" w15:restartNumberingAfterBreak="0">
     <w:nsid w:val="68315F8F"/>
     <w:multiLevelType w:val="multilevel"/>
     <w:tmpl w:val="7E6C8214"/>
@@ -19061,7 +20082,7 @@
       </w:rPr>
     </w:lvl>
   </w:abstractNum>
-  <w:abstractNum w:abstractNumId="21" w15:restartNumberingAfterBreak="0">
+  <w:abstractNum w:abstractNumId="22" w15:restartNumberingAfterBreak="0">
     <w:nsid w:val="69163521"/>
     <w:multiLevelType w:val="multilevel"/>
     <w:tmpl w:val="BFA6B64E"/>
@@ -19210,7 +20231,7 @@
       </w:rPr>
     </w:lvl>
   </w:abstractNum>
-  <w:abstractNum w:abstractNumId="22" w15:restartNumberingAfterBreak="0">
+  <w:abstractNum w:abstractNumId="23" w15:restartNumberingAfterBreak="0">
     <w:nsid w:val="69301126"/>
     <w:multiLevelType w:val="multilevel"/>
     <w:tmpl w:val="03FC3B34"/>
@@ -19359,7 +20380,7 @@
       </w:rPr>
     </w:lvl>
   </w:abstractNum>
-  <w:abstractNum w:abstractNumId="23" w15:restartNumberingAfterBreak="0">
+  <w:abstractNum w:abstractNumId="24" w15:restartNumberingAfterBreak="0">
     <w:nsid w:val="6DAA5B2F"/>
     <w:multiLevelType w:val="multilevel"/>
     <w:tmpl w:val="A7308230"/>
@@ -19508,7 +20529,7 @@
       </w:rPr>
     </w:lvl>
   </w:abstractNum>
-  <w:abstractNum w:abstractNumId="24" w15:restartNumberingAfterBreak="0">
+  <w:abstractNum w:abstractNumId="25" w15:restartNumberingAfterBreak="0">
     <w:nsid w:val="76974CF3"/>
     <w:multiLevelType w:val="multilevel"/>
     <w:tmpl w:val="959AC486"/>
@@ -19657,7 +20678,7 @@
       </w:rPr>
     </w:lvl>
   </w:abstractNum>
-  <w:abstractNum w:abstractNumId="25" w15:restartNumberingAfterBreak="0">
+  <w:abstractNum w:abstractNumId="26" w15:restartNumberingAfterBreak="0">
     <w:nsid w:val="777C2B71"/>
     <w:multiLevelType w:val="multilevel"/>
     <w:tmpl w:val="5B9AADF4"/>
@@ -19773,7 +20794,7 @@
       </w:pPr>
     </w:lvl>
   </w:abstractNum>
-  <w:abstractNum w:abstractNumId="26" w15:restartNumberingAfterBreak="0">
+  <w:abstractNum w:abstractNumId="27" w15:restartNumberingAfterBreak="0">
     <w:nsid w:val="7BD43F44"/>
     <w:multiLevelType w:val="multilevel"/>
     <w:tmpl w:val="63DEC1F6"/>
@@ -19919,7 +20940,7 @@
       </w:rPr>
     </w:lvl>
   </w:abstractNum>
-  <w:abstractNum w:abstractNumId="27" w15:restartNumberingAfterBreak="0">
+  <w:abstractNum w:abstractNumId="28" w15:restartNumberingAfterBreak="0">
     <w:nsid w:val="7FE3768F"/>
     <w:multiLevelType w:val="multilevel"/>
     <w:tmpl w:val="5C4ADD8C"/>
@@ -20072,13 +21093,13 @@
     <w:abstractNumId w:val="8"/>
   </w:num>
   <w:num w:numId="2" w16cid:durableId="1753315047">
-    <w:abstractNumId w:val="25"/>
+    <w:abstractNumId w:val="26"/>
   </w:num>
   <w:num w:numId="3" w16cid:durableId="1325665506">
     <w:abstractNumId w:val="17"/>
   </w:num>
   <w:num w:numId="4" w16cid:durableId="1891721260">
-    <w:abstractNumId w:val="20"/>
+    <w:abstractNumId w:val="21"/>
   </w:num>
   <w:num w:numId="5" w16cid:durableId="51119003">
     <w:abstractNumId w:val="16"/>
@@ -20087,13 +21108,13 @@
     <w:abstractNumId w:val="6"/>
   </w:num>
   <w:num w:numId="7" w16cid:durableId="273513776">
-    <w:abstractNumId w:val="18"/>
+    <w:abstractNumId w:val="19"/>
   </w:num>
   <w:num w:numId="8" w16cid:durableId="786923351">
     <w:abstractNumId w:val="13"/>
   </w:num>
   <w:num w:numId="9" w16cid:durableId="945383382">
-    <w:abstractNumId w:val="21"/>
+    <w:abstractNumId w:val="22"/>
   </w:num>
   <w:num w:numId="10" w16cid:durableId="1711414526">
     <w:abstractNumId w:val="0"/>
@@ -20108,7 +21129,7 @@
     <w:abstractNumId w:val="15"/>
   </w:num>
   <w:num w:numId="14" w16cid:durableId="287779776">
-    <w:abstractNumId w:val="26"/>
+    <w:abstractNumId w:val="27"/>
   </w:num>
   <w:num w:numId="15" w16cid:durableId="681784353">
     <w:abstractNumId w:val="7"/>
@@ -20117,7 +21138,7 @@
     <w:abstractNumId w:val="10"/>
   </w:num>
   <w:num w:numId="17" w16cid:durableId="1819687038">
-    <w:abstractNumId w:val="27"/>
+    <w:abstractNumId w:val="28"/>
   </w:num>
   <w:num w:numId="18" w16cid:durableId="1829443273">
     <w:abstractNumId w:val="5"/>
@@ -20129,7 +21150,7 @@
     <w:abstractNumId w:val="1"/>
   </w:num>
   <w:num w:numId="21" w16cid:durableId="1188173754">
-    <w:abstractNumId w:val="19"/>
+    <w:abstractNumId w:val="20"/>
   </w:num>
   <w:num w:numId="22" w16cid:durableId="1867979134">
     <w:abstractNumId w:val="11"/>
@@ -20138,19 +21159,22 @@
     <w:abstractNumId w:val="12"/>
   </w:num>
   <w:num w:numId="24" w16cid:durableId="1281960635">
-    <w:abstractNumId w:val="22"/>
+    <w:abstractNumId w:val="23"/>
   </w:num>
   <w:num w:numId="25" w16cid:durableId="859202939">
     <w:abstractNumId w:val="3"/>
   </w:num>
   <w:num w:numId="26" w16cid:durableId="1894191845">
-    <w:abstractNumId w:val="23"/>
+    <w:abstractNumId w:val="24"/>
   </w:num>
   <w:num w:numId="27" w16cid:durableId="698774151">
     <w:abstractNumId w:val="4"/>
   </w:num>
   <w:num w:numId="28" w16cid:durableId="1840660567">
-    <w:abstractNumId w:val="24"/>
+    <w:abstractNumId w:val="25"/>
+  </w:num>
+  <w:num w:numId="29" w16cid:durableId="956840231">
+    <w:abstractNumId w:val="18"/>
   </w:num>
 </w:numbering>
 </file>

</xml_diff>

<commit_message>
Fix audio muting after watchdog skip
</commit_message>
<xml_diff>
--- a/主題小売り業界向けの売上高改善の向けサイネージ広告共同運用の提案.docx
+++ b/主題小売り業界向けの売上高改善の向けサイネージ広告共同運用の提案.docx
@@ -3463,50 +3463,54 @@
         <w:spacing w:line="240" w:lineRule="atLeast"/>
         <w:rPr>
           <w:rFonts w:eastAsia="游明朝"/>
-          <w:b/>
-          <w:bCs/>
-        </w:rPr>
-      </w:pPr>
-      <w:r>
-        <w:rPr>
-          <w:rFonts w:eastAsia="游明朝"/>
-        </w:rPr>
-        <w:t>従来のサイネージは単なる「映像を流す機械」</w:t>
-      </w:r>
-      <w:r>
-        <w:rPr>
-          <w:rFonts w:eastAsia="游明朝"/>
-          <w:b/>
-          <w:bCs/>
-        </w:rPr>
-        <w:t>ですが、リテアドは</w:t>
-      </w:r>
-    </w:p>
-    <w:p>
-      <w:pPr>
-        <w:adjustRightInd w:val="0"/>
-        <w:snapToGrid w:val="0"/>
-        <w:spacing w:line="240" w:lineRule="atLeast"/>
-        <w:rPr>
-          <w:rFonts w:eastAsia="游明朝"/>
-        </w:rPr>
-      </w:pPr>
-      <w:r>
-        <w:rPr>
-          <w:rFonts w:eastAsia="游明朝"/>
-        </w:rPr>
-        <w:t>「店舗・メーカー・クリエイターの３者全員が自動で儲かるように設計された</w:t>
-      </w:r>
-    </w:p>
-    <w:p>
-      <w:pPr>
-        <w:adjustRightInd w:val="0"/>
-        <w:snapToGrid w:val="0"/>
-        <w:spacing w:line="240" w:lineRule="atLeast"/>
-        <w:rPr>
-          <w:rFonts w:eastAsia="游明朝"/>
-        </w:rPr>
-      </w:pPr>
+        </w:rPr>
+      </w:pPr>
+    </w:p>
+    <w:p>
+      <w:pPr>
+        <w:adjustRightInd w:val="0"/>
+        <w:snapToGrid w:val="0"/>
+        <w:spacing w:line="240" w:lineRule="atLeast"/>
+        <w:rPr>
+          <w:rFonts w:eastAsia="游明朝"/>
+        </w:rPr>
+      </w:pPr>
+    </w:p>
+    <w:p>
+      <w:pPr>
+        <w:adjustRightInd w:val="0"/>
+        <w:snapToGrid w:val="0"/>
+        <w:spacing w:line="240" w:lineRule="atLeast"/>
+        <w:rPr>
+          <w:rFonts w:eastAsia="游明朝"/>
+        </w:rPr>
+      </w:pPr>
+    </w:p>
+    <w:p>
+      <w:pPr>
+        <w:adjustRightInd w:val="0"/>
+        <w:snapToGrid w:val="0"/>
+        <w:spacing w:line="240" w:lineRule="atLeast"/>
+        <w:rPr>
+          <w:rFonts w:eastAsia="游明朝"/>
+        </w:rPr>
+      </w:pPr>
+    </w:p>
+    <w:p>
+      <w:pPr>
+        <w:adjustRightInd w:val="0"/>
+        <w:snapToGrid w:val="0"/>
+        <w:spacing w:line="240" w:lineRule="atLeast"/>
+        <w:rPr>
+          <w:rFonts w:eastAsia="游明朝"/>
+        </w:rPr>
+      </w:pPr>
+      <w:r>
+        <w:rPr>
+          <w:rFonts w:eastAsia="游明朝" w:hint="eastAsia"/>
+        </w:rPr>
+        <w:t>リテアドは</w:t>
+      </w:r>
       <w:r>
         <w:rPr>
           <w:rFonts w:eastAsia="游明朝"/>
@@ -4047,42 +4051,8 @@
         <w:adjustRightInd w:val="0"/>
         <w:snapToGrid w:val="0"/>
         <w:spacing w:line="240" w:lineRule="atLeast"/>
-        <w:ind w:left="720"/>
-        <w:rPr>
-          <w:rFonts w:eastAsia="游明朝"/>
-        </w:rPr>
-      </w:pPr>
-    </w:p>
-    <w:p>
-      <w:pPr>
-        <w:adjustRightInd w:val="0"/>
-        <w:snapToGrid w:val="0"/>
-        <w:spacing w:line="240" w:lineRule="atLeast"/>
-        <w:ind w:left="720"/>
-        <w:rPr>
-          <w:rFonts w:eastAsia="游明朝"/>
-        </w:rPr>
-      </w:pPr>
-    </w:p>
-    <w:p>
-      <w:pPr>
-        <w:adjustRightInd w:val="0"/>
-        <w:snapToGrid w:val="0"/>
-        <w:spacing w:line="240" w:lineRule="atLeast"/>
-        <w:ind w:left="720"/>
-        <w:rPr>
-          <w:rFonts w:eastAsia="游明朝"/>
-        </w:rPr>
-      </w:pPr>
-    </w:p>
-    <w:p>
-      <w:pPr>
-        <w:adjustRightInd w:val="0"/>
-        <w:snapToGrid w:val="0"/>
-        <w:spacing w:line="240" w:lineRule="atLeast"/>
-        <w:ind w:left="720"/>
-        <w:rPr>
-          <w:rFonts w:eastAsia="游明朝" w:hint="eastAsia"/>
+        <w:rPr>
+          <w:rFonts w:eastAsia="游明朝"/>
         </w:rPr>
       </w:pPr>
     </w:p>
@@ -5138,6 +5108,17 @@
         </w:rPr>
         <w:t>。</w:t>
       </w:r>
+    </w:p>
+    <w:p>
+      <w:pPr>
+        <w:adjustRightInd w:val="0"/>
+        <w:snapToGrid w:val="0"/>
+        <w:spacing w:line="240" w:lineRule="atLeast"/>
+        <w:ind w:left="1440"/>
+        <w:rPr>
+          <w:rFonts w:eastAsia="游明朝"/>
+        </w:rPr>
+      </w:pPr>
     </w:p>
     <w:p>
       <w:pPr>
@@ -5386,7 +5367,7 @@
           <w:noProof/>
         </w:rPr>
         <w:drawing>
-          <wp:inline distT="0" distB="0" distL="0" distR="0" wp14:anchorId="3CE421A6" wp14:editId="5314DE91">
+          <wp:inline distT="0" distB="0" distL="0" distR="0" wp14:anchorId="3CE421A6" wp14:editId="180AE273">
             <wp:extent cx="1074164" cy="1059011"/>
             <wp:effectExtent l="0" t="0" r="0" b="8255"/>
             <wp:docPr id="681950858" name="図 1"/>
@@ -7578,16 +7559,6 @@
         <w:snapToGrid w:val="0"/>
         <w:spacing w:line="240" w:lineRule="atLeast"/>
         <w:rPr>
-          <w:rFonts w:eastAsia="游明朝" w:hint="eastAsia"/>
-        </w:rPr>
-      </w:pPr>
-    </w:p>
-    <w:p>
-      <w:pPr>
-        <w:adjustRightInd w:val="0"/>
-        <w:snapToGrid w:val="0"/>
-        <w:spacing w:line="240" w:lineRule="atLeast"/>
-        <w:rPr>
           <w:b/>
           <w:bCs/>
           <w:sz w:val="28"/>
@@ -8005,9 +7976,6 @@
         <w:adjustRightInd w:val="0"/>
         <w:snapToGrid w:val="0"/>
         <w:spacing w:line="240" w:lineRule="atLeast"/>
-        <w:rPr>
-          <w:rFonts w:hint="eastAsia"/>
-        </w:rPr>
       </w:pPr>
     </w:p>
     <w:p>
@@ -8228,72 +8196,6 @@
         <w:adjustRightInd w:val="0"/>
         <w:snapToGrid w:val="0"/>
         <w:spacing w:line="240" w:lineRule="atLeast"/>
-      </w:pPr>
-    </w:p>
-    <w:p>
-      <w:pPr>
-        <w:adjustRightInd w:val="0"/>
-        <w:snapToGrid w:val="0"/>
-        <w:spacing w:line="240" w:lineRule="atLeast"/>
-      </w:pPr>
-    </w:p>
-    <w:p>
-      <w:pPr>
-        <w:adjustRightInd w:val="0"/>
-        <w:snapToGrid w:val="0"/>
-        <w:spacing w:line="240" w:lineRule="atLeast"/>
-      </w:pPr>
-    </w:p>
-    <w:p>
-      <w:pPr>
-        <w:adjustRightInd w:val="0"/>
-        <w:snapToGrid w:val="0"/>
-        <w:spacing w:line="240" w:lineRule="atLeast"/>
-      </w:pPr>
-    </w:p>
-    <w:p>
-      <w:pPr>
-        <w:adjustRightInd w:val="0"/>
-        <w:snapToGrid w:val="0"/>
-        <w:spacing w:line="240" w:lineRule="atLeast"/>
-      </w:pPr>
-    </w:p>
-    <w:p>
-      <w:pPr>
-        <w:adjustRightInd w:val="0"/>
-        <w:snapToGrid w:val="0"/>
-        <w:spacing w:line="240" w:lineRule="atLeast"/>
-      </w:pPr>
-    </w:p>
-    <w:p>
-      <w:pPr>
-        <w:adjustRightInd w:val="0"/>
-        <w:snapToGrid w:val="0"/>
-        <w:spacing w:line="240" w:lineRule="atLeast"/>
-      </w:pPr>
-    </w:p>
-    <w:p>
-      <w:pPr>
-        <w:adjustRightInd w:val="0"/>
-        <w:snapToGrid w:val="0"/>
-        <w:spacing w:line="240" w:lineRule="atLeast"/>
-      </w:pPr>
-    </w:p>
-    <w:p>
-      <w:pPr>
-        <w:adjustRightInd w:val="0"/>
-        <w:snapToGrid w:val="0"/>
-        <w:spacing w:line="240" w:lineRule="atLeast"/>
-        <w:rPr>
-          <w:rFonts w:hint="eastAsia"/>
-        </w:rPr>
-      </w:pPr>
-    </w:p>
-    <w:p>
-      <w:pPr>
-        <w:adjustRightInd w:val="0"/>
-        <w:snapToGrid w:val="0"/>
-        <w:spacing w:line="240" w:lineRule="atLeast"/>
         <w:rPr>
           <w:b/>
           <w:bCs/>
@@ -8491,7 +8393,21 @@
         <w:rPr>
           <w:rFonts w:hint="eastAsia"/>
         </w:rPr>
-        <w:t>を利用して自然言語で館内放送や特売・タイムセール等の</w:t>
+        <w:t>を利用して自然言語で館内放送や</w:t>
+      </w:r>
+    </w:p>
+    <w:p>
+      <w:pPr>
+        <w:adjustRightInd w:val="0"/>
+        <w:snapToGrid w:val="0"/>
+        <w:spacing w:line="240" w:lineRule="atLeast"/>
+        <w:ind w:firstLineChars="100" w:firstLine="210"/>
+      </w:pPr>
+      <w:r>
+        <w:rPr>
+          <w:rFonts w:hint="eastAsia"/>
+        </w:rPr>
+        <w:t>特売・タイムセール等の</w:t>
       </w:r>
     </w:p>
     <w:p>
@@ -8673,9 +8589,6 @@
         <w:snapToGrid w:val="0"/>
         <w:spacing w:line="240" w:lineRule="atLeast"/>
         <w:ind w:firstLineChars="100" w:firstLine="210"/>
-        <w:rPr>
-          <w:rFonts w:hint="eastAsia"/>
-        </w:rPr>
       </w:pPr>
       <w:r>
         <w:rPr>
@@ -8709,310 +8622,288 @@
         <w:adjustRightInd w:val="0"/>
         <w:snapToGrid w:val="0"/>
         <w:spacing w:line="240" w:lineRule="atLeast"/>
-      </w:pPr>
-      <w:r>
-        <w:rPr>
-          <w:rFonts w:hint="eastAsia"/>
+        <w:ind w:firstLineChars="100" w:firstLine="210"/>
+      </w:pPr>
+      <w:r>
+        <w:rPr>
+          <w:rFonts w:hint="eastAsia"/>
+        </w:rPr>
+        <w:t>方法</w:t>
+      </w:r>
+    </w:p>
+    <w:p>
+      <w:pPr>
+        <w:adjustRightInd w:val="0"/>
+        <w:snapToGrid w:val="0"/>
+        <w:spacing w:line="240" w:lineRule="atLeast"/>
+      </w:pPr>
+      <w:r>
+        <w:rPr>
+          <w:rFonts w:hint="eastAsia"/>
+          <w:b/>
+          <w:bCs/>
         </w:rPr>
         <w:t xml:space="preserve">　</w:t>
       </w:r>
       <w:r>
         <w:rPr>
           <w:rFonts w:hint="eastAsia"/>
+          <w:b/>
+          <w:bCs/>
+        </w:rPr>
+        <w:t>1</w:t>
+      </w:r>
+      <w:r>
+        <w:rPr>
+          <w:rFonts w:hint="eastAsia"/>
+        </w:rPr>
+        <w:t>.</w:t>
+      </w:r>
+      <w:r>
+        <w:rPr>
+          <w:rFonts w:hint="eastAsia"/>
+        </w:rPr>
+        <w:t>レジスペースの確保が難しい小規模スーパーやセルフレジの導入コストが</w:t>
+      </w:r>
+    </w:p>
+    <w:p>
+      <w:pPr>
+        <w:adjustRightInd w:val="0"/>
+        <w:snapToGrid w:val="0"/>
+        <w:spacing w:line="240" w:lineRule="atLeast"/>
+        <w:ind w:firstLineChars="100" w:firstLine="210"/>
+      </w:pPr>
+      <w:r>
+        <w:rPr>
+          <w:rFonts w:hint="eastAsia"/>
+        </w:rPr>
+        <w:t>多大な大型店で顧客や店員がモバイル片手で決済が可能</w:t>
+      </w:r>
+    </w:p>
+    <w:p>
+      <w:pPr>
+        <w:snapToGrid w:val="0"/>
+        <w:ind w:firstLineChars="100" w:firstLine="210"/>
+        <w:rPr>
+          <w:b/>
+          <w:bCs/>
+        </w:rPr>
+      </w:pPr>
+      <w:r>
+        <w:rPr>
+          <w:rFonts w:hint="eastAsia"/>
+          <w:b/>
+          <w:bCs/>
+        </w:rPr>
+        <w:t>2</w:t>
+      </w:r>
+      <w:r>
+        <w:rPr>
+          <w:rFonts w:hint="eastAsia"/>
+        </w:rPr>
+        <w:t>.限定・</w:t>
+      </w:r>
+      <w:r>
+        <w:rPr>
+          <w:rFonts w:hint="eastAsia"/>
+        </w:rPr>
+        <w:t>上位顧客から提供を開始し</w:t>
+      </w:r>
+    </w:p>
+    <w:p>
+      <w:pPr>
+        <w:snapToGrid w:val="0"/>
+      </w:pPr>
+      <w:r>
+        <w:rPr>
+          <w:rFonts w:hint="eastAsia"/>
+          <w:b/>
+          <w:bCs/>
+        </w:rPr>
+        <w:t xml:space="preserve">　</w:t>
+      </w:r>
+      <w:r>
+        <w:rPr>
+          <w:rFonts w:hint="eastAsia"/>
         </w:rPr>
         <w:t>1.</w:t>
       </w:r>
       <w:r>
-        <w:rPr>
-          <w:rFonts w:hint="eastAsia"/>
-        </w:rPr>
-        <w:t>レジスペースの確保が難しい小規模スーパーやセルフレジの導入コストが</w:t>
-      </w:r>
-    </w:p>
-    <w:p>
-      <w:pPr>
-        <w:adjustRightInd w:val="0"/>
-        <w:snapToGrid w:val="0"/>
-        <w:spacing w:line="240" w:lineRule="atLeast"/>
+        <w:t>「</w:t>
+      </w:r>
+      <w:r>
+        <w:rPr>
+          <w:rFonts w:hint="eastAsia"/>
+        </w:rPr>
+        <w:t>店舗・小売り業者の</w:t>
+      </w:r>
+      <w:r>
+        <w:t>顧客用スマホレジ」</w:t>
+      </w:r>
+      <w:r>
+        <w:rPr>
+          <w:rFonts w:hint="eastAsia"/>
+        </w:rPr>
+        <w:t>機能</w:t>
+      </w:r>
+      <w:r>
+        <w:rPr>
+          <w:rFonts w:hint="eastAsia"/>
+        </w:rPr>
+        <w:t>の提供</w:t>
+      </w:r>
+    </w:p>
+    <w:p>
+      <w:pPr>
+        <w:snapToGrid w:val="0"/>
         <w:ind w:firstLineChars="100" w:firstLine="210"/>
       </w:pPr>
       <w:r>
         <w:rPr>
           <w:rFonts w:hint="eastAsia"/>
         </w:rPr>
-        <w:t>多大な大型店で顧客や店員がモバイル片手で決済が可能</w:t>
+        <w:t>2.</w:t>
+      </w:r>
+      <w:r>
+        <w:rPr>
+          <w:rFonts w:hint="eastAsia"/>
+        </w:rPr>
+        <w:t>バーコードを読む＆決済で完了</w:t>
       </w:r>
     </w:p>
     <w:p>
       <w:pPr>
         <w:snapToGrid w:val="0"/>
         <w:ind w:firstLineChars="100" w:firstLine="210"/>
-        <w:rPr>
-          <w:b/>
-          <w:bCs/>
-        </w:rPr>
-      </w:pPr>
-      <w:r>
-        <w:rPr>
-          <w:rFonts w:hint="eastAsia"/>
-        </w:rPr>
-        <w:t>2.限定・</w:t>
-      </w:r>
-      <w:r>
-        <w:rPr>
-          <w:rFonts w:hint="eastAsia"/>
-        </w:rPr>
-        <w:t>上位顧客から提供を開始し</w:t>
-      </w:r>
-    </w:p>
-    <w:p>
-      <w:pPr>
-        <w:snapToGrid w:val="0"/>
-      </w:pPr>
-      <w:r>
-        <w:rPr>
-          <w:rFonts w:hint="eastAsia"/>
-          <w:b/>
-          <w:bCs/>
+      </w:pPr>
+      <w:r>
+        <w:t>【運用メリット】</w:t>
+      </w:r>
+    </w:p>
+    <w:p>
+      <w:pPr>
+        <w:snapToGrid w:val="0"/>
+        <w:ind w:firstLineChars="200" w:firstLine="420"/>
+      </w:pPr>
+      <w:r>
+        <w:rPr>
+          <w:rFonts w:hint="eastAsia"/>
+          <w:b/>
+          <w:bCs/>
+        </w:rPr>
+        <w:t>レター・</w:t>
+      </w:r>
+      <w:r>
+        <w:rPr>
+          <w:b/>
+          <w:bCs/>
+        </w:rPr>
+        <w:t>LINE等での遠隔配信が可能に:</w:t>
+      </w:r>
+      <w:r>
+        <w:t> </w:t>
+      </w:r>
+      <w:r>
+        <w:t xml:space="preserve"> </w:t>
+      </w:r>
+    </w:p>
+    <w:p>
+      <w:pPr>
+        <w:snapToGrid w:val="0"/>
+        <w:ind w:firstLineChars="200" w:firstLine="420"/>
+      </w:pPr>
+      <w:r>
+        <w:t>コピーしたURLをお店の公式LINEやメルマガで</w:t>
+      </w:r>
+    </w:p>
+    <w:p>
+      <w:pPr>
+        <w:snapToGrid w:val="0"/>
+        <w:ind w:firstLineChars="200" w:firstLine="420"/>
+      </w:pPr>
+      <w:r>
+        <w:t>上位顧客（VIP）に一斉送信することができます。</w:t>
+      </w:r>
+    </w:p>
+    <w:p>
+      <w:pPr>
+        <w:snapToGrid w:val="0"/>
+        <w:ind w:firstLineChars="200" w:firstLine="420"/>
+      </w:pPr>
+      <w:r>
+        <w:rPr>
+          <w:b/>
+          <w:bCs/>
+        </w:rPr>
+        <w:t>店側の完全コントロール:</w:t>
+      </w:r>
+      <w:r>
+        <w:t> </w:t>
+      </w:r>
+    </w:p>
+    <w:p>
+      <w:pPr>
+        <w:snapToGrid w:val="0"/>
+        <w:ind w:firstLineChars="200" w:firstLine="420"/>
+      </w:pPr>
+      <w:r>
+        <w:t>お客様がそのURLを開いて買い物をすれば</w:t>
+      </w:r>
+    </w:p>
+    <w:p>
+      <w:pPr>
+        <w:snapToGrid w:val="0"/>
+        <w:ind w:firstLineChars="200" w:firstLine="420"/>
+      </w:pPr>
+      <w:r>
+        <w:t>システム側には「パラメータに入っているA社の売上」として</w:t>
+      </w:r>
+    </w:p>
+    <w:p>
+      <w:pPr>
+        <w:snapToGrid w:val="0"/>
+        <w:ind w:firstLineChars="200" w:firstLine="420"/>
+      </w:pPr>
+      <w:r>
+        <w:t>自動で確実に記録されるため、お店側が配信先を</w:t>
+      </w:r>
+    </w:p>
+    <w:p>
+      <w:pPr>
+        <w:snapToGrid w:val="0"/>
+        <w:ind w:firstLineChars="200" w:firstLine="420"/>
+      </w:pPr>
+      <w:r>
+        <w:t>完全にコントロールしながら運用できます。</w:t>
+      </w:r>
+    </w:p>
+    <w:p>
+      <w:pPr>
+        <w:snapToGrid w:val="0"/>
+      </w:pPr>
+    </w:p>
+    <w:p>
+      <w:pPr>
+        <w:snapToGrid w:val="0"/>
+      </w:pPr>
+      <w:r>
+        <w:rPr>
+          <w:rFonts w:hint="eastAsia"/>
+        </w:rPr>
+        <w:t>※どこでもレジを顧客に提供した場合のデメリット</w:t>
+      </w:r>
+      <w:r>
+        <w:rPr>
+          <w:rFonts w:hint="eastAsia"/>
+        </w:rPr>
+        <w:t>(万引き)</w:t>
+      </w:r>
+      <w:r>
+        <w:rPr>
+          <w:rFonts w:hint="eastAsia"/>
         </w:rPr>
         <w:t xml:space="preserve">　</w:t>
       </w:r>
-      <w:r>
-        <w:rPr>
-          <w:rFonts w:hint="eastAsia"/>
-        </w:rPr>
-        <w:t>1.</w:t>
-      </w:r>
-      <w:r>
-        <w:t>「</w:t>
-      </w:r>
-      <w:r>
-        <w:rPr>
-          <w:rFonts w:hint="eastAsia"/>
-        </w:rPr>
-        <w:t>店舗・小売り業者の</w:t>
-      </w:r>
-      <w:r>
-        <w:t>顧客用スマホレジQR発行」</w:t>
-      </w:r>
-      <w:r>
-        <w:rPr>
-          <w:rFonts w:hint="eastAsia"/>
-        </w:rPr>
-        <w:t>機能</w:t>
-      </w:r>
-    </w:p>
-    <w:p>
-      <w:pPr>
-        <w:snapToGrid w:val="0"/>
-        <w:ind w:firstLineChars="100" w:firstLine="210"/>
-        <w:rPr>
-          <w:rFonts w:hint="eastAsia"/>
-        </w:rPr>
-      </w:pPr>
-      <w:r>
-        <w:rPr>
-          <w:rFonts w:hint="eastAsia"/>
-        </w:rPr>
-        <w:t>2.</w:t>
-      </w:r>
-      <w:r>
-        <w:t>自動パラメータ生成機能 </w:t>
-      </w:r>
-      <w:r>
-        <w:rPr>
-          <w:rFonts w:hint="eastAsia"/>
-        </w:rPr>
-        <w:t>account作成</w:t>
-      </w:r>
-      <w:r>
-        <w:t>し</w:t>
-      </w:r>
-      <w:r>
-        <w:rPr>
-          <w:rFonts w:hint="eastAsia"/>
-        </w:rPr>
-        <w:t>た</w:t>
-      </w:r>
-    </w:p>
-    <w:p>
-      <w:pPr>
-        <w:snapToGrid w:val="0"/>
-        <w:ind w:firstLineChars="200" w:firstLine="420"/>
-        <w:rPr>
-          <w:rFonts w:hint="eastAsia"/>
-        </w:rPr>
-      </w:pPr>
-      <w:r>
-        <w:t>お店の</w:t>
-      </w:r>
-      <w:r>
-        <w:rPr>
-          <w:rFonts w:hint="eastAsia"/>
-        </w:rPr>
-        <w:t>情報と決済をlink</w:t>
-      </w:r>
-    </w:p>
-    <w:p>
-      <w:pPr>
-        <w:snapToGrid w:val="0"/>
-        <w:ind w:firstLineChars="100" w:firstLine="210"/>
-        <w:rPr>
-          <w:rFonts w:hint="eastAsia"/>
-        </w:rPr>
-      </w:pPr>
-      <w:r>
-        <w:rPr>
-          <w:rFonts w:hint="eastAsia"/>
-        </w:rPr>
-        <w:t>3.</w:t>
-      </w:r>
-      <w:r>
-        <w:rPr>
-          <w:rFonts w:hint="eastAsia"/>
-        </w:rPr>
-        <w:t>顧客に提供する</w:t>
-      </w:r>
-      <w:r>
-        <w:t>QRコード画像 ＆ URLコピー機能 </w:t>
-      </w:r>
-    </w:p>
-    <w:p>
-      <w:pPr>
-        <w:snapToGrid w:val="0"/>
-        <w:ind w:firstLineChars="100" w:firstLine="210"/>
-      </w:pPr>
-      <w:r>
-        <w:t>【運用メリット】</w:t>
-      </w:r>
-    </w:p>
-    <w:p>
-      <w:pPr>
-        <w:snapToGrid w:val="0"/>
-        <w:ind w:firstLineChars="200" w:firstLine="420"/>
-      </w:pPr>
-      <w:r>
-        <w:rPr>
-          <w:rFonts w:hint="eastAsia"/>
-          <w:b/>
-          <w:bCs/>
-        </w:rPr>
-        <w:t>レター・</w:t>
-      </w:r>
-      <w:r>
-        <w:rPr>
-          <w:b/>
-          <w:bCs/>
-        </w:rPr>
-        <w:t>LINE等での遠隔配信が可能に:</w:t>
-      </w:r>
-      <w:r>
-        <w:t> </w:t>
-      </w:r>
-      <w:r>
-        <w:t xml:space="preserve"> </w:t>
-      </w:r>
-    </w:p>
-    <w:p>
-      <w:pPr>
-        <w:snapToGrid w:val="0"/>
-        <w:ind w:firstLineChars="200" w:firstLine="420"/>
-      </w:pPr>
-      <w:r>
-        <w:t>コピーしたURLをお店の公式LINEやメルマガで</w:t>
-      </w:r>
-    </w:p>
-    <w:p>
-      <w:pPr>
-        <w:snapToGrid w:val="0"/>
-        <w:ind w:firstLineChars="200" w:firstLine="420"/>
-      </w:pPr>
-      <w:r>
-        <w:t>上位顧客（VIP）に一斉送信することができます。</w:t>
-      </w:r>
-    </w:p>
-    <w:p>
-      <w:pPr>
-        <w:snapToGrid w:val="0"/>
-        <w:ind w:firstLineChars="200" w:firstLine="420"/>
-      </w:pPr>
-      <w:r>
-        <w:rPr>
-          <w:b/>
-          <w:bCs/>
-        </w:rPr>
-        <w:t>店側の完全コントロール:</w:t>
-      </w:r>
-      <w:r>
-        <w:t> </w:t>
-      </w:r>
-    </w:p>
-    <w:p>
-      <w:pPr>
-        <w:snapToGrid w:val="0"/>
-        <w:ind w:firstLineChars="200" w:firstLine="420"/>
-      </w:pPr>
-      <w:r>
-        <w:t>お客様がそのURLを開いて買い物をすれば</w:t>
-      </w:r>
-    </w:p>
-    <w:p>
-      <w:pPr>
-        <w:snapToGrid w:val="0"/>
-        <w:ind w:firstLineChars="200" w:firstLine="420"/>
-      </w:pPr>
-      <w:r>
-        <w:t>システム側には「パラメータに入っているA社の売上」として</w:t>
-      </w:r>
-    </w:p>
-    <w:p>
-      <w:pPr>
-        <w:snapToGrid w:val="0"/>
-        <w:ind w:firstLineChars="200" w:firstLine="420"/>
-      </w:pPr>
-      <w:r>
-        <w:t>自動で確実に記録されるため、お店側が配信先を</w:t>
-      </w:r>
-    </w:p>
-    <w:p>
-      <w:pPr>
-        <w:snapToGrid w:val="0"/>
-        <w:ind w:firstLineChars="200" w:firstLine="420"/>
-      </w:pPr>
-      <w:r>
-        <w:t>完全にコントロールしながら運用できます。</w:t>
-      </w:r>
-    </w:p>
-    <w:p>
-      <w:pPr>
-        <w:snapToGrid w:val="0"/>
-        <w:rPr>
-          <w:rFonts w:hint="eastAsia"/>
-        </w:rPr>
-      </w:pPr>
-    </w:p>
-    <w:p>
-      <w:pPr>
-        <w:snapToGrid w:val="0"/>
-      </w:pPr>
-      <w:r>
-        <w:rPr>
-          <w:rFonts w:hint="eastAsia"/>
-        </w:rPr>
-        <w:t>※どこでもレジを顧客に提供した場合のデメリット</w:t>
-      </w:r>
-      <w:r>
-        <w:rPr>
-          <w:rFonts w:hint="eastAsia"/>
-        </w:rPr>
-        <w:t>(万引き)</w:t>
-      </w:r>
-      <w:r>
-        <w:rPr>
-          <w:rFonts w:hint="eastAsia"/>
-        </w:rPr>
-        <w:t xml:space="preserve">　</w:t>
-      </w:r>
     </w:p>
     <w:p>
       <w:pPr>
@@ -9064,37 +8955,30 @@
           <w:rFonts w:hint="eastAsia"/>
           <w:u w:val="single"/>
         </w:rPr>
-        <w:t xml:space="preserve">このデメリットをセルフレジの廃止や　</w:t>
-      </w:r>
-    </w:p>
-    <w:p>
-      <w:pPr>
-        <w:snapToGrid w:val="0"/>
-        <w:rPr>
+        <w:t>このデメリットをセルフレジの廃止や広告スペース</w:t>
+      </w:r>
+      <w:r>
+        <w:rPr>
+          <w:rFonts w:hint="eastAsia"/>
           <w:u w:val="single"/>
         </w:rPr>
-      </w:pPr>
+        <w:t>を</w:t>
+      </w:r>
       <w:r>
         <w:rPr>
           <w:rFonts w:hint="eastAsia"/>
           <w:u w:val="single"/>
         </w:rPr>
-        <w:t>そのスペースを広告スペース</w:t>
-      </w:r>
-      <w:r>
-        <w:rPr>
-          <w:rFonts w:hint="eastAsia"/>
+        <w:t>収益化</w:t>
+      </w:r>
+    </w:p>
+    <w:p>
+      <w:pPr>
+        <w:snapToGrid w:val="0"/>
+        <w:rPr>
           <w:u w:val="single"/>
         </w:rPr>
-        <w:t>を</w:t>
-      </w:r>
-      <w:r>
-        <w:rPr>
-          <w:rFonts w:hint="eastAsia"/>
-          <w:u w:val="single"/>
-        </w:rPr>
-        <w:t>収益化</w:t>
-      </w:r>
+      </w:pPr>
     </w:p>
     <w:p>
       <w:pPr>
@@ -10026,9 +9910,55 @@
         <w:adjustRightInd w:val="0"/>
         <w:snapToGrid w:val="0"/>
         <w:spacing w:line="240" w:lineRule="atLeast"/>
-        <w:rPr>
-          <w:rFonts w:hint="eastAsia"/>
-        </w:rPr>
+      </w:pPr>
+    </w:p>
+    <w:p>
+      <w:pPr>
+        <w:adjustRightInd w:val="0"/>
+        <w:snapToGrid w:val="0"/>
+        <w:spacing w:line="240" w:lineRule="atLeast"/>
+      </w:pPr>
+    </w:p>
+    <w:p>
+      <w:pPr>
+        <w:adjustRightInd w:val="0"/>
+        <w:snapToGrid w:val="0"/>
+        <w:spacing w:line="240" w:lineRule="atLeast"/>
+      </w:pPr>
+    </w:p>
+    <w:p>
+      <w:pPr>
+        <w:adjustRightInd w:val="0"/>
+        <w:snapToGrid w:val="0"/>
+        <w:spacing w:line="240" w:lineRule="atLeast"/>
+      </w:pPr>
+    </w:p>
+    <w:p>
+      <w:pPr>
+        <w:adjustRightInd w:val="0"/>
+        <w:snapToGrid w:val="0"/>
+        <w:spacing w:line="240" w:lineRule="atLeast"/>
+      </w:pPr>
+    </w:p>
+    <w:p>
+      <w:pPr>
+        <w:adjustRightInd w:val="0"/>
+        <w:snapToGrid w:val="0"/>
+        <w:spacing w:line="240" w:lineRule="atLeast"/>
+      </w:pPr>
+    </w:p>
+    <w:p>
+      <w:pPr>
+        <w:adjustRightInd w:val="0"/>
+        <w:snapToGrid w:val="0"/>
+        <w:spacing w:line="240" w:lineRule="atLeast"/>
+      </w:pPr>
+    </w:p>
+    <w:p>
+      <w:pPr>
+        <w:adjustRightInd w:val="0"/>
+        <w:snapToGrid w:val="0"/>
+        <w:spacing w:line="240" w:lineRule="atLeast"/>
       </w:pPr>
     </w:p>
     <w:p>
@@ -10653,6 +10583,13 @@
         <w:adjustRightInd w:val="0"/>
         <w:snapToGrid w:val="0"/>
         <w:spacing w:line="240" w:lineRule="atLeast"/>
+      </w:pPr>
+    </w:p>
+    <w:p>
+      <w:pPr>
+        <w:adjustRightInd w:val="0"/>
+        <w:snapToGrid w:val="0"/>
+        <w:spacing w:line="240" w:lineRule="atLeast"/>
         <w:rPr>
           <w:b/>
           <w:bCs/>
@@ -10742,6 +10679,13 @@
         <w:snapToGrid w:val="0"/>
         <w:spacing w:line="240" w:lineRule="atLeast"/>
       </w:pPr>
+    </w:p>
+    <w:p>
+      <w:pPr>
+        <w:adjustRightInd w:val="0"/>
+        <w:snapToGrid w:val="0"/>
+        <w:spacing w:line="240" w:lineRule="atLeast"/>
+      </w:pPr>
       <w:r>
         <w:t>エッジ処理</w:t>
       </w:r>
@@ -10784,6 +10728,382 @@
         <w:snapToGrid w:val="0"/>
         <w:spacing w:line="240" w:lineRule="atLeast"/>
       </w:pPr>
+      <w:r>
+        <w:t>2025年6月から施行されている</w:t>
+      </w:r>
+    </w:p>
+    <w:p>
+      <w:pPr>
+        <w:adjustRightInd w:val="0"/>
+        <w:snapToGrid w:val="0"/>
+        <w:spacing w:line="240" w:lineRule="atLeast"/>
+      </w:pPr>
+      <w:r>
+        <w:t>「人工知能関連技術の研究開発及び活用の推進に関する法律（AI法）」</w:t>
+      </w:r>
+      <w:r>
+        <w:rPr>
+          <w:rFonts w:hint="eastAsia"/>
+        </w:rPr>
+        <w:t>に準拠</w:t>
+      </w:r>
+    </w:p>
+    <w:tbl>
+      <w:tblPr>
+        <w:tblW w:w="0" w:type="auto"/>
+        <w:tblCellSpacing w:w="15" w:type="dxa"/>
+        <w:tblCellMar>
+          <w:top w:w="15" w:type="dxa"/>
+          <w:left w:w="15" w:type="dxa"/>
+          <w:bottom w:w="15" w:type="dxa"/>
+          <w:right w:w="15" w:type="dxa"/>
+        </w:tblCellMar>
+        <w:tblLook w:val="04A0" w:firstRow="1" w:lastRow="0" w:firstColumn="1" w:lastColumn="0" w:noHBand="0" w:noVBand="1"/>
+      </w:tblPr>
+      <w:tblGrid>
+        <w:gridCol w:w="1360"/>
+        <w:gridCol w:w="4719"/>
+        <w:gridCol w:w="2409"/>
+      </w:tblGrid>
+      <w:tr>
+        <w:trPr>
+          <w:tblHeader/>
+          <w:tblCellSpacing w:w="15" w:type="dxa"/>
+        </w:trPr>
+        <w:tc>
+          <w:tcPr>
+            <w:tcW w:w="0" w:type="auto"/>
+            <w:tcBorders>
+              <w:top w:val="single" w:sz="6" w:space="0" w:color="auto"/>
+              <w:left w:val="single" w:sz="6" w:space="0" w:color="auto"/>
+              <w:bottom w:val="single" w:sz="6" w:space="0" w:color="auto"/>
+              <w:right w:val="single" w:sz="6" w:space="0" w:color="auto"/>
+            </w:tcBorders>
+            <w:vAlign w:val="center"/>
+            <w:hideMark/>
+          </w:tcPr>
+          <w:p>
+            <w:pPr>
+              <w:adjustRightInd w:val="0"/>
+              <w:snapToGrid w:val="0"/>
+              <w:spacing w:line="240" w:lineRule="atLeast"/>
+            </w:pPr>
+            <w:r>
+              <w:rPr>
+                <w:b/>
+                <w:bCs/>
+              </w:rPr>
+              <w:t>制度名</w:t>
+            </w:r>
+          </w:p>
+        </w:tc>
+        <w:tc>
+          <w:tcPr>
+            <w:tcW w:w="4689" w:type="dxa"/>
+            <w:tcBorders>
+              <w:top w:val="single" w:sz="6" w:space="0" w:color="auto"/>
+              <w:left w:val="single" w:sz="6" w:space="0" w:color="auto"/>
+              <w:bottom w:val="single" w:sz="6" w:space="0" w:color="auto"/>
+              <w:right w:val="single" w:sz="6" w:space="0" w:color="auto"/>
+            </w:tcBorders>
+            <w:vAlign w:val="center"/>
+            <w:hideMark/>
+          </w:tcPr>
+          <w:p>
+            <w:pPr>
+              <w:adjustRightInd w:val="0"/>
+              <w:snapToGrid w:val="0"/>
+              <w:spacing w:line="240" w:lineRule="atLeast"/>
+            </w:pPr>
+            <w:r>
+              <w:rPr>
+                <w:b/>
+                <w:bCs/>
+              </w:rPr>
+              <w:t>特徴</w:t>
+            </w:r>
+          </w:p>
+        </w:tc>
+        <w:tc>
+          <w:tcPr>
+            <w:tcW w:w="2364" w:type="dxa"/>
+            <w:tcBorders>
+              <w:top w:val="single" w:sz="6" w:space="0" w:color="auto"/>
+              <w:left w:val="single" w:sz="6" w:space="0" w:color="auto"/>
+              <w:bottom w:val="single" w:sz="6" w:space="0" w:color="auto"/>
+              <w:right w:val="single" w:sz="6" w:space="0" w:color="auto"/>
+            </w:tcBorders>
+            <w:vAlign w:val="center"/>
+            <w:hideMark/>
+          </w:tcPr>
+          <w:p>
+            <w:pPr>
+              <w:adjustRightInd w:val="0"/>
+              <w:snapToGrid w:val="0"/>
+              <w:spacing w:line="240" w:lineRule="atLeast"/>
+            </w:pPr>
+            <w:r>
+              <w:rPr>
+                <w:b/>
+                <w:bCs/>
+              </w:rPr>
+              <w:t>AI利用におけるメリット</w:t>
+            </w:r>
+          </w:p>
+        </w:tc>
+      </w:tr>
+      <w:tr>
+        <w:trPr>
+          <w:tblCellSpacing w:w="15" w:type="dxa"/>
+        </w:trPr>
+        <w:tc>
+          <w:tcPr>
+            <w:tcW w:w="0" w:type="auto"/>
+            <w:tcBorders>
+              <w:top w:val="single" w:sz="6" w:space="0" w:color="auto"/>
+              <w:left w:val="single" w:sz="6" w:space="0" w:color="auto"/>
+              <w:bottom w:val="single" w:sz="6" w:space="0" w:color="auto"/>
+              <w:right w:val="single" w:sz="6" w:space="0" w:color="auto"/>
+            </w:tcBorders>
+            <w:vAlign w:val="center"/>
+            <w:hideMark/>
+          </w:tcPr>
+          <w:p>
+            <w:pPr>
+              <w:adjustRightInd w:val="0"/>
+              <w:snapToGrid w:val="0"/>
+              <w:spacing w:line="240" w:lineRule="atLeast"/>
+            </w:pPr>
+            <w:r>
+              <w:rPr>
+                <w:b/>
+                <w:bCs/>
+              </w:rPr>
+              <w:t>仮名加工情報</w:t>
+            </w:r>
+          </w:p>
+        </w:tc>
+        <w:tc>
+          <w:tcPr>
+            <w:tcW w:w="4689" w:type="dxa"/>
+            <w:tcBorders>
+              <w:top w:val="single" w:sz="6" w:space="0" w:color="auto"/>
+              <w:left w:val="single" w:sz="6" w:space="0" w:color="auto"/>
+              <w:bottom w:val="single" w:sz="6" w:space="0" w:color="auto"/>
+              <w:right w:val="single" w:sz="6" w:space="0" w:color="auto"/>
+            </w:tcBorders>
+            <w:vAlign w:val="center"/>
+            <w:hideMark/>
+          </w:tcPr>
+          <w:p>
+            <w:pPr>
+              <w:adjustRightInd w:val="0"/>
+              <w:snapToGrid w:val="0"/>
+              <w:spacing w:line="240" w:lineRule="atLeast"/>
+            </w:pPr>
+            <w:r>
+              <w:t>他の情報と照合しない限り</w:t>
+            </w:r>
+          </w:p>
+          <w:p>
+            <w:pPr>
+              <w:adjustRightInd w:val="0"/>
+              <w:snapToGrid w:val="0"/>
+              <w:spacing w:line="240" w:lineRule="atLeast"/>
+            </w:pPr>
+            <w:r>
+              <w:t>個人を特定できない状態にしたもの。</w:t>
+            </w:r>
+          </w:p>
+        </w:tc>
+        <w:tc>
+          <w:tcPr>
+            <w:tcW w:w="2364" w:type="dxa"/>
+            <w:tcBorders>
+              <w:top w:val="single" w:sz="6" w:space="0" w:color="auto"/>
+              <w:left w:val="single" w:sz="6" w:space="0" w:color="auto"/>
+              <w:bottom w:val="single" w:sz="6" w:space="0" w:color="auto"/>
+              <w:right w:val="single" w:sz="6" w:space="0" w:color="auto"/>
+            </w:tcBorders>
+            <w:vAlign w:val="center"/>
+            <w:hideMark/>
+          </w:tcPr>
+          <w:p>
+            <w:pPr>
+              <w:adjustRightInd w:val="0"/>
+              <w:snapToGrid w:val="0"/>
+              <w:spacing w:line="240" w:lineRule="atLeast"/>
+            </w:pPr>
+            <w:r>
+              <w:rPr>
+                <w:b/>
+                <w:bCs/>
+              </w:rPr>
+              <w:t>利用目的の変更制限が緩和</w:t>
+            </w:r>
+            <w:r>
+              <w:t>され</w:t>
+            </w:r>
+            <w:r>
+              <w:rPr>
+                <w:rFonts w:hint="eastAsia"/>
+              </w:rPr>
+              <w:t>、</w:t>
+            </w:r>
+          </w:p>
+          <w:p>
+            <w:pPr>
+              <w:adjustRightInd w:val="0"/>
+              <w:snapToGrid w:val="0"/>
+              <w:spacing w:line="240" w:lineRule="atLeast"/>
+            </w:pPr>
+            <w:r>
+              <w:t>AI分析やモデル学習に、柔軟に</w:t>
+            </w:r>
+          </w:p>
+          <w:p>
+            <w:pPr>
+              <w:adjustRightInd w:val="0"/>
+              <w:snapToGrid w:val="0"/>
+              <w:spacing w:line="240" w:lineRule="atLeast"/>
+            </w:pPr>
+            <w:r>
+              <w:t>利用しやすくなります。</w:t>
+            </w:r>
+          </w:p>
+        </w:tc>
+      </w:tr>
+      <w:tr>
+        <w:trPr>
+          <w:tblCellSpacing w:w="15" w:type="dxa"/>
+        </w:trPr>
+        <w:tc>
+          <w:tcPr>
+            <w:tcW w:w="0" w:type="auto"/>
+            <w:tcBorders>
+              <w:top w:val="single" w:sz="6" w:space="0" w:color="auto"/>
+              <w:left w:val="single" w:sz="6" w:space="0" w:color="auto"/>
+              <w:bottom w:val="single" w:sz="6" w:space="0" w:color="auto"/>
+              <w:right w:val="single" w:sz="6" w:space="0" w:color="auto"/>
+            </w:tcBorders>
+            <w:vAlign w:val="center"/>
+            <w:hideMark/>
+          </w:tcPr>
+          <w:p>
+            <w:pPr>
+              <w:adjustRightInd w:val="0"/>
+              <w:snapToGrid w:val="0"/>
+              <w:spacing w:line="240" w:lineRule="atLeast"/>
+            </w:pPr>
+            <w:r>
+              <w:rPr>
+                <w:b/>
+                <w:bCs/>
+              </w:rPr>
+              <w:t>匿名加工情報</w:t>
+            </w:r>
+          </w:p>
+        </w:tc>
+        <w:tc>
+          <w:tcPr>
+            <w:tcW w:w="4689" w:type="dxa"/>
+            <w:tcBorders>
+              <w:top w:val="single" w:sz="6" w:space="0" w:color="auto"/>
+              <w:left w:val="single" w:sz="6" w:space="0" w:color="auto"/>
+              <w:bottom w:val="single" w:sz="6" w:space="0" w:color="auto"/>
+              <w:right w:val="single" w:sz="6" w:space="0" w:color="auto"/>
+            </w:tcBorders>
+            <w:vAlign w:val="center"/>
+            <w:hideMark/>
+          </w:tcPr>
+          <w:p>
+            <w:pPr>
+              <w:adjustRightInd w:val="0"/>
+              <w:snapToGrid w:val="0"/>
+              <w:spacing w:line="240" w:lineRule="atLeast"/>
+            </w:pPr>
+            <w:r>
+              <w:t>復元不可能なレベルまで完全に匿名化したもの。</w:t>
+            </w:r>
+          </w:p>
+        </w:tc>
+        <w:tc>
+          <w:tcPr>
+            <w:tcW w:w="2364" w:type="dxa"/>
+            <w:tcBorders>
+              <w:top w:val="single" w:sz="6" w:space="0" w:color="auto"/>
+              <w:left w:val="single" w:sz="6" w:space="0" w:color="auto"/>
+              <w:bottom w:val="single" w:sz="6" w:space="0" w:color="auto"/>
+              <w:right w:val="single" w:sz="6" w:space="0" w:color="auto"/>
+            </w:tcBorders>
+            <w:vAlign w:val="center"/>
+            <w:hideMark/>
+          </w:tcPr>
+          <w:p>
+            <w:pPr>
+              <w:adjustRightInd w:val="0"/>
+              <w:snapToGrid w:val="0"/>
+              <w:spacing w:line="240" w:lineRule="atLeast"/>
+              <w:rPr>
+                <w:b/>
+                <w:bCs/>
+              </w:rPr>
+            </w:pPr>
+            <w:r>
+              <w:t>「個人情報」ではなくなるため、</w:t>
+            </w:r>
+            <w:r>
+              <w:rPr>
+                <w:b/>
+                <w:bCs/>
+              </w:rPr>
+              <w:t>本人の同意なく</w:t>
+            </w:r>
+          </w:p>
+          <w:p>
+            <w:pPr>
+              <w:adjustRightInd w:val="0"/>
+              <w:snapToGrid w:val="0"/>
+              <w:spacing w:line="240" w:lineRule="atLeast"/>
+              <w:rPr>
+                <w:b/>
+                <w:bCs/>
+              </w:rPr>
+            </w:pPr>
+            <w:r>
+              <w:rPr>
+                <w:b/>
+                <w:bCs/>
+              </w:rPr>
+              <w:t>第三者への提供や</w:t>
+            </w:r>
+          </w:p>
+          <w:p>
+            <w:pPr>
+              <w:adjustRightInd w:val="0"/>
+              <w:snapToGrid w:val="0"/>
+              <w:spacing w:line="240" w:lineRule="atLeast"/>
+            </w:pPr>
+            <w:r>
+              <w:rPr>
+                <w:b/>
+                <w:bCs/>
+              </w:rPr>
+              <w:t>自由な利活用</w:t>
+            </w:r>
+            <w:r>
+              <w:t>が可能</w:t>
+            </w:r>
+          </w:p>
+        </w:tc>
+      </w:tr>
+    </w:tbl>
+    <w:p>
+      <w:pPr>
+        <w:adjustRightInd w:val="0"/>
+        <w:snapToGrid w:val="0"/>
+        <w:spacing w:line="240" w:lineRule="atLeast"/>
+      </w:pPr>
     </w:p>
     <w:p>
       <w:pPr>
@@ -10894,7 +11214,7 @@
         <w:snapToGrid w:val="0"/>
       </w:pPr>
       <w:r>
-        <w:t>1. サーバー環境の「使い捨て」構造</w:t>
+        <w:t>サーバー環境の「使い捨て」構造</w:t>
       </w:r>
       <w:r>
         <w:rPr>
@@ -10903,258 +11223,81 @@
         <w:t>など</w:t>
       </w:r>
       <w:r>
-        <w:t>（AWS App Runner）</w:t>
-      </w:r>
-    </w:p>
-    <w:p>
-      <w:pPr>
-        <w:adjustRightInd w:val="0"/>
-        <w:snapToGrid w:val="0"/>
-        <w:spacing w:line="240" w:lineRule="atLeast"/>
-        <w:rPr>
-          <w:b/>
-          <w:bCs/>
-        </w:rPr>
-      </w:pPr>
-    </w:p>
-    <w:p>
-      <w:pPr>
-        <w:adjustRightInd w:val="0"/>
-        <w:snapToGrid w:val="0"/>
-        <w:spacing w:line="240" w:lineRule="atLeast"/>
-        <w:rPr>
-          <w:b/>
-          <w:bCs/>
-        </w:rPr>
-      </w:pPr>
-    </w:p>
-    <w:p>
-      <w:pPr>
-        <w:adjustRightInd w:val="0"/>
-        <w:snapToGrid w:val="0"/>
-        <w:spacing w:line="240" w:lineRule="atLeast"/>
-        <w:rPr>
-          <w:b/>
-          <w:bCs/>
-        </w:rPr>
-      </w:pPr>
-    </w:p>
-    <w:p>
-      <w:pPr>
-        <w:adjustRightInd w:val="0"/>
-        <w:snapToGrid w:val="0"/>
-        <w:spacing w:line="240" w:lineRule="atLeast"/>
-        <w:rPr>
-          <w:b/>
-          <w:bCs/>
-        </w:rPr>
-      </w:pPr>
-    </w:p>
-    <w:p>
-      <w:pPr>
-        <w:adjustRightInd w:val="0"/>
-        <w:snapToGrid w:val="0"/>
-        <w:spacing w:line="240" w:lineRule="atLeast"/>
-        <w:rPr>
-          <w:b/>
-          <w:bCs/>
-        </w:rPr>
-      </w:pPr>
-    </w:p>
-    <w:p>
-      <w:pPr>
-        <w:adjustRightInd w:val="0"/>
-        <w:snapToGrid w:val="0"/>
-        <w:spacing w:line="240" w:lineRule="atLeast"/>
-        <w:rPr>
-          <w:b/>
-          <w:bCs/>
-        </w:rPr>
-      </w:pPr>
-    </w:p>
-    <w:p>
-      <w:pPr>
-        <w:adjustRightInd w:val="0"/>
-        <w:snapToGrid w:val="0"/>
-        <w:spacing w:line="240" w:lineRule="atLeast"/>
-        <w:rPr>
-          <w:b/>
-          <w:bCs/>
-        </w:rPr>
-      </w:pPr>
-    </w:p>
-    <w:p>
-      <w:pPr>
-        <w:adjustRightInd w:val="0"/>
-        <w:snapToGrid w:val="0"/>
-        <w:spacing w:line="240" w:lineRule="atLeast"/>
-        <w:rPr>
-          <w:b/>
-          <w:bCs/>
-        </w:rPr>
-      </w:pPr>
-    </w:p>
-    <w:p>
-      <w:pPr>
-        <w:adjustRightInd w:val="0"/>
-        <w:snapToGrid w:val="0"/>
-        <w:spacing w:line="240" w:lineRule="atLeast"/>
-        <w:rPr>
-          <w:b/>
-          <w:bCs/>
-        </w:rPr>
-      </w:pPr>
-    </w:p>
-    <w:p>
-      <w:pPr>
-        <w:adjustRightInd w:val="0"/>
-        <w:snapToGrid w:val="0"/>
-        <w:spacing w:line="240" w:lineRule="atLeast"/>
-        <w:rPr>
-          <w:b/>
-          <w:bCs/>
-        </w:rPr>
-      </w:pPr>
-    </w:p>
-    <w:p>
-      <w:pPr>
-        <w:adjustRightInd w:val="0"/>
-        <w:snapToGrid w:val="0"/>
-        <w:spacing w:line="240" w:lineRule="atLeast"/>
-        <w:rPr>
-          <w:b/>
-          <w:bCs/>
-        </w:rPr>
-      </w:pPr>
-    </w:p>
-    <w:p>
-      <w:pPr>
-        <w:adjustRightInd w:val="0"/>
-        <w:snapToGrid w:val="0"/>
-        <w:spacing w:line="240" w:lineRule="atLeast"/>
-        <w:rPr>
-          <w:b/>
-          <w:bCs/>
-        </w:rPr>
-      </w:pPr>
-    </w:p>
-    <w:p>
-      <w:pPr>
-        <w:adjustRightInd w:val="0"/>
-        <w:snapToGrid w:val="0"/>
-        <w:spacing w:line="240" w:lineRule="atLeast"/>
-        <w:rPr>
-          <w:b/>
-          <w:bCs/>
-        </w:rPr>
-      </w:pPr>
-    </w:p>
-    <w:p>
-      <w:pPr>
-        <w:adjustRightInd w:val="0"/>
-        <w:snapToGrid w:val="0"/>
-        <w:spacing w:line="240" w:lineRule="atLeast"/>
-        <w:rPr>
-          <w:b/>
-          <w:bCs/>
-        </w:rPr>
-      </w:pPr>
-    </w:p>
-    <w:p>
-      <w:pPr>
-        <w:adjustRightInd w:val="0"/>
-        <w:snapToGrid w:val="0"/>
-        <w:spacing w:line="240" w:lineRule="atLeast"/>
-        <w:rPr>
-          <w:b/>
-          <w:bCs/>
-        </w:rPr>
-      </w:pPr>
-    </w:p>
-    <w:p>
-      <w:pPr>
-        <w:adjustRightInd w:val="0"/>
-        <w:snapToGrid w:val="0"/>
-        <w:spacing w:line="240" w:lineRule="atLeast"/>
-        <w:rPr>
-          <w:b/>
-          <w:bCs/>
-        </w:rPr>
-      </w:pPr>
-    </w:p>
-    <w:p>
-      <w:pPr>
-        <w:adjustRightInd w:val="0"/>
-        <w:snapToGrid w:val="0"/>
-        <w:spacing w:line="240" w:lineRule="atLeast"/>
-        <w:rPr>
-          <w:b/>
-          <w:bCs/>
-        </w:rPr>
-      </w:pPr>
-    </w:p>
-    <w:p>
-      <w:pPr>
-        <w:adjustRightInd w:val="0"/>
-        <w:snapToGrid w:val="0"/>
-        <w:spacing w:line="240" w:lineRule="atLeast"/>
-        <w:rPr>
-          <w:b/>
-          <w:bCs/>
-        </w:rPr>
-      </w:pPr>
-    </w:p>
-    <w:p>
-      <w:pPr>
-        <w:adjustRightInd w:val="0"/>
-        <w:snapToGrid w:val="0"/>
-        <w:spacing w:line="240" w:lineRule="atLeast"/>
-        <w:rPr>
-          <w:b/>
-          <w:bCs/>
-        </w:rPr>
-      </w:pPr>
-    </w:p>
-    <w:p>
-      <w:pPr>
-        <w:adjustRightInd w:val="0"/>
-        <w:snapToGrid w:val="0"/>
-        <w:spacing w:line="240" w:lineRule="atLeast"/>
-        <w:rPr>
-          <w:b/>
-          <w:bCs/>
-        </w:rPr>
-      </w:pPr>
-    </w:p>
-    <w:p>
-      <w:pPr>
-        <w:adjustRightInd w:val="0"/>
-        <w:snapToGrid w:val="0"/>
-        <w:spacing w:line="240" w:lineRule="atLeast"/>
-        <w:rPr>
-          <w:b/>
-          <w:bCs/>
-        </w:rPr>
-      </w:pPr>
-    </w:p>
-    <w:p>
-      <w:pPr>
-        <w:adjustRightInd w:val="0"/>
-        <w:snapToGrid w:val="0"/>
-        <w:spacing w:line="240" w:lineRule="atLeast"/>
-        <w:rPr>
-          <w:b/>
-          <w:bCs/>
-        </w:rPr>
-      </w:pPr>
-    </w:p>
-    <w:p>
-      <w:pPr>
-        <w:adjustRightInd w:val="0"/>
-        <w:snapToGrid w:val="0"/>
-        <w:spacing w:line="240" w:lineRule="atLeast"/>
-        <w:rPr>
-          <w:rFonts w:hint="eastAsia"/>
+        <w:t>（AWS ）</w:t>
+      </w:r>
+    </w:p>
+    <w:p>
+      <w:pPr>
+        <w:adjustRightInd w:val="0"/>
+        <w:snapToGrid w:val="0"/>
+        <w:spacing w:line="240" w:lineRule="atLeast"/>
+        <w:rPr>
+          <w:b/>
+          <w:bCs/>
+        </w:rPr>
+      </w:pPr>
+    </w:p>
+    <w:p>
+      <w:pPr>
+        <w:adjustRightInd w:val="0"/>
+        <w:snapToGrid w:val="0"/>
+        <w:spacing w:line="240" w:lineRule="atLeast"/>
+        <w:rPr>
+          <w:b/>
+          <w:bCs/>
+        </w:rPr>
+      </w:pPr>
+    </w:p>
+    <w:p>
+      <w:pPr>
+        <w:adjustRightInd w:val="0"/>
+        <w:snapToGrid w:val="0"/>
+        <w:spacing w:line="240" w:lineRule="atLeast"/>
+        <w:rPr>
+          <w:b/>
+          <w:bCs/>
+        </w:rPr>
+      </w:pPr>
+    </w:p>
+    <w:p>
+      <w:pPr>
+        <w:adjustRightInd w:val="0"/>
+        <w:snapToGrid w:val="0"/>
+        <w:spacing w:line="240" w:lineRule="atLeast"/>
+        <w:rPr>
+          <w:b/>
+          <w:bCs/>
+        </w:rPr>
+      </w:pPr>
+    </w:p>
+    <w:p>
+      <w:pPr>
+        <w:adjustRightInd w:val="0"/>
+        <w:snapToGrid w:val="0"/>
+        <w:spacing w:line="240" w:lineRule="atLeast"/>
+        <w:rPr>
+          <w:b/>
+          <w:bCs/>
+        </w:rPr>
+      </w:pPr>
+    </w:p>
+    <w:p>
+      <w:pPr>
+        <w:adjustRightInd w:val="0"/>
+        <w:snapToGrid w:val="0"/>
+        <w:spacing w:line="240" w:lineRule="atLeast"/>
+        <w:rPr>
+          <w:b/>
+          <w:bCs/>
+        </w:rPr>
+      </w:pPr>
+    </w:p>
+    <w:p>
+      <w:pPr>
+        <w:adjustRightInd w:val="0"/>
+        <w:snapToGrid w:val="0"/>
+        <w:spacing w:line="240" w:lineRule="atLeast"/>
+        <w:rPr>
           <w:b/>
           <w:bCs/>
         </w:rPr>
@@ -12335,16 +12478,62 @@
         <w:ind w:firstLineChars="200" w:firstLine="420"/>
       </w:pPr>
       <w:r>
+        <w:rPr>
+          <w:rFonts w:hint="eastAsia"/>
+        </w:rPr>
+        <w:t>コンビニ</w:t>
+      </w:r>
+      <w:r>
+        <w:t>のサイネージより、リテアド（スーパーの売り場）に</w:t>
+      </w:r>
+    </w:p>
+    <w:p>
+      <w:pPr>
+        <w:adjustRightInd w:val="0"/>
+        <w:snapToGrid w:val="0"/>
+        <w:spacing w:line="240" w:lineRule="atLeast"/>
+        <w:ind w:firstLineChars="200" w:firstLine="420"/>
+      </w:pPr>
+      <w:r>
         <w:t>「</w:t>
       </w:r>
       <w:r>
+        <w:t>広告費を出したい」と思わせる最大のキラーポイント。</w:t>
+      </w:r>
+    </w:p>
+    <w:p>
+      <w:pPr>
+        <w:pStyle w:val="a9"/>
+        <w:adjustRightInd w:val="0"/>
+        <w:snapToGrid w:val="0"/>
+        <w:spacing w:line="240" w:lineRule="atLeast"/>
+        <w:ind w:left="1440"/>
+      </w:pPr>
+    </w:p>
+    <w:p>
+      <w:pPr>
+        <w:adjustRightInd w:val="0"/>
+        <w:snapToGrid w:val="0"/>
+        <w:spacing w:line="240" w:lineRule="atLeast"/>
+      </w:pPr>
+      <w:r>
+        <w:rPr>
+          <w:b/>
+          <w:bCs/>
+        </w:rPr>
+        <w:t>結論</w:t>
+      </w:r>
+      <w:r>
+        <w:t> 「先行する</w:t>
+      </w:r>
+      <w:r>
         <w:rPr>
           <w:rFonts w:hint="eastAsia"/>
         </w:rPr>
         <w:t>コンビニ</w:t>
       </w:r>
       <w:r>
-        <w:t>のサイネージより、リテアド（スーパーの売り場）に広告費を出したい」</w:t>
+        <w:t>の3万パネル網」に対して</w:t>
       </w:r>
     </w:p>
     <w:p>
@@ -12355,34 +12544,36 @@
         <w:ind w:firstLineChars="200" w:firstLine="420"/>
       </w:pPr>
       <w:r>
-        <w:t>と思わせる最大のキラーポイント。</w:t>
-      </w:r>
-    </w:p>
-    <w:p>
-      <w:pPr>
-        <w:pStyle w:val="a9"/>
-        <w:adjustRightInd w:val="0"/>
-        <w:snapToGrid w:val="0"/>
-        <w:spacing w:line="240" w:lineRule="atLeast"/>
-        <w:ind w:left="1440"/>
-      </w:pPr>
-    </w:p>
-    <w:p>
-      <w:pPr>
-        <w:adjustRightInd w:val="0"/>
-        <w:snapToGrid w:val="0"/>
-        <w:spacing w:line="240" w:lineRule="atLeast"/>
-      </w:pPr>
-      <w:r>
-        <w:rPr>
-          <w:b/>
-          <w:bCs/>
-        </w:rPr>
-        <w:t>結論</w:t>
-      </w:r>
-      <w:r>
-        <w:t> 「先行する</w:t>
-      </w:r>
+        <w:t>リテアドは「スーパー</w:t>
+      </w:r>
+      <w:r>
+        <w:rPr>
+          <w:rFonts w:hint="eastAsia"/>
+        </w:rPr>
+        <w:t>上位</w:t>
+      </w:r>
+      <w:r>
+        <w:t>60社の3万パネル」で対抗でき、</w:t>
+      </w:r>
+    </w:p>
+    <w:p>
+      <w:pPr>
+        <w:adjustRightInd w:val="0"/>
+        <w:snapToGrid w:val="0"/>
+        <w:spacing w:line="240" w:lineRule="atLeast"/>
+        <w:ind w:firstLineChars="200" w:firstLine="420"/>
+      </w:pPr>
+      <w:r>
+        <w:t>「滞在時間の長さ」と「客単価（クリエイター動画との相性）」という質的な部分で</w:t>
+      </w:r>
+    </w:p>
+    <w:p>
+      <w:pPr>
+        <w:adjustRightInd w:val="0"/>
+        <w:snapToGrid w:val="0"/>
+        <w:spacing w:line="240" w:lineRule="atLeast"/>
+        <w:ind w:firstLineChars="200" w:firstLine="420"/>
+      </w:pPr>
       <w:r>
         <w:rPr>
           <w:rFonts w:hint="eastAsia"/>
@@ -12390,54 +12581,6 @@
         <w:t>コンビニ</w:t>
       </w:r>
       <w:r>
-        <w:t>の3万パネル網」に対して</w:t>
-      </w:r>
-    </w:p>
-    <w:p>
-      <w:pPr>
-        <w:adjustRightInd w:val="0"/>
-        <w:snapToGrid w:val="0"/>
-        <w:spacing w:line="240" w:lineRule="atLeast"/>
-        <w:ind w:firstLineChars="200" w:firstLine="420"/>
-      </w:pPr>
-      <w:r>
-        <w:t>リテアドは「スーパー</w:t>
-      </w:r>
-      <w:r>
-        <w:rPr>
-          <w:rFonts w:hint="eastAsia"/>
-        </w:rPr>
-        <w:t>上位</w:t>
-      </w:r>
-      <w:r>
-        <w:t>60社の3万パネル」で対抗でき、</w:t>
-      </w:r>
-    </w:p>
-    <w:p>
-      <w:pPr>
-        <w:adjustRightInd w:val="0"/>
-        <w:snapToGrid w:val="0"/>
-        <w:spacing w:line="240" w:lineRule="atLeast"/>
-        <w:ind w:firstLineChars="200" w:firstLine="420"/>
-      </w:pPr>
-      <w:r>
-        <w:t>「滞在時間の長さ」と「客単価（クリエイター動画との相性）」という質的な部分で</w:t>
-      </w:r>
-    </w:p>
-    <w:p>
-      <w:pPr>
-        <w:adjustRightInd w:val="0"/>
-        <w:snapToGrid w:val="0"/>
-        <w:spacing w:line="240" w:lineRule="atLeast"/>
-        <w:ind w:firstLineChars="200" w:firstLine="420"/>
-      </w:pPr>
-      <w:r>
-        <w:rPr>
-          <w:rFonts w:hint="eastAsia"/>
-        </w:rPr>
-        <w:t>コンビニ</w:t>
-      </w:r>
-      <w:r>
         <w:t>のメディア価値を凌駕するポテンシャルを秘めています！</w:t>
       </w:r>
     </w:p>
@@ -12478,7 +12621,7 @@
         <w:t>某</w:t>
       </w:r>
       <w:r>
-        <w:t>カンパニー）のサイネージ設置数は、店舗の規模や形態によって異なりますが</w:t>
+        <w:t>カンパニー）のサイネージ設置数は、店舗の規模や形態によって</w:t>
       </w:r>
     </w:p>
     <w:p>
@@ -12498,7 +12641,17 @@
         <w:t>1店舗あたり100台前後</w:t>
       </w:r>
       <w:r>
-        <w:t>設置されているケースが見られます。</w:t>
+        <w:t>設置されている</w:t>
+      </w:r>
+    </w:p>
+    <w:p>
+      <w:pPr>
+        <w:adjustRightInd w:val="0"/>
+        <w:snapToGrid w:val="0"/>
+        <w:spacing w:line="240" w:lineRule="atLeast"/>
+      </w:pPr>
+      <w:r>
+        <w:t>ケースが見られます。</w:t>
       </w:r>
     </w:p>
     <w:p>
@@ -12752,7 +12905,7 @@
         <w:t>約100台</w:t>
       </w:r>
       <w:r>
-        <w:t>のサイネージが稼働していることになります。</w:t>
+        <w:t>のサイネージが稼働している</w:t>
       </w:r>
     </w:p>
     <w:p>
@@ -13082,6 +13235,24 @@
         <w:snapToGrid w:val="0"/>
         <w:spacing w:line="240" w:lineRule="atLeast"/>
       </w:pPr>
+      <w:r>
+        <w:t>スーパー（</w:t>
+      </w:r>
+      <w:r>
+        <w:rPr>
+          <w:rFonts w:hint="eastAsia"/>
+        </w:rPr>
+        <w:t>某</w:t>
+      </w:r>
+      <w:r>
+        <w:t>カンパニー）</w:t>
+      </w:r>
+      <w:r>
+        <w:rPr>
+          <w:rFonts w:hint="eastAsia"/>
+        </w:rPr>
+        <w:t xml:space="preserve">　</w:t>
+      </w:r>
       <w:r>
         <w:rPr>
           <w:rFonts w:hint="eastAsia"/>
@@ -16811,16 +16982,6 @@
         </w:rPr>
         <w:t xml:space="preserve">　　　　　　Googleアドセンス・アドマネージャーとの連携</w:t>
       </w:r>
-    </w:p>
-    <w:p>
-      <w:pPr>
-        <w:snapToGrid w:val="0"/>
-      </w:pPr>
-    </w:p>
-    <w:p>
-      <w:pPr>
-        <w:snapToGrid w:val="0"/>
-      </w:pPr>
     </w:p>
     <w:sectPr>
       <w:pgSz w:w="11906" w:h="16838"/>
@@ -21780,6 +21941,7 @@
   <w:style w:type="character" w:default="1" w:styleId="a0">
     <w:name w:val="Default Paragraph Font"/>
     <w:uiPriority w:val="1"/>
+    <w:semiHidden/>
     <w:unhideWhenUsed/>
   </w:style>
   <w:style w:type="table" w:default="1" w:styleId="a1">

</xml_diff>

<commit_message>
Implement cloud video compression and update retailer portal UI
</commit_message>
<xml_diff>
--- a/主題小売り業界向けの売上高改善の向けサイネージ広告共同運用の提案.docx
+++ b/主題小売り業界向けの売上高改善の向けサイネージ広告共同運用の提案.docx
@@ -5367,7 +5367,7 @@
           <w:noProof/>
         </w:rPr>
         <w:drawing>
-          <wp:inline distT="0" distB="0" distL="0" distR="0" wp14:anchorId="3CE421A6" wp14:editId="180AE273">
+          <wp:inline distT="0" distB="0" distL="0" distR="0" wp14:anchorId="3CE421A6" wp14:editId="43497644">
             <wp:extent cx="1074164" cy="1059011"/>
             <wp:effectExtent l="0" t="0" r="0" b="8255"/>
             <wp:docPr id="681950858" name="図 1"/>
@@ -5484,7 +5484,19 @@
         <w:rPr>
           <w:rFonts w:eastAsia="游明朝"/>
         </w:rPr>
-        <w:t>中国メーカー（Alibaba /）経由で調達</w:t>
+        <w:t>中国メーカー</w:t>
+      </w:r>
+      <w:r>
+        <w:rPr>
+          <w:rFonts w:eastAsia="游明朝"/>
+        </w:rPr>
+        <w:t>テンリン</w:t>
+      </w:r>
+      <w:r>
+        <w:rPr>
+          <w:rFonts w:eastAsia="游明朝"/>
+        </w:rPr>
+        <w:t>（Alibaba /）経由で調達</w:t>
       </w:r>
     </w:p>
     <w:p>
@@ -5503,10 +5515,10 @@
           <w:noProof/>
         </w:rPr>
         <w:drawing>
-          <wp:inline distT="0" distB="0" distL="0" distR="0" wp14:anchorId="03770A9A" wp14:editId="494B765B">
-            <wp:extent cx="906780" cy="906780"/>
-            <wp:effectExtent l="0" t="0" r="7620" b="7620"/>
-            <wp:docPr id="1123684352" name="図 1"/>
+          <wp:inline distT="0" distB="0" distL="0" distR="0" wp14:anchorId="3E512CAA" wp14:editId="1CFEE466">
+            <wp:extent cx="952500" cy="952500"/>
+            <wp:effectExtent l="0" t="0" r="0" b="0"/>
+            <wp:docPr id="1791372357" name="図 1"/>
             <wp:cNvGraphicFramePr>
               <a:graphicFrameLocks xmlns:a="http://schemas.openxmlformats.org/drawingml/2006/main" noChangeAspect="1"/>
             </wp:cNvGraphicFramePr>
@@ -5533,9 +5545,9 @@
                     </a:stretch>
                   </pic:blipFill>
                   <pic:spPr bwMode="auto">
-                    <a:xfrm>
+                    <a:xfrm flipH="1">
                       <a:off x="0" y="0"/>
-                      <a:ext cx="906780" cy="906780"/>
+                      <a:ext cx="952500" cy="952500"/>
                     </a:xfrm>
                     <a:prstGeom prst="rect">
                       <a:avLst/>
@@ -8984,7 +8996,6 @@
       <w:pPr>
         <w:snapToGrid w:val="0"/>
         <w:rPr>
-          <w:rFonts w:hint="eastAsia"/>
           <w:u w:val="single"/>
         </w:rPr>
       </w:pPr>
@@ -10573,36 +10584,25 @@
         <w:adjustRightInd w:val="0"/>
         <w:snapToGrid w:val="0"/>
         <w:spacing w:line="240" w:lineRule="atLeast"/>
-        <w:rPr>
-          <w:rFonts w:hint="eastAsia"/>
-        </w:rPr>
-      </w:pPr>
-    </w:p>
-    <w:p>
-      <w:pPr>
-        <w:adjustRightInd w:val="0"/>
-        <w:snapToGrid w:val="0"/>
-        <w:spacing w:line="240" w:lineRule="atLeast"/>
-      </w:pPr>
-    </w:p>
-    <w:p>
-      <w:pPr>
-        <w:adjustRightInd w:val="0"/>
-        <w:snapToGrid w:val="0"/>
-        <w:spacing w:line="240" w:lineRule="atLeast"/>
-        <w:rPr>
-          <w:b/>
-          <w:bCs/>
-        </w:rPr>
-      </w:pPr>
-      <w:r>
-        <w:rPr>
-          <w:rFonts w:hint="eastAsia"/>
-          <w:b/>
-          <w:bCs/>
-        </w:rPr>
-        <w:t>5.</w:t>
-      </w:r>
+      </w:pPr>
+    </w:p>
+    <w:p>
+      <w:pPr>
+        <w:adjustRightInd w:val="0"/>
+        <w:snapToGrid w:val="0"/>
+        <w:spacing w:line="240" w:lineRule="atLeast"/>
+      </w:pPr>
+    </w:p>
+    <w:p>
+      <w:pPr>
+        <w:adjustRightInd w:val="0"/>
+        <w:snapToGrid w:val="0"/>
+        <w:spacing w:line="240" w:lineRule="atLeast"/>
+        <w:rPr>
+          <w:b/>
+          <w:bCs/>
+        </w:rPr>
+      </w:pPr>
       <w:r>
         <w:rPr>
           <w:rFonts w:hint="eastAsia"/>
@@ -15426,7 +15426,7 @@
       <w:tblGrid>
         <w:gridCol w:w="2627"/>
         <w:gridCol w:w="1771"/>
-        <w:gridCol w:w="3992"/>
+        <w:gridCol w:w="3494"/>
       </w:tblGrid>
       <w:tr>
         <w:trPr>
@@ -15871,19 +15871,12 @@
               <w:snapToGrid w:val="0"/>
               <w:spacing w:line="240" w:lineRule="atLeast"/>
               <w:rPr>
+                <w:rFonts w:hint="eastAsia"/>
                 <w:b/>
                 <w:bCs/>
                 <w:u w:val="single"/>
               </w:rPr>
             </w:pPr>
-            <w:r>
-              <w:rPr>
-                <w:b/>
-                <w:bCs/>
-                <w:u w:val="single"/>
-              </w:rPr>
-              <w:t>業務委託費（1年分）</w:t>
-            </w:r>
           </w:p>
         </w:tc>
         <w:tc>
@@ -15904,19 +15897,12 @@
               <w:snapToGrid w:val="0"/>
               <w:spacing w:line="240" w:lineRule="atLeast"/>
               <w:rPr>
+                <w:rFonts w:hint="eastAsia"/>
                 <w:b/>
                 <w:bCs/>
                 <w:u w:val="single"/>
               </w:rPr>
             </w:pPr>
-            <w:r>
-              <w:rPr>
-                <w:b/>
-                <w:bCs/>
-                <w:u w:val="single"/>
-              </w:rPr>
-              <w:t>1,000万円</w:t>
-            </w:r>
           </w:p>
         </w:tc>
         <w:tc>
@@ -15937,19 +15923,12 @@
               <w:snapToGrid w:val="0"/>
               <w:spacing w:line="240" w:lineRule="atLeast"/>
               <w:rPr>
+                <w:rFonts w:hint="eastAsia"/>
                 <w:b/>
                 <w:bCs/>
                 <w:u w:val="single"/>
               </w:rPr>
             </w:pPr>
-            <w:r>
-              <w:rPr>
-                <w:b/>
-                <w:bCs/>
-                <w:u w:val="single"/>
-              </w:rPr>
-              <w:t>広告営業 動画制作・クリエイティブ委託</w:t>
-            </w:r>
           </w:p>
         </w:tc>
       </w:tr>
@@ -16121,11 +16100,20 @@
             </w:pPr>
             <w:r>
               <w:rPr>
+                <w:rFonts w:hint="eastAsia"/>
                 <w:b/>
                 <w:bCs/>
                 <w:u w:val="single"/>
               </w:rPr>
-              <w:t>100万円</w:t>
+              <w:t>3</w:t>
+            </w:r>
+            <w:r>
+              <w:rPr>
+                <w:b/>
+                <w:bCs/>
+                <w:u w:val="single"/>
+              </w:rPr>
+              <w:t>00万円</w:t>
             </w:r>
           </w:p>
         </w:tc>
@@ -16230,7 +16218,41 @@
                 <w:bCs/>
                 <w:u w:val="single"/>
               </w:rPr>
-              <w:t>約6,472万円</w:t>
+              <w:t>約</w:t>
+            </w:r>
+            <w:r>
+              <w:rPr>
+                <w:rFonts w:hint="eastAsia"/>
+                <w:b/>
+                <w:bCs/>
+                <w:u w:val="single"/>
+              </w:rPr>
+              <w:t>5</w:t>
+            </w:r>
+            <w:r>
+              <w:rPr>
+                <w:b/>
+                <w:bCs/>
+                <w:u w:val="single"/>
+              </w:rPr>
+              <w:t>,</w:t>
+            </w:r>
+            <w:r>
+              <w:rPr>
+                <w:rFonts w:hint="eastAsia"/>
+                <w:b/>
+                <w:bCs/>
+                <w:u w:val="single"/>
+              </w:rPr>
+              <w:t>6</w:t>
+            </w:r>
+            <w:r>
+              <w:rPr>
+                <w:b/>
+                <w:bCs/>
+                <w:u w:val="single"/>
+              </w:rPr>
+              <w:t>72万円</w:t>
             </w:r>
           </w:p>
         </w:tc>
@@ -16481,22 +16503,26 @@
         <w:spacing w:line="240" w:lineRule="atLeast"/>
         <w:rPr>
           <w:u w:val="single"/>
-          <w:lang w:eastAsia="zh-CN"/>
         </w:rPr>
       </w:pPr>
       <w:r>
         <w:rPr>
           <w:rFonts w:hint="eastAsia"/>
           <w:u w:val="single"/>
-          <w:lang w:eastAsia="zh-CN"/>
-        </w:rPr>
-        <w:t>業務委託費　想定内訳</w:t>
+        </w:rPr>
+        <w:t>通信インフラ費用</w:t>
       </w:r>
       <w:r>
         <w:rPr>
           <w:rFonts w:hint="eastAsia"/>
           <w:u w:val="single"/>
-          <w:lang w:eastAsia="zh-CN"/>
+        </w:rPr>
+        <w:t xml:space="preserve">　想定内訳</w:t>
+      </w:r>
+      <w:r>
+        <w:rPr>
+          <w:rFonts w:hint="eastAsia"/>
+          <w:u w:val="single"/>
         </w:rPr>
         <w:t>(</w:t>
       </w:r>
@@ -16506,74 +16532,94 @@
           <w:b/>
           <w:bCs/>
           <w:u w:val="single"/>
-          <w:lang w:eastAsia="zh-CN"/>
-        </w:rPr>
-        <w:t>1</w:t>
-      </w:r>
-      <w:r>
-        <w:rPr>
+        </w:rPr>
+        <w:t>5</w:t>
+      </w:r>
+      <w:r>
+        <w:rPr>
+          <w:rFonts w:hint="eastAsia"/>
           <w:b/>
           <w:bCs/>
           <w:u w:val="single"/>
-          <w:lang w:eastAsia="zh-CN"/>
-        </w:rPr>
-        <w:t>,</w:t>
-      </w:r>
-      <w:r>
-        <w:rPr>
-          <w:rFonts w:hint="eastAsia"/>
-          <w:b/>
-          <w:bCs/>
+        </w:rPr>
+        <w:t>00万円</w:t>
+      </w:r>
+      <w:r>
+        <w:rPr>
+          <w:rFonts w:hint="eastAsia"/>
           <w:u w:val="single"/>
-          <w:lang w:eastAsia="zh-CN"/>
-        </w:rPr>
-        <w:t>300万円</w:t>
-      </w:r>
-      <w:r>
-        <w:rPr>
-          <w:rFonts w:hint="eastAsia"/>
+        </w:rPr>
+        <w:t>)</w:t>
+      </w:r>
+    </w:p>
+    <w:p>
+      <w:pPr>
+        <w:adjustRightInd w:val="0"/>
+        <w:snapToGrid w:val="0"/>
+        <w:spacing w:line="240" w:lineRule="atLeast"/>
+        <w:rPr>
           <w:u w:val="single"/>
-          <w:lang w:eastAsia="zh-CN"/>
-        </w:rPr>
-        <w:t>)</w:t>
-      </w:r>
-    </w:p>
-    <w:p>
-      <w:pPr>
-        <w:adjustRightInd w:val="0"/>
-        <w:snapToGrid w:val="0"/>
-        <w:spacing w:line="240" w:lineRule="atLeast"/>
-        <w:rPr>
+        </w:rPr>
+      </w:pPr>
+      <w:r>
+        <w:rPr>
+          <w:rFonts w:hint="eastAsia"/>
           <w:u w:val="single"/>
         </w:rPr>
-      </w:pPr>
+        <w:t>※</w:t>
+      </w:r>
       <w:r>
         <w:rPr>
           <w:rFonts w:hint="eastAsia"/>
           <w:u w:val="single"/>
         </w:rPr>
-        <w:t>※</w:t>
+        <w:t>通信インフラ</w:t>
       </w:r>
       <w:r>
         <w:rPr>
           <w:rFonts w:hint="eastAsia"/>
           <w:u w:val="single"/>
         </w:rPr>
-        <w:t>通信インフラ</w:t>
+        <w:t>費</w:t>
       </w:r>
       <w:r>
         <w:rPr>
           <w:rFonts w:hint="eastAsia"/>
           <w:u w:val="single"/>
         </w:rPr>
-        <w:t>費</w:t>
-      </w:r>
-      <w:r>
-        <w:rPr>
-          <w:rFonts w:hint="eastAsia"/>
+        <w:t>は最大300台のサーバー代金なので</w:t>
+      </w:r>
+    </w:p>
+    <w:p>
+      <w:pPr>
+        <w:adjustRightInd w:val="0"/>
+        <w:snapToGrid w:val="0"/>
+        <w:spacing w:line="240" w:lineRule="atLeast"/>
+        <w:ind w:firstLineChars="100" w:firstLine="210"/>
+        <w:rPr>
           <w:u w:val="single"/>
         </w:rPr>
-        <w:t>は最大300台のサーバー代金なので</w:t>
+      </w:pPr>
+      <w:r>
+        <w:rPr>
+          <w:rFonts w:hint="eastAsia"/>
+          <w:u w:val="single"/>
+        </w:rPr>
+        <w:t>初期から</w:t>
+      </w:r>
+      <w:r>
+        <w:rPr>
+          <w:rFonts w:hint="eastAsia"/>
+          <w:u w:val="single"/>
+        </w:rPr>
+        <w:t>の</w:t>
+      </w:r>
+      <w:r>
+        <w:rPr>
+          <w:rFonts w:hint="eastAsia"/>
+          <w:u w:val="single"/>
+        </w:rPr>
+        <w:t>コストではありません</w:t>
       </w:r>
     </w:p>
     <w:p>
@@ -16591,21 +16637,21 @@
           <w:rFonts w:hint="eastAsia"/>
           <w:u w:val="single"/>
         </w:rPr>
-        <w:t>初期から</w:t>
+        <w:t>現在の</w:t>
       </w:r>
       <w:r>
         <w:rPr>
           <w:rFonts w:hint="eastAsia"/>
           <w:u w:val="single"/>
         </w:rPr>
-        <w:t>の</w:t>
+        <w:t>4月時点の</w:t>
       </w:r>
       <w:r>
         <w:rPr>
           <w:rFonts w:hint="eastAsia"/>
           <w:u w:val="single"/>
         </w:rPr>
-        <w:t>コストではありません</w:t>
+        <w:t xml:space="preserve">サーバー代は月100円～500円　</w:t>
       </w:r>
     </w:p>
     <w:p>
@@ -16620,76 +16666,41 @@
       </w:pPr>
       <w:r>
         <w:rPr>
-          <w:rFonts w:hint="eastAsia"/>
+          <w:b/>
+          <w:bCs/>
           <w:u w:val="single"/>
         </w:rPr>
-        <w:t>現在の</w:t>
-      </w:r>
-      <w:r>
-        <w:rPr>
-          <w:rFonts w:hint="eastAsia"/>
+        <w:t>諸経費</w:t>
+      </w:r>
+      <w:r>
+        <w:rPr>
+          <w:rFonts w:hint="eastAsia"/>
+          <w:b/>
+          <w:bCs/>
           <w:u w:val="single"/>
         </w:rPr>
-        <w:t>4月時点の</w:t>
+        <w:t xml:space="preserve">　</w:t>
       </w:r>
       <w:r>
         <w:rPr>
           <w:rFonts w:hint="eastAsia"/>
           <w:u w:val="single"/>
         </w:rPr>
-        <w:t xml:space="preserve">サーバー代は月100円～500円　</w:t>
-      </w:r>
-    </w:p>
-    <w:p>
-      <w:pPr>
-        <w:adjustRightInd w:val="0"/>
-        <w:snapToGrid w:val="0"/>
-        <w:spacing w:line="240" w:lineRule="atLeast"/>
-        <w:ind w:firstLineChars="100" w:firstLine="210"/>
-        <w:rPr>
+        <w:t>パネル選定など、</w:t>
+      </w:r>
+      <w:r>
+        <w:rPr>
+          <w:rFonts w:hint="eastAsia"/>
           <w:u w:val="single"/>
         </w:rPr>
-      </w:pPr>
-      <w:r>
-        <w:rPr>
+        <w:t>中国渡航費・契約金</w:t>
+      </w:r>
+      <w:r>
+        <w:rPr>
+          <w:rFonts w:hint="eastAsia"/>
           <w:u w:val="single"/>
         </w:rPr>
-        <w:t>広告営業の委託</w:t>
-      </w:r>
-    </w:p>
-    <w:p>
-      <w:pPr>
-        <w:adjustRightInd w:val="0"/>
-        <w:snapToGrid w:val="0"/>
-        <w:spacing w:line="240" w:lineRule="atLeast"/>
-        <w:ind w:firstLineChars="100" w:firstLine="210"/>
-        <w:rPr>
-          <w:u w:val="single"/>
-        </w:rPr>
-      </w:pPr>
-      <w:r>
-        <w:rPr>
-          <w:u w:val="single"/>
-        </w:rPr>
-        <w:t>動画制作・クリエイティブ委託</w:t>
-      </w:r>
-    </w:p>
-    <w:p>
-      <w:pPr>
-        <w:adjustRightInd w:val="0"/>
-        <w:snapToGrid w:val="0"/>
-        <w:spacing w:line="240" w:lineRule="atLeast"/>
-        <w:ind w:firstLineChars="100" w:firstLine="210"/>
-        <w:rPr>
-          <w:u w:val="single"/>
-        </w:rPr>
-      </w:pPr>
-      <w:r>
-        <w:rPr>
-          <w:rFonts w:hint="eastAsia"/>
-          <w:u w:val="single"/>
-        </w:rPr>
-        <w:t>中国渡航費・契約金</w:t>
+        <w:t>など</w:t>
       </w:r>
     </w:p>
     <w:p>

</xml_diff>

<commit_message>
Convert all login sections across portals to standard HTML form elements with autocomplete attributes for Google Password Manager support
</commit_message>
<xml_diff>
--- a/主題小売り業界向けの売上高改善の向けサイネージ広告共同運用の提案.docx
+++ b/主題小売り業界向けの売上高改善の向けサイネージ広告共同運用の提案.docx
@@ -5367,7 +5367,7 @@
           <w:noProof/>
         </w:rPr>
         <w:drawing>
-          <wp:inline distT="0" distB="0" distL="0" distR="0" wp14:anchorId="3CE421A6" wp14:editId="43497644">
+          <wp:inline distT="0" distB="0" distL="0" distR="0" wp14:anchorId="3CE421A6" wp14:editId="46C611DE">
             <wp:extent cx="1074164" cy="1059011"/>
             <wp:effectExtent l="0" t="0" r="0" b="8255"/>
             <wp:docPr id="681950858" name="図 1"/>
@@ -7615,6 +7615,14 @@
           <w:bCs/>
         </w:rPr>
         <w:t>広告主のダッシュボードの概要</w:t>
+      </w:r>
+      <w:r>
+        <w:rPr>
+          <w:rFonts w:hint="eastAsia"/>
+          <w:b/>
+          <w:bCs/>
+        </w:rPr>
+        <w:t>(デモは配信できません)</w:t>
       </w:r>
     </w:p>
     <w:p>
@@ -10557,40 +10565,111 @@
         <w:snapToGrid w:val="0"/>
         <w:spacing w:line="240" w:lineRule="atLeast"/>
       </w:pPr>
-    </w:p>
-    <w:p>
-      <w:pPr>
-        <w:adjustRightInd w:val="0"/>
-        <w:snapToGrid w:val="0"/>
-        <w:spacing w:line="240" w:lineRule="atLeast"/>
-      </w:pPr>
-    </w:p>
-    <w:p>
-      <w:pPr>
-        <w:adjustRightInd w:val="0"/>
-        <w:snapToGrid w:val="0"/>
-        <w:spacing w:line="240" w:lineRule="atLeast"/>
-      </w:pPr>
-    </w:p>
-    <w:p>
-      <w:pPr>
-        <w:adjustRightInd w:val="0"/>
-        <w:snapToGrid w:val="0"/>
-        <w:spacing w:line="240" w:lineRule="atLeast"/>
-      </w:pPr>
-    </w:p>
-    <w:p>
-      <w:pPr>
-        <w:adjustRightInd w:val="0"/>
-        <w:snapToGrid w:val="0"/>
-        <w:spacing w:line="240" w:lineRule="atLeast"/>
-      </w:pPr>
-    </w:p>
-    <w:p>
-      <w:pPr>
-        <w:adjustRightInd w:val="0"/>
-        <w:snapToGrid w:val="0"/>
-        <w:spacing w:line="240" w:lineRule="atLeast"/>
+      <w:r>
+        <w:rPr>
+          <w:rFonts w:hint="eastAsia"/>
+        </w:rPr>
+        <w:t>※広告主の配信と同様に詐欺</w:t>
+      </w:r>
+    </w:p>
+    <w:p>
+      <w:pPr>
+        <w:adjustRightInd w:val="0"/>
+        <w:snapToGrid w:val="0"/>
+        <w:spacing w:line="240" w:lineRule="atLeast"/>
+      </w:pPr>
+      <w:r>
+        <w:rPr>
+          <w:rFonts w:hint="eastAsia"/>
+        </w:rPr>
+        <w:t>(投資・行政・情報商材</w:t>
+      </w:r>
+      <w:r>
+        <w:rPr>
+          <w:rFonts w:hint="eastAsia"/>
+        </w:rPr>
+        <w:t>・</w:t>
+      </w:r>
+      <w:r>
+        <w:t>定期購入の隠蔽（お試し詐欺）</w:t>
+      </w:r>
+    </w:p>
+    <w:p>
+      <w:pPr>
+        <w:adjustRightInd w:val="0"/>
+        <w:snapToGrid w:val="0"/>
+        <w:spacing w:line="240" w:lineRule="atLeast"/>
+      </w:pPr>
+      <w:r>
+        <w:rPr>
+          <w:rFonts w:hint="eastAsia"/>
+        </w:rPr>
+        <w:t>・</w:t>
+      </w:r>
+      <w:r>
+        <w:t>ウイルスの偽警告</w:t>
+      </w:r>
+      <w:r>
+        <w:rPr>
+          <w:rFonts w:hint="eastAsia"/>
+        </w:rPr>
+        <w:t>・</w:t>
+      </w:r>
+      <w:r>
+        <w:t>不自然なほど格安な水回り修理</w:t>
+      </w:r>
+      <w:r>
+        <w:rPr>
+          <w:rFonts w:hint="eastAsia"/>
+        </w:rPr>
+        <w:t>)</w:t>
+      </w:r>
+    </w:p>
+    <w:p>
+      <w:pPr>
+        <w:adjustRightInd w:val="0"/>
+        <w:snapToGrid w:val="0"/>
+        <w:spacing w:line="240" w:lineRule="atLeast"/>
+      </w:pPr>
+      <w:r>
+        <w:rPr>
+          <w:rFonts w:hint="eastAsia"/>
+        </w:rPr>
+        <w:t>・暴力・QRコードに誘導などは</w:t>
+      </w:r>
+    </w:p>
+    <w:p>
+      <w:pPr>
+        <w:adjustRightInd w:val="0"/>
+        <w:snapToGrid w:val="0"/>
+        <w:spacing w:line="240" w:lineRule="atLeast"/>
+        <w:ind w:firstLineChars="100" w:firstLine="210"/>
+      </w:pPr>
+      <w:r>
+        <w:rPr>
+          <w:rFonts w:hint="eastAsia"/>
+        </w:rPr>
+        <w:t>即時ブロックAI審査機能</w:t>
+      </w:r>
+      <w:r>
+        <w:rPr>
+          <w:rFonts w:hint="eastAsia"/>
+        </w:rPr>
+        <w:t xml:space="preserve">　</w:t>
+      </w:r>
+      <w:r>
+        <w:rPr>
+          <w:rFonts w:hint="eastAsia"/>
+        </w:rPr>
+        <w:t>QRコードの先までAIが解析して判定する</w:t>
+      </w:r>
+    </w:p>
+    <w:p>
+      <w:pPr>
+        <w:adjustRightInd w:val="0"/>
+        <w:snapToGrid w:val="0"/>
+        <w:spacing w:line="240" w:lineRule="atLeast"/>
+        <w:ind w:firstLineChars="100" w:firstLine="210"/>
       </w:pPr>
     </w:p>
     <w:p>
@@ -11231,22 +11310,96 @@
         <w:adjustRightInd w:val="0"/>
         <w:snapToGrid w:val="0"/>
         <w:spacing w:line="240" w:lineRule="atLeast"/>
-        <w:rPr>
-          <w:b/>
-          <w:bCs/>
-        </w:rPr>
-      </w:pPr>
-    </w:p>
-    <w:p>
-      <w:pPr>
-        <w:adjustRightInd w:val="0"/>
-        <w:snapToGrid w:val="0"/>
-        <w:spacing w:line="240" w:lineRule="atLeast"/>
-        <w:rPr>
-          <w:b/>
-          <w:bCs/>
-        </w:rPr>
-      </w:pPr>
+      </w:pPr>
+      <w:r>
+        <w:rPr>
+          <w:rFonts w:hint="eastAsia"/>
+        </w:rPr>
+        <w:t>接続カメラ</w:t>
+      </w:r>
+      <w:r>
+        <w:rPr>
+          <w:rFonts w:hint="eastAsia"/>
+        </w:rPr>
+        <w:t>のみ</w:t>
+      </w:r>
+      <w:r>
+        <w:rPr>
+          <w:rFonts w:hint="eastAsia"/>
+        </w:rPr>
+        <w:t>ホワイトリスト化</w:t>
+      </w:r>
+      <w:r>
+        <w:rPr>
+          <w:rFonts w:hint="eastAsia"/>
+        </w:rPr>
+        <w:t>接続、その他は不可(リテアドLEDフィルム</w:t>
+      </w:r>
+      <w:r>
+        <w:rPr>
+          <w:rFonts w:hint="eastAsia"/>
+        </w:rPr>
+        <w:t>のみ</w:t>
+      </w:r>
+      <w:r>
+        <w:rPr>
+          <w:rFonts w:hint="eastAsia"/>
+        </w:rPr>
+        <w:t>)</w:t>
+      </w:r>
+    </w:p>
+    <w:p>
+      <w:pPr>
+        <w:adjustRightInd w:val="0"/>
+        <w:snapToGrid w:val="0"/>
+        <w:spacing w:line="240" w:lineRule="atLeast"/>
+      </w:pPr>
+      <w:r>
+        <w:rPr>
+          <w:rFonts w:hint="eastAsia"/>
+        </w:rPr>
+        <w:t>他社の</w:t>
+      </w:r>
+      <w:r>
+        <w:t>Windows</w:t>
+      </w:r>
+      <w:r>
+        <w:rPr>
+          <w:rFonts w:hint="eastAsia"/>
+        </w:rPr>
+        <w:t xml:space="preserve">　</w:t>
+      </w:r>
+      <w:r>
+        <w:t>Android</w:t>
+      </w:r>
+      <w:r>
+        <w:rPr>
+          <w:rFonts w:hint="eastAsia"/>
+        </w:rPr>
+        <w:t>サイネージパネルにも</w:t>
+      </w:r>
+    </w:p>
+    <w:p>
+      <w:pPr>
+        <w:adjustRightInd w:val="0"/>
+        <w:snapToGrid w:val="0"/>
+        <w:spacing w:line="240" w:lineRule="atLeast"/>
+      </w:pPr>
+      <w:r>
+        <w:t>OSレベルで無効化</w:t>
+      </w:r>
+      <w:r>
+        <w:rPr>
+          <w:rFonts w:hint="eastAsia"/>
+        </w:rPr>
+        <w:t>など</w:t>
+      </w:r>
+      <w:r>
+        <w:rPr>
+          <w:rFonts w:hint="eastAsia"/>
+        </w:rPr>
+        <w:t>セキュリティパッチを付与</w:t>
+      </w:r>
     </w:p>
     <w:p>
       <w:pPr>
@@ -13332,7 +13485,19 @@
         <w:rPr>
           <w:rFonts w:hint="eastAsia"/>
         </w:rPr>
-        <w:t>キャッシュが悪化してるので</w:t>
+        <w:t>26年6月期の決算で</w:t>
+      </w:r>
+      <w:r>
+        <w:rPr>
+          <w:rFonts w:hint="eastAsia"/>
+        </w:rPr>
+        <w:t>買収効果が出てない</w:t>
+      </w:r>
+      <w:r>
+        <w:rPr>
+          <w:rFonts w:hint="eastAsia"/>
+        </w:rPr>
+        <w:t>ので</w:t>
       </w:r>
       <w:r>
         <w:rPr>
@@ -13345,7 +13510,14 @@
           <w:rFonts w:hint="eastAsia"/>
           <w:u w:val="single"/>
         </w:rPr>
-        <w:t>数年は猶予あると想定。</w:t>
+        <w:t>1－3</w:t>
+      </w:r>
+      <w:r>
+        <w:rPr>
+          <w:rFonts w:hint="eastAsia"/>
+          <w:u w:val="single"/>
+        </w:rPr>
+        <w:t>年は猶予あると想定。</w:t>
       </w:r>
     </w:p>
     <w:p>
@@ -14103,10 +14275,10 @@
         <w:tblLook w:val="04A0" w:firstRow="1" w:lastRow="0" w:firstColumn="1" w:lastColumn="0" w:noHBand="0" w:noVBand="1"/>
       </w:tblPr>
       <w:tblGrid>
-        <w:gridCol w:w="2207"/>
-        <w:gridCol w:w="2342"/>
-        <w:gridCol w:w="1345"/>
-        <w:gridCol w:w="2594"/>
+        <w:gridCol w:w="2169"/>
+        <w:gridCol w:w="2306"/>
+        <w:gridCol w:w="1340"/>
+        <w:gridCol w:w="2673"/>
       </w:tblGrid>
       <w:tr>
         <w:trPr>
@@ -14273,10 +14445,18 @@
             </w:pPr>
             <w:r>
               <w:rPr>
+                <w:rFonts w:hint="eastAsia"/>
                 <w:b/>
                 <w:bCs/>
               </w:rPr>
-              <w:t>28,000円</w:t>
+              <w:t>50</w:t>
+            </w:r>
+            <w:r>
+              <w:rPr>
+                <w:b/>
+                <w:bCs/>
+              </w:rPr>
+              <w:t>,000円</w:t>
             </w:r>
           </w:p>
         </w:tc>
@@ -14300,10 +14480,33 @@
             </w:pPr>
             <w:r>
               <w:rPr>
+                <w:rFonts w:hint="eastAsia"/>
                 <w:b/>
                 <w:bCs/>
               </w:rPr>
-              <w:t>8,400,000円</w:t>
+              <w:t>15</w:t>
+            </w:r>
+            <w:r>
+              <w:rPr>
+                <w:b/>
+                <w:bCs/>
+              </w:rPr>
+              <w:t>,</w:t>
+            </w:r>
+            <w:r>
+              <w:rPr>
+                <w:rFonts w:hint="eastAsia"/>
+                <w:b/>
+                <w:bCs/>
+              </w:rPr>
+              <w:t>0</w:t>
+            </w:r>
+            <w:r>
+              <w:rPr>
+                <w:b/>
+                <w:bCs/>
+              </w:rPr>
+              <w:t>00,000円</w:t>
             </w:r>
           </w:p>
         </w:tc>
@@ -14345,6 +14548,132 @@
               <w:right w:val="single" w:sz="6" w:space="0" w:color="auto"/>
             </w:tcBorders>
             <w:vAlign w:val="center"/>
+          </w:tcPr>
+          <w:p>
+            <w:pPr>
+              <w:adjustRightInd w:val="0"/>
+              <w:snapToGrid w:val="0"/>
+              <w:spacing w:line="240" w:lineRule="atLeast"/>
+              <w:rPr>
+                <w:b/>
+                <w:bCs/>
+              </w:rPr>
+            </w:pPr>
+            <w:r>
+              <w:rPr>
+                <w:rFonts w:hint="eastAsia"/>
+                <w:b/>
+                <w:bCs/>
+              </w:rPr>
+              <w:t>カメラ</w:t>
+            </w:r>
+          </w:p>
+        </w:tc>
+        <w:tc>
+          <w:tcPr>
+            <w:tcW w:w="0" w:type="auto"/>
+            <w:tcBorders>
+              <w:top w:val="single" w:sz="6" w:space="0" w:color="auto"/>
+              <w:left w:val="single" w:sz="6" w:space="0" w:color="auto"/>
+              <w:bottom w:val="single" w:sz="6" w:space="0" w:color="auto"/>
+              <w:right w:val="single" w:sz="6" w:space="0" w:color="auto"/>
+            </w:tcBorders>
+            <w:vAlign w:val="center"/>
+          </w:tcPr>
+          <w:p>
+            <w:pPr>
+              <w:adjustRightInd w:val="0"/>
+              <w:snapToGrid w:val="0"/>
+              <w:spacing w:line="240" w:lineRule="atLeast"/>
+              <w:rPr>
+                <w:b/>
+                <w:bCs/>
+              </w:rPr>
+            </w:pPr>
+            <w:r>
+              <w:rPr>
+                <w:b/>
+                <w:bCs/>
+              </w:rPr>
+              <w:t>2,500</w:t>
+            </w:r>
+          </w:p>
+        </w:tc>
+        <w:tc>
+          <w:tcPr>
+            <w:tcW w:w="0" w:type="auto"/>
+            <w:tcBorders>
+              <w:top w:val="single" w:sz="6" w:space="0" w:color="auto"/>
+              <w:left w:val="single" w:sz="6" w:space="0" w:color="auto"/>
+              <w:bottom w:val="single" w:sz="6" w:space="0" w:color="auto"/>
+              <w:right w:val="single" w:sz="6" w:space="0" w:color="auto"/>
+            </w:tcBorders>
+            <w:vAlign w:val="center"/>
+          </w:tcPr>
+          <w:p>
+            <w:pPr>
+              <w:adjustRightInd w:val="0"/>
+              <w:snapToGrid w:val="0"/>
+              <w:spacing w:line="240" w:lineRule="atLeast"/>
+              <w:rPr>
+                <w:b/>
+                <w:bCs/>
+              </w:rPr>
+            </w:pPr>
+            <w:r>
+              <w:rPr>
+                <w:b/>
+                <w:bCs/>
+              </w:rPr>
+              <w:t>750,000</w:t>
+            </w:r>
+            <w:r>
+              <w:rPr>
+                <w:rFonts w:hint="eastAsia"/>
+                <w:b/>
+                <w:bCs/>
+              </w:rPr>
+              <w:t>円</w:t>
+            </w:r>
+          </w:p>
+        </w:tc>
+        <w:tc>
+          <w:tcPr>
+            <w:tcW w:w="0" w:type="auto"/>
+            <w:tcBorders>
+              <w:top w:val="single" w:sz="6" w:space="0" w:color="auto"/>
+              <w:left w:val="single" w:sz="6" w:space="0" w:color="auto"/>
+              <w:bottom w:val="single" w:sz="6" w:space="0" w:color="auto"/>
+              <w:right w:val="single" w:sz="6" w:space="0" w:color="auto"/>
+            </w:tcBorders>
+            <w:vAlign w:val="center"/>
+          </w:tcPr>
+          <w:p>
+            <w:pPr>
+              <w:adjustRightInd w:val="0"/>
+              <w:snapToGrid w:val="0"/>
+              <w:spacing w:line="240" w:lineRule="atLeast"/>
+            </w:pPr>
+            <w:r>
+              <w:t>LogicoolC270n</w:t>
+            </w:r>
+          </w:p>
+        </w:tc>
+      </w:tr>
+      <w:tr>
+        <w:trPr>
+          <w:tblCellSpacing w:w="15" w:type="dxa"/>
+        </w:trPr>
+        <w:tc>
+          <w:tcPr>
+            <w:tcW w:w="0" w:type="auto"/>
+            <w:tcBorders>
+              <w:top w:val="single" w:sz="6" w:space="0" w:color="auto"/>
+              <w:left w:val="single" w:sz="6" w:space="0" w:color="auto"/>
+              <w:bottom w:val="single" w:sz="6" w:space="0" w:color="auto"/>
+              <w:right w:val="single" w:sz="6" w:space="0" w:color="auto"/>
+            </w:tcBorders>
+            <w:vAlign w:val="center"/>
             <w:hideMark/>
           </w:tcPr>
           <w:p>
@@ -14380,13 +14709,26 @@
               <w:snapToGrid w:val="0"/>
               <w:spacing w:line="240" w:lineRule="atLeast"/>
             </w:pPr>
-            <w:r>
-              <w:rPr>
-                <w:b/>
-                <w:bCs/>
-              </w:rPr>
-              <w:t>22,000円</w:t>
-            </w:r>
+          </w:p>
+        </w:tc>
+        <w:tc>
+          <w:tcPr>
+            <w:tcW w:w="0" w:type="auto"/>
+            <w:tcBorders>
+              <w:top w:val="single" w:sz="6" w:space="0" w:color="auto"/>
+              <w:left w:val="single" w:sz="6" w:space="0" w:color="auto"/>
+              <w:bottom w:val="single" w:sz="6" w:space="0" w:color="auto"/>
+              <w:right w:val="single" w:sz="6" w:space="0" w:color="auto"/>
+            </w:tcBorders>
+            <w:vAlign w:val="center"/>
+            <w:hideMark/>
+          </w:tcPr>
+          <w:p>
+            <w:pPr>
+              <w:adjustRightInd w:val="0"/>
+              <w:snapToGrid w:val="0"/>
+              <w:spacing w:line="240" w:lineRule="atLeast"/>
+            </w:pPr>
           </w:p>
         </w:tc>
         <w:tc>
@@ -14408,34 +14750,13 @@
               <w:spacing w:line="240" w:lineRule="atLeast"/>
             </w:pPr>
             <w:r>
-              <w:rPr>
-                <w:b/>
-                <w:bCs/>
-              </w:rPr>
-              <w:t>6,600,000円</w:t>
+              <w:t>A</w:t>
             </w:r>
-          </w:p>
-        </w:tc>
-        <w:tc>
-          <w:tcPr>
-            <w:tcW w:w="0" w:type="auto"/>
-            <w:tcBorders>
-              <w:top w:val="single" w:sz="6" w:space="0" w:color="auto"/>
-              <w:left w:val="single" w:sz="6" w:space="0" w:color="auto"/>
-              <w:bottom w:val="single" w:sz="6" w:space="0" w:color="auto"/>
-              <w:right w:val="single" w:sz="6" w:space="0" w:color="auto"/>
-            </w:tcBorders>
-            <w:vAlign w:val="center"/>
-            <w:hideMark/>
-          </w:tcPr>
-          <w:p>
-            <w:pPr>
-              <w:adjustRightInd w:val="0"/>
-              <w:snapToGrid w:val="0"/>
-              <w:spacing w:line="240" w:lineRule="atLeast"/>
-            </w:pPr>
             <w:r>
-              <w:t>共通基板での一括発注</w:t>
+              <w:rPr>
+                <w:rFonts w:hint="eastAsia"/>
+              </w:rPr>
+              <w:t>ndroidアプリ</w:t>
             </w:r>
           </w:p>
         </w:tc>
@@ -14623,10 +14944,33 @@
             </w:pPr>
             <w:r>
               <w:rPr>
+                <w:rFonts w:hint="eastAsia"/>
                 <w:b/>
                 <w:bCs/>
               </w:rPr>
-              <w:t>870,000円</w:t>
+              <w:t>907</w:t>
+            </w:r>
+            <w:r>
+              <w:rPr>
+                <w:b/>
+                <w:bCs/>
+              </w:rPr>
+              <w:t>,</w:t>
+            </w:r>
+            <w:r>
+              <w:rPr>
+                <w:rFonts w:hint="eastAsia"/>
+                <w:b/>
+                <w:bCs/>
+              </w:rPr>
+              <w:t>5</w:t>
+            </w:r>
+            <w:r>
+              <w:rPr>
+                <w:b/>
+                <w:bCs/>
+              </w:rPr>
+              <w:t>00円</w:t>
             </w:r>
           </w:p>
         </w:tc>
@@ -14918,7 +15262,45 @@
                 <w:b/>
                 <w:bCs/>
               </w:rPr>
-              <w:t>約6.9万円 / 台</w:t>
+              <w:t>約</w:t>
+            </w:r>
+            <w:r>
+              <w:rPr>
+                <w:rFonts w:hint="eastAsia"/>
+                <w:b/>
+                <w:bCs/>
+              </w:rPr>
+              <w:t>7</w:t>
+            </w:r>
+            <w:r>
+              <w:rPr>
+                <w:b/>
+                <w:bCs/>
+              </w:rPr>
+              <w:t>.</w:t>
+            </w:r>
+            <w:r>
+              <w:rPr>
+                <w:rFonts w:hint="eastAsia"/>
+                <w:b/>
+                <w:bCs/>
+              </w:rPr>
+              <w:t>1</w:t>
+            </w:r>
+            <w:r>
+              <w:rPr>
+                <w:rFonts w:hint="eastAsia"/>
+                <w:b/>
+                <w:bCs/>
+              </w:rPr>
+              <w:t>9</w:t>
+            </w:r>
+            <w:r>
+              <w:rPr>
+                <w:b/>
+                <w:bCs/>
+              </w:rPr>
+              <w:t>万円 / 台</w:t>
             </w:r>
           </w:p>
         </w:tc>
@@ -14945,7 +15327,60 @@
                 <w:b/>
                 <w:bCs/>
               </w:rPr>
-              <w:t>20,770,000円</w:t>
+              <w:t>2</w:t>
+            </w:r>
+            <w:r>
+              <w:rPr>
+                <w:rFonts w:hint="eastAsia"/>
+                <w:b/>
+                <w:bCs/>
+              </w:rPr>
+              <w:t>1</w:t>
+            </w:r>
+            <w:r>
+              <w:rPr>
+                <w:b/>
+                <w:bCs/>
+              </w:rPr>
+              <w:t>,</w:t>
+            </w:r>
+            <w:r>
+              <w:rPr>
+                <w:rFonts w:hint="eastAsia"/>
+                <w:b/>
+                <w:bCs/>
+              </w:rPr>
+              <w:t>5</w:t>
+            </w:r>
+            <w:r>
+              <w:rPr>
+                <w:rFonts w:hint="eastAsia"/>
+                <w:b/>
+                <w:bCs/>
+              </w:rPr>
+              <w:t>57</w:t>
+            </w:r>
+            <w:r>
+              <w:rPr>
+                <w:b/>
+                <w:bCs/>
+              </w:rPr>
+              <w:t>,</w:t>
+            </w:r>
+            <w:r>
+              <w:rPr>
+                <w:rFonts w:hint="eastAsia"/>
+                <w:b/>
+                <w:bCs/>
+              </w:rPr>
+              <w:t>5</w:t>
+            </w:r>
+            <w:r>
+              <w:rPr>
+                <w:b/>
+                <w:bCs/>
+              </w:rPr>
+              <w:t>00円</w:t>
             </w:r>
           </w:p>
         </w:tc>
@@ -15600,7 +16035,33 @@
                 <w:bCs/>
                 <w:u w:val="single"/>
               </w:rPr>
-              <w:t>2,077万円</w:t>
+              <w:t>2,</w:t>
+            </w:r>
+            <w:r>
+              <w:rPr>
+                <w:rFonts w:hint="eastAsia"/>
+                <w:b/>
+                <w:bCs/>
+                <w:u w:val="single"/>
+              </w:rPr>
+              <w:t>15</w:t>
+            </w:r>
+            <w:r>
+              <w:rPr>
+                <w:rFonts w:hint="eastAsia"/>
+                <w:b/>
+                <w:bCs/>
+                <w:u w:val="single"/>
+              </w:rPr>
+              <w:t>7</w:t>
+            </w:r>
+            <w:r>
+              <w:rPr>
+                <w:b/>
+                <w:bCs/>
+                <w:u w:val="single"/>
+              </w:rPr>
+              <w:t>万円</w:t>
             </w:r>
           </w:p>
         </w:tc>
@@ -15871,7 +16332,6 @@
               <w:snapToGrid w:val="0"/>
               <w:spacing w:line="240" w:lineRule="atLeast"/>
               <w:rPr>
-                <w:rFonts w:hint="eastAsia"/>
                 <w:b/>
                 <w:bCs/>
                 <w:u w:val="single"/>
@@ -15897,7 +16357,6 @@
               <w:snapToGrid w:val="0"/>
               <w:spacing w:line="240" w:lineRule="atLeast"/>
               <w:rPr>
-                <w:rFonts w:hint="eastAsia"/>
                 <w:b/>
                 <w:bCs/>
                 <w:u w:val="single"/>
@@ -15923,7 +16382,6 @@
               <w:snapToGrid w:val="0"/>
               <w:spacing w:line="240" w:lineRule="atLeast"/>
               <w:rPr>
-                <w:rFonts w:hint="eastAsia"/>
                 <w:b/>
                 <w:bCs/>
                 <w:u w:val="single"/>
@@ -15999,7 +16457,24 @@
                 <w:bCs/>
                 <w:u w:val="single"/>
               </w:rPr>
-              <w:t>200万円</w:t>
+              <w:t>2</w:t>
+            </w:r>
+            <w:r>
+              <w:rPr>
+                <w:rFonts w:hint="eastAsia"/>
+                <w:b/>
+                <w:bCs/>
+                <w:u w:val="single"/>
+              </w:rPr>
+              <w:t>5</w:t>
+            </w:r>
+            <w:r>
+              <w:rPr>
+                <w:b/>
+                <w:bCs/>
+                <w:u w:val="single"/>
+              </w:rPr>
+              <w:t>0万円</w:t>
             </w:r>
           </w:p>
         </w:tc>
@@ -16032,7 +16507,24 @@
                 <w:bCs/>
                 <w:u w:val="single"/>
               </w:rPr>
-              <w:t>従量課金（最大400万の半額計上）</w:t>
+              <w:t>従量課金（最大</w:t>
+            </w:r>
+            <w:r>
+              <w:rPr>
+                <w:rFonts w:hint="eastAsia"/>
+                <w:b/>
+                <w:bCs/>
+                <w:u w:val="single"/>
+              </w:rPr>
+              <w:t>5</w:t>
+            </w:r>
+            <w:r>
+              <w:rPr>
+                <w:b/>
+                <w:bCs/>
+                <w:u w:val="single"/>
+              </w:rPr>
+              <w:t>00万の半額計上）</w:t>
             </w:r>
           </w:p>
         </w:tc>
@@ -16244,7 +16736,7 @@
                 <w:bCs/>
                 <w:u w:val="single"/>
               </w:rPr>
-              <w:t>6</w:t>
+              <w:t>802</w:t>
             </w:r>
             <w:r>
               <w:rPr>
@@ -16252,7 +16744,7 @@
                 <w:bCs/>
                 <w:u w:val="single"/>
               </w:rPr>
-              <w:t>72万円</w:t>
+              <w:t>万円</w:t>
             </w:r>
           </w:p>
         </w:tc>

</xml_diff>

<commit_message>
Fix final JS syntax errors in html files and remove temporary patch files
</commit_message>
<xml_diff>
--- a/主題小売り業界向けの売上高改善の向けサイネージ広告共同運用の提案.docx
+++ b/主題小売り業界向けの売上高改善の向けサイネージ広告共同運用の提案.docx
@@ -5367,7 +5367,7 @@
           <w:noProof/>
         </w:rPr>
         <w:drawing>
-          <wp:inline distT="0" distB="0" distL="0" distR="0" wp14:anchorId="3CE421A6" wp14:editId="46C611DE">
+          <wp:inline distT="0" distB="0" distL="0" distR="0" wp14:anchorId="3CE421A6" wp14:editId="7980B2F1">
             <wp:extent cx="1074164" cy="1059011"/>
             <wp:effectExtent l="0" t="0" r="0" b="8255"/>
             <wp:docPr id="681950858" name="図 1"/>
@@ -17484,6 +17484,41 @@
           <w:bCs/>
         </w:rPr>
         <w:t xml:space="preserve">　　　　　　Googleアドセンス・アドマネージャーとの連携</w:t>
+      </w:r>
+    </w:p>
+    <w:p>
+      <w:pPr>
+        <w:adjustRightInd w:val="0"/>
+        <w:snapToGrid w:val="0"/>
+        <w:spacing w:line="240" w:lineRule="atLeast"/>
+        <w:rPr>
+          <w:rFonts w:hint="eastAsia"/>
+          <w:b/>
+          <w:bCs/>
+        </w:rPr>
+      </w:pPr>
+      <w:r>
+        <w:rPr>
+          <w:rFonts w:hint="eastAsia"/>
+          <w:b/>
+          <w:bCs/>
+        </w:rPr>
+        <w:t xml:space="preserve">　　　　　　銀行APIと経理A</w:t>
+      </w:r>
+      <w:r>
+        <w:rPr>
+          <w:b/>
+          <w:bCs/>
+        </w:rPr>
+        <w:t>p</w:t>
+      </w:r>
+      <w:r>
+        <w:rPr>
+          <w:rFonts w:hint="eastAsia"/>
+          <w:b/>
+          <w:bCs/>
+        </w:rPr>
+        <w:t>iの連携</w:t>
       </w:r>
     </w:p>
     <w:sectPr>

</xml_diff>

<commit_message>
fix: resolve duplicate navigation menu and sync updates
</commit_message>
<xml_diff>
--- a/主題小売り業界向けの売上高改善の向けサイネージ広告共同運用の提案.docx
+++ b/主題小売り業界向けの売上高改善の向けサイネージ広告共同運用の提案.docx
@@ -5367,7 +5367,7 @@
           <w:noProof/>
         </w:rPr>
         <w:drawing>
-          <wp:inline distT="0" distB="0" distL="0" distR="0" wp14:anchorId="3CE421A6" wp14:editId="7980B2F1">
+          <wp:inline distT="0" distB="0" distL="0" distR="0" wp14:anchorId="3CE421A6" wp14:editId="746F8A65">
             <wp:extent cx="1074164" cy="1059011"/>
             <wp:effectExtent l="0" t="0" r="0" b="8255"/>
             <wp:docPr id="681950858" name="図 1"/>
@@ -7551,17 +7551,7 @@
         <w:snapToGrid w:val="0"/>
         <w:spacing w:line="240" w:lineRule="atLeast"/>
         <w:rPr>
-          <w:rFonts w:eastAsia="游明朝"/>
-        </w:rPr>
-      </w:pPr>
-    </w:p>
-    <w:p>
-      <w:pPr>
-        <w:adjustRightInd w:val="0"/>
-        <w:snapToGrid w:val="0"/>
-        <w:spacing w:line="240" w:lineRule="atLeast"/>
-        <w:rPr>
-          <w:rFonts w:eastAsia="游明朝"/>
+          <w:rFonts w:eastAsia="游明朝" w:hint="eastAsia"/>
         </w:rPr>
       </w:pPr>
     </w:p>
@@ -7624,6 +7614,44 @@
         </w:rPr>
         <w:t>(デモは配信できません)</w:t>
       </w:r>
+    </w:p>
+    <w:p>
+      <w:pPr>
+        <w:adjustRightInd w:val="0"/>
+        <w:snapToGrid w:val="0"/>
+        <w:spacing w:line="240" w:lineRule="atLeast"/>
+        <w:rPr>
+          <w:rFonts w:hint="eastAsia"/>
+          <w:b/>
+          <w:bCs/>
+        </w:rPr>
+      </w:pPr>
+      <w:proofErr w:type="spellStart"/>
+      <w:r>
+        <w:rPr>
+          <w:b/>
+          <w:bCs/>
+        </w:rPr>
+        <w:t>ad_dashboard</w:t>
+      </w:r>
+      <w:proofErr w:type="spellEnd"/>
+      <w:r>
+        <w:rPr>
+          <w:rFonts w:hint="eastAsia"/>
+          <w:b/>
+          <w:bCs/>
+        </w:rPr>
+        <w:t xml:space="preserve"> </w:t>
+      </w:r>
+      <w:proofErr w:type="spellStart"/>
+      <w:r>
+        <w:rPr>
+          <w:b/>
+          <w:bCs/>
+        </w:rPr>
+        <w:t>advertiser_dashboard</w:t>
+      </w:r>
+      <w:proofErr w:type="spellEnd"/>
     </w:p>
     <w:p>
       <w:pPr>
@@ -8059,6 +8087,23 @@
         </w:rPr>
         <w:t>売り上げセンター</w:t>
       </w:r>
+      <w:r>
+        <w:rPr>
+          <w:rFonts w:hint="eastAsia"/>
+          <w:b/>
+          <w:bCs/>
+        </w:rPr>
+        <w:t xml:space="preserve"> </w:t>
+      </w:r>
+      <w:proofErr w:type="spellStart"/>
+      <w:r>
+        <w:rPr>
+          <w:b/>
+          <w:bCs/>
+        </w:rPr>
+        <w:t>store_portal</w:t>
+      </w:r>
+      <w:proofErr w:type="spellEnd"/>
     </w:p>
     <w:p>
       <w:pPr>
@@ -8542,6 +8587,23 @@
         </w:rPr>
         <w:t>どこでもレジ</w:t>
       </w:r>
+      <w:r>
+        <w:rPr>
+          <w:rFonts w:hint="eastAsia"/>
+          <w:b/>
+          <w:bCs/>
+        </w:rPr>
+        <w:t xml:space="preserve"> </w:t>
+      </w:r>
+      <w:proofErr w:type="spellStart"/>
+      <w:r>
+        <w:rPr>
+          <w:b/>
+          <w:bCs/>
+        </w:rPr>
+        <w:t>anywhere_regi</w:t>
+      </w:r>
+      <w:proofErr w:type="spellEnd"/>
     </w:p>
     <w:p>
       <w:pPr>
@@ -9805,6 +9867,23 @@
         </w:rPr>
         <w:t>シフト表管理機能</w:t>
       </w:r>
+      <w:r>
+        <w:rPr>
+          <w:rFonts w:hint="eastAsia"/>
+          <w:b/>
+          <w:bCs/>
+        </w:rPr>
+        <w:t xml:space="preserve"> </w:t>
+      </w:r>
+      <w:proofErr w:type="spellStart"/>
+      <w:r>
+        <w:rPr>
+          <w:b/>
+          <w:bCs/>
+        </w:rPr>
+        <w:t>shift_manager</w:t>
+      </w:r>
+      <w:proofErr w:type="spellEnd"/>
     </w:p>
     <w:p>
       <w:pPr>
@@ -10006,6 +10085,19 @@
         </w:rPr>
         <w:t>.マニュアルヘルプ</w:t>
       </w:r>
+      <w:r>
+        <w:rPr>
+          <w:rFonts w:hint="eastAsia"/>
+          <w:b/>
+          <w:bCs/>
+        </w:rPr>
+        <w:t xml:space="preserve"> </w:t>
+      </w:r>
+      <w:proofErr w:type="spellStart"/>
+      <w:r>
+        <w:t>manualhelp</w:t>
+      </w:r>
+      <w:proofErr w:type="spellEnd"/>
     </w:p>
     <w:p>
       <w:pPr>
@@ -11200,7 +11292,27 @@
         <w:rPr>
           <w:rFonts w:hint="eastAsia"/>
         </w:rPr>
-        <w:t>法人配信管理画面(大企業の</w:t>
+        <w:t>法人配信管理画面</w:t>
+      </w:r>
+      <w:r>
+        <w:rPr>
+          <w:rFonts w:hint="eastAsia"/>
+        </w:rPr>
+        <w:t xml:space="preserve">　</w:t>
+      </w:r>
+      <w:proofErr w:type="spellStart"/>
+      <w:r>
+        <w:t>retailer_portal</w:t>
+      </w:r>
+      <w:proofErr w:type="spellEnd"/>
+      <w:r>
+        <w:t xml:space="preserve"> </w:t>
+      </w:r>
+      <w:r>
+        <w:rPr>
+          <w:rFonts w:hint="eastAsia"/>
+        </w:rPr>
+        <w:t>(大企業の</w:t>
       </w:r>
       <w:r>
         <w:rPr>
@@ -11252,6 +11364,12 @@
           <w:rFonts w:hint="eastAsia"/>
         </w:rPr>
         <w:t>管理画面</w:t>
+      </w:r>
+      <w:r>
+        <w:rPr>
+          <w:rFonts w:hint="eastAsia"/>
+        </w:rPr>
+        <w:t>(admin)</w:t>
       </w:r>
       <w:r>
         <w:rPr>
@@ -17492,7 +17610,6 @@
         <w:snapToGrid w:val="0"/>
         <w:spacing w:line="240" w:lineRule="atLeast"/>
         <w:rPr>
-          <w:rFonts w:hint="eastAsia"/>
           <w:b/>
           <w:bCs/>
         </w:rPr>
@@ -22479,7 +22596,6 @@
   <w:style w:type="character" w:default="1" w:styleId="a0">
     <w:name w:val="Default Paragraph Font"/>
     <w:uiPriority w:val="1"/>
-    <w:semiHidden/>
     <w:unhideWhenUsed/>
   </w:style>
   <w:style w:type="table" w:default="1" w:styleId="a1">

</xml_diff>